<commit_message>
Remove unsupported citation from integrated manuscript
</commit_message>
<xml_diff>
--- a/manuscript/discovery_bottleneck_combined.docx
+++ b/manuscript/discovery_bottleneck_combined.docx
@@ -211,7 +211,7 @@
         <w:pStyle w:val="BodyText"/>
       </w:pPr>
       <w:r>
-        <w:t xml:space="preserve">Korean political science provides a case in which this distinction can be examined directly. Korean-language political science contains a substantial literature that is cited within Korean scholarship but only rarely cited by English-language scholarship. Previous bibliographic analysis of Korean politics identifies a linguistically divided citation structure in which Korean-language scholarship relies substantially on locally accumulated work, while English-language scholarship concentrates citation within a different set of publications (Kim 2025).</w:t>
+        <w:t xml:space="preserve">This paper examines that distinction in Korean political science. Study 1 begins with 54,789 Korean-language papers cited within Korean scholarship and tests whether their Google Scholar retrievability is associated with entry into English-language citation.</w:t>
       </w:r>
     </w:p>
     <w:p>
@@ -7383,7 +7383,7 @@
       </w:r>
     </w:p>
     <w:bookmarkEnd w:id="70"/>
-    <w:bookmarkStart w:id="87" w:name="references"/>
+    <w:bookmarkStart w:id="86" w:name="references"/>
     <w:p>
       <w:pPr>
         <w:pStyle w:val="Heading2"/>
@@ -7931,7 +7931,19 @@
         <w:pStyle w:val="BodyText"/>
       </w:pPr>
       <w:r>
-        <w:t xml:space="preserve">Kim, Hyowon. 2025.</w:t>
+        <w:t xml:space="preserve">Konno, Ko, Munemitsu Akasaka, Chieko Koshida, Naoki Katayama, Noriyuki Osada, Rebecca Spake, and Tatsuya Amano. 2020.</w:t>
+      </w:r>
+      <w:r>
+        <w:t xml:space="preserve"> </w:t>
+      </w:r>
+      <w:r>
+        <w:t xml:space="preserve">“</w:t>
+      </w:r>
+      <w:r>
+        <w:t xml:space="preserve">Ignoring Non-English-Language Studies May Bias Ecological Meta-Analyses.</w:t>
+      </w:r>
+      <w:r>
+        <w:t xml:space="preserve">”</w:t>
       </w:r>
       <w:r>
         <w:t xml:space="preserve"> </w:t>
@@ -7941,65 +7953,18 @@
           <w:iCs/>
           <w:i/>
         </w:rPr>
-        <w:t xml:space="preserve">Two Spheres of Korean Politics: Knowledge Production and Dissemination across Linguistic Divides</w:t>
-      </w:r>
-      <w:r>
-        <w:t xml:space="preserve">. Ann Arbor, MI: Inter-university Consortium for Political and Social Research.</w:t>
+        <w:t xml:space="preserve">Ecology and Evolution</w:t>
+      </w:r>
+      <w:r>
+        <w:t xml:space="preserve"> </w:t>
+      </w:r>
+      <w:r>
+        <w:t xml:space="preserve">10(13): 6373–6384.</w:t>
       </w:r>
       <w:r>
         <w:t xml:space="preserve"> </w:t>
       </w:r>
       <w:hyperlink r:id="rId81">
-        <w:r>
-          <w:rPr>
-            <w:rStyle w:val="Hyperlink"/>
-          </w:rPr>
-          <w:t xml:space="preserve">https://doi.org/10.3886/E240683V1</w:t>
-        </w:r>
-      </w:hyperlink>
-      <w:r>
-        <w:t xml:space="preserve">.</w:t>
-      </w:r>
-    </w:p>
-    <w:p>
-      <w:pPr>
-        <w:pStyle w:val="BodyText"/>
-      </w:pPr>
-      <w:r>
-        <w:t xml:space="preserve">Konno, Ko, Munemitsu Akasaka, Chieko Koshida, Naoki Katayama, Noriyuki Osada, Rebecca Spake, and Tatsuya Amano. 2020.</w:t>
-      </w:r>
-      <w:r>
-        <w:t xml:space="preserve"> </w:t>
-      </w:r>
-      <w:r>
-        <w:t xml:space="preserve">“</w:t>
-      </w:r>
-      <w:r>
-        <w:t xml:space="preserve">Ignoring Non-English-Language Studies May Bias Ecological Meta-Analyses.</w:t>
-      </w:r>
-      <w:r>
-        <w:t xml:space="preserve">”</w:t>
-      </w:r>
-      <w:r>
-        <w:t xml:space="preserve"> </w:t>
-      </w:r>
-      <w:r>
-        <w:rPr>
-          <w:iCs/>
-          <w:i/>
-        </w:rPr>
-        <w:t xml:space="preserve">Ecology and Evolution</w:t>
-      </w:r>
-      <w:r>
-        <w:t xml:space="preserve"> </w:t>
-      </w:r>
-      <w:r>
-        <w:t xml:space="preserve">10(13): 6373–6384.</w:t>
-      </w:r>
-      <w:r>
-        <w:t xml:space="preserve"> </w:t>
-      </w:r>
-      <w:hyperlink r:id="rId82">
         <w:r>
           <w:rPr>
             <w:rStyle w:val="Hyperlink"/>
@@ -8106,7 +8071,7 @@
       <w:r>
         <w:t xml:space="preserve"> </w:t>
       </w:r>
-      <w:hyperlink r:id="rId83">
+      <w:hyperlink r:id="rId82">
         <w:r>
           <w:rPr>
             <w:rStyle w:val="Hyperlink"/>
@@ -8156,7 +8121,7 @@
       <w:r>
         <w:t xml:space="preserve"> </w:t>
       </w:r>
-      <w:hyperlink r:id="rId84">
+      <w:hyperlink r:id="rId83">
         <w:r>
           <w:rPr>
             <w:rStyle w:val="Hyperlink"/>
@@ -8206,7 +8171,7 @@
       <w:r>
         <w:t xml:space="preserve"> </w:t>
       </w:r>
-      <w:hyperlink r:id="rId85">
+      <w:hyperlink r:id="rId84">
         <w:r>
           <w:rPr>
             <w:rStyle w:val="Hyperlink"/>
@@ -8256,7 +8221,7 @@
       <w:r>
         <w:t xml:space="preserve"> </w:t>
       </w:r>
-      <w:hyperlink r:id="rId86">
+      <w:hyperlink r:id="rId85">
         <w:r>
           <w:rPr>
             <w:rStyle w:val="Hyperlink"/>
@@ -8268,7 +8233,7 @@
         <w:t xml:space="preserve">.</w:t>
       </w:r>
     </w:p>
-    <w:bookmarkEnd w:id="87"/>
+    <w:bookmarkEnd w:id="86"/>
     <w:sectPr/>
   </w:body>
 </w:document>

</xml_diff>

<commit_message>
Refine manuscript typography and punctuation
</commit_message>
<xml_diff>
--- a/manuscript/discovery_bottleneck_combined.docx
+++ b/manuscript/discovery_bottleneck_combined.docx
@@ -160,199 +160,39 @@
         <w:pStyle w:val="FirstParagraph"/>
       </w:pPr>
       <w:r>
-        <w:t xml:space="preserve">한국 정치학은 KCI와 SSCI를 중심으로 서로 구분되는 학술공간에서 생산·유통된다(Rhee 2026). 본 논문은 이러한 분절이 나타나는 한 측면을</w:t>
-      </w:r>
-      <w:r>
-        <w:t xml:space="preserve"> </w:t>
-      </w:r>
-      <w:r>
-        <w:rPr>
-          <w:bCs/>
-          <w:b/>
-        </w:rPr>
-        <w:t xml:space="preserve">학술검색에서의 가시성과 원문 접근</w:t>
-      </w:r>
-      <w:r>
-        <w:t xml:space="preserve">을 통해 분석한다.</w:t>
-      </w:r>
-    </w:p>
-    <w:p>
-      <w:pPr>
-        <w:pStyle w:val="BodyText"/>
-      </w:pPr>
-      <w:r>
-        <w:rPr>
-          <w:bCs/>
-          <w:b/>
-        </w:rPr>
-        <w:t xml:space="preserve">Study 1</w:t>
-      </w:r>
-      <w:r>
-        <w:t xml:space="preserve">은 2000–2025년 한국어권 정치학 논문들이 인용한 한국 정치 관련 논문 54,789편을 대상으로 현재 Google Scholar 검색가능성과 영어권 인용확률의 시기별 관계를 분석한다. 검색 가능한 논문과 그렇지 않은 논문의 인용확률 격차는 기준기간보다 2010–2014년에</w:t>
-      </w:r>
-      <w:r>
-        <w:t xml:space="preserve"> </w:t>
-      </w:r>
-      <w:r>
-        <w:rPr>
-          <w:bCs/>
-          <w:b/>
-        </w:rPr>
-        <w:t xml:space="preserve">0.405퍼센트포인트(pp)</w:t>
-      </w:r>
-      <w:r>
-        <w:t xml:space="preserve">, 2015–2019년에</w:t>
-      </w:r>
-      <w:r>
-        <w:t xml:space="preserve"> </w:t>
-      </w:r>
-      <w:r>
-        <w:rPr>
-          <w:bCs/>
-          <w:b/>
-        </w:rPr>
-        <w:t xml:space="preserve">0.696pp</w:t>
-      </w:r>
-      <w:r>
-        <w:t xml:space="preserve"> </w:t>
-      </w:r>
-      <w:r>
-        <w:t xml:space="preserve">유의하게 더 컸지만 2020–2024년에는 추가 확대되지 않았다. Google Scholar 링크를 통한 원문 접근은 영어권 인용확률과 유의한 관계를 보이지 않았다. 이는 현재 검색가능성과 과거 인용궤적의 연관성이며 Google Scholar의 인과효과를 뜻하지 않는다.</w:t>
-      </w:r>
-    </w:p>
-    <w:p>
-      <w:pPr>
-        <w:pStyle w:val="BodyText"/>
-      </w:pPr>
-      <w:r>
-        <w:rPr>
-          <w:bCs/>
-          <w:b/>
-        </w:rPr>
-        <w:t xml:space="preserve">Study 2</w:t>
-      </w:r>
-      <w:r>
-        <w:t xml:space="preserve">는 다섯 주제에서 사전 선정한 한국어 논문 50편과 영어 논문 50편을 이용해 두 개의 web-enabled generative search system을 감사한다. 영어 질의·일반 웹검색 baseline에서 한국어 benchmark는 검색과 최종 추천에서 모두 회수되지 않았지만 영어 benchmark recovery는 각각</w:t>
-      </w:r>
-      <w:r>
-        <w:t xml:space="preserve"> </w:t>
-      </w:r>
-      <w:r>
-        <w:rPr>
-          <w:bCs/>
-          <w:b/>
-        </w:rPr>
-        <w:t xml:space="preserve">3.4%와 3.2%</w:t>
-      </w:r>
-      <w:r>
-        <w:t xml:space="preserve">였다. 한국어 질의와 한국 학술 데이터베이스 지시를 함께 적용하면 한국어–영어 격차가 검색에서</w:t>
-      </w:r>
-      <w:r>
-        <w:t xml:space="preserve"> </w:t>
-      </w:r>
-      <w:r>
-        <w:rPr>
-          <w:bCs/>
-          <w:b/>
-        </w:rPr>
-        <w:t xml:space="preserve">5.6pp</w:t>
-      </w:r>
-      <w:r>
-        <w:t xml:space="preserve">, 추천에서</w:t>
-      </w:r>
-      <w:r>
-        <w:t xml:space="preserve"> </w:t>
-      </w:r>
-      <w:r>
-        <w:rPr>
-          <w:bCs/>
-          <w:b/>
-        </w:rPr>
-        <w:t xml:space="preserve">6.4pp</w:t>
-      </w:r>
-      <w:r>
-        <w:t xml:space="preserve"> </w:t>
-      </w:r>
-      <w:r>
-        <w:t xml:space="preserve">축소되었지만, 한국어 benchmark의 recommendation recovery는</w:t>
-      </w:r>
-      <w:r>
-        <w:t xml:space="preserve"> </w:t>
-      </w:r>
-      <w:r>
-        <w:rPr>
-          <w:bCs/>
-          <w:b/>
-        </w:rPr>
-        <w:t xml:space="preserve">3.2%</w:t>
-      </w:r>
-      <w:r>
-        <w:t xml:space="preserve">에 머물렀다. 전체 추천의</w:t>
-      </w:r>
-      <w:r>
-        <w:t xml:space="preserve"> </w:t>
-      </w:r>
-      <w:r>
-        <w:rPr>
-          <w:bCs/>
-          <w:b/>
-        </w:rPr>
-        <w:t xml:space="preserve">44.2%</w:t>
-      </w:r>
-      <w:r>
-        <w:t xml:space="preserve">만 제공된 링크를 통해 원문에 직접 접근할 수 있었으며 유의한 언어격차는 없었다.</w:t>
-      </w:r>
-    </w:p>
-    <w:p>
-      <w:pPr>
-        <w:pStyle w:val="BodyText"/>
-      </w:pPr>
-      <w:r>
-        <w:t xml:space="preserve">두 연구는 한국 정치학의 국제적 가시성을 설명할 때 출판과 인용뿐 아니라</w:t>
-      </w:r>
-      <w:r>
-        <w:t xml:space="preserve"> </w:t>
-      </w:r>
-      <w:r>
-        <w:rPr>
-          <w:bCs/>
-          <w:b/>
-        </w:rPr>
-        <w:t xml:space="preserve">문헌이 검색되고 최종 출처로 선택되는 과정</w:t>
-      </w:r>
-      <w:r>
-        <w:t xml:space="preserve">을 별도로 분석할 필요가 있음을 보여준다. 검색·추천에서 나타난 차이와 달리 원문 접근에서는 이에 상응하는 언어격차가 확인되지 않았다. 본 논문은 문헌이 내용 평가 이전에 검색 후보로 진입하지 못하거나 최종 출처로 선택되지 않는 현상을</w:t>
-      </w:r>
-      <w:r>
-        <w:t xml:space="preserve"> </w:t>
-      </w:r>
-      <w:r>
-        <w:rPr>
-          <w:bCs/>
-          <w:b/>
-        </w:rPr>
-        <w:t xml:space="preserve">discovery bottleneck</w:t>
-      </w:r>
-      <w:r>
-        <w:t xml:space="preserve">으로 제시한다.</w:t>
-      </w:r>
-    </w:p>
-    <w:p>
-      <w:pPr>
-        <w:pStyle w:val="BodyText"/>
-      </w:pPr>
-      <w:r>
-        <w:rPr>
-          <w:bCs/>
-          <w:b/>
-        </w:rPr>
-        <w:t xml:space="preserve">Keywords:</w:t>
-      </w:r>
-      <w:r>
-        <w:t xml:space="preserve"> </w:t>
-      </w:r>
-      <w:r>
-        <w:t xml:space="preserve">한국 정치학; 학술검색; Google Scholar; 생성형 검색; 비영어권 학술문헌; 국제적 가시성; 원문 접근; discovery bottleneck</w:t>
+        <w:t xml:space="preserve">한국 정치학은 KCI와 SSCI를 중심으로 서로 구분되는 학술공간에서 생산·유통된다(Rhee 2026). 본 논문은 이러한 분절이 나타나는 한 측면을 학술검색에서의 가시성과 원문 접근을 통해 분석한다.</w:t>
+      </w:r>
+    </w:p>
+    <w:p>
+      <w:pPr>
+        <w:pStyle w:val="BodyText"/>
+      </w:pPr>
+      <w:r>
+        <w:t xml:space="preserve">Study 1은 2000–2025년 한국어권 정치학 논문들이 인용한 한국 정치 관련 논문 54,789편을 대상으로 현재 Google Scholar 검색가능성과 영어권 인용확률의 시기별 관계를 분석한다. 검색 가능한 논문과 그렇지 않은 논문의 인용확률 격차는 기준기간보다 2010–2014년에 0.405퍼센트포인트(pp), 2015–2019년에 0.696pp 유의하게 더 컸지만 2020–2024년에는 추가 확대되지 않았다. Google Scholar 링크를 통한 원문 접근은 영어권 인용확률과 유의한 관계를 보이지 않았다. 이는 현재 검색가능성과 과거 인용궤적의 연관성이며 Google Scholar의 인과효과를 뜻하지 않는다.</w:t>
+      </w:r>
+    </w:p>
+    <w:p>
+      <w:pPr>
+        <w:pStyle w:val="BodyText"/>
+      </w:pPr>
+      <w:r>
+        <w:t xml:space="preserve">Study 2는 다섯 주제에서 사전 선정한 한국어 논문 50편과 영어 논문 50편을 이용해 두 개의 web-enabled generative search system을 감사한다. 영어 질의·일반 웹검색 baseline에서 한국어 benchmark는 검색과 최종 추천에서 모두 회수되지 않았지만 영어 benchmark recovery는 각각 3.4%와 3.2%였다. 한국어 질의와 한국 학술 데이터베이스 지시를 함께 적용하면 한국어–영어 격차가 검색에서 5.6pp, 추천에서 6.4pp 축소되었지만, 한국어 benchmark의 recommendation recovery는 3.2%에 머물렀다. 전체 추천의 44.2%만 제공된 링크를 통해 원문에 직접 접근할 수 있었으며 유의한 언어격차는 없었다.</w:t>
+      </w:r>
+    </w:p>
+    <w:p>
+      <w:pPr>
+        <w:pStyle w:val="BodyText"/>
+      </w:pPr>
+      <w:r>
+        <w:t xml:space="preserve">두 연구는 한국 정치학의 국제적 가시성을 설명할 때 출판과 인용뿐 아니라 문헌이 검색되고 최종 출처로 선택되는 과정을 별도로 분석할 필요가 있음을 보여준다. 검색·추천에서 나타난 차이와 달리 원문 접근에서는 이에 상응하는 언어격차가 확인되지 않았다. 본 논문은 문헌이 내용 평가 이전에 검색 후보로 진입하지 못하거나 최종 출처로 선택되지 않는 현상을 discovery bottleneck으로 제시한다.</w:t>
+      </w:r>
+    </w:p>
+    <w:p>
+      <w:pPr>
+        <w:pStyle w:val="BodyText"/>
+      </w:pPr>
+      <w:r>
+        <w:t xml:space="preserve">Keywords — 한국 정치학; 학술검색; Google Scholar; 생성형 검색; 비영어권 학술문헌; 국제적 가시성; 원문 접근; discovery bottleneck</w:t>
       </w:r>
     </w:p>
     <w:bookmarkEnd w:id="20"/>
@@ -384,182 +224,55 @@
         <w:pStyle w:val="BodyText"/>
       </w:pPr>
       <w:r>
-        <w:t xml:space="preserve">본 논문은 이러한 국제적 가시성의 차이를</w:t>
-      </w:r>
-      <w:r>
-        <w:t xml:space="preserve"> </w:t>
-      </w:r>
-      <w:r>
-        <w:rPr>
-          <w:bCs/>
-          <w:b/>
-        </w:rPr>
-        <w:t xml:space="preserve">학술문헌이 검색환경에서 실제로 가시화되는 과정</w:t>
-      </w:r>
-      <w:r>
-        <w:t xml:space="preserve">에서 분석한다. 데이터베이스에 문헌이 존재하는 것과 특정 검색환경에서 개별 논문이 반환되는 것은 동일하지 않다. 정보검색 연구에서는 데이터베이스 전체의 coverage와 개별 문헌이 검색을 통해 반환될 수 있는 retrievability를 구분한다(Azzopardi and Vinay 2008). 따라서 한국어권에서 생산·사용된 연구가 국제적 학술검색에서 어느 정도 가시적인지는 출판과 최종 인용의 차이와 별도로 분석할 수 있다.</w:t>
-      </w:r>
-    </w:p>
-    <w:p>
-      <w:pPr>
-        <w:pStyle w:val="BodyText"/>
-      </w:pPr>
-      <w:r>
-        <w:t xml:space="preserve">이 논문에서</w:t>
-      </w:r>
-      <w:r>
-        <w:t xml:space="preserve"> </w:t>
-      </w:r>
-      <w:r>
-        <w:rPr>
-          <w:bCs/>
-          <w:b/>
-        </w:rPr>
-        <w:t xml:space="preserve">가시성은 검색환경 안에서 문헌이 관찰 가능한 후보로 나타나는 정도</w:t>
-      </w:r>
-      <w:r>
-        <w:t xml:space="preserve">를 뜻하며, 두 Study에서 그 조작화는 다르다. Study 1에서는 논문의 식별정보를 알고 있는 상태에서 현재 Google Scholar가 해당 bibliographic record를 반환하는</w:t>
-      </w:r>
-      <w:r>
-        <w:t xml:space="preserve"> </w:t>
-      </w:r>
-      <w:r>
-        <w:rPr>
-          <w:bCs/>
-          <w:b/>
-        </w:rPr>
-        <w:t xml:space="preserve">paper-level known-item retrievability</w:t>
-      </w:r>
-      <w:r>
-        <w:t xml:space="preserve">를 측정한다. Study 2에서는 사전에 정한 benchmark paper가 provider가 노출하는 search trace에 나타나는지와 최종 recommendation으로 선택되는지를 각각 측정한다. 따라서 Study 1은 broad topic search에서 처음 논문을 발견할 확률을 측정하지 않으며, Study 2의 observable search trace 역시 시스템 내부의 모든 retrieval 과정을 의미하지 않는다.</w:t>
-      </w:r>
-    </w:p>
-    <w:p>
-      <w:pPr>
-        <w:pStyle w:val="BodyText"/>
-      </w:pPr>
-      <w:r>
-        <w:rPr>
-          <w:bCs/>
-          <w:b/>
-        </w:rPr>
-        <w:t xml:space="preserve">원문 접근은 이러한 검색 가시성과 별개의 결과</w:t>
-      </w:r>
-      <w:r>
-        <w:t xml:space="preserve">로 다룬다. 논문이 검색되거나 추천되더라도 이용 가능한 full text로 직접 연결되지 않을 수 있고, 반대로 publisher version이 paywall 뒤에 있어도 repository나 저자 공개본이 제시될 수 있다(Jamali and Nabavi 2015). 따라서 본 연구가 측정하는 access는 논문의 일반적인 OA status가 아니라</w:t>
-      </w:r>
-      <w:r>
-        <w:t xml:space="preserve"> </w:t>
-      </w:r>
-      <w:r>
-        <w:rPr>
-          <w:bCs/>
-          <w:b/>
-        </w:rPr>
-        <w:t xml:space="preserve">해당 검색환경이 실제로 제공한 링크가 로그인이나 결제 없이 full text로 이어지는지</w:t>
-      </w:r>
-      <w:r>
-        <w:t xml:space="preserve">이다.</w:t>
-      </w:r>
-    </w:p>
-    <w:p>
-      <w:pPr>
-        <w:pStyle w:val="BodyText"/>
-      </w:pPr>
-      <w:r>
-        <w:t xml:space="preserve">이러한 구분을 바탕으로 두 연구를 수행한다.</w:t>
-      </w:r>
-      <w:r>
-        <w:t xml:space="preserve"> </w:t>
-      </w:r>
-      <w:r>
-        <w:rPr>
-          <w:bCs/>
-          <w:b/>
-        </w:rPr>
-        <w:t xml:space="preserve">Study 1은 확립된 학술검색 환경인 Google Scholar를 분석한다.</w:t>
-      </w:r>
-      <w:r>
-        <w:t xml:space="preserve"> </w:t>
-      </w:r>
-      <w:r>
-        <w:t xml:space="preserve">2000–2025년에 생산된 한국어권 정치학 논문들이 인용한 한국 정치 관련 문헌을 출발점으로 하여, 현재 Google Scholar에서 검색 가능한 논문과 그렇지 않은 논문의 영어권 인용확률 격차가 시기에 따라 어떻게 나타나는지를 분석한다. 표본에는 한국어권에서만 인용된 문헌과 영어권에서도 인용된 문헌이 함께 포함되므로, 한국어권에서 이미 학술적으로 사용된 문헌이라는 공통 조건 아래 영어권으로의 인용 범위가 어떻게 달라지는지를 비교할 수 있다.</w:t>
-      </w:r>
-    </w:p>
-    <w:p>
-      <w:pPr>
-        <w:pStyle w:val="BodyText"/>
-      </w:pPr>
-      <w:r>
-        <w:rPr>
-          <w:bCs/>
-          <w:b/>
-        </w:rPr>
-        <w:t xml:space="preserve">Study 2는 현재의 web-enabled generative search를 분석한다.</w:t>
-      </w:r>
-      <w:r>
-        <w:t xml:space="preserve"> </w:t>
-      </w:r>
-      <w:r>
-        <w:t xml:space="preserve">생성형 검색은 외부 문헌을 검색하는 데서 그치지 않고 그중 일부를 최종 citation이나 recommendation으로 선택하여 답변을 구성한다(Liu, Zhang, and Liang 2023; He et al. 2025). 따라서 retrieval과 final source selection은 서로 다른 가시성 단계가 된다. Study 2는 한국어권과 영어권에서 모두 연구되어 온 동일한 한국 정치 주제에 대해 양 언어권의 주요 문헌을 사전에 benchmark로 정하고, 질의 언어와 한국 학술 데이터베이스 검색 지시를 변화시켜 검색과 추천에서의 한국어–영어 recovery gap이 어떻게 달라지는지를 비교한다.</w:t>
-      </w:r>
-    </w:p>
-    <w:p>
-      <w:pPr>
-        <w:pStyle w:val="BodyText"/>
-      </w:pPr>
-      <w:r>
-        <w:t xml:space="preserve">본 논문은 이처럼 문헌이</w:t>
-      </w:r>
-      <w:r>
-        <w:t xml:space="preserve"> </w:t>
-      </w:r>
-      <w:r>
-        <w:rPr>
-          <w:bCs/>
-          <w:b/>
-        </w:rPr>
-        <w:t xml:space="preserve">실질적인 내용 평가 이전에 검색 가능한 후보가 되지 못하거나 검색된 뒤 최종 출처로 선택되지 않는 현상</w:t>
-      </w:r>
-      <w:r>
-        <w:t xml:space="preserve">을</w:t>
-      </w:r>
-      <w:r>
-        <w:t xml:space="preserve"> </w:t>
-      </w:r>
-      <w:r>
-        <w:rPr>
-          <w:bCs/>
-          <w:b/>
-        </w:rPr>
-        <w:t xml:space="preserve">discovery bottleneck</w:t>
-      </w:r>
-      <w:r>
-        <w:t xml:space="preserve">이라고 부른다. 이는 모든 학술적 발견경로를 포괄하는 일반이론이나 검색 인프라가 국제적 인용격차를 인과적으로 발생시킨다는 주장이 아니다. 본 연구에서 관찰하는 특정 검색환경과 특정 검색단계에서 발생하는 누락을 지칭하기 위한 조작적 개념이다.</w:t>
-      </w:r>
-    </w:p>
-    <w:p>
-      <w:pPr>
-        <w:pStyle w:val="BodyText"/>
-      </w:pPr>
-      <w:r>
-        <w:t xml:space="preserve">따라서 본 논문의 기여는 한국 정치학의 국제적 가시성을 출판언어와 인용에만 두지 않고,</w:t>
-      </w:r>
-      <w:r>
-        <w:t xml:space="preserve"> </w:t>
-      </w:r>
-      <w:r>
-        <w:rPr>
-          <w:bCs/>
-          <w:b/>
-        </w:rPr>
-        <w:t xml:space="preserve">Google Scholar에서의 논문 검색가능성, 생성형 검색의 문헌 회수와 최종 출처 선택, 그리고 제공 링크를 통한 원문 접근을 구분하여 측정하는 데 있다.</w:t>
-      </w:r>
-      <w:r>
-        <w:t xml:space="preserve"> </w:t>
-      </w:r>
-      <w:r>
-        <w:t xml:space="preserve">Study 1은 현재 검색가능성에 따라 과거 영어권 인용궤적이 다르게 나타남을 보여주고, Study 2는 기본 검색조건의 한국어 benchmark deficit이 조건에 따라 달라지지만 언어적 representation의 증가가 높은 benchmark recovery로 이어지지는 않음을 보여준다. 원문 접근은 두 연구의 검색·추천 결과와 동일한 패턴을 보이지 않았다.</w:t>
+        <w:t xml:space="preserve">본 논문은 이러한 국제적 가시성의 차이를 학술문헌이 검색환경에서 실제로 가시화되는 과정에서 분석한다. 데이터베이스에 문헌이 존재하는 것과 특정 검색환경에서 개별 논문이 반환되는 것은 동일하지 않다. 정보검색 연구에서는 데이터베이스 전체의 coverage와 개별 문헌이 검색을 통해 반환될 수 있는 retrievability를 구분한다(Azzopardi and Vinay 2008). 따라서 한국어권에서 생산·사용된 연구가 국제적 학술검색에서 어느 정도 가시적인지는 출판과 최종 인용의 차이와 별도로 분석할 수 있다.</w:t>
+      </w:r>
+    </w:p>
+    <w:p>
+      <w:pPr>
+        <w:pStyle w:val="BodyText"/>
+      </w:pPr>
+      <w:r>
+        <w:t xml:space="preserve">이 논문에서 가시성은 검색환경 안에서 문헌이 관찰 가능한 후보로 나타나는 정도를 뜻하며, 두 Study에서 그 조작화는 다르다. Study 1에서는 논문의 식별정보를 알고 있는 상태에서 현재 Google Scholar가 해당 bibliographic record를 반환하는 paper-level known-item retrievability를 측정한다. Study 2에서는 사전에 정한 benchmark paper가 provider가 노출하는 search trace에 나타나는지와 최종 recommendation으로 선택되는지를 각각 측정한다. 따라서 Study 1은 broad topic search에서 처음 논문을 발견할 확률을 측정하지 않으며, Study 2의 observable search trace 역시 시스템 내부의 모든 retrieval 과정을 의미하지 않는다.</w:t>
+      </w:r>
+    </w:p>
+    <w:p>
+      <w:pPr>
+        <w:pStyle w:val="BodyText"/>
+      </w:pPr>
+      <w:r>
+        <w:t xml:space="preserve">원문 접근은 이러한 검색 가시성과 별개의 결과로 다룬다. 논문이 검색되거나 추천되더라도 이용 가능한 full text로 직접 연결되지 않을 수 있고, 반대로 publisher version이 paywall 뒤에 있어도 repository나 저자 공개본이 제시될 수 있다(Jamali and Nabavi 2015). 따라서 본 연구가 측정하는 access는 논문의 일반적인 OA status가 아니라 해당 검색환경이 실제로 제공한 링크가 로그인이나 결제 없이 full text로 이어지는지이다.</w:t>
+      </w:r>
+    </w:p>
+    <w:p>
+      <w:pPr>
+        <w:pStyle w:val="BodyText"/>
+      </w:pPr>
+      <w:r>
+        <w:t xml:space="preserve">이러한 구분을 바탕으로 두 연구를 수행한다. Study 1은 확립된 학술검색 환경인 Google Scholar를 분석한다. 2000–2025년에 생산된 한국어권 정치학 논문들이 인용한 한국 정치 관련 문헌을 출발점으로 하여, 현재 Google Scholar에서 검색 가능한 논문과 그렇지 않은 논문의 영어권 인용확률 격차가 시기에 따라 어떻게 나타나는지를 분석한다. 표본에는 한국어권에서만 인용된 문헌과 영어권에서도 인용된 문헌이 함께 포함되므로, 한국어권에서 이미 학술적으로 사용된 문헌이라는 공통 조건 아래 영어권으로의 인용 범위가 어떻게 달라지는지를 비교할 수 있다.</w:t>
+      </w:r>
+    </w:p>
+    <w:p>
+      <w:pPr>
+        <w:pStyle w:val="BodyText"/>
+      </w:pPr>
+      <w:r>
+        <w:t xml:space="preserve">Study 2는 현재의 web-enabled generative search를 분석한다. 생성형 검색은 외부 문헌을 검색하는 데서 그치지 않고 그중 일부를 최종 citation이나 recommendation으로 선택하여 답변을 구성한다(Liu, Zhang, and Liang 2023; He et al. 2025). 따라서 retrieval과 final source selection은 서로 다른 가시성 단계가 된다. Study 2는 한국어권과 영어권에서 모두 연구되어 온 동일한 한국 정치 주제에 대해 양 언어권의 주요 문헌을 사전에 benchmark로 정하고, 질의 언어와 한국 학술 데이터베이스 검색 지시를 변화시켜 검색과 추천에서의 한국어–영어 recovery gap이 어떻게 달라지는지를 비교한다.</w:t>
+      </w:r>
+    </w:p>
+    <w:p>
+      <w:pPr>
+        <w:pStyle w:val="BodyText"/>
+      </w:pPr>
+      <w:r>
+        <w:t xml:space="preserve">본 논문은 이처럼 문헌이 실질적인 내용 평가 이전에 검색 가능한 후보가 되지 못하거나 검색된 뒤 최종 출처로 선택되지 않는 현상을 discovery bottleneck이라고 부른다. 이는 모든 학술적 발견경로를 포괄하는 일반이론이나 검색 인프라가 국제적 인용격차를 인과적으로 발생시킨다는 주장이 아니다. 본 연구에서 관찰하는 특정 검색환경과 특정 검색단계에서 발생하는 누락을 지칭하기 위한 조작적 개념이다.</w:t>
+      </w:r>
+    </w:p>
+    <w:p>
+      <w:pPr>
+        <w:pStyle w:val="BodyText"/>
+      </w:pPr>
+      <w:r>
+        <w:t xml:space="preserve">따라서 본 논문의 기여는 한국 정치학의 국제적 가시성을 출판언어와 인용에만 두지 않고, Google Scholar에서의 논문 검색가능성, 생성형 검색의 문헌 회수와 최종 출처 선택, 그리고 제공 링크를 통한 원문 접근을 구분하여 측정하는 데 있다. Study 1은 현재 검색가능성에 따라 과거 영어권 인용궤적이 다르게 나타남을 보여주고, Study 2는 기본 검색조건의 한국어 benchmark deficit이 조건에 따라 달라지지만 언어적 representation의 증가가 높은 benchmark recovery로 이어지지는 않음을 보여준다. 원문 접근은 두 연구의 검색·추천 결과와 동일한 패턴을 보이지 않았다.</w:t>
       </w:r>
     </w:p>
     <w:bookmarkEnd w:id="22"/>
@@ -594,23 +307,7 @@
         <w:pStyle w:val="BodyText"/>
       </w:pPr>
       <w:r>
-        <w:t xml:space="preserve">다른 한편으로는</w:t>
-      </w:r>
-      <w:r>
-        <w:t xml:space="preserve"> </w:t>
-      </w:r>
-      <w:r>
-        <w:rPr>
-          <w:bCs/>
-          <w:b/>
-        </w:rPr>
-        <w:t xml:space="preserve">동일한 국가나 정치현상을 다루더라도 연구가 어느 언어권과 학술공간에서 생산·유통되는가에 따라 국제적 가시성과 인용 범위가 달라질 수 있다.</w:t>
-      </w:r>
-      <w:r>
-        <w:t xml:space="preserve"> </w:t>
-      </w:r>
-      <w:r>
-        <w:t xml:space="preserve">주요 국제 학술 데이터베이스는 영어권 학술지를 상대적으로 많이 포괄하며(Mongeon and Paul-Hus 2016; Vera-Baceta, Thelwall, and Kousha 2019), 다언어 학술지에서는 다른 출판특성을 고려한 뒤에도 비영어 논문의 인용이 영어 논문보다 낮게 나타난다(Di Bitetti and Ferreras 2017). 따라서 정치학의 국제적 지식구조에는 어떤 지역이 연구되는가뿐 아니라 그 연구가 어느 언어권의 학술공간을 통해 유통되는가라는 차원도 존재한다.</w:t>
+        <w:t xml:space="preserve">다른 한편으로는 동일한 국가나 정치현상을 다루더라도 연구가 어느 언어권과 학술공간에서 생산·유통되는가에 따라 국제적 가시성과 인용 범위가 달라질 수 있다. 주요 국제 학술 데이터베이스는 영어권 학술지를 상대적으로 많이 포괄하며(Mongeon and Paul-Hus 2016; Vera-Baceta, Thelwall, and Kousha 2019), 다언어 학술지에서는 다른 출판특성을 고려한 뒤에도 비영어 논문의 인용이 영어 논문보다 낮게 나타난다(Di Bitetti and Ferreras 2017). 따라서 정치학의 국제적 지식구조에는 어떤 지역이 연구되는가뿐 아니라 그 연구가 어느 언어권의 학술공간을 통해 유통되는가라는 차원도 존재한다.</w:t>
       </w:r>
     </w:p>
     <w:p>
@@ -626,20 +323,7 @@
         <w:pStyle w:val="BodyText"/>
       </w:pPr>
       <w:r>
-        <w:t xml:space="preserve">본 연구는 이러한 차이를</w:t>
-      </w:r>
-      <w:r>
-        <w:t xml:space="preserve"> </w:t>
-      </w:r>
-      <w:r>
-        <w:rPr>
-          <w:bCs/>
-          <w:b/>
-        </w:rPr>
-        <w:t xml:space="preserve">학술검색에서 어떤 문헌이 가시화되는가</w:t>
-      </w:r>
-      <w:r>
-        <w:t xml:space="preserve">라는 차원에서 확장한다. 데이터베이스가 어떤 문헌을 수록하는지는 coverage의 문제인 반면, 개별 문헌이 특정 검색에서 반환되는지는 retrievability의 문제이다(Azzopardi and Vinay 2008). 따라서 학술적 기록에 존재하는 문헌 전체와 특정 검색환경이 실제로 반환하는 문헌은 구분할 필요가 있다.</w:t>
+        <w:t xml:space="preserve">본 연구는 이러한 차이를 학술검색에서 어떤 문헌이 가시화되는가라는 차원에서 확장한다. 데이터베이스가 어떤 문헌을 수록하는지는 coverage의 문제인 반면, 개별 문헌이 특정 검색에서 반환되는지는 retrievability의 문제이다(Azzopardi and Vinay 2008). 따라서 학술적 기록에 존재하는 문헌 전체와 특정 검색환경이 실제로 반환하는 문헌은 구분할 필요가 있다.</w:t>
       </w:r>
     </w:p>
     <w:p>
@@ -689,96 +373,31 @@
         <w:pStyle w:val="BodyText"/>
       </w:pPr>
       <w:r>
-        <w:t xml:space="preserve">Study 1은 이 구분을</w:t>
-      </w:r>
-      <w:r>
-        <w:t xml:space="preserve"> </w:t>
-      </w:r>
-      <w:r>
-        <w:rPr>
-          <w:bCs/>
-          <w:b/>
-        </w:rPr>
-        <w:t xml:space="preserve">한국어권 정치학에서 이미 사용된 한국 정치 관련 문헌</w:t>
-      </w:r>
-      <w:r>
-        <w:t xml:space="preserve">에 적용한다. 분석대상에는 한국어권에서만 인용된 논문과 영어권에서도 인용된 논문이 함께 포함되므로, 한국어권에서의 학술적 사용이라는 공통 출발점을 가진 문헌 안에서 현재 Google Scholar retrievability와 영어권 인용이 어떤 관계를 보이는지를 비교할 수 있다. 검색 인프라에서의 가시성이 국제적 학술 유통과 관련된다면, 현재 retrievable한 논문과 그렇지 않은 논문의 영어권 인용확률에서도 차이가 나타날 수 있다. 그러나 이는 현재의 Google Scholar 상태가 과거 인용을 발생시켰다는 인과가정이 아니라</w:t>
-      </w:r>
-      <w:r>
-        <w:t xml:space="preserve"> </w:t>
-      </w:r>
-      <w:r>
-        <w:rPr>
-          <w:bCs/>
-          <w:b/>
-        </w:rPr>
-        <w:t xml:space="preserve">현재 검색가능성에 따라 역사적 영어권 인용패턴이 어떻게 구분되는지를 보는 분석적 기대</w:t>
-      </w:r>
-      <w:r>
-        <w:t xml:space="preserve">이다.</w:t>
-      </w:r>
-    </w:p>
-    <w:p>
-      <w:pPr>
-        <w:pStyle w:val="BodyText"/>
-      </w:pPr>
-      <w:r>
-        <w:t xml:space="preserve">Google Scholar가 제공하는 full-text route도 별도의 조건이다. Publisher version이 paywall 뒤에 있더라도 repository copy나 author-deposited manuscript가 연결될 수 있고, 반대로 무료 version이 웹에 존재하더라도 Google Scholar가 이를 제시하지 않을 수 있다(Jamali and Nabavi 2015). 기존 연구는 Google Scholar의 database 및 citation coverage와 Google Scholar를 통해 이용할 수 있는 full text의 범위를 주로 분석해 왔다(Chen 2010; Jamali and Nabavi 2015; Martín-Martín et al. 2018a, 2018b, 2021; Delgado-Quirós et al. 2024). 본 연구에서는 이러한 접근경로를 일반적 OA와 구분하여</w:t>
-      </w:r>
-      <w:r>
-        <w:t xml:space="preserve"> </w:t>
-      </w:r>
-      <w:r>
-        <w:rPr>
-          <w:bCs/>
-          <w:b/>
-        </w:rPr>
-        <w:t xml:space="preserve">Google Scholar-mediated full-text access</w:t>
-      </w:r>
-      <w:r>
-        <w:t xml:space="preserve">로 측정한다.</w:t>
-      </w:r>
-    </w:p>
-    <w:p>
-      <w:pPr>
-        <w:pStyle w:val="BodyText"/>
-      </w:pPr>
-      <w:r>
-        <w:t xml:space="preserve">영어권 인용을 시기별 cohort로 나누는 이유는 누적 인용만으로는 현재 retrievable한 논문과 그렇지 않은 논문의 격차가</w:t>
-      </w:r>
-      <w:r>
-        <w:t xml:space="preserve"> </w:t>
-      </w:r>
-      <w:r>
-        <w:rPr>
-          <w:bCs/>
-          <w:b/>
-        </w:rPr>
-        <w:t xml:space="preserve">어느 기간에 확대되거나 축소되었는지</w:t>
-      </w:r>
-      <w:r>
-        <w:t xml:space="preserve">를 알 수 없기 때문이다. 반면 연도별 citation incidence는 희소하여 지나치게 세분하면 추정이 불안정해질 수 있다. 이에 2010년 이후를 동일한 5년 단위로 나누고 그 이전을 기준기간으로 통합하여 visible–nonvisible gap의 시간적 이질성을 비교한다.</w:t>
-      </w:r>
-    </w:p>
-    <w:p>
-      <w:pPr>
-        <w:pStyle w:val="BodyText"/>
-      </w:pPr>
-      <w:r>
-        <w:t xml:space="preserve">이 cohort는 Google Scholar의 역사적 indexing 상태나 adoption stage를 대리하지 않는다. 각 target paper가 어느 시점부터 Google Scholar에서 검색 가능했는지는 관찰되지 않기 때문이다. 따라서 cohort의 역할은</w:t>
-      </w:r>
-      <w:r>
-        <w:t xml:space="preserve"> </w:t>
-      </w:r>
-      <w:r>
-        <w:rPr>
-          <w:bCs/>
-          <w:b/>
-        </w:rPr>
-        <w:t xml:space="preserve">현재의 retrievability로 구분되는 두 집단 사이의 영어권 인용격차가 서로 다른 citation period에서 어떻게 나타났는지를 비교하는 것</w:t>
-      </w:r>
-      <w:r>
-        <w:t xml:space="preserve">에 한정된다.</w:t>
+        <w:t xml:space="preserve">Study 1은 이 구분을 한국어권 정치학에서 이미 사용된 한국 정치 관련 문헌에 적용한다. 분석대상에는 한국어권에서만 인용된 논문과 영어권에서도 인용된 논문이 함께 포함되므로, 한국어권에서의 학술적 사용이라는 공통 출발점을 가진 문헌 안에서 현재 Google Scholar retrievability와 영어권 인용이 어떤 관계를 보이는지를 비교할 수 있다. 검색 인프라에서의 가시성이 국제적 학술 유통과 관련된다면, 현재 retrievable한 논문과 그렇지 않은 논문의 영어권 인용확률에서도 차이가 나타날 수 있다. 그러나 이는 현재의 Google Scholar 상태가 과거 인용을 발생시켰다는 인과가정이 아니라 현재 검색가능성에 따라 역사적 영어권 인용패턴이 어떻게 구분되는지를 보는 분석적 기대이다.</w:t>
+      </w:r>
+    </w:p>
+    <w:p>
+      <w:pPr>
+        <w:pStyle w:val="BodyText"/>
+      </w:pPr>
+      <w:r>
+        <w:t xml:space="preserve">Google Scholar가 제공하는 full-text route도 별도의 조건이다. Publisher version이 paywall 뒤에 있더라도 repository copy나 author-deposited manuscript가 연결될 수 있고, 반대로 무료 version이 웹에 존재하더라도 Google Scholar가 이를 제시하지 않을 수 있다(Jamali and Nabavi 2015). 기존 연구는 Google Scholar의 database 및 citation coverage와 Google Scholar를 통해 이용할 수 있는 full text의 범위를 주로 분석해 왔다(Chen 2010; Jamali and Nabavi 2015; Martín-Martín et al. 2018a, 2018b, 2021; Delgado-Quirós et al. 2024). 본 연구에서는 이러한 접근경로를 일반적 OA와 구분하여 Google Scholar-mediated full-text access로 측정한다.</w:t>
+      </w:r>
+    </w:p>
+    <w:p>
+      <w:pPr>
+        <w:pStyle w:val="BodyText"/>
+      </w:pPr>
+      <w:r>
+        <w:t xml:space="preserve">영어권 인용을 시기별 cohort로 나누는 이유는 누적 인용만으로는 현재 retrievable한 논문과 그렇지 않은 논문의 격차가 어느 기간에 확대되거나 축소되었는지를 알 수 없기 때문이다. 반면 연도별 citation incidence는 희소하여 지나치게 세분하면 추정이 불안정해질 수 있다. 이에 2010년 이후를 동일한 5년 단위로 나누고 그 이전을 기준기간으로 통합하여 visible–nonvisible gap의 시간적 이질성을 비교한다.</w:t>
+      </w:r>
+    </w:p>
+    <w:p>
+      <w:pPr>
+        <w:pStyle w:val="BodyText"/>
+      </w:pPr>
+      <w:r>
+        <w:t xml:space="preserve">이 cohort는 Google Scholar의 역사적 indexing 상태나 adoption stage를 대리하지 않는다. 각 target paper가 어느 시점부터 Google Scholar에서 검색 가능했는지는 관찰되지 않기 때문이다. 따라서 cohort의 역할은 현재의 retrievability로 구분되는 두 집단 사이의 영어권 인용격차가 서로 다른 citation period에서 어떻게 나타났는지를 비교하는 것에 한정된다.</w:t>
       </w:r>
     </w:p>
     <w:p>
@@ -804,133 +423,39 @@
         <w:pStyle w:val="FirstParagraph"/>
       </w:pPr>
       <w:r>
-        <w:t xml:space="preserve">Generative search는 retrieval 이후의 source selection까지 검색환경이 수행한다는 점에서 기존 학술검색과 구분된다. Web-enabled LLM은 외부 자료를 검색한 뒤 검색된 문헌 전체를 그대로 제시하지 않고 그중 일부를 citation이나 recommendation으로 선택하여 답변을 구성한다(Liu, Zhang, and Liang 2023). 따라서 생성형 검색에서의 문헌 가시성은</w:t>
-      </w:r>
-      <w:r>
-        <w:t xml:space="preserve"> </w:t>
-      </w:r>
-      <w:r>
-        <w:rPr>
-          <w:bCs/>
-          <w:b/>
-        </w:rPr>
-        <w:t xml:space="preserve">검색단계에 나타나는 것과 최종 출처로 선택되는 것</w:t>
-      </w:r>
-      <w:r>
-        <w:t xml:space="preserve">을 구분하여 분석할 필요가 있다.</w:t>
-      </w:r>
-    </w:p>
-    <w:p>
-      <w:pPr>
-        <w:pStyle w:val="BodyText"/>
-      </w:pPr>
-      <w:r>
-        <w:t xml:space="preserve">Scholarly retrieval을 평가하려면 생성된 결과 자체와 독립적인 비교기준이 필요하다. 정보검색에서는 사전에 정의된 relevant set을 이용하여 retrieval 성능을 평가하며(Manning, Raghavan, and Schütze 2008), 최근의 scholarly-search benchmark도 실행 이전에 target paper를 정한 뒤 해당 문헌의 회수를 측정한다(Ajith et al. 2024; He et al. 2025). 이 구분은 multilingual search에서 특히 중요하다. 한국어 논문이 결과에 많이 포함되는 것과 한국어권에서 사전에 주요 문헌으로 선정된 특정 논문이 실제로 회수되는 것은 동일하지 않다. Study 2는 전자를</w:t>
-      </w:r>
-      <w:r>
-        <w:t xml:space="preserve"> </w:t>
-      </w:r>
-      <w:r>
-        <w:rPr>
-          <w:bCs/>
-          <w:b/>
-        </w:rPr>
-        <w:t xml:space="preserve">language representation</w:t>
-      </w:r>
-      <w:r>
-        <w:t xml:space="preserve">, 후자를</w:t>
-      </w:r>
-      <w:r>
-        <w:t xml:space="preserve"> </w:t>
-      </w:r>
-      <w:r>
-        <w:rPr>
-          <w:bCs/>
-          <w:b/>
-        </w:rPr>
-        <w:t xml:space="preserve">benchmark recovery</w:t>
-      </w:r>
-      <w:r>
-        <w:t xml:space="preserve">로 구분한다.</w:t>
-      </w:r>
-    </w:p>
-    <w:p>
-      <w:pPr>
-        <w:pStyle w:val="BodyText"/>
-      </w:pPr>
-      <w:r>
-        <w:t xml:space="preserve">질의 언어와 출처 지시는 생성형 검색에서 어떤 학술공간의 문헌이 후보로 들어오는지와 관련된 조건이다. Query와 source instruction은 retrieval과 source selection의 입력이 되며, 탐색되는 출처의 범위와 최종적으로 선택되는 자료를 변화시킬 수 있다(Liu, Zhang, and Liang 2023; He et al. 2025). 한국 정치학처럼 한국어권과 영어권이 서로 다른 학술정보원을 통해 문헌을 유통하는 경우에는 영어 general-web query와 한국어 질의 또는 한국 학술 데이터베이스를 명시한 검색이 서로 다른 scholarly source space를 불러올 수 있다. 따라서 한국어 문헌의 상대적 가시성은 고정된 값이 아니라</w:t>
-      </w:r>
-      <w:r>
-        <w:t xml:space="preserve"> </w:t>
-      </w:r>
-      <w:r>
-        <w:rPr>
-          <w:bCs/>
-          <w:b/>
-        </w:rPr>
-        <w:t xml:space="preserve">검색조건에 따라 달라질 수 있는 결과</w:t>
-      </w:r>
-      <w:r>
-        <w:t xml:space="preserve">로 분석할 필요가 있다.</w:t>
-      </w:r>
-    </w:p>
-    <w:p>
-      <w:pPr>
-        <w:pStyle w:val="BodyText"/>
-      </w:pPr>
-      <w:r>
-        <w:t xml:space="preserve">Study 2의 주제는 이 언어권 비교가 가능한 영역으로 제한한다. 한국어권과 영어권 한국 정치학의 연구지형을 비교한 Kim et al. (2025)을 바탕으로,</w:t>
-      </w:r>
-      <w:r>
-        <w:t xml:space="preserve"> </w:t>
-      </w:r>
-      <w:r>
-        <w:rPr>
-          <w:bCs/>
-          <w:b/>
-        </w:rPr>
-        <w:t xml:space="preserve">두 학술공간에서 모두 지속적으로 연구되어 온 한국 정치 주제</w:t>
-      </w:r>
-      <w:r>
-        <w:t xml:space="preserve"> </w:t>
-      </w:r>
-      <w:r>
-        <w:t xml:space="preserve">가운데 한국 현대정치의 전개를 대체로 시간적 순서로 포괄하도록 한국전쟁, 한국 경제발전, 한국 민주화, 북한 핵문제, 한류의 다섯 주제를 선정하였다. 이는 특정 주제 자체가 한 언어권에 거의 존재하지 않기 때문에 발생하는 차이를 줄이고,</w:t>
-      </w:r>
-      <w:r>
-        <w:t xml:space="preserve"> </w:t>
-      </w:r>
-      <w:r>
-        <w:rPr>
-          <w:bCs/>
-          <w:b/>
-        </w:rPr>
-        <w:t xml:space="preserve">동일한 substantive topic 안에서 양 언어권의 주요 문헌이 어떻게 검색·선택되는지</w:t>
-      </w:r>
-      <w:r>
-        <w:t xml:space="preserve">를 비교하기 위한 것이다.</w:t>
-      </w:r>
-    </w:p>
-    <w:p>
-      <w:pPr>
-        <w:pStyle w:val="BodyText"/>
-      </w:pPr>
-      <w:r>
-        <w:t xml:space="preserve">생성형 검색에서 추천 이후의 원문 접근도 별개의 결과이다. 실제 논문이 정확하게 추천되더라도 제공된 URL이 paywall, abstract page 또는 broken link로 연결될 수 있다. 따라서 Study 2는</w:t>
-      </w:r>
-      <w:r>
-        <w:t xml:space="preserve"> </w:t>
-      </w:r>
-      <w:r>
-        <w:rPr>
-          <w:bCs/>
-          <w:b/>
-        </w:rPr>
-        <w:t xml:space="preserve">검색 결과에서의 benchmark recovery, final recommendation recovery, 제공 링크를 통한 full-text access</w:t>
-      </w:r>
-      <w:r>
-        <w:t xml:space="preserve">를 분리하여 측정한다. 이 구분을 통해 한국어–영어 격차가 검색에서 발생하는지, 최종 source selection에서 나타나는지, 또는 원문 접근에서도 이어지는지를 살펴본다.</w:t>
+        <w:t xml:space="preserve">Generative search는 retrieval 이후의 source selection까지 검색환경이 수행한다는 점에서 기존 학술검색과 구분된다. Web-enabled LLM은 외부 자료를 검색한 뒤 검색된 문헌 전체를 그대로 제시하지 않고 그중 일부를 citation이나 recommendation으로 선택하여 답변을 구성한다(Liu, Zhang, and Liang 2023). 따라서 생성형 검색에서의 문헌 가시성은 검색단계에 나타나는 것과 최종 출처로 선택되는 것을 구분하여 분석할 필요가 있다.</w:t>
+      </w:r>
+    </w:p>
+    <w:p>
+      <w:pPr>
+        <w:pStyle w:val="BodyText"/>
+      </w:pPr>
+      <w:r>
+        <w:t xml:space="preserve">Scholarly retrieval을 평가하려면 생성된 결과 자체와 독립적인 비교기준이 필요하다. 정보검색에서는 사전에 정의된 relevant set을 이용하여 retrieval 성능을 평가하며(Manning, Raghavan, and Schütze 2008), 최근의 scholarly-search benchmark도 실행 이전에 target paper를 정한 뒤 해당 문헌의 회수를 측정한다(Ajith et al. 2024; He et al. 2025). 이 구분은 multilingual search에서 특히 중요하다. 한국어 논문이 결과에 많이 포함되는 것과 한국어권에서 사전에 주요 문헌으로 선정된 특정 논문이 실제로 회수되는 것은 동일하지 않다. Study 2는 전자를 language representation, 후자를 benchmark recovery로 구분한다.</w:t>
+      </w:r>
+    </w:p>
+    <w:p>
+      <w:pPr>
+        <w:pStyle w:val="BodyText"/>
+      </w:pPr>
+      <w:r>
+        <w:t xml:space="preserve">질의 언어와 출처 지시는 생성형 검색에서 어떤 학술공간의 문헌이 후보로 들어오는지와 관련된 조건이다. Query와 source instruction은 retrieval과 source selection의 입력이 되며, 탐색되는 출처의 범위와 최종적으로 선택되는 자료를 변화시킬 수 있다(Liu, Zhang, and Liang 2023; He et al. 2025). 한국 정치학처럼 한국어권과 영어권이 서로 다른 학술정보원을 통해 문헌을 유통하는 경우에는 영어 general-web query와 한국어 질의 또는 한국 학술 데이터베이스를 명시한 검색이 서로 다른 scholarly source space를 불러올 수 있다. 따라서 한국어 문헌의 상대적 가시성은 고정된 값이 아니라 검색조건에 따라 달라질 수 있는 결과로 분석할 필요가 있다.</w:t>
+      </w:r>
+    </w:p>
+    <w:p>
+      <w:pPr>
+        <w:pStyle w:val="BodyText"/>
+      </w:pPr>
+      <w:r>
+        <w:t xml:space="preserve">Study 2의 주제는 이 언어권 비교가 가능한 영역으로 제한한다. 한국어권과 영어권 한국 정치학의 연구지형을 비교한 Kim et al. (2025)을 바탕으로, 두 학술공간에서 모두 지속적으로 연구되어 온 한국 정치 주제 가운데 한국 현대정치의 전개를 대체로 시간적 순서로 포괄하도록 한국전쟁, 한국 경제발전, 한국 민주화, 북한 핵문제, 한류의 다섯 주제를 선정하였다. 이는 특정 주제 자체가 한 언어권에 거의 존재하지 않기 때문에 발생하는 차이를 줄이고, 동일한 substantive topic 안에서 양 언어권의 주요 문헌이 어떻게 검색·선택되는지를 비교하기 위한 것이다.</w:t>
+      </w:r>
+    </w:p>
+    <w:p>
+      <w:pPr>
+        <w:pStyle w:val="BodyText"/>
+      </w:pPr>
+      <w:r>
+        <w:t xml:space="preserve">생성형 검색에서 추천 이후의 원문 접근도 별개의 결과이다. 실제 논문이 정확하게 추천되더라도 제공된 URL이 paywall, abstract page 또는 broken link로 연결될 수 있다. 따라서 Study 2는 검색 결과에서의 benchmark recovery, final recommendation recovery, 제공 링크를 통한 full-text access를 분리하여 측정한다. 이 구분을 통해 한국어–영어 격차가 검색에서 발생하는지, 최종 source selection에서 나타나는지, 또는 원문 접근에서도 이어지는지를 살펴본다.</w:t>
       </w:r>
     </w:p>
     <w:bookmarkEnd w:id="25"/>
@@ -958,62 +483,23 @@
         <w:pStyle w:val="FirstParagraph"/>
       </w:pPr>
       <w:r>
-        <w:t xml:space="preserve">Study 1의 핵심 비교는</w:t>
-      </w:r>
-      <w:r>
-        <w:t xml:space="preserve"> </w:t>
-      </w:r>
-      <w:r>
-        <w:rPr>
-          <w:bCs/>
-          <w:b/>
-        </w:rPr>
-        <w:t xml:space="preserve">한국어권 정치학에서 이미 사용된 한국 정치 관련 문헌 가운데 현재 Google Scholar에서 검색 가능한 논문과 그렇지 않은 논문의 영어권 인용확률이 시기에 따라 어떻게 다른가</w:t>
-      </w:r>
-      <w:r>
-        <w:t xml:space="preserve">이다.</w:t>
-      </w:r>
-    </w:p>
-    <w:p>
-      <w:pPr>
-        <w:pStyle w:val="BodyText"/>
-      </w:pPr>
-      <w:r>
-        <w:t xml:space="preserve">분석대상은</w:t>
-      </w:r>
-      <w:r>
-        <w:t xml:space="preserve"> </w:t>
-      </w:r>
-      <w:r>
-        <w:rPr>
-          <w:bCs/>
-          <w:b/>
-        </w:rPr>
-        <w:t xml:space="preserve">2000–2025년에 생산된 한국어권 정치학 논문들이 인용한 한국 정치 관련 논문 54,789편</w:t>
-      </w:r>
-      <w:r>
-        <w:t xml:space="preserve">이다. 표본 포함 기준은 해당 기간의 한국어권 정치학 문헌에서 최소 한 번 인용되었다는 것이므로, 한국어권에서만 인용된 논문과 한국어권 및 영어권 양쪽에서 인용된 논문이 함께 포함된다. 따라서 분석은 국내 학술적 사용 여부가 전혀 다른 문헌을 비교하는 것이 아니라, 한국어권에서 사용된 기록을 공유하는 문헌 안에서 영어권 인용 여부와 검색가능성의 관계를 살펴본다.</w:t>
-      </w:r>
-    </w:p>
-    <w:p>
-      <w:pPr>
-        <w:pStyle w:val="BodyText"/>
-      </w:pPr>
-      <w:r>
-        <w:t xml:space="preserve">영어권 인용은 누적 citation count로 합치지 않고</w:t>
-      </w:r>
-      <w:r>
-        <w:t xml:space="preserve"> </w:t>
-      </w:r>
-      <w:r>
-        <w:rPr>
-          <w:bCs/>
-          <w:b/>
-        </w:rPr>
-        <w:t xml:space="preserve">citation cohort별 incidence</w:t>
-      </w:r>
-      <w:r>
-        <w:t xml:space="preserve">로 구성한다. 누적 인용만 사용하면 visible–nonvisible gap의 시간적 변화를 확인할 수 없고, 연도별 outcome은 citation event가 희소하여 추정이 불안정할 수 있다. 이에 영어권 citing paper를 다음 네 기간으로 구분한다.</w:t>
+        <w:t xml:space="preserve">Study 1의 핵심 비교는 한국어권 정치학에서 이미 사용된 한국 정치 관련 문헌 가운데 현재 Google Scholar에서 검색 가능한 논문과 그렇지 않은 논문의 영어권 인용확률이 시기에 따라 어떻게 다른가이다.</w:t>
+      </w:r>
+    </w:p>
+    <w:p>
+      <w:pPr>
+        <w:pStyle w:val="BodyText"/>
+      </w:pPr>
+      <w:r>
+        <w:t xml:space="preserve">분석대상은 2000–2025년에 생산된 한국어권 정치학 논문들이 인용한 한국 정치 관련 논문 54,789편이다. 표본 포함 기준은 해당 기간의 한국어권 정치학 문헌에서 최소 한 번 인용되었다는 것이므로, 한국어권에서만 인용된 논문과 한국어권 및 영어권 양쪽에서 인용된 논문이 함께 포함된다. 따라서 분석은 국내 학술적 사용 여부가 전혀 다른 문헌을 비교하는 것이 아니라, 한국어권에서 사용된 기록을 공유하는 문헌 안에서 영어권 인용 여부와 검색가능성의 관계를 살펴본다.</w:t>
+      </w:r>
+    </w:p>
+    <w:p>
+      <w:pPr>
+        <w:pStyle w:val="BodyText"/>
+      </w:pPr>
+      <w:r>
+        <w:t xml:space="preserve">영어권 인용은 누적 citation count로 합치지 않고 citation cohort별 incidence로 구성한다. 누적 인용만 사용하면 visible–nonvisible gap의 시간적 변화를 확인할 수 없고, 연도별 outcome은 citation event가 희소하여 추정이 불안정할 수 있다. 이에 영어권 citing paper를 다음 네 기간으로 구분한다.</w:t>
       </w:r>
     </w:p>
     <w:p>
@@ -1025,17 +511,7 @@
         <w:pStyle w:val="Compact"/>
       </w:pPr>
       <w:r>
-        <w:rPr>
-          <w:bCs/>
-          <w:b/>
-        </w:rPr>
-        <w:t xml:space="preserve">C1:</w:t>
-      </w:r>
-      <w:r>
-        <w:t xml:space="preserve"> </w:t>
-      </w:r>
-      <w:r>
-        <w:t xml:space="preserve">2009년 이하</w:t>
+        <w:t xml:space="preserve">C1 — 2009년 이하</w:t>
       </w:r>
     </w:p>
     <w:p>
@@ -1047,17 +523,7 @@
         <w:pStyle w:val="Compact"/>
       </w:pPr>
       <w:r>
-        <w:rPr>
-          <w:bCs/>
-          <w:b/>
-        </w:rPr>
-        <w:t xml:space="preserve">C2:</w:t>
-      </w:r>
-      <w:r>
-        <w:t xml:space="preserve"> </w:t>
-      </w:r>
-      <w:r>
-        <w:t xml:space="preserve">2010–2014</w:t>
+        <w:t xml:space="preserve">C2 — 2010–2014</w:t>
       </w:r>
     </w:p>
     <w:p>
@@ -1069,17 +535,7 @@
         <w:pStyle w:val="Compact"/>
       </w:pPr>
       <w:r>
-        <w:rPr>
-          <w:bCs/>
-          <w:b/>
-        </w:rPr>
-        <w:t xml:space="preserve">C3:</w:t>
-      </w:r>
-      <w:r>
-        <w:t xml:space="preserve"> </w:t>
-      </w:r>
-      <w:r>
-        <w:t xml:space="preserve">2015–2019</w:t>
+        <w:t xml:space="preserve">C3 — 2015–2019</w:t>
       </w:r>
     </w:p>
     <w:p>
@@ -1091,17 +547,7 @@
         <w:pStyle w:val="Compact"/>
       </w:pPr>
       <w:r>
-        <w:rPr>
-          <w:bCs/>
-          <w:b/>
-        </w:rPr>
-        <w:t xml:space="preserve">C4:</w:t>
-      </w:r>
-      <w:r>
-        <w:t xml:space="preserve"> </w:t>
-      </w:r>
-      <w:r>
-        <w:t xml:space="preserve">2020–2024</w:t>
+        <w:t xml:space="preserve">C4 — 2020–2024</w:t>
       </w:r>
     </w:p>
     <w:p>
@@ -1161,109 +607,31 @@
         <w:pStyle w:val="FirstParagraph"/>
       </w:pPr>
       <w:r>
-        <w:t xml:space="preserve">은 해당 기간의 영어권 source paper가 target을 적어도 한 번 인용한 경우이며, 그렇지 않으면 0이다. 최종 panel은</w:t>
-      </w:r>
-      <w:r>
-        <w:t xml:space="preserve"> </w:t>
-      </w:r>
-      <w:r>
-        <w:rPr>
-          <w:bCs/>
-          <w:b/>
-        </w:rPr>
-        <w:t xml:space="preserve">179,230개의 target-paper × cohort observation</w:t>
-      </w:r>
-      <w:r>
-        <w:t xml:space="preserve">으로 구성된다.</w:t>
-      </w:r>
-    </w:p>
-    <w:p>
-      <w:pPr>
-        <w:pStyle w:val="BodyText"/>
-      </w:pPr>
-      <w:r>
-        <w:t xml:space="preserve">주요 exposure (D_j)는</w:t>
-      </w:r>
-      <w:r>
-        <w:t xml:space="preserve"> </w:t>
-      </w:r>
-      <w:r>
-        <w:rPr>
-          <w:bCs/>
-          <w:b/>
-        </w:rPr>
-        <w:t xml:space="preserve">2026년 현재 Google Scholar retrievability</w:t>
-      </w:r>
-      <w:r>
-        <w:t xml:space="preserve">이다. 가능한 한국어 제목, 영어 제목, reference-title variant를 이용하여 검색하고 사전에 정한 bibliographic matching 기준을 충족하는 record가 확인되면 (D_j=1), 검색을 완료했지만 match가 없으면 (D_j=0)으로 코딩한다. 표본에는</w:t>
-      </w:r>
-      <w:r>
-        <w:t xml:space="preserve"> </w:t>
-      </w:r>
-      <w:r>
-        <w:rPr>
-          <w:bCs/>
-          <w:b/>
-        </w:rPr>
-        <w:t xml:space="preserve">19,436편의 retrievable paper</w:t>
-      </w:r>
-      <w:r>
-        <w:t xml:space="preserve">와</w:t>
-      </w:r>
-      <w:r>
-        <w:t xml:space="preserve"> </w:t>
-      </w:r>
-      <w:r>
-        <w:rPr>
-          <w:bCs/>
-          <w:b/>
-        </w:rPr>
-        <w:t xml:space="preserve">35,353편의 nonretrievable paper</w:t>
-      </w:r>
-      <w:r>
-        <w:t xml:space="preserve">가 있다.</w:t>
-      </w:r>
-    </w:p>
-    <w:p>
-      <w:pPr>
-        <w:pStyle w:val="BodyText"/>
-      </w:pPr>
-      <w:r>
-        <w:t xml:space="preserve">여기서 retrievability의 범위는 의도적으로 좁다. Exact-title 기반 lookup은</w:t>
-      </w:r>
-      <w:r>
-        <w:t xml:space="preserve"> </w:t>
-      </w:r>
-      <w:r>
-        <w:rPr>
-          <w:bCs/>
-          <w:b/>
-        </w:rPr>
-        <w:t xml:space="preserve">known-item search</w:t>
-      </w:r>
-      <w:r>
-        <w:t xml:space="preserve">이므로 broad topic query에서 처음 해당 논문이 발견될 가능성이나 ranking을 측정하지 않는다. 이미 논문을 식별할 수 있는 제목정보가 주어졌을 때 현재 Google Scholar가 해당 bibliographic record를 반환하는지를 측정한다.</w:t>
-      </w:r>
-    </w:p>
-    <w:p>
-      <w:pPr>
-        <w:pStyle w:val="BodyText"/>
-      </w:pPr>
-      <w:r>
-        <w:t xml:space="preserve">보조 변수는 현재 retrievable한 논문에 대한</w:t>
-      </w:r>
-      <w:r>
-        <w:t xml:space="preserve"> </w:t>
-      </w:r>
-      <w:r>
-        <w:rPr>
-          <w:bCs/>
-          <w:b/>
-        </w:rPr>
-        <w:t xml:space="preserve">Google Scholar-mediated full-text access</w:t>
-      </w:r>
-      <w:r>
-        <w:t xml:space="preserve">이다. Google Scholar가 제공한 링크가 로그인이나 결제 없이 full text를 여는 경우 accessible로 코딩한다. 이는 인터넷 전체에서의 OA status가 아니라 현재 Google Scholar가 제공하는 접근경로에 조건부인 변수이다.</w:t>
+        <w:t xml:space="preserve">은 해당 기간의 영어권 source paper가 target을 적어도 한 번 인용한 경우이며, 그렇지 않으면 0이다. 최종 panel은 179,230개의 target-paper × cohort observation으로 구성된다.</w:t>
+      </w:r>
+    </w:p>
+    <w:p>
+      <w:pPr>
+        <w:pStyle w:val="BodyText"/>
+      </w:pPr>
+      <w:r>
+        <w:t xml:space="preserve">주요 exposure (D_j)는 2026년 현재 Google Scholar retrievability이다. 가능한 한국어 제목, 영어 제목, reference-title variant를 이용하여 검색하고 사전에 정한 bibliographic matching 기준을 충족하는 record가 확인되면 (D_j=1), 검색을 완료했지만 match가 없으면 (D_j=0)으로 코딩한다. 표본에는 19,436편의 retrievable paper와 35,353편의 nonretrievable paper가 있다.</w:t>
+      </w:r>
+    </w:p>
+    <w:p>
+      <w:pPr>
+        <w:pStyle w:val="BodyText"/>
+      </w:pPr>
+      <w:r>
+        <w:t xml:space="preserve">여기서 retrievability의 범위는 의도적으로 좁다. Exact-title 기반 lookup은 known-item search이므로 broad topic query에서 처음 해당 논문이 발견될 가능성이나 ranking을 측정하지 않는다. 이미 논문을 식별할 수 있는 제목정보가 주어졌을 때 현재 Google Scholar가 해당 bibliographic record를 반환하는지를 측정한다.</w:t>
+      </w:r>
+    </w:p>
+    <w:p>
+      <w:pPr>
+        <w:pStyle w:val="BodyText"/>
+      </w:pPr>
+      <w:r>
+        <w:t xml:space="preserve">보조 변수는 현재 retrievable한 논문에 대한 Google Scholar-mediated full-text access이다. Google Scholar가 제공한 링크가 로그인이나 결제 없이 full text를 여는 경우 accessible로 코딩한다. 이는 인터넷 전체에서의 OA status가 아니라 현재 Google Scholar가 제공하는 접근경로에 조건부인 변수이다.</w:t>
       </w:r>
     </w:p>
     <w:bookmarkEnd w:id="27"/>
@@ -1281,20 +649,7 @@
         <w:pStyle w:val="FirstParagraph"/>
       </w:pPr>
       <w:r>
-        <w:t xml:space="preserve">주요 분석은</w:t>
-      </w:r>
-      <w:r>
-        <w:t xml:space="preserve"> </w:t>
-      </w:r>
-      <w:r>
-        <w:rPr>
-          <w:bCs/>
-          <w:b/>
-        </w:rPr>
-        <w:t xml:space="preserve">현재 Google Scholar retrievability에 따른 영어권 인용확률 격차가 citation cohort별로 달라지는지</w:t>
-      </w:r>
-      <w:r>
-        <w:t xml:space="preserve">를 검정한다. Target-paper fixed-effects linear probability model은 다음과 같다.</w:t>
+        <w:t xml:space="preserve">주요 분석은 현재 Google Scholar retrievability에 따른 영어권 인용확률 격차가 citation cohort별로 달라지는지를 검정한다. Target-paper fixed-effects linear probability model은 다음과 같다.</w:t>
       </w:r>
     </w:p>
     <w:p>
@@ -1548,41 +903,15 @@
         <w:t xml:space="preserve">따라서 핵심 계수 (</w:t>
       </w:r>
       <w:r>
-        <w:t xml:space="preserve">_k)는</w:t>
-      </w:r>
-      <w:r>
-        <w:t xml:space="preserve"> </w:t>
-      </w:r>
-      <w:r>
-        <w:rPr>
-          <w:bCs/>
-          <w:b/>
-        </w:rPr>
-        <w:t xml:space="preserve">각 후속 cohort의 visible–nonvisible 영어권 인용확률 격차가 C1의 격차와 얼마나 다른지</w:t>
-      </w:r>
-      <w:r>
-        <w:t xml:space="preserve">를 나타낸다. 이 계수는 Google Scholar visibility의 causal effect가 아니라 두 집단 사이 gap의 시기별 차이를 의미한다. Standard error는 target paper 수준에서 cluster한다.</w:t>
-      </w:r>
-    </w:p>
-    <w:p>
-      <w:pPr>
-        <w:pStyle w:val="BodyText"/>
-      </w:pPr>
-      <w:r>
-        <w:t xml:space="preserve">Cohort별 eligible-target composition의 변화를 점검하기 위해</w:t>
-      </w:r>
-      <w:r>
-        <w:t xml:space="preserve"> </w:t>
-      </w:r>
-      <w:r>
-        <w:rPr>
-          <w:bCs/>
-          <w:b/>
-        </w:rPr>
-        <w:t xml:space="preserve">2004년까지 출판된 target paper만을 대상으로 같은 분석을 반복</w:t>
-      </w:r>
-      <w:r>
-        <w:t xml:space="preserve">한다. 이 논문들은 네 cohort 모두에 기여할 시간적 기회를 가지므로, 후기에 출판된 논문의 추가로 인해 cohort 구성 자체가 바뀌는 문제를 줄일 수 있다.</w:t>
+        <w:t xml:space="preserve">_k)는 각 후속 cohort의 visible–nonvisible 영어권 인용확률 격차가 C1의 격차와 얼마나 다른지를 나타낸다. 이 계수는 Google Scholar visibility의 causal effect가 아니라 두 집단 사이 gap의 시기별 차이를 의미한다. Standard error는 target paper 수준에서 cluster한다.</w:t>
+      </w:r>
+    </w:p>
+    <w:p>
+      <w:pPr>
+        <w:pStyle w:val="BodyText"/>
+      </w:pPr>
+      <w:r>
+        <w:t xml:space="preserve">Cohort별 eligible-target composition의 변화를 점검하기 위해 2004년까지 출판된 target paper만을 대상으로 같은 분석을 반복한다. 이 논문들은 네 cohort 모두에 기여할 시간적 기회를 가지므로, 후기에 출판된 논문의 추가로 인해 cohort 구성 자체가 바뀌는 문제를 줄일 수 있다.</w:t>
       </w:r>
     </w:p>
     <w:p>
@@ -1883,54 +1212,15 @@
         <w:pStyle w:val="BodyText"/>
       </w:pPr>
       <w:r>
-        <w:t xml:space="preserve">Fixed-effects 분석에서는 C1 대비 visible–nonvisible gap이</w:t>
-      </w:r>
-      <w:r>
-        <w:t xml:space="preserve"> </w:t>
-      </w:r>
-      <w:r>
-        <w:rPr>
-          <w:bCs/>
-          <w:b/>
-        </w:rPr>
-        <w:t xml:space="preserve">C2에서 0.405pp 증가</w:t>
-      </w:r>
-      <w:r>
-        <w:t xml:space="preserve">한다(95% CI [0.040, 0.770], (p=.030)).</w:t>
-      </w:r>
-      <w:r>
-        <w:t xml:space="preserve"> </w:t>
-      </w:r>
-      <w:r>
-        <w:rPr>
-          <w:bCs/>
-          <w:b/>
-        </w:rPr>
-        <w:t xml:space="preserve">C3에서는 0.696pp 증가</w:t>
-      </w:r>
-      <w:r>
-        <w:t xml:space="preserve">한다(95% CI [0.329, 1.063], (p&lt;.001)). C2와 C3 계수의 joint test 역시 (p&lt;.001)이다.</w:t>
-      </w:r>
-    </w:p>
-    <w:p>
-      <w:pPr>
-        <w:pStyle w:val="BodyText"/>
-      </w:pPr>
-      <w:r>
-        <w:t xml:space="preserve">반면 C4의 변화는</w:t>
-      </w:r>
-      <w:r>
-        <w:t xml:space="preserve"> </w:t>
-      </w:r>
-      <w:r>
-        <w:rPr>
-          <w:bCs/>
-          <w:b/>
-        </w:rPr>
-        <w:t xml:space="preserve">0.008pp</w:t>
-      </w:r>
-      <w:r>
-        <w:t xml:space="preserve">(95% CI [−0.337, 0.353], (p=.965))로, 2020–2024년에 C1 대비 격차가 추가적으로 확대되었다는 근거는 확인되지 않는다.</w:t>
+        <w:t xml:space="preserve">Fixed-effects 분석에서는 C1 대비 visible–nonvisible gap이 C2에서 0.405pp 증가한다(95% CI [0.040, 0.770], (p=.030)). C3에서는 0.696pp 증가한다(95% CI [0.329, 1.063], (p&lt;.001)). C2와 C3 계수의 joint test 역시 (p&lt;.001)이다.</w:t>
+      </w:r>
+    </w:p>
+    <w:p>
+      <w:pPr>
+        <w:pStyle w:val="BodyText"/>
+      </w:pPr>
+      <w:r>
+        <w:t xml:space="preserve">반면 C4의 변화는 0.008pp(95% CI [−0.337, 0.353], (p=.965))로, 2020–2024년에 C1 대비 격차가 추가적으로 확대되었다는 근거는 확인되지 않는다.</w:t>
       </w:r>
     </w:p>
     <w:p>
@@ -2123,44 +1413,15 @@
         <w:pStyle w:val="BodyText"/>
       </w:pPr>
       <w:r>
-        <w:t xml:space="preserve">Robustness 결과는 모든 specification에서 동일하지 않다. Target-fixed-effects Poisson에서는 C2와 C3 변화가 양수이지만 영어권 인용이 전혀 없는 target은 conditional model을 식별하지 못하므로 제외된다. 다른 Poisson specification은 더 불정확하며, journal-by-cohort 및 publication-year-by-cohort model에서는 C2의 양의 추정치는 유지되지만 C3와 C4가 통계적으로 유의하게 재현되지는 않는다. 따라서 결과는</w:t>
-      </w:r>
-      <w:r>
-        <w:t xml:space="preserve"> </w:t>
-      </w:r>
-      <w:r>
-        <w:rPr>
-          <w:bCs/>
-          <w:b/>
-        </w:rPr>
-        <w:t xml:space="preserve">main incidence model과 pre-2005 restriction에서 확인된 C2–C3 패턴의 범위</w:t>
-      </w:r>
-      <w:r>
-        <w:t xml:space="preserve">에서 해석한다.</w:t>
-      </w:r>
-    </w:p>
-    <w:p>
-      <w:pPr>
-        <w:pStyle w:val="BodyText"/>
-      </w:pPr>
-      <w:r>
-        <w:t xml:space="preserve">현재 Google Scholar에서 visible한 논문들 사이에서는</w:t>
-      </w:r>
-      <w:r>
-        <w:t xml:space="preserve"> </w:t>
-      </w:r>
-      <w:r>
-        <w:rPr>
-          <w:bCs/>
-          <w:b/>
-        </w:rPr>
-        <w:t xml:space="preserve">Google Scholar-mediated full-text access가 cohort별 영어권 citation incidence와 통계적으로 유의한 관계를 보이지 않았다.</w:t>
-      </w:r>
-      <w:r>
-        <w:t xml:space="preserve"> </w:t>
-      </w:r>
-      <w:r>
-        <w:t xml:space="preserve">이 null result는 access가 일반적으로 중요하지 않다는 의미가 아니라 현재 retrievability에 조건부인 현재 시점의 접근경로가 이 표본의 historical citation pattern을 별도로 구분하지 못했다는 의미이다.</w:t>
+        <w:t xml:space="preserve">Robustness 결과는 모든 specification에서 동일하지 않다. Target-fixed-effects Poisson에서는 C2와 C3 변화가 양수이지만 영어권 인용이 전혀 없는 target은 conditional model을 식별하지 못하므로 제외된다. 다른 Poisson specification은 더 불정확하며, journal-by-cohort 및 publication-year-by-cohort model에서는 C2의 양의 추정치는 유지되지만 C3와 C4가 통계적으로 유의하게 재현되지는 않는다. 따라서 결과는 main incidence model과 pre-2005 restriction에서 확인된 C2–C3 패턴의 범위에서 해석한다.</w:t>
+      </w:r>
+    </w:p>
+    <w:p>
+      <w:pPr>
+        <w:pStyle w:val="BodyText"/>
+      </w:pPr>
+      <w:r>
+        <w:t xml:space="preserve">현재 Google Scholar에서 visible한 논문들 사이에서는 Google Scholar-mediated full-text access가 cohort별 영어권 citation incidence와 통계적으로 유의한 관계를 보이지 않았다. 이 null result는 access가 일반적으로 중요하지 않다는 의미가 아니라 현재 retrievability에 조건부인 현재 시점의 접근경로가 이 표본의 historical citation pattern을 별도로 구분하지 못했다는 의미이다.</w:t>
       </w:r>
     </w:p>
     <w:bookmarkEnd w:id="29"/>
@@ -2178,62 +1439,23 @@
         <w:pStyle w:val="FirstParagraph"/>
       </w:pPr>
       <w:r>
-        <w:t xml:space="preserve">Study 1의 결과는</w:t>
-      </w:r>
-      <w:r>
-        <w:t xml:space="preserve"> </w:t>
-      </w:r>
-      <w:r>
-        <w:rPr>
-          <w:bCs/>
-          <w:b/>
-        </w:rPr>
-        <w:t xml:space="preserve">현재 Google Scholar에서 known-item search로 확인 가능한 논문과 그렇지 않은 논문의 과거 영어권 인용패턴이 동일하지 않음</w:t>
-      </w:r>
-      <w:r>
-        <w:t xml:space="preserve">을 보여준다. C1에 비해 visible–nonvisible gap은 C2와 C3에서 확대되며, 네 cohort에 모두 기여할 수 있는 pre-2005 target으로 제한해도 같은 방향의 결과가 나타난다. 그러나 C4에서는 추가적인 확대가 확인되지 않고 일부 대안 specification에서는 결과가 덜 정밀하다.</w:t>
-      </w:r>
-    </w:p>
-    <w:p>
-      <w:pPr>
-        <w:pStyle w:val="BodyText"/>
-      </w:pPr>
-      <w:r>
-        <w:t xml:space="preserve">여기서 0.405pp와 0.696pp는 각 기간의 인용확률 수준 자체가 아니라</w:t>
-      </w:r>
-      <w:r>
-        <w:t xml:space="preserve"> </w:t>
-      </w:r>
-      <w:r>
-        <w:rPr>
-          <w:bCs/>
-          <w:b/>
-        </w:rPr>
-        <w:t xml:space="preserve">C1 대비 visible–nonvisible gap의 추가 변화량</w:t>
-      </w:r>
-      <w:r>
-        <w:t xml:space="preserve">이다. 따라서 핵심 결과는 검색 가능한 논문의 인용확률이 모든 시기에 일관되게 더 빠르게 증가했다는 것이 아니라, 격차 확대가 C2와 C3에 집중되고 C4에서는 재현되지 않았다는 것이다.</w:t>
-      </w:r>
-    </w:p>
-    <w:p>
-      <w:pPr>
-        <w:pStyle w:val="BodyText"/>
-      </w:pPr>
-      <w:r>
-        <w:t xml:space="preserve">따라서 이 결과를 Google Scholar가 영어권 인용을 증가시켰다는 증거로 해석할 수 없다. 현재 retrievability는 과거의 circulation, 이후의 web availability, indexing 또는 이들과 함께 변화한 다른 특성과 관련될 수 있다. Study 1이 보여주는 것은 보다 제한적으로</w:t>
-      </w:r>
-      <w:r>
-        <w:t xml:space="preserve"> </w:t>
-      </w:r>
-      <w:r>
-        <w:rPr>
-          <w:bCs/>
-          <w:b/>
-        </w:rPr>
-        <w:t xml:space="preserve">현재 paper-level retrievability가 서로 다른 historical English-language citation trajectory를 가진 논문을 구분한다는 것</w:t>
-      </w:r>
-      <w:r>
-        <w:t xml:space="preserve">이다.</w:t>
+        <w:t xml:space="preserve">Study 1의 결과는 현재 Google Scholar에서 known-item search로 확인 가능한 논문과 그렇지 않은 논문의 과거 영어권 인용패턴이 동일하지 않음을 보여준다. C1에 비해 visible–nonvisible gap은 C2와 C3에서 확대되며, 네 cohort에 모두 기여할 수 있는 pre-2005 target으로 제한해도 같은 방향의 결과가 나타난다. 그러나 C4에서는 추가적인 확대가 확인되지 않고 일부 대안 specification에서는 결과가 덜 정밀하다.</w:t>
+      </w:r>
+    </w:p>
+    <w:p>
+      <w:pPr>
+        <w:pStyle w:val="BodyText"/>
+      </w:pPr>
+      <w:r>
+        <w:t xml:space="preserve">여기서 0.405pp와 0.696pp는 각 기간의 인용확률 수준 자체가 아니라 C1 대비 visible–nonvisible gap의 추가 변화량이다. 따라서 핵심 결과는 검색 가능한 논문의 인용확률이 모든 시기에 일관되게 더 빠르게 증가했다는 것이 아니라, 격차 확대가 C2와 C3에 집중되고 C4에서는 재현되지 않았다는 것이다.</w:t>
+      </w:r>
+    </w:p>
+    <w:p>
+      <w:pPr>
+        <w:pStyle w:val="BodyText"/>
+      </w:pPr>
+      <w:r>
+        <w:t xml:space="preserve">따라서 이 결과를 Google Scholar가 영어권 인용을 증가시켰다는 증거로 해석할 수 없다. 현재 retrievability는 과거의 circulation, 이후의 web availability, indexing 또는 이들과 함께 변화한 다른 특성과 관련될 수 있다. Study 1이 보여주는 것은 보다 제한적으로 현재 paper-level retrievability가 서로 다른 historical English-language citation trajectory를 가진 논문을 구분한다는 것이다.</w:t>
       </w:r>
     </w:p>
     <w:bookmarkEnd w:id="30"/>
@@ -2261,20 +1483,7 @@
         <w:pStyle w:val="FirstParagraph"/>
       </w:pPr>
       <w:r>
-        <w:t xml:space="preserve">Study 2는</w:t>
-      </w:r>
-      <w:r>
-        <w:t xml:space="preserve"> </w:t>
-      </w:r>
-      <w:r>
-        <w:rPr>
-          <w:bCs/>
-          <w:b/>
-        </w:rPr>
-        <w:t xml:space="preserve">동일한 한국 정치 주제를 다루는 한국어권과 영어권의 주요 문헌이 생성형 검색에서 어느 정도 검색되고 최종 출처로 선택되는지, 그리고 그 격차가 검색조건에 따라 달라지는지</w:t>
-      </w:r>
-      <w:r>
-        <w:t xml:space="preserve">를 분석한다.</w:t>
+        <w:t xml:space="preserve">Study 2는 동일한 한국 정치 주제를 다루는 한국어권과 영어권의 주요 문헌이 생성형 검색에서 어느 정도 검색되고 최종 출처로 선택되는지, 그리고 그 격차가 검색조건에 따라 달라지는지를 분석한다.</w:t>
       </w:r>
     </w:p>
     <w:p>
@@ -2302,10 +1511,6 @@
         <w:pStyle w:val="Compact"/>
       </w:pPr>
       <w:r>
-        <w:rPr>
-          <w:bCs/>
-          <w:b/>
-        </w:rPr>
         <w:t xml:space="preserve">한국전쟁</w:t>
       </w:r>
     </w:p>
@@ -2318,10 +1523,6 @@
         <w:pStyle w:val="Compact"/>
       </w:pPr>
       <w:r>
-        <w:rPr>
-          <w:bCs/>
-          <w:b/>
-        </w:rPr>
         <w:t xml:space="preserve">한국 경제발전</w:t>
       </w:r>
     </w:p>
@@ -2334,10 +1535,6 @@
         <w:pStyle w:val="Compact"/>
       </w:pPr>
       <w:r>
-        <w:rPr>
-          <w:bCs/>
-          <w:b/>
-        </w:rPr>
         <w:t xml:space="preserve">한국 민주화</w:t>
       </w:r>
     </w:p>
@@ -2350,10 +1547,6 @@
         <w:pStyle w:val="Compact"/>
       </w:pPr>
       <w:r>
-        <w:rPr>
-          <w:bCs/>
-          <w:b/>
-        </w:rPr>
         <w:t xml:space="preserve">북한 핵문제</w:t>
       </w:r>
     </w:p>
@@ -2366,10 +1559,6 @@
         <w:pStyle w:val="Compact"/>
       </w:pPr>
       <w:r>
-        <w:rPr>
-          <w:bCs/>
-          <w:b/>
-        </w:rPr>
         <w:t xml:space="preserve">한류</w:t>
       </w:r>
     </w:p>
@@ -2378,20 +1567,7 @@
         <w:pStyle w:val="FirstParagraph"/>
       </w:pPr>
       <w:r>
-        <w:t xml:space="preserve">주제를 양 언어권에서 공통적으로 연구된 영역으로 제한한 이유는 특정 주제 자체의 연구축적이 한쪽에 거의 없기 때문에 발생하는 차이를 언어별 검색가시성의 차이와 혼동하지 않기 위해서이다. 따라서 비교의 초점은</w:t>
-      </w:r>
-      <w:r>
-        <w:t xml:space="preserve"> </w:t>
-      </w:r>
-      <w:r>
-        <w:rPr>
-          <w:bCs/>
-          <w:b/>
-        </w:rPr>
-        <w:t xml:space="preserve">동일한 substantive topic 안에서 각 언어권의 주요 문헌이 생성형 검색에 얼마나 진입하고 선택되는가</w:t>
-      </w:r>
-      <w:r>
-        <w:t xml:space="preserve">에 있다.</w:t>
+        <w:t xml:space="preserve">주제를 양 언어권에서 공통적으로 연구된 영역으로 제한한 이유는 특정 주제 자체의 연구축적이 한쪽에 거의 없기 때문에 발생하는 차이를 언어별 검색가시성의 차이와 혼동하지 않기 위해서이다. 따라서 비교의 초점은 동일한 substantive topic 안에서 각 언어권의 주요 문헌이 생성형 검색에 얼마나 진입하고 선택되는가에 있다.</w:t>
       </w:r>
     </w:p>
     <w:p>
@@ -2652,20 +1828,7 @@
         <w:pStyle w:val="BodyText"/>
       </w:pPr>
       <w:r>
-        <w:t xml:space="preserve">각 주제에는 한국어 논문 10편과 영어 논문 10편을 포함한다. 한국어 benchmark는 DBpia와 KISS, 영어 benchmark는 Web of Science와 Google Scholar를 이용해 구성한다. Candidate pool을 citation count에 따라 정렬한 뒤 두 source에서 공통적으로 상위에 위치하는 논문을 기준으로 주제별 10편을 선정하였다. 최종 benchmark는</w:t>
-      </w:r>
-      <w:r>
-        <w:t xml:space="preserve"> </w:t>
-      </w:r>
-      <w:r>
-        <w:rPr>
-          <w:bCs/>
-          <w:b/>
-        </w:rPr>
-        <w:t xml:space="preserve">한국어 50편과 영어 50편, 총 100편</w:t>
-      </w:r>
-      <w:r>
-        <w:t xml:space="preserve">이며 LLM audit 전에 고정하였다. 이는 각 주제의 전체 relevant literature를 포괄하는 gold standard가 아니라 조건 간 상대적 recovery를 비교하기 위한 evaluation set이다.</w:t>
+        <w:t xml:space="preserve">각 주제에는 한국어 논문 10편과 영어 논문 10편을 포함한다. 한국어 benchmark는 DBpia와 KISS, 영어 benchmark는 Web of Science와 Google Scholar를 이용해 구성한다. Candidate pool을 citation count에 따라 정렬한 뒤 두 source에서 공통적으로 상위에 위치하는 논문을 기준으로 주제별 10편을 선정하였다. 최종 benchmark는 한국어 50편과 영어 50편, 총 100편이며 LLM audit 전에 고정하였다. 이는 각 주제의 전체 relevant literature를 포괄하는 gold standard가 아니라 조건 간 상대적 recovery를 비교하기 위한 evaluation set이다.</w:t>
       </w:r>
     </w:p>
     <w:p>
@@ -2685,17 +1848,7 @@
         <w:pStyle w:val="Compact"/>
       </w:pPr>
       <w:r>
-        <w:rPr>
-          <w:bCs/>
-          <w:b/>
-        </w:rPr>
-        <w:t xml:space="preserve">Query language:</w:t>
-      </w:r>
-      <w:r>
-        <w:t xml:space="preserve"> </w:t>
-      </w:r>
-      <w:r>
-        <w:t xml:space="preserve">영어 / 한국어</w:t>
+        <w:t xml:space="preserve">Query language — 영어 / 한국어</w:t>
       </w:r>
     </w:p>
     <w:p>
@@ -2707,17 +1860,7 @@
         <w:pStyle w:val="Compact"/>
       </w:pPr>
       <w:r>
-        <w:rPr>
-          <w:bCs/>
-          <w:b/>
-        </w:rPr>
-        <w:t xml:space="preserve">Source instruction:</w:t>
-      </w:r>
-      <w:r>
-        <w:t xml:space="preserve"> </w:t>
-      </w:r>
-      <w:r>
-        <w:t xml:space="preserve">general web / KCI·DBpia·KISS 명시</w:t>
+        <w:t xml:space="preserve">Source instruction — general web / KCI·DBpia·KISS 명시</w:t>
       </w:r>
     </w:p>
     <w:p>
@@ -2729,17 +1872,7 @@
         <w:pStyle w:val="Compact"/>
       </w:pPr>
       <w:r>
-        <w:rPr>
-          <w:bCs/>
-          <w:b/>
-        </w:rPr>
-        <w:t xml:space="preserve">System:</w:t>
-      </w:r>
-      <w:r>
-        <w:t xml:space="preserve"> </w:t>
-      </w:r>
-      <w:r>
-        <w:t xml:space="preserve">OpenAI</w:t>
+        <w:t xml:space="preserve">System — OpenAI</w:t>
       </w:r>
       <w:r>
         <w:t xml:space="preserve"> </w:t>
@@ -2771,54 +1904,15 @@
         <w:pStyle w:val="FirstParagraph"/>
       </w:pPr>
       <w:r>
-        <w:t xml:space="preserve">Query language와 source instruction은 단순한 문구상의 차이가 아니라 retrieval에 입력되는 검색조건으로 사용한다. 한국어 질의나 한국 학술 데이터베이스의 명시가 한국어 benchmark의 상대적 recovery를 변화시킨다면, 해당 문헌의 가시성이 단일한 고정값이라기보다</w:t>
-      </w:r>
-      <w:r>
-        <w:t xml:space="preserve"> </w:t>
-      </w:r>
-      <w:r>
-        <w:rPr>
-          <w:bCs/>
-          <w:b/>
-        </w:rPr>
-        <w:t xml:space="preserve">검색이 구성되는 조건에 따라 달라질 수 있음</w:t>
-      </w:r>
-      <w:r>
-        <w:t xml:space="preserve">을 의미한다.</w:t>
-      </w:r>
-    </w:p>
-    <w:p>
-      <w:pPr>
-        <w:pStyle w:val="BodyText"/>
-      </w:pPr>
-      <w:r>
-        <w:t xml:space="preserve">모든 prompt는 해당 주제의 세 주제어를 포함하고 관련 학술문헌 10편을 고정된 JSON 형식으로 요청하였다. 검색횟수는 주제어당 최대 2회, execution당 최대 6회로 제한하였다. 5개 주제 × 4개 prompt condition × 2개 system × 5회 독립 repetition으로</w:t>
-      </w:r>
-      <w:r>
-        <w:t xml:space="preserve"> </w:t>
-      </w:r>
-      <w:r>
-        <w:rPr>
-          <w:bCs/>
-          <w:b/>
-        </w:rPr>
-        <w:t xml:space="preserve">200개의 stateless execution</w:t>
-      </w:r>
-      <w:r>
-        <w:t xml:space="preserve">을 수행하며, 최종적으로</w:t>
-      </w:r>
-      <w:r>
-        <w:t xml:space="preserve"> </w:t>
-      </w:r>
-      <w:r>
-        <w:rPr>
-          <w:bCs/>
-          <w:b/>
-        </w:rPr>
-        <w:t xml:space="preserve">1,932개의 valid recommendation occurrence</w:t>
-      </w:r>
-      <w:r>
-        <w:t xml:space="preserve">가 생성되었다.</w:t>
+        <w:t xml:space="preserve">Query language와 source instruction은 단순한 문구상의 차이가 아니라 retrieval에 입력되는 검색조건으로 사용한다. 한국어 질의나 한국 학술 데이터베이스의 명시가 한국어 benchmark의 상대적 recovery를 변화시킨다면, 해당 문헌의 가시성이 단일한 고정값이라기보다 검색이 구성되는 조건에 따라 달라질 수 있음을 의미한다.</w:t>
+      </w:r>
+    </w:p>
+    <w:p>
+      <w:pPr>
+        <w:pStyle w:val="BodyText"/>
+      </w:pPr>
+      <w:r>
+        <w:t xml:space="preserve">모든 prompt는 해당 주제의 세 주제어를 포함하고 관련 학술문헌 10편을 고정된 JSON 형식으로 요청하였다. 검색횟수는 주제어당 최대 2회, execution당 최대 6회로 제한하였다. 5개 주제 × 4개 prompt condition × 2개 system × 5회 독립 repetition으로 200개의 stateless execution을 수행하며, 최종적으로 1,932개의 valid recommendation occurrence가 생성되었다.</w:t>
       </w:r>
     </w:p>
     <w:bookmarkEnd w:id="32"/>
@@ -2848,17 +1942,7 @@
         <w:pStyle w:val="Compact"/>
       </w:pPr>
       <w:r>
-        <w:rPr>
-          <w:bCs/>
-          <w:b/>
-        </w:rPr>
-        <w:t xml:space="preserve">TraceRecovery:</w:t>
-      </w:r>
-      <w:r>
-        <w:t xml:space="preserve"> </w:t>
-      </w:r>
-      <w:r>
-        <w:t xml:space="preserve">provider가 외부에 노출하는 observable search trace에 benchmark paper가 나타나는지</w:t>
+        <w:t xml:space="preserve">TraceRecovery — provider가 외부에 노출하는 observable search trace에 benchmark paper가 나타나는지</w:t>
       </w:r>
     </w:p>
     <w:p>
@@ -2870,17 +1954,7 @@
         <w:pStyle w:val="Compact"/>
       </w:pPr>
       <w:r>
-        <w:rPr>
-          <w:bCs/>
-          <w:b/>
-        </w:rPr>
-        <w:t xml:space="preserve">Recommendation:</w:t>
-      </w:r>
-      <w:r>
-        <w:t xml:space="preserve"> </w:t>
-      </w:r>
-      <w:r>
-        <w:t xml:space="preserve">benchmark paper가 final recommendation에 포함되는지</w:t>
+        <w:t xml:space="preserve">Recommendation — benchmark paper가 final recommendation에 포함되는지</w:t>
       </w:r>
     </w:p>
     <w:p>
@@ -2892,17 +1966,7 @@
         <w:pStyle w:val="Compact"/>
       </w:pPr>
       <w:r>
-        <w:rPr>
-          <w:bCs/>
-          <w:b/>
-        </w:rPr>
-        <w:t xml:space="preserve">SuppliedLinkAccess:</w:t>
-      </w:r>
-      <w:r>
-        <w:t xml:space="preserve"> </w:t>
-      </w:r>
-      <w:r>
-        <w:t xml:space="preserve">benchmark가 추천되고 제공된 URL이 로그인이나 결제 없이 full text를 제공하는지</w:t>
+        <w:t xml:space="preserve">SuppliedLinkAccess — benchmark가 추천되고 제공된 URL이 로그인이나 결제 없이 full text를 제공하는지</w:t>
       </w:r>
     </w:p>
     <w:p>
@@ -2910,41 +1974,15 @@
         <w:pStyle w:val="FirstParagraph"/>
       </w:pPr>
       <w:r>
-        <w:t xml:space="preserve">앞의 두 지표가 Study 2에서의</w:t>
-      </w:r>
-      <w:r>
-        <w:t xml:space="preserve"> </w:t>
-      </w:r>
-      <w:r>
-        <w:rPr>
-          <w:bCs/>
-          <w:b/>
-        </w:rPr>
-        <w:t xml:space="preserve">검색 가시성</w:t>
-      </w:r>
-      <w:r>
-        <w:t xml:space="preserve">을 구성한다. TraceRecovery는 관찰 가능한 검색단계에 진입했는지를, Recommendation은 그 문헌이 최종 source selection을 통과했는지를 측정한다. SuppliedLinkAccess는 이와 구분되는 후속 접근결과이다.</w:t>
-      </w:r>
-    </w:p>
-    <w:p>
-      <w:pPr>
-        <w:pStyle w:val="BodyText"/>
-      </w:pPr>
-      <w:r>
-        <w:t xml:space="preserve">Benchmark panel은</w:t>
-      </w:r>
-      <w:r>
-        <w:t xml:space="preserve"> </w:t>
-      </w:r>
-      <w:r>
-        <w:rPr>
-          <w:bCs/>
-          <w:b/>
-        </w:rPr>
-        <w:t xml:space="preserve">4,000개의 paper × execution observation</w:t>
-      </w:r>
-      <w:r>
-        <w:t xml:space="preserve">으로 구성된다. 200개의 execution 각각에 해당 topic의 한국어 benchmark 10편과 영어 benchmark 10편을 대응시킨다.</w:t>
+        <w:t xml:space="preserve">앞의 두 지표가 Study 2에서의 검색 가시성을 구성한다. TraceRecovery는 관찰 가능한 검색단계에 진입했는지를, Recommendation은 그 문헌이 최종 source selection을 통과했는지를 측정한다. SuppliedLinkAccess는 이와 구분되는 후속 접근결과이다.</w:t>
+      </w:r>
+    </w:p>
+    <w:p>
+      <w:pPr>
+        <w:pStyle w:val="BodyText"/>
+      </w:pPr>
+      <w:r>
+        <w:t xml:space="preserve">Benchmark panel은 4,000개의 paper × execution observation으로 구성된다. 200개의 execution 각각에 해당 topic의 한국어 benchmark 10편과 영어 benchmark 10편을 대응시킨다.</w:t>
       </w:r>
       <w:r>
         <w:t xml:space="preserve"> </w:t>
@@ -2956,20 +1994,7 @@
         <w:t xml:space="preserve">SuppliedLinkAccess</w:t>
       </w:r>
       <w:r>
-        <w:t xml:space="preserve">의 denominator는 모든 benchmark-paper × execution pair이므로 이는 추천된 논문에 조건부인 access rate가 아니라</w:t>
-      </w:r>
-      <w:r>
-        <w:t xml:space="preserve"> </w:t>
-      </w:r>
-      <w:r>
-        <w:rPr>
-          <w:bCs/>
-          <w:b/>
-        </w:rPr>
-        <w:t xml:space="preserve">검색, 추천, 접근을 함께 통과했는지를 나타내는 joint pipeline-survival outcome</w:t>
-      </w:r>
-      <w:r>
-        <w:t xml:space="preserve">이다.</w:t>
+        <w:t xml:space="preserve">의 denominator는 모든 benchmark-paper × execution pair이므로 이는 추천된 논문에 조건부인 access rate가 아니라 검색, 추천, 접근을 함께 통과했는지를 나타내는 joint pipeline-survival outcome이다.</w:t>
       </w:r>
     </w:p>
     <w:p>
@@ -2985,41 +2010,15 @@
         <w:pStyle w:val="BodyText"/>
       </w:pPr>
       <w:r>
-        <w:t xml:space="preserve">이와 별도로 전체 recommendation 가운데 한국어 논문이 차지하는 비율을</w:t>
-      </w:r>
-      <w:r>
-        <w:t xml:space="preserve"> </w:t>
-      </w:r>
-      <w:r>
-        <w:rPr>
-          <w:bCs/>
-          <w:b/>
-        </w:rPr>
-        <w:t xml:space="preserve">Korean-language representation</w:t>
-      </w:r>
-      <w:r>
-        <w:t xml:space="preserve">으로 측정한다. 이는 benchmark recovery가 아니다. Benchmark에 포함되지 않은 한국어 논문도 representation에는 포함되기 때문에, 결과목록의 언어구성과 사전에 정한 주요 문헌의 회수는 서로 다른 결과이다.</w:t>
-      </w:r>
-    </w:p>
-    <w:p>
-      <w:pPr>
-        <w:pStyle w:val="BodyText"/>
-      </w:pPr>
-      <w:r>
-        <w:t xml:space="preserve">마지막으로</w:t>
-      </w:r>
-      <w:r>
-        <w:t xml:space="preserve"> </w:t>
-      </w:r>
-      <w:r>
-        <w:rPr>
-          <w:bCs/>
-          <w:b/>
-        </w:rPr>
-        <w:t xml:space="preserve">927개의 distinct supplied URL 또는 no-URL item key</w:t>
-      </w:r>
-      <w:r>
-        <w:t xml:space="preserve">를 검토하여 accessible full text, abstract only, paywalled, broken link, hallucinated/unverifiable publication으로 분류한다. 여기서 access는 웹 전체에서 해당 논문의 다른 무료 copy를 찾는 것이 아니라 실제 제공된 URL의 상태를 측정한다.</w:t>
+        <w:t xml:space="preserve">이와 별도로 전체 recommendation 가운데 한국어 논문이 차지하는 비율을 Korean-language representation으로 측정한다. 이는 benchmark recovery가 아니다. Benchmark에 포함되지 않은 한국어 논문도 representation에는 포함되기 때문에, 결과목록의 언어구성과 사전에 정한 주요 문헌의 회수는 서로 다른 결과이다.</w:t>
+      </w:r>
+    </w:p>
+    <w:p>
+      <w:pPr>
+        <w:pStyle w:val="BodyText"/>
+      </w:pPr>
+      <w:r>
+        <w:t xml:space="preserve">마지막으로 927개의 distinct supplied URL 또는 no-URL item key를 검토하여 accessible full text, abstract only, paywalled, broken link, hallucinated/unverifiable publication으로 분류한다. 여기서 access는 웹 전체에서 해당 논문의 다른 무료 copy를 찾는 것이 아니라 실제 제공된 URL의 상태를 측정한다.</w:t>
       </w:r>
     </w:p>
     <w:bookmarkEnd w:id="33"/>
@@ -3369,118 +2368,15 @@
         <w:pStyle w:val="BodyText"/>
       </w:pPr>
       <w:r>
-        <w:t xml:space="preserve">한국어 query는 observable search 단계의 Korean–English gap을</w:t>
-      </w:r>
-      <w:r>
-        <w:t xml:space="preserve"> </w:t>
-      </w:r>
-      <w:r>
-        <w:rPr>
-          <w:bCs/>
-          <w:b/>
-        </w:rPr>
-        <w:t xml:space="preserve">+3.8pp</w:t>
-      </w:r>
-      <w:r>
-        <w:t xml:space="preserve"> </w:t>
-      </w:r>
-      <w:r>
-        <w:t xml:space="preserve">변화시키고(95% CI [0.72, 6.88], (p=.016)), Korean-database instruction은</w:t>
-      </w:r>
-      <w:r>
-        <w:t xml:space="preserve"> </w:t>
-      </w:r>
-      <w:r>
-        <w:rPr>
-          <w:bCs/>
-          <w:b/>
-        </w:rPr>
-        <w:t xml:space="preserve">+4.0pp</w:t>
-      </w:r>
-      <w:r>
-        <w:t xml:space="preserve"> </w:t>
-      </w:r>
-      <w:r>
-        <w:t xml:space="preserve">변화시킨다(95% CI [0.73, 7.27], (p=.017)). Final recommendation에서는 database instruction이 gap을</w:t>
-      </w:r>
-      <w:r>
-        <w:t xml:space="preserve"> </w:t>
-      </w:r>
-      <w:r>
-        <w:rPr>
-          <w:bCs/>
-          <w:b/>
-        </w:rPr>
-        <w:t xml:space="preserve">+3.2pp</w:t>
-      </w:r>
-      <w:r>
-        <w:t xml:space="preserve"> </w:t>
-      </w:r>
-      <w:r>
-        <w:t xml:space="preserve">변화시킨다(95% CI [0.71, 5.69], (p=.012)). Korean-query estimate는 +2.6pp로 같은 방향이지만 (p=.068)로 더 불확실하다.</w:t>
-      </w:r>
-    </w:p>
-    <w:p>
-      <w:pPr>
-        <w:pStyle w:val="BodyText"/>
-      </w:pPr>
-      <w:r>
-        <w:t xml:space="preserve">두 조건을 함께 적용한 combined condition과 baseline을 직접 비교하면 Korean–English gap은 observable search에서</w:t>
-      </w:r>
-      <w:r>
-        <w:t xml:space="preserve"> </w:t>
-      </w:r>
-      <w:r>
-        <w:rPr>
-          <w:bCs/>
-          <w:b/>
-        </w:rPr>
-        <w:t xml:space="preserve">+5.6pp</w:t>
-      </w:r>
-      <w:r>
-        <w:t xml:space="preserve">, recommendation에서</w:t>
-      </w:r>
-      <w:r>
-        <w:t xml:space="preserve"> </w:t>
-      </w:r>
-      <w:r>
-        <w:rPr>
-          <w:bCs/>
-          <w:b/>
-        </w:rPr>
-        <w:t xml:space="preserve">+6.4pp</w:t>
-      </w:r>
-      <w:r>
-        <w:t xml:space="preserve"> </w:t>
-      </w:r>
-      <w:r>
-        <w:t xml:space="preserve">변화한다. Combined condition에서 한국어 benchmark의 observable-trace recovery는</w:t>
-      </w:r>
-      <w:r>
-        <w:t xml:space="preserve"> </w:t>
-      </w:r>
-      <w:r>
-        <w:rPr>
-          <w:bCs/>
-          <w:b/>
-        </w:rPr>
-        <w:t xml:space="preserve">2.2%</w:t>
-      </w:r>
-      <w:r>
-        <w:t xml:space="preserve">, recommendation recovery는</w:t>
-      </w:r>
-      <w:r>
-        <w:t xml:space="preserve"> </w:t>
-      </w:r>
-      <w:r>
-        <w:rPr>
-          <w:bCs/>
-          <w:b/>
-        </w:rPr>
-        <w:t xml:space="preserve">3.2%</w:t>
-      </w:r>
-      <w:r>
-        <w:t xml:space="preserve">이다. 이는 relative gap의 reversal이지만 높은 절대 recovery를 의미하지 않는다. 한국어 benchmark-paper opportunity의 96% 이상이 여전히 최종 추천에 포함되지 않는다.</w:t>
+        <w:t xml:space="preserve">한국어 query는 observable search 단계의 Korean–English gap을 +3.8pp 변화시키고(95% CI [0.72, 6.88], (p=.016)), Korean-database instruction은 +4.0pp 변화시킨다(95% CI [0.73, 7.27], (p=.017)). Final recommendation에서는 database instruction이 gap을 +3.2pp 변화시킨다(95% CI [0.71, 5.69], (p=.012)). Korean-query estimate는 +2.6pp로 같은 방향이지만 (p=.068)로 더 불확실하다.</w:t>
+      </w:r>
+    </w:p>
+    <w:p>
+      <w:pPr>
+        <w:pStyle w:val="BodyText"/>
+      </w:pPr>
+      <w:r>
+        <w:t xml:space="preserve">두 조건을 함께 적용한 combined condition과 baseline을 직접 비교하면 Korean–English gap은 observable search에서 +5.6pp, recommendation에서 +6.4pp 변화한다. Combined condition에서 한국어 benchmark의 observable-trace recovery는 2.2%, recommendation recovery는 3.2%이다. 이는 relative gap의 reversal이지만 높은 절대 recovery를 의미하지 않는다. 한국어 benchmark-paper opportunity의 96% 이상이 여전히 최종 추천에 포함되지 않는다.</w:t>
       </w:r>
     </w:p>
     <w:p>
@@ -3630,10 +2526,6 @@
               <w:jc w:val="right"/>
             </w:pPr>
             <w:r>
-              <w:rPr>
-                <w:bCs/>
-                <w:b/>
-              </w:rPr>
               <w:t xml:space="preserve">91.2%</w:t>
             </w:r>
           </w:p>
@@ -3645,100 +2537,23 @@
         <w:pStyle w:val="BodyText"/>
       </w:pPr>
       <w:r>
-        <w:t xml:space="preserve">한국어 query는 recommendation의 Korean-language share를</w:t>
-      </w:r>
-      <w:r>
-        <w:t xml:space="preserve"> </w:t>
-      </w:r>
-      <w:r>
-        <w:rPr>
-          <w:bCs/>
-          <w:b/>
-        </w:rPr>
-        <w:t xml:space="preserve">55.7pp</w:t>
-      </w:r>
-      <w:r>
-        <w:t xml:space="preserve"> </w:t>
-      </w:r>
-      <w:r>
-        <w:t xml:space="preserve">증가시키고((p&lt;.001)), Korean-database instruction은</w:t>
-      </w:r>
-      <w:r>
-        <w:t xml:space="preserve"> </w:t>
-      </w:r>
-      <w:r>
-        <w:rPr>
-          <w:bCs/>
-          <w:b/>
-        </w:rPr>
-        <w:t xml:space="preserve">35.4pp</w:t>
-      </w:r>
-      <w:r>
-        <w:t xml:space="preserve"> </w:t>
-      </w:r>
-      <w:r>
-        <w:t xml:space="preserve">증가시킨다((p&lt;.001)). 그러나 combined condition에서도 사전에 선정한 한국어 benchmark의 recommendation recovery는</w:t>
-      </w:r>
-      <w:r>
-        <w:t xml:space="preserve"> </w:t>
-      </w:r>
-      <w:r>
-        <w:rPr>
-          <w:bCs/>
-          <w:b/>
-        </w:rPr>
-        <w:t xml:space="preserve">3.2%</w:t>
-      </w:r>
-      <w:r>
-        <w:t xml:space="preserve">에 그친다.</w:t>
-      </w:r>
-    </w:p>
-    <w:p>
-      <w:pPr>
-        <w:pStyle w:val="BodyText"/>
-      </w:pPr>
-      <w:r>
-        <w:t xml:space="preserve">따라서</w:t>
-      </w:r>
-      <w:r>
-        <w:t xml:space="preserve"> </w:t>
-      </w:r>
-      <w:r>
-        <w:rPr>
-          <w:bCs/>
-          <w:b/>
-        </w:rPr>
-        <w:t xml:space="preserve">추천결과가 한국어 중심으로 구성된다는 것과 한국어권의 사전 지정 주요 문헌이 높은 비율로 회수된다는 것은 동일하지 않다.</w:t>
-      </w:r>
-      <w:r>
-        <w:t xml:space="preserve"> </w:t>
-      </w:r>
-      <w:r>
-        <w:t xml:space="preserve">이는 benchmark 밖의 한국어 논문이 부적절하다는 뜻이 아니라 language representation과 benchmark recovery가 서로 다른 속성을 측정한다는 의미이다.</w:t>
-      </w:r>
-    </w:p>
-    <w:p>
-      <w:pPr>
-        <w:pStyle w:val="BodyText"/>
-      </w:pPr>
-      <w:r>
-        <w:t xml:space="preserve">전체</w:t>
-      </w:r>
-      <w:r>
-        <w:t xml:space="preserve"> </w:t>
-      </w:r>
-      <w:r>
-        <w:rPr>
-          <w:bCs/>
-          <w:b/>
-        </w:rPr>
-        <w:t xml:space="preserve">1,932개의 recommendation occurrence</w:t>
-      </w:r>
-      <w:r>
-        <w:t xml:space="preserve"> </w:t>
-      </w:r>
-      <w:r>
-        <w:t xml:space="preserve">가운데 제공된 링크의 결과는 다음과 같다.</w:t>
+        <w:t xml:space="preserve">한국어 query는 recommendation의 Korean-language share를 55.7pp 증가시키고((p&lt;.001)), Korean-database instruction은 35.4pp 증가시킨다((p&lt;.001)). 그러나 combined condition에서도 사전에 선정한 한국어 benchmark의 recommendation recovery는 3.2%에 그친다.</w:t>
+      </w:r>
+    </w:p>
+    <w:p>
+      <w:pPr>
+        <w:pStyle w:val="BodyText"/>
+      </w:pPr>
+      <w:r>
+        <w:t xml:space="preserve">따라서 추천결과가 한국어 중심으로 구성된다는 것과 한국어권의 사전 지정 주요 문헌이 높은 비율로 회수된다는 것은 동일하지 않다. 이는 benchmark 밖의 한국어 논문이 부적절하다는 뜻이 아니라 language representation과 benchmark recovery가 서로 다른 속성을 측정한다는 의미이다.</w:t>
+      </w:r>
+    </w:p>
+    <w:p>
+      <w:pPr>
+        <w:pStyle w:val="BodyText"/>
+      </w:pPr>
+      <w:r>
+        <w:t xml:space="preserve">전체 1,932개의 recommendation occurrence 가운데 제공된 링크의 결과는 다음과 같다.</w:t>
       </w:r>
     </w:p>
     <w:p>
@@ -3749,14 +2564,7 @@
         </w:numPr>
       </w:pPr>
       <w:r>
-        <w:rPr>
-          <w:bCs/>
-          <w:b/>
-        </w:rPr>
-        <w:t xml:space="preserve">854개(44.2%)</w:t>
-      </w:r>
-      <w:r>
-        <w:t xml:space="preserve">: full text 접근 가능</w:t>
+        <w:t xml:space="preserve">854개(44.2%) — full text 접근 가능</w:t>
       </w:r>
     </w:p>
     <w:p>
@@ -3767,14 +2575,7 @@
         </w:numPr>
       </w:pPr>
       <w:r>
-        <w:rPr>
-          <w:bCs/>
-          <w:b/>
-        </w:rPr>
-        <w:t xml:space="preserve">859개(44.5%)</w:t>
-      </w:r>
-      <w:r>
-        <w:t xml:space="preserve">: 접근 제한</w:t>
+        <w:t xml:space="preserve">859개(44.5%) — 접근 제한</w:t>
       </w:r>
     </w:p>
     <w:p>
@@ -3809,14 +2610,7 @@
         </w:numPr>
       </w:pPr>
       <w:r>
-        <w:rPr>
-          <w:bCs/>
-          <w:b/>
-        </w:rPr>
-        <w:t xml:space="preserve">219개(11.3%)</w:t>
-      </w:r>
-      <w:r>
-        <w:t xml:space="preserve">: invalid 또는 unverifiable</w:t>
+        <w:t xml:space="preserve">219개(11.3%) — invalid 또는 unverifiable</w:t>
       </w:r>
     </w:p>
     <w:p>
@@ -4183,44 +2977,15 @@
         <w:pStyle w:val="FirstParagraph"/>
       </w:pPr>
       <w:r>
-        <w:t xml:space="preserve">Study 2에서 한국어–영어 가시성 격차는</w:t>
-      </w:r>
-      <w:r>
-        <w:t xml:space="preserve"> </w:t>
-      </w:r>
-      <w:r>
-        <w:rPr>
-          <w:bCs/>
-          <w:b/>
-        </w:rPr>
-        <w:t xml:space="preserve">검색과 최종 source selection에서 직접 관찰된다.</w:t>
-      </w:r>
-      <w:r>
-        <w:t xml:space="preserve"> </w:t>
-      </w:r>
-      <w:r>
-        <w:t xml:space="preserve">영어 general-web baseline에서는 한국어 benchmark가 observable search trace와 recommendation에서 모두 회수되지 않았으며, 한국어 질의와 한국 학술 데이터베이스 지시는 상대적 gap을 줄였다. 그러나 이러한 조건 변화가 높은 절대 recovery로 이어지지는 않았다.</w:t>
-      </w:r>
-    </w:p>
-    <w:p>
-      <w:pPr>
-        <w:pStyle w:val="BodyText"/>
-      </w:pPr>
-      <w:r>
-        <w:t xml:space="preserve">두 조건을 함께 적용한 경우에는 gap의 방향이 반전되지만, 이는 한국어 benchmark가 충분히 회수되었다는 의미가 아니다. 검색 회수율 2.2%와 추천 회수율 3.2%는</w:t>
-      </w:r>
-      <w:r>
-        <w:t xml:space="preserve"> </w:t>
-      </w:r>
-      <w:r>
-        <w:rPr>
-          <w:bCs/>
-          <w:b/>
-        </w:rPr>
-        <w:t xml:space="preserve">상대적 격차의 개선과 절대적 discovery bottleneck이 동시에 존재할 수 있음</w:t>
-      </w:r>
-      <w:r>
-        <w:t xml:space="preserve">을 보여준다. 또한 search trace는 provider가 공개한 범위만 관찰하므로 내부 retrieval 전체로 해석하지 않는다.</w:t>
+        <w:t xml:space="preserve">Study 2에서 한국어–영어 가시성 격차는 검색과 최종 source selection에서 직접 관찰된다. 영어 general-web baseline에서는 한국어 benchmark가 observable search trace와 recommendation에서 모두 회수되지 않았으며, 한국어 질의와 한국 학술 데이터베이스 지시는 상대적 gap을 줄였다. 그러나 이러한 조건 변화가 높은 절대 recovery로 이어지지는 않았다.</w:t>
+      </w:r>
+    </w:p>
+    <w:p>
+      <w:pPr>
+        <w:pStyle w:val="BodyText"/>
+      </w:pPr>
+      <w:r>
+        <w:t xml:space="preserve">두 조건을 함께 적용한 경우에는 gap의 방향이 반전되지만, 이는 한국어 benchmark가 충분히 회수되었다는 의미가 아니다. 검색 회수율 2.2%와 추천 회수율 3.2%는 상대적 격차의 개선과 절대적 discovery bottleneck이 동시에 존재할 수 있음을 보여준다. 또한 search trace는 provider가 공개한 범위만 관찰하므로 내부 retrieval 전체로 해석하지 않는다.</w:t>
       </w:r>
     </w:p>
     <w:p>
@@ -4264,77 +3029,31 @@
         <w:pStyle w:val="FirstParagraph"/>
       </w:pPr>
       <w:r>
-        <w:t xml:space="preserve">두 Study가 공통으로 보여주는 것은</w:t>
-      </w:r>
-      <w:r>
-        <w:t xml:space="preserve"> </w:t>
-      </w:r>
-      <w:r>
-        <w:rPr>
-          <w:bCs/>
-          <w:b/>
-        </w:rPr>
-        <w:t xml:space="preserve">한국어권에서 학술적으로 사용되거나 주요하게 다뤄진 문헌이 다른 검색환경에서 자동적으로 동일한 가시성을 갖는 것은 아니라는 점</w:t>
-      </w:r>
-      <w:r>
-        <w:t xml:space="preserve">이다. 다만 두 연구에서 가시성이 의미하는 바와 증거의 성격은 구분해야 한다.</w:t>
-      </w:r>
-    </w:p>
-    <w:p>
-      <w:pPr>
-        <w:pStyle w:val="BodyText"/>
-      </w:pPr>
-      <w:r>
-        <w:t xml:space="preserve">Study 1의 분석대상은 2000–2025년에 생산된 한국어권 정치학 논문들이 인용한 한국 정치 관련 문헌이다. 이 문헌들 가운데 현재 Google Scholar의 known-item search에서 확인되는 논문과 그렇지 않은 논문의 영어권 인용확률 격차는 시기에 따라 다르게 나타났다. 특히 기준기간보다 2010–2014년과 2015–2019년에 격차가 확대되었지만, 2020–2024년에는 추가 확대가 확인되지 않았다. 여기서 가시성은 broad discovery가 아니라</w:t>
-      </w:r>
-      <w:r>
-        <w:t xml:space="preserve"> </w:t>
-      </w:r>
-      <w:r>
-        <w:rPr>
-          <w:bCs/>
-          <w:b/>
-        </w:rPr>
-        <w:t xml:space="preserve">현재 bibliographic retrievability</w:t>
-      </w:r>
-      <w:r>
-        <w:t xml:space="preserve">를 의미하며, 영어권 citation은 그와 비교되는 별도의 historical outcome이다.</w:t>
-      </w:r>
-    </w:p>
-    <w:p>
-      <w:pPr>
-        <w:pStyle w:val="BodyText"/>
-      </w:pPr>
-      <w:r>
-        <w:t xml:space="preserve">Study 2에서는 가시성을 현재의 생성형 검색과정에서 직접 관찰한다. 영어 general-web baseline에서 한국어 benchmark의 observable search-trace recovery와 final recommendation recovery가 영어 benchmark보다 낮았고, 그 격차는 한국어 질의와 한국 학술 데이터베이스 지시에 따라 변화하였다. 따라서 Study 2의 가시성은</w:t>
-      </w:r>
-      <w:r>
-        <w:t xml:space="preserve"> </w:t>
-      </w:r>
-      <w:r>
-        <w:rPr>
-          <w:bCs/>
-          <w:b/>
-        </w:rPr>
-        <w:t xml:space="preserve">사전에 정의한 문헌이 검색과 최종 source selection을 통과하는가</w:t>
-      </w:r>
-      <w:r>
-        <w:t xml:space="preserve">를 의미한다.</w:t>
-      </w:r>
-    </w:p>
-    <w:p>
-      <w:pPr>
-        <w:pStyle w:val="BodyText"/>
-      </w:pPr>
-      <w:r>
-        <w:rPr>
-          <w:bCs/>
-          <w:b/>
-        </w:rPr>
-        <w:t xml:space="preserve">Figure 1에서 보듯이</w:t>
-      </w:r>
-      <w:r>
-        <w:t xml:space="preserve">, Study 1의 격차 확대는 C2와 C3에 집중되고 C4에서는 확인되지 않는다. Study 2에서는 baseline의 한국어 deficit이 검색조건에 따라 반전되지만 절대 recovery는 낮으며, combined condition에서 한국어 추천 비율은 91.2%까지 증가해도 한국어 benchmark recommendation recovery는 3.2%에 머문다.</w:t>
+        <w:t xml:space="preserve">두 Study가 공통으로 보여주는 것은 한국어권에서 학술적으로 사용되거나 주요하게 다뤄진 문헌이 다른 검색환경에서 자동적으로 동일한 가시성을 갖는 것은 아니라는 점이다. 다만 두 연구에서 가시성이 의미하는 바와 증거의 성격은 구분해야 한다.</w:t>
+      </w:r>
+    </w:p>
+    <w:p>
+      <w:pPr>
+        <w:pStyle w:val="BodyText"/>
+      </w:pPr>
+      <w:r>
+        <w:t xml:space="preserve">Study 1의 분석대상은 2000–2025년에 생산된 한국어권 정치학 논문들이 인용한 한국 정치 관련 문헌이다. 이 문헌들 가운데 현재 Google Scholar의 known-item search에서 확인되는 논문과 그렇지 않은 논문의 영어권 인용확률 격차는 시기에 따라 다르게 나타났다. 특히 기준기간보다 2010–2014년과 2015–2019년에 격차가 확대되었지만, 2020–2024년에는 추가 확대가 확인되지 않았다. 여기서 가시성은 broad discovery가 아니라 현재 bibliographic retrievability를 의미하며, 영어권 citation은 그와 비교되는 별도의 historical outcome이다.</w:t>
+      </w:r>
+    </w:p>
+    <w:p>
+      <w:pPr>
+        <w:pStyle w:val="BodyText"/>
+      </w:pPr>
+      <w:r>
+        <w:t xml:space="preserve">Study 2에서는 가시성을 현재의 생성형 검색과정에서 직접 관찰한다. 영어 general-web baseline에서 한국어 benchmark의 observable search-trace recovery와 final recommendation recovery가 영어 benchmark보다 낮았고, 그 격차는 한국어 질의와 한국 학술 데이터베이스 지시에 따라 변화하였다. 따라서 Study 2의 가시성은 사전에 정의한 문헌이 검색과 최종 source selection을 통과하는가를 의미한다.</w:t>
+      </w:r>
+    </w:p>
+    <w:p>
+      <w:pPr>
+        <w:pStyle w:val="BodyText"/>
+      </w:pPr>
+      <w:r>
+        <w:t xml:space="preserve">Figure 1에서 보듯이, Study 1의 격차 확대는 C2와 C3에 집중되고 C4에서는 확인되지 않는다. Study 2에서는 baseline의 한국어 deficit이 검색조건에 따라 반전되지만 절대 recovery는 낮으며, combined condition에서 한국어 추천 비율은 91.2%까지 증가해도 한국어 benchmark recommendation recovery는 3.2%에 머문다.</w:t>
       </w:r>
     </w:p>
     <w:p>
@@ -4397,41 +3116,15 @@
         <w:pStyle w:val="BodyText"/>
       </w:pPr>
       <w:r>
-        <w:t xml:space="preserve">이 차이 때문에 두 결과를 하나의 인과 메커니즘으로 결합해서는 안 된다. Study 1은 현재의 paper-level retrievability와 historical English-language citation pattern 사이의 association을 보여주며, Study 2는 현재 조건에서 나타나는 retrieval 및 recommendation difference를 실험적으로 비교한다. 두 연구가 공유하는 것은</w:t>
-      </w:r>
-      <w:r>
-        <w:t xml:space="preserve"> </w:t>
-      </w:r>
-      <w:r>
-        <w:rPr>
-          <w:bCs/>
-          <w:b/>
-        </w:rPr>
-        <w:t xml:space="preserve">검색환경이 문헌을 후보로 포함하고 선택하는 과정 자체가 관찰 가능한 차이를 만든다는 것</w:t>
-      </w:r>
-      <w:r>
-        <w:t xml:space="preserve">이다.</w:t>
-      </w:r>
-    </w:p>
-    <w:p>
-      <w:pPr>
-        <w:pStyle w:val="BodyText"/>
-      </w:pPr>
-      <w:r>
-        <w:t xml:space="preserve">Study 2의 결과는 특히</w:t>
-      </w:r>
-      <w:r>
-        <w:t xml:space="preserve"> </w:t>
-      </w:r>
-      <w:r>
-        <w:rPr>
-          <w:bCs/>
-          <w:b/>
-        </w:rPr>
-        <w:t xml:space="preserve">language representation과 scholarly recovery의 차이</w:t>
-      </w:r>
-      <w:r>
-        <w:t xml:space="preserve">를 명확하게 보여준다. Combined condition에서는 추천의 91.2%가 한국어 논문이지만 사전에 선정한 한국어 benchmark의 recommendation recovery는 3.2%이다. 따라서 결과목록이 언어적으로 local해 보이는 것과 특정 local scholarly record가 실제로 가시화되는 것은 다른 문제이다.</w:t>
+        <w:t xml:space="preserve">이 차이 때문에 두 결과를 하나의 인과 메커니즘으로 결합해서는 안 된다. Study 1은 현재의 paper-level retrievability와 historical English-language citation pattern 사이의 association을 보여주며, Study 2는 현재 조건에서 나타나는 retrieval 및 recommendation difference를 실험적으로 비교한다. 두 연구가 공유하는 것은 검색환경이 문헌을 후보로 포함하고 선택하는 과정 자체가 관찰 가능한 차이를 만든다는 것이다.</w:t>
+      </w:r>
+    </w:p>
+    <w:p>
+      <w:pPr>
+        <w:pStyle w:val="BodyText"/>
+      </w:pPr>
+      <w:r>
+        <w:t xml:space="preserve">Study 2의 결과는 특히 language representation과 scholarly recovery의 차이를 명확하게 보여준다. Combined condition에서는 추천의 91.2%가 한국어 논문이지만 사전에 선정한 한국어 benchmark의 recommendation recovery는 3.2%이다. 따라서 결과목록이 언어적으로 local해 보이는 것과 특정 local scholarly record가 실제로 가시화되는 것은 다른 문제이다.</w:t>
       </w:r>
     </w:p>
     <w:p>
@@ -4451,20 +3144,7 @@
         <w:t xml:space="preserve">retrieval → access → citation</w:t>
       </w:r>
       <w:r>
-        <w:t xml:space="preserve">이라는 단일한 연쇄효과를 지지하지 않는다.</w:t>
-      </w:r>
-      <w:r>
-        <w:t xml:space="preserve"> </w:t>
-      </w:r>
-      <w:r>
-        <w:rPr>
-          <w:bCs/>
-          <w:b/>
-        </w:rPr>
-        <w:t xml:space="preserve">검색가능성, source selection, access through provided links는 서로 구분되는 결과</w:t>
-      </w:r>
-      <w:r>
-        <w:t xml:space="preserve">이다.</w:t>
+        <w:t xml:space="preserve">이라는 단일한 연쇄효과를 지지하지 않는다. 검색가능성, source selection, access through provided links는 서로 구분되는 결과이다.</w:t>
       </w:r>
     </w:p>
     <w:p>
@@ -4498,62 +3178,23 @@
         <w:pStyle w:val="BodyText"/>
       </w:pPr>
       <w:r>
-        <w:t xml:space="preserve">본 연구가 추가하는 것은</w:t>
-      </w:r>
-      <w:r>
-        <w:t xml:space="preserve"> </w:t>
-      </w:r>
-      <w:r>
-        <w:rPr>
-          <w:bCs/>
-          <w:b/>
-        </w:rPr>
-        <w:t xml:space="preserve">문헌이 검색 가능한 후보가 되고 최종 출처로 선택되는 과정도 국제적 가시성의 한 차원으로 측정할 수 있다는 점</w:t>
-      </w:r>
-      <w:r>
-        <w:t xml:space="preserve">이다. 한국어권에서 이미 인용된 문헌이라도 현재 국제적으로 이용되는 학술검색 환경에서 모두 동일하게 검색되는 것은 아니며, 생성형 검색이 다수의 한국어 논문을 제시하더라도 한국어권의 사전 지정 주요 문헌이 같은 정도로 회수되는 것도 아니다.</w:t>
-      </w:r>
-    </w:p>
-    <w:p>
-      <w:pPr>
-        <w:pStyle w:val="BodyText"/>
-      </w:pPr>
-      <w:r>
-        <w:t xml:space="preserve">이 관점에서 검색환경은 문헌의 학술적 가치를 직접 결정한다기보다</w:t>
-      </w:r>
-      <w:r>
-        <w:t xml:space="preserve"> </w:t>
-      </w:r>
-      <w:r>
-        <w:rPr>
-          <w:bCs/>
-          <w:b/>
-        </w:rPr>
-        <w:t xml:space="preserve">어떤 문헌이 평가받을 후보집합에 들어오는가</w:t>
-      </w:r>
-      <w:r>
-        <w:t xml:space="preserve">를 구조화한다. Discovery bottleneck의 정치학적 의미는 검색결과의 언어적 외형보다, 현지 학술공간에서 축적된 구체적 문헌이 실제 평가대상으로 제시되는지를 묻는 데 있다.</w:t>
-      </w:r>
-    </w:p>
-    <w:p>
-      <w:pPr>
-        <w:pStyle w:val="BodyText"/>
-      </w:pPr>
-      <w:r>
-        <w:t xml:space="preserve">이 문제는 동일한 정치현상에 대해 현지어와 영어의 학술문헌이 병존하는 경우에 특히 중요하다. 한국 정치에 관한 국제적 지식을 영어권 학술지나 국제 citation index 또는 생성된 reading list만으로 파악하면,</w:t>
-      </w:r>
-      <w:r>
-        <w:t xml:space="preserve"> </w:t>
-      </w:r>
-      <w:r>
-        <w:rPr>
-          <w:bCs/>
-          <w:b/>
-        </w:rPr>
-        <w:t xml:space="preserve">한국어권에 축적된 문헌과 실제로 외부 검색환경에서 가시화되는 subset 사이의 차이</w:t>
-      </w:r>
-      <w:r>
-        <w:t xml:space="preserve">를 놓칠 수 있다.</w:t>
+        <w:t xml:space="preserve">본 연구가 추가하는 것은 문헌이 검색 가능한 후보가 되고 최종 출처로 선택되는 과정도 국제적 가시성의 한 차원으로 측정할 수 있다는 점이다. 한국어권에서 이미 인용된 문헌이라도 현재 국제적으로 이용되는 학술검색 환경에서 모두 동일하게 검색되는 것은 아니며, 생성형 검색이 다수의 한국어 논문을 제시하더라도 한국어권의 사전 지정 주요 문헌이 같은 정도로 회수되는 것도 아니다.</w:t>
+      </w:r>
+    </w:p>
+    <w:p>
+      <w:pPr>
+        <w:pStyle w:val="BodyText"/>
+      </w:pPr>
+      <w:r>
+        <w:t xml:space="preserve">이 관점에서 검색환경은 문헌의 학술적 가치를 직접 결정한다기보다 어떤 문헌이 평가받을 후보집합에 들어오는가를 구조화한다. Discovery bottleneck의 정치학적 의미는 검색결과의 언어적 외형보다, 현지 학술공간에서 축적된 구체적 문헌이 실제 평가대상으로 제시되는지를 묻는 데 있다.</w:t>
+      </w:r>
+    </w:p>
+    <w:p>
+      <w:pPr>
+        <w:pStyle w:val="BodyText"/>
+      </w:pPr>
+      <w:r>
+        <w:t xml:space="preserve">이 문제는 동일한 정치현상에 대해 현지어와 영어의 학술문헌이 병존하는 경우에 특히 중요하다. 한국 정치에 관한 국제적 지식을 영어권 학술지나 국제 citation index 또는 생성된 reading list만으로 파악하면, 한국어권에 축적된 문헌과 실제로 외부 검색환경에서 가시화되는 subset 사이의 차이를 놓칠 수 있다.</w:t>
       </w:r>
     </w:p>
     <w:p>
@@ -4576,62 +3217,23 @@
         <w:t xml:space="preserve">”</w:t>
       </w:r>
       <w:r>
-        <w:t xml:space="preserve">는 진술보다</w:t>
-      </w:r>
-      <w:r>
-        <w:t xml:space="preserve"> </w:t>
-      </w:r>
-      <w:r>
-        <w:rPr>
-          <w:bCs/>
-          <w:b/>
-        </w:rPr>
-        <w:t xml:space="preserve">동일한 비교범위 안에서 어떤 구체적인 문헌이 검색과 선택을 통과하는가</w:t>
-      </w:r>
-      <w:r>
-        <w:t xml:space="preserve">에 초점을 둔다.</w:t>
-      </w:r>
-    </w:p>
-    <w:p>
-      <w:pPr>
-        <w:pStyle w:val="BodyText"/>
-      </w:pPr>
-      <w:r>
-        <w:t xml:space="preserve">이러한 관점에서 본 논문의</w:t>
-      </w:r>
-      <w:r>
-        <w:t xml:space="preserve"> </w:t>
-      </w:r>
-      <w:r>
-        <w:rPr>
-          <w:bCs/>
-          <w:b/>
-        </w:rPr>
-        <w:t xml:space="preserve">discovery bottleneck</w:t>
-      </w:r>
-      <w:r>
-        <w:t xml:space="preserve">은 문헌이 관련성이나 학술적 가치에 대한 실질적 평가를 받기 전에 검색과 선택의 관찰 가능한 단계에서 후보집합에 들어오지 못하거나 최종 출처로 남지 못하는 현상을 가리킨다. Study 1에서는 현재 known-item lookup에서도 bibliographic record가 반환되지 않는 상태가 가장 좁은 형태의 bottleneck이고, Study 2에서는 benchmark가 observable search trace 또는 final recommendation에 진입하지 못하는 상태가 이에 해당한다. 두 경우 모두 다른 경로를 통한 발견 가능성을 부정하는 개념은 아니다.</w:t>
-      </w:r>
-    </w:p>
-    <w:p>
-      <w:pPr>
-        <w:pStyle w:val="BodyText"/>
-      </w:pPr>
-      <w:r>
-        <w:t xml:space="preserve">후속연구에서는 이러한 검색상태를 longitudinal하게 관찰할 필요가 있다. Google Scholar에서 동일한 문헌의 retrievability와 status of provided links를 반복 측정하면 현재 Study 1에서 관찰할 수 없는 indexing 및 접근경로의 변화를 직접 기록할 수 있다. 생성형 검색에서도 동일 benchmark와 조건을 반복 적용하면 현재 관찰된 recovery pattern이 시간이 지나면서 어떻게 변화하는지를 확인할 수 있다. 이러한 자료는</w:t>
-      </w:r>
-      <w:r>
-        <w:t xml:space="preserve"> </w:t>
-      </w:r>
-      <w:r>
-        <w:rPr>
-          <w:bCs/>
-          <w:b/>
-        </w:rPr>
-        <w:t xml:space="preserve">현재 검색상태와 과거 scholarly circulation 사이의 시간적 간극</w:t>
-      </w:r>
-      <w:r>
-        <w:t xml:space="preserve">을 줄이고 discovery bottleneck의 형성과 변화를 보다 직접적으로 분석할 수 있게 한다.</w:t>
+        <w:t xml:space="preserve">는 진술보다 동일한 비교범위 안에서 어떤 구체적인 문헌이 검색과 선택을 통과하는가에 초점을 둔다.</w:t>
+      </w:r>
+    </w:p>
+    <w:p>
+      <w:pPr>
+        <w:pStyle w:val="BodyText"/>
+      </w:pPr>
+      <w:r>
+        <w:t xml:space="preserve">이러한 관점에서 본 논문의 discovery bottleneck은 문헌이 관련성이나 학술적 가치에 대한 실질적 평가를 받기 전에 검색과 선택의 관찰 가능한 단계에서 후보집합에 들어오지 못하거나 최종 출처로 남지 못하는 현상을 가리킨다. Study 1에서는 현재 known-item lookup에서도 bibliographic record가 반환되지 않는 상태가 가장 좁은 형태의 bottleneck이고, Study 2에서는 benchmark가 observable search trace 또는 final recommendation에 진입하지 못하는 상태가 이에 해당한다. 두 경우 모두 다른 경로를 통한 발견 가능성을 부정하는 개념은 아니다.</w:t>
+      </w:r>
+    </w:p>
+    <w:p>
+      <w:pPr>
+        <w:pStyle w:val="BodyText"/>
+      </w:pPr>
+      <w:r>
+        <w:t xml:space="preserve">후속연구에서는 이러한 검색상태를 longitudinal하게 관찰할 필요가 있다. Google Scholar에서 동일한 문헌의 retrievability와 status of provided links를 반복 측정하면 현재 Study 1에서 관찰할 수 없는 indexing 및 접근경로의 변화를 직접 기록할 수 있다. 생성형 검색에서도 동일 benchmark와 조건을 반복 적용하면 현재 관찰된 recovery pattern이 시간이 지나면서 어떻게 변화하는지를 확인할 수 있다. 이러한 자료는 현재 검색상태와 과거 scholarly circulation 사이의 시간적 간극을 줄이고 discovery bottleneck의 형성과 변화를 보다 직접적으로 분석할 수 있게 한다.</w:t>
       </w:r>
     </w:p>
     <w:bookmarkEnd w:id="41"/>
@@ -4650,72 +3252,23 @@
         <w:pStyle w:val="FirstParagraph"/>
       </w:pPr>
       <w:r>
-        <w:t xml:space="preserve">한국 정치학의 국제적 가시성은 어떤 연구가 출판되고 최종적으로 인용되는가만으로 완전히 포착되지 않는다. 그 사이에는 문헌이 특정 검색환경에서</w:t>
-      </w:r>
-      <w:r>
-        <w:t xml:space="preserve"> </w:t>
-      </w:r>
-      <w:r>
-        <w:rPr>
-          <w:bCs/>
-          <w:b/>
-        </w:rPr>
-        <w:t xml:space="preserve">검색 가능한 후보로 나타나는지, 최종 출처로 선택되는지, 그리고 원문으로 연결되는지</w:t>
-      </w:r>
-      <w:r>
-        <w:t xml:space="preserve">라는 서로 구분되는 단계가 존재한다.</w:t>
-      </w:r>
-    </w:p>
-    <w:p>
-      <w:pPr>
-        <w:pStyle w:val="BodyText"/>
-      </w:pPr>
-      <w:r>
-        <w:t xml:space="preserve">Study 1은</w:t>
-      </w:r>
-      <w:r>
-        <w:t xml:space="preserve"> </w:t>
-      </w:r>
-      <w:r>
-        <w:rPr>
-          <w:bCs/>
-          <w:b/>
-        </w:rPr>
-        <w:t xml:space="preserve">2000–2025년에 생산된 한국어권 정치학 논문들이 인용한 한국 정치 관련 논문 54,789편</w:t>
-      </w:r>
-      <w:r>
-        <w:t xml:space="preserve">을 대상으로 현재 Google Scholar의 paper-level retrievability와 과거 영어권 인용패턴을 비교하였다. 현재 검색 가능한 논문과 그렇지 않은 논문의 영어권 인용확률 격차는 기준기간보다 2010–2014년과 2015–2019년에 유의하게 더 컸으나 2020–2024년에는 추가적인 확대가 확인되지 않았다. 현재 Google Scholar가 제공하는 full-text route는 영어권 citation incidence와 별도의 유의한 관계를 보이지 않았다. 이는 Google Scholar의 역사적 인과효과가 아니라</w:t>
-      </w:r>
-      <w:r>
-        <w:t xml:space="preserve"> </w:t>
-      </w:r>
-      <w:r>
-        <w:rPr>
-          <w:bCs/>
-          <w:b/>
-        </w:rPr>
-        <w:t xml:space="preserve">현재 known-item retrievability에 따라 historical citation trajectory가 다르게 나타난다는 제한적인 association</w:t>
-      </w:r>
-      <w:r>
-        <w:t xml:space="preserve">이다.</w:t>
-      </w:r>
-    </w:p>
-    <w:p>
-      <w:pPr>
-        <w:pStyle w:val="BodyText"/>
-      </w:pPr>
-      <w:r>
-        <w:t xml:space="preserve">Study 2에서는 양 언어권에서 모두 연구되어 온 동일한 한국 정치 주제를 기준으로 한국어와 영어 benchmark를 사전에 구성하여 현재의 생성형 검색을 감사하였다. 영어 general-web baseline에서는 한국어 benchmark가 검색과 final recommendation에서 영어 benchmark보다 유의하게 덜 회수되었다. 한국어 질의와 한국 학술 데이터베이스 지시는 이 상대적 격차를 줄였지만 절대적인 한국어 benchmark recovery는 낮게 유지되었다. 특히 combined condition에서 recommendation의 91.2%가 한국어 논문이어도 사전 지정 한국어 benchmark의 recommendation recovery는 3.2%였다. 따라서</w:t>
-      </w:r>
-      <w:r>
-        <w:t xml:space="preserve"> </w:t>
-      </w:r>
-      <w:r>
-        <w:rPr>
-          <w:bCs/>
-          <w:b/>
-        </w:rPr>
-        <w:t xml:space="preserve">한국어 문헌이 많이 보이는 것과 한국어권의 주요 문헌이 실제로 회수되는 것은 동일하지 않았다.</w:t>
+        <w:t xml:space="preserve">한국 정치학의 국제적 가시성은 어떤 연구가 출판되고 최종적으로 인용되는가만으로 완전히 포착되지 않는다. 그 사이에는 문헌이 특정 검색환경에서 검색 가능한 후보로 나타나는지, 최종 출처로 선택되는지, 그리고 원문으로 연결되는지라는 서로 구분되는 단계가 존재한다.</w:t>
+      </w:r>
+    </w:p>
+    <w:p>
+      <w:pPr>
+        <w:pStyle w:val="BodyText"/>
+      </w:pPr>
+      <w:r>
+        <w:t xml:space="preserve">Study 1은 2000–2025년에 생산된 한국어권 정치학 논문들이 인용한 한국 정치 관련 논문 54,789편을 대상으로 현재 Google Scholar의 paper-level retrievability와 과거 영어권 인용패턴을 비교하였다. 현재 검색 가능한 논문과 그렇지 않은 논문의 영어권 인용확률 격차는 기준기간보다 2010–2014년과 2015–2019년에 유의하게 더 컸으나 2020–2024년에는 추가적인 확대가 확인되지 않았다. 현재 Google Scholar가 제공하는 full-text route는 영어권 citation incidence와 별도의 유의한 관계를 보이지 않았다. 이는 Google Scholar의 역사적 인과효과가 아니라 현재 known-item retrievability에 따라 historical citation trajectory가 다르게 나타난다는 제한적인 association이다.</w:t>
+      </w:r>
+    </w:p>
+    <w:p>
+      <w:pPr>
+        <w:pStyle w:val="BodyText"/>
+      </w:pPr>
+      <w:r>
+        <w:t xml:space="preserve">Study 2에서는 양 언어권에서 모두 연구되어 온 동일한 한국 정치 주제를 기준으로 한국어와 영어 benchmark를 사전에 구성하여 현재의 생성형 검색을 감사하였다. 영어 general-web baseline에서는 한국어 benchmark가 검색과 final recommendation에서 영어 benchmark보다 유의하게 덜 회수되었다. 한국어 질의와 한국 학술 데이터베이스 지시는 이 상대적 격차를 줄였지만 절대적인 한국어 benchmark recovery는 낮게 유지되었다. 특히 combined condition에서 recommendation의 91.2%가 한국어 논문이어도 사전 지정 한국어 benchmark의 recommendation recovery는 3.2%였다. 따라서 한국어 문헌이 많이 보이는 것과 한국어권의 주요 문헌이 실제로 회수되는 것은 동일하지 않았다.</w:t>
       </w:r>
     </w:p>
     <w:p>
@@ -4731,54 +3284,15 @@
         <w:pStyle w:val="BodyText"/>
       </w:pPr>
       <w:r>
-        <w:t xml:space="preserve">이 논문에서</w:t>
-      </w:r>
-      <w:r>
-        <w:t xml:space="preserve"> </w:t>
-      </w:r>
-      <w:r>
-        <w:rPr>
-          <w:bCs/>
-          <w:b/>
-        </w:rPr>
-        <w:t xml:space="preserve">discovery bottleneck</w:t>
-      </w:r>
-      <w:r>
-        <w:t xml:space="preserve">은 바로 이러한 구분을 포착하기 위한 조작적 개념이다. 문헌은 학술적으로 존재하고 한 학술공간에서 이미 이용되고 있어도 특정 검색환경에서 후보로 나타나지 않을 수 있으며, 검색단계에 진입하더라도 최종 출처로 선택되지 않을 수 있다. 이 개념은 검색기술이 국제적 지식 불평등을 단독으로 발생시킨다는 주장이 아니다. 한국 정치학처럼 한국어권과 영어권에 병렬적인 연구축적이 존재하는 경우,</w:t>
-      </w:r>
-      <w:r>
-        <w:t xml:space="preserve"> </w:t>
-      </w:r>
-      <w:r>
-        <w:rPr>
-          <w:bCs/>
-          <w:b/>
-        </w:rPr>
-        <w:t xml:space="preserve">어떤 문헌이 생산되고 인용되는가와 함께 어떤 문헌이 실제 검색환경에서 가시화되는가를 별도의 국제적 가시성의 차원으로 분석할 필요가 있다는 주장</w:t>
-      </w:r>
-      <w:r>
-        <w:t xml:space="preserve">이다.</w:t>
-      </w:r>
-    </w:p>
-    <w:p>
-      <w:pPr>
-        <w:pStyle w:val="BodyText"/>
-      </w:pPr>
-      <w:r>
-        <w:t xml:space="preserve">이 점에서 본 연구는 국제적 가시성을 최종 인용의 결과만으로 보지 않고, 문헌이 평가대상이 되기 전의 검색단계까지 분석범위를 확장한다. 한국어권에서 축적된 지식과 특정 검색환경이 실제로 보여주는 지식 사이의 차이를 측정하는 것은, 국제 정치학에서 어떤 연구가 실질적으로</w:t>
-      </w:r>
-      <w:r>
-        <w:t xml:space="preserve"> </w:t>
-      </w:r>
-      <w:r>
-        <w:rPr>
-          <w:bCs/>
-          <w:b/>
-        </w:rPr>
-        <w:t xml:space="preserve">발견 가능한 scholarly record</w:t>
-      </w:r>
-      <w:r>
-        <w:t xml:space="preserve">가 되는지를 이해하기 위한 추가적인 분석축을 제공한다.</w:t>
+        <w:t xml:space="preserve">이 논문에서 discovery bottleneck은 바로 이러한 구분을 포착하기 위한 조작적 개념이다. 문헌은 학술적으로 존재하고 한 학술공간에서 이미 이용되고 있어도 특정 검색환경에서 후보로 나타나지 않을 수 있으며, 검색단계에 진입하더라도 최종 출처로 선택되지 않을 수 있다. 이 개념은 검색기술이 국제적 지식 불평등을 단독으로 발생시킨다는 주장이 아니다. 한국 정치학처럼 한국어권과 영어권에 병렬적인 연구축적이 존재하는 경우, 어떤 문헌이 생산되고 인용되는가와 함께 어떤 문헌이 실제 검색환경에서 가시화되는가를 별도의 국제적 가시성의 차원으로 분석할 필요가 있다는 주장이다.</w:t>
+      </w:r>
+    </w:p>
+    <w:p>
+      <w:pPr>
+        <w:pStyle w:val="BodyText"/>
+      </w:pPr>
+      <w:r>
+        <w:t xml:space="preserve">이 점에서 본 연구는 국제적 가시성을 최종 인용의 결과만으로 보지 않고, 문헌이 평가대상이 되기 전의 검색단계까지 분석범위를 확장한다. 한국어권에서 축적된 지식과 특정 검색환경이 실제로 보여주는 지식 사이의 차이를 측정하는 것은, 국제 정치학에서 어떤 연구가 실질적으로 발견 가능한 scholarly record가 되는지를 이해하기 위한 추가적인 분석축을 제공한다.</w:t>
       </w:r>
     </w:p>
     <w:bookmarkEnd w:id="43"/>
@@ -4796,65 +3310,23 @@
         <w:pStyle w:val="FirstParagraph"/>
       </w:pPr>
       <w:r>
-        <w:t xml:space="preserve">Study 1의 가장 중요한 한계는</w:t>
-      </w:r>
-      <w:r>
-        <w:t xml:space="preserve"> </w:t>
-      </w:r>
-      <w:r>
-        <w:rPr>
-          <w:bCs/>
-          <w:b/>
-        </w:rPr>
-        <w:t xml:space="preserve">2026년에 관찰한 Google Scholar 환경과 과거 영어권 인용이 발생할 당시의 검색환경이 동일하지 않다는 점</w:t>
-      </w:r>
-      <w:r>
-        <w:t xml:space="preserve">이다. 각 target이 언제 Google Scholar에 처음 포함되었는지, 어느 시점부터 현재와 같은 제목으로 검색 가능했는지, 또는 당시 어떤 full-text link가 제공되었는지는 알 수 없다. 과거 연구자들이 실제로 Google Scholar를 통해 해당 문헌을 발견했는지도 관찰하지 않는다. 연구자들은 Web of Science, 도서관 데이터베이스, 참고문헌 추적, 학술지 browsing, 동료 추천 등 다양한 경로를 사용할 수 있었으므로 현재 retrievability를 과거의 실제 discovery opportunity와 동일시할 수 없다.</w:t>
-      </w:r>
-    </w:p>
-    <w:p>
-      <w:pPr>
-        <w:pStyle w:val="BodyText"/>
-      </w:pPr>
-      <w:r>
-        <w:t xml:space="preserve">Citation cohort는 이 문제를 해결하기 위한 historical indexing proxy가 아니다. 그 목적은 현재 retrievability에 따른 영어권 인용격차가 서로 다른 기간에 어떻게 나타났는지를 비교하는 데 있다.</w:t>
-      </w:r>
-      <w:r>
-        <w:t xml:space="preserve"> </w:t>
-      </w:r>
-      <w:r>
-        <w:rPr>
-          <w:bCs/>
-          <w:b/>
-        </w:rPr>
-        <w:t xml:space="preserve">Pre-2005 restriction 역시 historical search environment를 복원하지 않는다.</w:t>
-      </w:r>
-      <w:r>
-        <w:t xml:space="preserve"> </w:t>
-      </w:r>
-      <w:r>
-        <w:t xml:space="preserve">이 분석은 늦게 출판된 target이 초기 cohort에 기여하지 못해 발생하는 eligible-target composition의 변화를 줄이고, 네 기간 모두에서 비교 가능한 보다 일정한 target set에서도 결과가 나타나는지를 점검하기 위한 것이다.</w:t>
-      </w:r>
-    </w:p>
-    <w:p>
-      <w:pPr>
-        <w:pStyle w:val="BodyText"/>
-      </w:pPr>
-      <w:r>
-        <w:t xml:space="preserve">현재 Google Scholar retrievability 자체가 이전 scholarly circulation과 관련되어 있을 가능성도 남는다. 널리 인용되거나 웹에 더 많이 노출된 논문이 이후 Google Scholar에서 검색되기 쉬워졌을 수 있다. Target fixed effects는 시간불변의 paper characteristic을 흡수하지만 이러한 temporal ordering이나 time-varying process를 제거하지 못한다. 따라서 Study 1의 결과는</w:t>
-      </w:r>
-      <w:r>
-        <w:t xml:space="preserve"> </w:t>
-      </w:r>
-      <w:r>
-        <w:rPr>
-          <w:bCs/>
-          <w:b/>
-        </w:rPr>
-        <w:t xml:space="preserve">현재 retrievability와 historical citation trajectory의 association</w:t>
-      </w:r>
-      <w:r>
-        <w:t xml:space="preserve">으로 제한하여 해석한다.</w:t>
+        <w:t xml:space="preserve">Study 1의 가장 중요한 한계는 2026년에 관찰한 Google Scholar 환경과 과거 영어권 인용이 발생할 당시의 검색환경이 동일하지 않다는 점이다. 각 target이 언제 Google Scholar에 처음 포함되었는지, 어느 시점부터 현재와 같은 제목으로 검색 가능했는지, 또는 당시 어떤 full-text link가 제공되었는지는 알 수 없다. 과거 연구자들이 실제로 Google Scholar를 통해 해당 문헌을 발견했는지도 관찰하지 않는다. 연구자들은 Web of Science, 도서관 데이터베이스, 참고문헌 추적, 학술지 browsing, 동료 추천 등 다양한 경로를 사용할 수 있었으므로 현재 retrievability를 과거의 실제 discovery opportunity와 동일시할 수 없다.</w:t>
+      </w:r>
+    </w:p>
+    <w:p>
+      <w:pPr>
+        <w:pStyle w:val="BodyText"/>
+      </w:pPr>
+      <w:r>
+        <w:t xml:space="preserve">Citation cohort는 이 문제를 해결하기 위한 historical indexing proxy가 아니다. 그 목적은 현재 retrievability에 따른 영어권 인용격차가 서로 다른 기간에 어떻게 나타났는지를 비교하는 데 있다. Pre-2005 restriction 역시 historical search environment를 복원하지 않는다. 이 분석은 늦게 출판된 target이 초기 cohort에 기여하지 못해 발생하는 eligible-target composition의 변화를 줄이고, 네 기간 모두에서 비교 가능한 보다 일정한 target set에서도 결과가 나타나는지를 점검하기 위한 것이다.</w:t>
+      </w:r>
+    </w:p>
+    <w:p>
+      <w:pPr>
+        <w:pStyle w:val="BodyText"/>
+      </w:pPr>
+      <w:r>
+        <w:t xml:space="preserve">현재 Google Scholar retrievability 자체가 이전 scholarly circulation과 관련되어 있을 가능성도 남는다. 널리 인용되거나 웹에 더 많이 노출된 논문이 이후 Google Scholar에서 검색되기 쉬워졌을 수 있다. Target fixed effects는 시간불변의 paper characteristic을 흡수하지만 이러한 temporal ordering이나 time-varying process를 제거하지 못한다. 따라서 Study 1의 결과는 현재 retrievability와 historical citation trajectory의 association으로 제한하여 해석한다.</w:t>
       </w:r>
     </w:p>
     <w:p>
@@ -4878,20 +3350,7 @@
         <w:pStyle w:val="BodyText"/>
       </w:pPr>
       <w:r>
-        <w:t xml:space="preserve">Study 2는</w:t>
-      </w:r>
-      <w:r>
-        <w:t xml:space="preserve"> </w:t>
-      </w:r>
-      <w:r>
-        <w:rPr>
-          <w:bCs/>
-          <w:b/>
-        </w:rPr>
-        <w:t xml:space="preserve">두 개의 시스템, 다섯 개의 한국 정치 주제, 한 번의 collection period, 100편의 사전 지정 benchmark</w:t>
-      </w:r>
-      <w:r>
-        <w:t xml:space="preserve">에 한정된다. 다섯 주제는 양 언어권에서 모두 연구되어 온 영역을 비교하기 위해 선정되었지만 한국 정치학 전체를 대표하는 확률표본은 아니다. Benchmark 역시 각 주제의 모든 relevant literature를 포괄하지 않으므로 낮은 benchmark recovery가 benchmark 밖의 recommendation이 관련성 없음을 의미하지 않는다.</w:t>
+        <w:t xml:space="preserve">Study 2는 두 개의 시스템, 다섯 개의 한국 정치 주제, 한 번의 collection period, 100편의 사전 지정 benchmark에 한정된다. 다섯 주제는 양 언어권에서 모두 연구되어 온 영역을 비교하기 위해 선정되었지만 한국 정치학 전체를 대표하는 확률표본은 아니다. Benchmark 역시 각 주제의 모든 relevant literature를 포괄하지 않으므로 낮은 benchmark recovery가 benchmark 밖의 recommendation이 관련성 없음을 의미하지 않는다.</w:t>
       </w:r>
     </w:p>
     <w:p>
@@ -4923,44 +3382,15 @@
         <w:pStyle w:val="BodyText"/>
       </w:pPr>
       <w:r>
-        <w:t xml:space="preserve">Link audit은</w:t>
-      </w:r>
-      <w:r>
-        <w:t xml:space="preserve"> </w:t>
-      </w:r>
-      <w:r>
-        <w:rPr>
-          <w:bCs/>
-          <w:b/>
-        </w:rPr>
-        <w:t xml:space="preserve">시스템이 실제 제공한 URL만 평가한다.</w:t>
-      </w:r>
-      <w:r>
-        <w:t xml:space="preserve"> </w:t>
-      </w:r>
-      <w:r>
-        <w:t xml:space="preserve">Paywall, abstract-only page 또는 broken link로 분류된 논문이 인터넷의 다른 위치에서도 이용 불가능하다는 의미는 아니다. Hallucination event 역시 적고 특정 experimental cell에 집중되어 있어 system-level 특성으로 일반화하기 어렵다.</w:t>
-      </w:r>
-    </w:p>
-    <w:p>
-      <w:pPr>
-        <w:pStyle w:val="BodyText"/>
-      </w:pPr>
-      <w:r>
-        <w:t xml:space="preserve">마지막으로 두 Study 모두 문헌이 가시화된 이후 연구자가 실제로 무엇을 하는지는 관찰하지 않는다. 검색결과의 클릭, 원문의 열람, substantive relevance 평가, 언어능력, perceived quality, citation norm, collaboration network 및 publication venue 등은 후속 이용과 인용에 영향을 줄 수 있다. 따라서 본 논문의 증거는 전체적인 지식순환 과정이 아니라</w:t>
-      </w:r>
-      <w:r>
-        <w:t xml:space="preserve"> </w:t>
-      </w:r>
-      <w:r>
-        <w:rPr>
-          <w:bCs/>
-          <w:b/>
-        </w:rPr>
-        <w:t xml:space="preserve">검색환경에서의 paper-level visibility, source selection, 그리고 access through provided links</w:t>
-      </w:r>
-      <w:r>
-        <w:t xml:space="preserve">에 한정된다.</w:t>
+        <w:t xml:space="preserve">Link audit은 시스템이 실제 제공한 URL만 평가한다. Paywall, abstract-only page 또는 broken link로 분류된 논문이 인터넷의 다른 위치에서도 이용 불가능하다는 의미는 아니다. Hallucination event 역시 적고 특정 experimental cell에 집중되어 있어 system-level 특성으로 일반화하기 어렵다.</w:t>
+      </w:r>
+    </w:p>
+    <w:p>
+      <w:pPr>
+        <w:pStyle w:val="BodyText"/>
+      </w:pPr>
+      <w:r>
+        <w:t xml:space="preserve">마지막으로 두 Study 모두 문헌이 가시화된 이후 연구자가 실제로 무엇을 하는지는 관찰하지 않는다. 검색결과의 클릭, 원문의 열람, substantive relevance 평가, 언어능력, perceived quality, citation norm, collaboration network 및 publication venue 등은 후속 이용과 인용에 영향을 줄 수 있다. 따라서 본 논문의 증거는 전체적인 지식순환 과정이 아니라 검색환경에서의 paper-level visibility, source selection, 그리고 access through provided links에 한정된다.</w:t>
       </w:r>
     </w:p>
     <w:bookmarkEnd w:id="44"/>
@@ -6981,7 +5411,7 @@
     </a:clrScheme>
     <a:fontScheme name="Office">
       <a:majorFont>
-        <a:latin typeface="Calibri"/>
+        <a:latin typeface="Times New Roman"/>
         <a:ea typeface=""/>
         <a:cs typeface=""/>
         <a:font script="Jpan" typeface="ＭＳ ゴシック"/>
@@ -7015,7 +5445,7 @@
         <a:font script="Uigh" typeface="Microsoft Uighur"/>
       </a:majorFont>
       <a:minorFont>
-        <a:latin typeface="Cambria"/>
+        <a:latin typeface="Times New Roman"/>
         <a:ea typeface=""/>
         <a:cs typeface=""/>
         <a:font script="Jpan" typeface="ＭＳ 明朝"/>

</xml_diff>

<commit_message>
Simplify discussion section heading
</commit_message>
<xml_diff>
--- a/manuscript/discovery_bottleneck_combined.docx
+++ b/manuscript/discovery_bottleneck_combined.docx
@@ -3006,13 +3006,13 @@
     </w:p>
     <w:bookmarkEnd w:id="35"/>
     <w:bookmarkEnd w:id="36"/>
-    <w:bookmarkStart w:id="42" w:name="종합-논의"/>
+    <w:bookmarkStart w:id="42" w:name="논의"/>
     <w:p>
       <w:pPr>
         <w:pStyle w:val="Heading1"/>
       </w:pPr>
       <w:r>
-        <w:t xml:space="preserve">5. 종합 논의</w:t>
+        <w:t xml:space="preserve">5. 논의</w:t>
       </w:r>
     </w:p>
     <w:bookmarkStart w:id="40" w:name="주요-발견의-종합"/>

</xml_diff>

<commit_message>
Remove em dashes from manuscript body
</commit_message>
<xml_diff>
--- a/manuscript/discovery_bottleneck_combined.docx
+++ b/manuscript/discovery_bottleneck_combined.docx
@@ -511,7 +511,7 @@
         <w:pStyle w:val="Compact"/>
       </w:pPr>
       <w:r>
-        <w:t xml:space="preserve">C1 — 2009년 이하</w:t>
+        <w:t xml:space="preserve">C1: 2009년 이하</w:t>
       </w:r>
     </w:p>
     <w:p>
@@ -523,7 +523,7 @@
         <w:pStyle w:val="Compact"/>
       </w:pPr>
       <w:r>
-        <w:t xml:space="preserve">C2 — 2010–2014</w:t>
+        <w:t xml:space="preserve">C2: 2010–2014</w:t>
       </w:r>
     </w:p>
     <w:p>
@@ -535,7 +535,7 @@
         <w:pStyle w:val="Compact"/>
       </w:pPr>
       <w:r>
-        <w:t xml:space="preserve">C3 — 2015–2019</w:t>
+        <w:t xml:space="preserve">C3: 2015–2019</w:t>
       </w:r>
     </w:p>
     <w:p>
@@ -547,7 +547,7 @@
         <w:pStyle w:val="Compact"/>
       </w:pPr>
       <w:r>
-        <w:t xml:space="preserve">C4 — 2020–2024</w:t>
+        <w:t xml:space="preserve">C4: 2020–2024</w:t>
       </w:r>
     </w:p>
     <w:p>
@@ -1848,7 +1848,7 @@
         <w:pStyle w:val="Compact"/>
       </w:pPr>
       <w:r>
-        <w:t xml:space="preserve">Query language — 영어 / 한국어</w:t>
+        <w:t xml:space="preserve">Query language: 영어 / 한국어</w:t>
       </w:r>
     </w:p>
     <w:p>
@@ -1860,7 +1860,7 @@
         <w:pStyle w:val="Compact"/>
       </w:pPr>
       <w:r>
-        <w:t xml:space="preserve">Source instruction — general web / KCI·DBpia·KISS 명시</w:t>
+        <w:t xml:space="preserve">Source instruction: general web / KCI·DBpia·KISS 명시</w:t>
       </w:r>
     </w:p>
     <w:p>
@@ -1872,7 +1872,7 @@
         <w:pStyle w:val="Compact"/>
       </w:pPr>
       <w:r>
-        <w:t xml:space="preserve">System — OpenAI</w:t>
+        <w:t xml:space="preserve">System: OpenAI</w:t>
       </w:r>
       <w:r>
         <w:t xml:space="preserve"> </w:t>
@@ -1942,7 +1942,7 @@
         <w:pStyle w:val="Compact"/>
       </w:pPr>
       <w:r>
-        <w:t xml:space="preserve">TraceRecovery — provider가 외부에 노출하는 observable search trace에 benchmark paper가 나타나는지</w:t>
+        <w:t xml:space="preserve">TraceRecovery는 provider가 외부에 노출하는 observable search trace에 benchmark paper가 나타나는지를 측정한다.</w:t>
       </w:r>
     </w:p>
     <w:p>
@@ -1954,7 +1954,7 @@
         <w:pStyle w:val="Compact"/>
       </w:pPr>
       <w:r>
-        <w:t xml:space="preserve">Recommendation — benchmark paper가 final recommendation에 포함되는지</w:t>
+        <w:t xml:space="preserve">Recommendation은 benchmark paper가 final recommendation에 포함되는지를 측정한다.</w:t>
       </w:r>
     </w:p>
     <w:p>
@@ -1966,7 +1966,7 @@
         <w:pStyle w:val="Compact"/>
       </w:pPr>
       <w:r>
-        <w:t xml:space="preserve">SuppliedLinkAccess — benchmark가 추천되고 제공된 URL이 로그인이나 결제 없이 full text를 제공하는지</w:t>
+        <w:t xml:space="preserve">SuppliedLinkAccess는 benchmark가 추천되고 제공된 URL이 로그인이나 결제 없이 full text를 제공하는지를 측정한다.</w:t>
       </w:r>
     </w:p>
     <w:p>
@@ -2564,7 +2564,7 @@
         </w:numPr>
       </w:pPr>
       <w:r>
-        <w:t xml:space="preserve">854개(44.2%) — full text 접근 가능</w:t>
+        <w:t xml:space="preserve">854개(44.2%)는 full text 접근 가능</w:t>
       </w:r>
     </w:p>
     <w:p>
@@ -2575,7 +2575,7 @@
         </w:numPr>
       </w:pPr>
       <w:r>
-        <w:t xml:space="preserve">859개(44.5%) — 접근 제한</w:t>
+        <w:t xml:space="preserve">859개(44.5%)는 접근 제한</w:t>
       </w:r>
     </w:p>
     <w:p>
@@ -2610,7 +2610,7 @@
         </w:numPr>
       </w:pPr>
       <w:r>
-        <w:t xml:space="preserve">219개(11.3%) — invalid 또는 unverifiable</w:t>
+        <w:t xml:space="preserve">219개(11.3%)는 invalid 또는 unverifiable</w:t>
       </w:r>
     </w:p>
     <w:p>
@@ -2862,7 +2862,7 @@
               <w:jc w:val="left"/>
             </w:pPr>
             <w:r>
-              <w:t xml:space="preserve">— Broken link</w:t>
+              <w:t xml:space="preserve">Broken link</w:t>
             </w:r>
           </w:p>
         </w:tc>
@@ -2912,7 +2912,7 @@
               <w:jc w:val="left"/>
             </w:pPr>
             <w:r>
-              <w:t xml:space="preserve">— Hallucinated item</w:t>
+              <w:t xml:space="preserve">Hallucinated item</w:t>
             </w:r>
           </w:p>
         </w:tc>

</xml_diff>

<commit_message>
Update Korean and English combined manuscript
</commit_message>
<xml_diff>
--- a/manuscript/discovery_bottleneck_combined.docx
+++ b/manuscript/discovery_bottleneck_combined.docx
@@ -160,39 +160,215 @@
         <w:pStyle w:val="FirstParagraph"/>
       </w:pPr>
       <w:r>
-        <w:t xml:space="preserve">한국 정치학은 KCI와 SSCI를 중심으로 서로 구분되는 학술공간에서 생산·유통된다(Rhee 2026). 본 논문은 이러한 분절이 나타나는 한 측면을 학술검색에서의 가시성과 원문 접근을 통해 분석한다.</w:t>
-      </w:r>
-    </w:p>
-    <w:p>
-      <w:pPr>
-        <w:pStyle w:val="BodyText"/>
-      </w:pPr>
-      <w:r>
-        <w:t xml:space="preserve">Study 1은 2000–2025년 한국어권 정치학 논문들이 인용한 한국 정치 관련 논문 54,789편을 대상으로 현재 Google Scholar 검색가능성과 영어권 인용확률의 시기별 관계를 분석한다. 검색 가능한 논문과 그렇지 않은 논문의 인용확률 격차는 기준기간보다 2010–2014년에 0.405퍼센트포인트(pp), 2015–2019년에 0.696pp 유의하게 더 컸지만 2020–2024년에는 추가 확대되지 않았다. Google Scholar 링크를 통한 원문 접근은 영어권 인용확률과 유의한 관계를 보이지 않았다. 이는 현재 검색가능성과 과거 인용궤적의 연관성이며 Google Scholar의 인과효과를 뜻하지 않는다.</w:t>
-      </w:r>
-    </w:p>
-    <w:p>
-      <w:pPr>
-        <w:pStyle w:val="BodyText"/>
-      </w:pPr>
-      <w:r>
-        <w:t xml:space="preserve">Study 2는 다섯 주제에서 사전 선정한 한국어 논문 50편과 영어 논문 50편을 이용해 두 개의 web-enabled generative search system을 감사한다. 영어 질의·일반 웹검색 baseline에서 한국어 benchmark는 검색과 최종 추천에서 모두 회수되지 않았지만 영어 benchmark recovery는 각각 3.4%와 3.2%였다. 한국어 질의와 한국 학술 데이터베이스 지시를 함께 적용하면 한국어–영어 격차가 검색에서 5.6pp, 추천에서 6.4pp 축소되었지만, 한국어 benchmark의 recommendation recovery는 3.2%에 머물렀다. 전체 추천의 44.2%만 제공된 링크를 통해 원문에 직접 접근할 수 있었으며 유의한 언어격차는 없었다.</w:t>
-      </w:r>
-    </w:p>
-    <w:p>
-      <w:pPr>
-        <w:pStyle w:val="BodyText"/>
-      </w:pPr>
-      <w:r>
-        <w:t xml:space="preserve">두 연구는 한국 정치학의 국제적 가시성을 설명할 때 출판과 인용뿐 아니라 문헌이 검색되고 최종 출처로 선택되는 과정을 별도로 분석할 필요가 있음을 보여준다. 검색·추천에서 나타난 차이와 달리 원문 접근에서는 이에 상응하는 언어격차가 확인되지 않았다. 본 논문은 문헌이 내용 평가 이전에 검색 후보로 진입하지 못하거나 최종 출처로 선택되지 않는 현상을 discovery bottleneck으로 제시한다.</w:t>
-      </w:r>
-    </w:p>
-    <w:p>
-      <w:pPr>
-        <w:pStyle w:val="BodyText"/>
-      </w:pPr>
-      <w:r>
-        <w:t xml:space="preserve">Keywords: 한국 정치학; 학술검색; Google Scholar; 생성형 검색; 비영어권 학술문헌; 국제적 가시성; 원문 접근; discovery bottleneck</w:t>
+        <w:t xml:space="preserve">한국 정치에 관한 연구는 한국어권과 영어권의 구분된 학술공간에서 생산·유통되며, 두 공간에서 축적된 연구가 국제적으로 가시화되고 인용되는 범위도 동일하지 않다(Rhee 2026; Kim et al. 2025). 본 논문은 이러한 차이의 한 측면을</w:t>
+      </w:r>
+      <w:r>
+        <w:t xml:space="preserve"> </w:t>
+      </w:r>
+      <w:r>
+        <w:rPr>
+          <w:bCs/>
+          <w:b/>
+        </w:rPr>
+        <w:t xml:space="preserve">학술검색 환경에서의 문헌 가시성</w:t>
+      </w:r>
+      <w:r>
+        <w:t xml:space="preserve">에서 분석한다. 연구자가 선행연구를 탐색할 때 검색환경을 이용해 검토할 문헌을 구성한다는 점에서, 어떤 연구가 학술적으로 존재하는가와 실제 검색과정에서 어떤 연구가 후보 문헌으로 나타나는가는 구분될 수 있다. 본 연구는 한국어권에서 이미 사용되거나 주요 문헌으로 확인된 한국 정치 연구가 Google Scholar와 생성형 검색에서 어떻게 가시화되는지를 분석하고, 검색환경이 제공하는 링크를 통한 원문 접근을 별도의 결과로 살펴본다.</w:t>
+      </w:r>
+    </w:p>
+    <w:p>
+      <w:pPr>
+        <w:pStyle w:val="BodyText"/>
+      </w:pPr>
+      <w:r>
+        <w:rPr>
+          <w:bCs/>
+          <w:b/>
+        </w:rPr>
+        <w:t xml:space="preserve">Study 1</w:t>
+      </w:r>
+      <w:r>
+        <w:t xml:space="preserve">은 2000–2025년에 생산된 한국어권 정치학 논문들이 인용한 한국 정치 관련 논문 54,789편을 대상으로,</w:t>
+      </w:r>
+      <w:r>
+        <w:t xml:space="preserve"> </w:t>
+      </w:r>
+      <w:r>
+        <w:rPr>
+          <w:bCs/>
+          <w:b/>
+        </w:rPr>
+        <w:t xml:space="preserve">2026년 현재 Google Scholar index presence</w:t>
+      </w:r>
+      <w:r>
+        <w:t xml:space="preserve">와 영어권 인용확률의 시기별 관계를 분석한다. 현재 Google Scholar에서 bibliographic record가 확인된 논문과 확인되지 않은 논문 사이의 영어권 인용확률 격차는 2009년까지의 기준기간에 비해 2010–2014년에</w:t>
+      </w:r>
+      <w:r>
+        <w:t xml:space="preserve"> </w:t>
+      </w:r>
+      <w:r>
+        <w:rPr>
+          <w:bCs/>
+          <w:b/>
+        </w:rPr>
+        <w:t xml:space="preserve">0.405퍼센트포인트(pp)</w:t>
+      </w:r>
+      <w:r>
+        <w:t xml:space="preserve">, 2015–2019년에</w:t>
+      </w:r>
+      <w:r>
+        <w:t xml:space="preserve"> </w:t>
+      </w:r>
+      <w:r>
+        <w:rPr>
+          <w:bCs/>
+          <w:b/>
+        </w:rPr>
+        <w:t xml:space="preserve">0.696pp</w:t>
+      </w:r>
+      <w:r>
+        <w:t xml:space="preserve"> </w:t>
+      </w:r>
+      <w:r>
+        <w:t xml:space="preserve">유의하게 더 컸으나 2020–2024년에는 추가 확대되지 않았다. 현재 Google Scholar가 제공하는 링크를 통한 원문 접근은 index presence가 확인된 논문들 사이에서 영어권 인용확률과 유의한 관계를 보이지 않았다. 이 결과는 현재 Google Scholar index presence와 과거 영어권 인용궤적 사이의 연관성이며 Google Scholar의 인과효과를 의미하지 않는다.</w:t>
+      </w:r>
+    </w:p>
+    <w:p>
+      <w:pPr>
+        <w:pStyle w:val="BodyText"/>
+      </w:pPr>
+      <w:r>
+        <w:rPr>
+          <w:bCs/>
+          <w:b/>
+        </w:rPr>
+        <w:t xml:space="preserve">Study 2</w:t>
+      </w:r>
+      <w:r>
+        <w:t xml:space="preserve">는 한국어권과 영어권에서 모두 연구되어 온 다섯 개의 한국 정치 주제에서 사전에 선정한 한국어 논문 50편과 영어 논문 50편을 기준으로 두 개의 web-enabled generative search system을 감사한다. 영어 질의와 일반 웹검색을 사용한 baseline에서는 한국어 benchmark가 관찰 가능한 검색흔적과 최종 추천에서 모두 회수되지 않은 반면 영어 benchmark는 각각</w:t>
+      </w:r>
+      <w:r>
+        <w:t xml:space="preserve"> </w:t>
+      </w:r>
+      <w:r>
+        <w:rPr>
+          <w:bCs/>
+          <w:b/>
+        </w:rPr>
+        <w:t xml:space="preserve">3.4%와 3.2%</w:t>
+      </w:r>
+      <w:r>
+        <w:t xml:space="preserve"> </w:t>
+      </w:r>
+      <w:r>
+        <w:t xml:space="preserve">회수되었다. 한국어 질의와 한국 학술 데이터베이스 검색 지시를 함께 적용하면 한국어–영어 격차는 검색에서</w:t>
+      </w:r>
+      <w:r>
+        <w:t xml:space="preserve"> </w:t>
+      </w:r>
+      <w:r>
+        <w:rPr>
+          <w:bCs/>
+          <w:b/>
+        </w:rPr>
+        <w:t xml:space="preserve">5.6pp</w:t>
+      </w:r>
+      <w:r>
+        <w:t xml:space="preserve">, 추천에서</w:t>
+      </w:r>
+      <w:r>
+        <w:t xml:space="preserve"> </w:t>
+      </w:r>
+      <w:r>
+        <w:rPr>
+          <w:bCs/>
+          <w:b/>
+        </w:rPr>
+        <w:t xml:space="preserve">6.4pp</w:t>
+      </w:r>
+      <w:r>
+        <w:t xml:space="preserve"> </w:t>
+      </w:r>
+      <w:r>
+        <w:t xml:space="preserve">축소되었지만, 한국어 benchmark의 최종 추천 회수율은</w:t>
+      </w:r>
+      <w:r>
+        <w:t xml:space="preserve"> </w:t>
+      </w:r>
+      <w:r>
+        <w:rPr>
+          <w:bCs/>
+          <w:b/>
+        </w:rPr>
+        <w:t xml:space="preserve">3.2%</w:t>
+      </w:r>
+      <w:r>
+        <w:t xml:space="preserve">에 머물렀다. 전체 추천의</w:t>
+      </w:r>
+      <w:r>
+        <w:t xml:space="preserve"> </w:t>
+      </w:r>
+      <w:r>
+        <w:rPr>
+          <w:bCs/>
+          <w:b/>
+        </w:rPr>
+        <w:t xml:space="preserve">44.2%</w:t>
+      </w:r>
+      <w:r>
+        <w:t xml:space="preserve">만 제공된 링크를 통해 원문에 직접 접근할 수 있었으며, 원문 접근에서는 유의한 언어격차가 확인되지 않았다.</w:t>
+      </w:r>
+    </w:p>
+    <w:p>
+      <w:pPr>
+        <w:pStyle w:val="BodyText"/>
+      </w:pPr>
+      <w:r>
+        <w:t xml:space="preserve">두 연구는 한국 정치 연구의 국제적 가시성을 출판과 인용만으로 파악하기보다</w:t>
+      </w:r>
+      <w:r>
+        <w:t xml:space="preserve"> </w:t>
+      </w:r>
+      <w:r>
+        <w:rPr>
+          <w:bCs/>
+          <w:b/>
+        </w:rPr>
+        <w:t xml:space="preserve">어떤 문헌이 학술검색에서 실제 검토 가능한 후보로 나타나고 최종 출처로 선택되는가</w:t>
+      </w:r>
+      <w:r>
+        <w:t xml:space="preserve">를 함께 분석할 필요가 있음을 보여준다. 특히 생성형 검색에서 한국어 논문이 많이 제시된다고 해서 한국어권에서 축적된 주요 연구가 그만큼 충실하게 반영되었다고 볼 수는 없다. 본 논문은 문헌이 내용에 대한 실질적 평가를 받기 전에 검색 또는 최종 출처 선택의 관찰 가능한 단계에서 가시성을 잃는 현상을</w:t>
+      </w:r>
+      <w:r>
+        <w:t xml:space="preserve"> </w:t>
+      </w:r>
+      <w:r>
+        <w:rPr>
+          <w:bCs/>
+          <w:b/>
+        </w:rPr>
+        <w:t xml:space="preserve">discovery bottleneck</w:t>
+      </w:r>
+      <w:r>
+        <w:t xml:space="preserve">이라는 조작적 개념으로 제시한다.</w:t>
+      </w:r>
+    </w:p>
+    <w:p>
+      <w:pPr>
+        <w:pStyle w:val="BodyText"/>
+      </w:pPr>
+      <w:r>
+        <w:rPr>
+          <w:bCs/>
+          <w:b/>
+        </w:rPr>
+        <w:t xml:space="preserve">Keywords:</w:t>
+      </w:r>
+      <w:r>
+        <w:t xml:space="preserve"> </w:t>
+      </w:r>
+      <w:r>
+        <w:t xml:space="preserve">한국 정치학; 한국 정치 연구; 학술검색; Google Scholar; 생성형 검색; 비영어권 학술문헌; 국제적 가시성; 원문 접근; discovery bottleneck</w:t>
       </w:r>
     </w:p>
     <w:bookmarkEnd w:id="20"/>
@@ -210,7 +386,15 @@
         <w:pStyle w:val="FirstParagraph"/>
       </w:pPr>
       <w:r>
-        <w:t xml:space="preserve">국제 정치학에서 어떤 연구가 가시화되고 인용되는지는 연구대상뿐 아니라 연구가 생산·유통되는 언어와 학술공간과도 관련된다. 주요 국제 학술 데이터베이스는 영어권 학술지를 상대적으로 많이 포괄하며, 비영어로 출판된 연구는 국제 인용에서도 불리한 경향을 보인다(Mongeon and Paul-Hus 2016; Vera-Baceta, Thelwall, and Kousha 2019; Di Bitetti and Ferreras 2017). 한국 정치학에서도 KCI를 중심으로 한 국내 학술공간과 SSCI를 중심으로 한 국제 학술공간 사이에 연구 주제와 방법론적 차이가 관찰되며(Rhee 2026), 영어로 출판되어 국제 학술공간에서 유통되는 한국 정치 연구는 한국어권에서 생산·유통되는 연구보다 더 넓은 인용 범위와 국제적 인지도를 갖는 경향이 있다(Kim et al. 2025).</w:t>
+        <w:t xml:space="preserve">국제 정치학에서 어떤 연구가 학문적 논의에 포함되고 인용되는지는 연구의 내용만으로 결정되지 않는다. 주요 정치학 학술지에서 다루어지는 국가와 지역은 오랫동안 북미와 서유럽에 집중되어 왔으며, 국제적 출판에서도 연구자의 지리적·제도적 위치에 따른 불균형이 관찰된다(Wilson and Knutsen 2022; Breuning et al. 2018). 여기에 언어의 차이가 더해진다. 주요 국제 학술 데이터베이스는 영어권 학술지를 상대적으로 많이 포괄하며, 비영어로 출판된 연구는 영어 논문보다 국제 인용에서 불리한 경향을 보인다(Mongeon and Paul-Hus 2016; Vera-Baceta, Thelwall, and Kousha 2019; Di Bitetti and Ferreras 2017).</w:t>
+      </w:r>
+    </w:p>
+    <w:p>
+      <w:pPr>
+        <w:pStyle w:val="BodyText"/>
+      </w:pPr>
+      <w:r>
+        <w:t xml:space="preserve">한국 정치 연구는 이러한 언어적·학술공간적 분화를 관찰할 수 있는 사례이다. 한국 정치학에서 KCI와 SSCI를 중심으로 유통되는 연구는 주제와 방법론에서 서로 다른 패턴을 보이며(Rhee 2026), 한국 정치에 관한 한국어권 연구와 영어권 연구 역시 생산과 유통, 국제적 인용 범위에서 구분되는 학술공간을 형성한다(Kim et al. 2025*).</w:t>
       </w:r>
       <w:r>
         <w:rPr>
@@ -218,61 +402,214 @@
         </w:rPr>
         <w:footnoteReference w:id="21"/>
       </w:r>
-    </w:p>
-    <w:p>
-      <w:pPr>
-        <w:pStyle w:val="BodyText"/>
-      </w:pPr>
-      <w:r>
-        <w:t xml:space="preserve">본 논문은 이러한 국제적 가시성의 차이를 학술문헌이 검색환경에서 실제로 가시화되는 과정에서 분석한다. 데이터베이스에 문헌이 존재하는 것과 특정 검색환경에서 개별 논문이 반환되는 것은 동일하지 않다. 정보검색 연구에서는 데이터베이스 전체의 coverage와 개별 문헌이 검색을 통해 반환될 수 있는 retrievability를 구분한다(Azzopardi and Vinay 2008). 따라서 한국어권에서 생산·사용된 연구가 국제적 학술검색에서 어느 정도 가시적인지는 출판과 최종 인용의 차이와 별도로 분석할 수 있다.</w:t>
-      </w:r>
-    </w:p>
-    <w:p>
-      <w:pPr>
-        <w:pStyle w:val="BodyText"/>
-      </w:pPr>
-      <w:r>
-        <w:t xml:space="preserve">이 논문에서 가시성은 검색환경 안에서 문헌이 관찰 가능한 후보로 나타나는 정도를 뜻하며, 두 Study에서 그 조작화는 다르다. Study 1에서는 논문의 식별정보를 알고 있는 상태에서 현재 Google Scholar가 해당 bibliographic record를 반환하는 paper-level known-item retrievability를 측정한다. Study 2에서는 사전에 정한 benchmark paper가 provider가 노출하는 search trace에 나타나는지와 최종 recommendation으로 선택되는지를 각각 측정한다. 따라서 Study 1은 broad topic search에서 처음 논문을 발견할 확률을 측정하지 않으며, Study 2의 observable search trace 역시 시스템 내부의 모든 retrieval 과정을 의미하지 않는다.</w:t>
-      </w:r>
-    </w:p>
-    <w:p>
-      <w:pPr>
-        <w:pStyle w:val="BodyText"/>
-      </w:pPr>
-      <w:r>
-        <w:t xml:space="preserve">원문 접근은 이러한 검색 가시성과 별개의 결과로 다룬다. 논문이 검색되거나 추천되더라도 이용 가능한 full text로 직접 연결되지 않을 수 있고, 반대로 publisher version이 paywall 뒤에 있어도 repository나 저자 공개본이 제시될 수 있다(Jamali and Nabavi 2015). 따라서 본 연구가 측정하는 access는 논문의 일반적인 OA status가 아니라 해당 검색환경이 실제로 제공한 링크가 로그인이나 결제 없이 full text로 이어지는지이다.</w:t>
-      </w:r>
-    </w:p>
-    <w:p>
-      <w:pPr>
-        <w:pStyle w:val="BodyText"/>
-      </w:pPr>
-      <w:r>
-        <w:t xml:space="preserve">이러한 구분을 바탕으로 두 연구를 수행한다. Study 1은 확립된 학술검색 환경인 Google Scholar를 분석한다. 2000–2025년에 생산된 한국어권 정치학 논문들이 인용한 한국 정치 관련 문헌을 출발점으로 하여, 현재 Google Scholar에서 검색 가능한 논문과 그렇지 않은 논문의 영어권 인용확률 격차가 시기에 따라 어떻게 나타나는지를 분석한다. 표본에는 한국어권에서만 인용된 문헌과 영어권에서도 인용된 문헌이 함께 포함되므로, 한국어권에서 이미 학술적으로 사용된 문헌이라는 공통 조건 아래 영어권으로의 인용 범위가 어떻게 달라지는지를 비교할 수 있다.</w:t>
-      </w:r>
-    </w:p>
-    <w:p>
-      <w:pPr>
-        <w:pStyle w:val="BodyText"/>
-      </w:pPr>
-      <w:r>
-        <w:t xml:space="preserve">Study 2는 현재의 web-enabled generative search를 분석한다. 생성형 검색은 외부 문헌을 검색하는 데서 그치지 않고 그중 일부를 최종 citation이나 recommendation으로 선택하여 답변을 구성한다(Liu, Zhang, and Liang 2023; He et al. 2025). 따라서 retrieval과 final source selection은 서로 다른 가시성 단계가 된다. Study 2는 한국어권과 영어권에서 모두 연구되어 온 동일한 한국 정치 주제에 대해 양 언어권의 주요 문헌을 사전에 benchmark로 정하고, 질의 언어와 한국 학술 데이터베이스 검색 지시를 변화시켜 검색과 추천에서의 한국어–영어 recovery gap이 어떻게 달라지는지를 비교한다.</w:t>
-      </w:r>
-    </w:p>
-    <w:p>
-      <w:pPr>
-        <w:pStyle w:val="BodyText"/>
-      </w:pPr>
-      <w:r>
-        <w:t xml:space="preserve">본 논문은 이처럼 문헌이 실질적인 내용 평가 이전에 검색 가능한 후보가 되지 못하거나 검색된 뒤 최종 출처로 선택되지 않는 현상을 discovery bottleneck이라고 부른다. 이는 모든 학술적 발견경로를 포괄하는 일반이론이나 검색 인프라가 국제적 인용격차를 인과적으로 발생시킨다는 주장이 아니다. 본 연구에서 관찰하는 특정 검색환경과 특정 검색단계에서 발생하는 누락을 지칭하기 위한 조작적 개념이다.</w:t>
-      </w:r>
-    </w:p>
-    <w:p>
-      <w:pPr>
-        <w:pStyle w:val="BodyText"/>
-      </w:pPr>
-      <w:r>
-        <w:t xml:space="preserve">따라서 본 논문의 기여는 한국 정치학의 국제적 가시성을 출판언어와 인용에만 두지 않고, Google Scholar에서의 논문 검색가능성, 생성형 검색의 문헌 회수와 최종 출처 선택, 그리고 제공 링크를 통한 원문 접근을 구분하여 측정하는 데 있다. Study 1은 현재 검색가능성에 따라 과거 영어권 인용궤적이 다르게 나타남을 보여주고, Study 2는 기본 검색조건의 한국어 benchmark deficit이 조건에 따라 달라지지만 언어적 representation의 증가가 높은 benchmark recovery로 이어지지는 않음을 보여준다. 원문 접근은 두 연구의 검색·추천 결과와 동일한 패턴을 보이지 않았다.</w:t>
+      <w:r>
+        <w:t xml:space="preserve"> </w:t>
+      </w:r>
+      <w:r>
+        <w:t xml:space="preserve">따라서 한국어권에 상당한 연구가 축적되어 있다는 사실만으로 그 연구가 국제적 학술환경에서도 같은 정도로 발견되고 검토된다고 가정할 수 없다.</w:t>
+      </w:r>
+    </w:p>
+    <w:p>
+      <w:pPr>
+        <w:pStyle w:val="BodyText"/>
+      </w:pPr>
+      <w:r>
+        <w:t xml:space="preserve">본 논문은 이 차이를</w:t>
+      </w:r>
+      <w:r>
+        <w:t xml:space="preserve"> </w:t>
+      </w:r>
+      <w:r>
+        <w:rPr>
+          <w:bCs/>
+          <w:b/>
+        </w:rPr>
+        <w:t xml:space="preserve">학술검색 환경에서의 문헌 가시성</w:t>
+      </w:r>
+      <w:r>
+        <w:t xml:space="preserve">이라는 차원에서 분석한다. 연구자는 선행연구를 파악하고 연구질문을 위치시키기 위해 검색과정을 거쳐 검토할 문헌을 구성한다. 따라서 어떤 논문이 출판되어 존재하거나 특정 데이터베이스의 전체 coverage 안에 포함되는 것과, 특정 검색환경에서 개별 문헌이 실제로 연구자의 검토대상으로 나타나는 것은 동일하지 않다. 정보검색 연구가 데이터베이스 수준의 coverage와 개별 문헌의 retrievability를 구분해 온 것도 이러한 차이와 관련된다(Azzopardi and Vinay 2008). 본 연구는 이 구분을 한국 정치 연구의 국제적 가시성에 적용한다.</w:t>
+      </w:r>
+    </w:p>
+    <w:p>
+      <w:pPr>
+        <w:pStyle w:val="BodyText"/>
+      </w:pPr>
+      <w:r>
+        <w:rPr>
+          <w:bCs/>
+          <w:b/>
+        </w:rPr>
+        <w:t xml:space="preserve">Study 1은 현재 Google Scholar에 개별 논문의 bibliographic record가 인덱스되어 검색되는지와 영어권 인용의 시기별 관계를 분석한다.</w:t>
+      </w:r>
+      <w:r>
+        <w:t xml:space="preserve"> </w:t>
+      </w:r>
+      <w:r>
+        <w:t xml:space="preserve">분석대상은 2000–2025년에 생산된 한국어권 정치학 논문에서 적어도 한 번 인용된 한국 정치 관련 문헌 54,789편이다. 따라서 모든 target paper는 한국어권에서 실제 학술적으로 사용된 기록을 갖는다. 이 공통된 문헌집합 안에서 현재 Google Scholar index presence가 확인되는 논문과 확인되지 않는 논문의 영어권 인용확률 격차가 시기에 따라 어떻게 나타나는지를 비교한다. Google Scholar 상태는 2026년에만 관찰되므로, 이 분석은 과거 Google Scholar indexing이 영어권 인용을 발생시켰는지를 추정하지 않는다.</w:t>
+      </w:r>
+    </w:p>
+    <w:p>
+      <w:pPr>
+        <w:pStyle w:val="BodyText"/>
+      </w:pPr>
+      <w:r>
+        <w:rPr>
+          <w:bCs/>
+          <w:b/>
+        </w:rPr>
+        <w:t xml:space="preserve">Study 2는 생성형 검색에서 개별 논문이 검색과정에 나타나는지와 그중 어떤 논문이 최종 출처로 제시되는지를 분석한다.</w:t>
+      </w:r>
+      <w:r>
+        <w:t xml:space="preserve"> </w:t>
+      </w:r>
+      <w:r>
+        <w:t xml:space="preserve">Web-enabled generative search는 외부 자료를 검색한 뒤 검색된 자료 전체를 그대로 사용자에게 반환하지 않고, 일부를 citation이나 recommendation으로 선택해 답변을 구성한다(Liu, Zhang, and Liang 2023; He et al. 2025). 따라서 사전에 정한 benchmark paper가 provider가 공개하는 search trace에서 확인되는 것과 최종 recommendation에 포함되는 것은 서로 다른 결과이다. Study 2는 한국어권과 영어권 모두에서 연구되어 온 동일한 한국 정치 주제를 대상으로 query language와 한국 학술 데이터베이스 검색 지시를 변화시키고, 한국어와 영어의 주요 문헌이 두 지점에서 어떻게 나타나는지를 비교한다.</w:t>
+      </w:r>
+    </w:p>
+    <w:p>
+      <w:pPr>
+        <w:pStyle w:val="BodyText"/>
+      </w:pPr>
+      <w:r>
+        <w:t xml:space="preserve">이 분석에서 중요한 것은 단순히 한국어 논문이 몇 편 제시되는가가 아니다.</w:t>
+      </w:r>
+      <w:r>
+        <w:t xml:space="preserve"> </w:t>
+      </w:r>
+      <w:r>
+        <w:rPr>
+          <w:bCs/>
+          <w:b/>
+        </w:rPr>
+        <w:t xml:space="preserve">한국어 논문이 많이 제시되는 것과 한국어권 정치학에서 축적된 주요 연구가 실제 검색결과에 반영되는 것은 다른 문제이다.</w:t>
+      </w:r>
+      <w:r>
+        <w:t xml:space="preserve"> </w:t>
+      </w:r>
+      <w:r>
+        <w:t xml:space="preserve">생성형 검색이 한국어 논문을 다수 추천하더라도, 검색 이전에 주요 문헌으로 정한 한국어 연구가 거의 포함되지 않을 수 있다. 따라서 Study 2는 최종 추천에서 한국어 논문이 차지하는 비율과 사전에 정한 한국어 benchmark가 실제로 검색·추천되는 정도를 구분한다.</w:t>
+      </w:r>
+    </w:p>
+    <w:p>
+      <w:pPr>
+        <w:pStyle w:val="BodyText"/>
+      </w:pPr>
+      <w:r>
+        <w:rPr>
+          <w:bCs/>
+          <w:b/>
+        </w:rPr>
+        <w:t xml:space="preserve">원문 접근 역시 문헌의 검색 가시성과 별도로 분석한다.</w:t>
+      </w:r>
+      <w:r>
+        <w:t xml:space="preserve"> </w:t>
+      </w:r>
+      <w:r>
+        <w:t xml:space="preserve">논문이 Google Scholar에 인덱스되어 있거나 생성형 검색에서 추천되더라도 제공된 URL이 paywall, abstract page 또는 broken link로 이어질 수 있다. 반대로 출판사 version은 유료이지만 repository나 저자 공개본을 통해 원문을 볼 수 있는 경우도 있다(Jamali and Nabavi 2015). 따라서 본 연구는 논문의 일반적인</w:t>
+      </w:r>
+      <w:r>
+        <w:t xml:space="preserve"> </w:t>
+      </w:r>
+      <w:r>
+        <w:rPr>
+          <w:bCs/>
+          <w:b/>
+        </w:rPr>
+        <w:t xml:space="preserve">오픈 액세스(open access, OA) 여부</w:t>
+      </w:r>
+      <w:r>
+        <w:t xml:space="preserve">를 측정하는 것이 아니라, 각 검색환경이 실제 제공한 링크가 로그인이나 결제 없이 full text로 연결되는지를 측정한다.</w:t>
+      </w:r>
+    </w:p>
+    <w:p>
+      <w:pPr>
+        <w:pStyle w:val="BodyText"/>
+      </w:pPr>
+      <w:r>
+        <w:t xml:space="preserve">두 Study는 하나의</w:t>
+      </w:r>
+      <w:r>
+        <w:t xml:space="preserve"> </w:t>
+      </w:r>
+      <w:r>
+        <w:rPr>
+          <w:rStyle w:val="VerbatimChar"/>
+        </w:rPr>
+        <w:t xml:space="preserve">검색 → 원문 접근 → 인용</w:t>
+      </w:r>
+      <w:r>
+        <w:t xml:space="preserve"> </w:t>
+      </w:r>
+      <w:r>
+        <w:t xml:space="preserve">인과과정을 구성하지 않는다. Study 1은 현재 Google Scholar index presence와 과거 영어권 인용궤적의 관계를 분석하고, Study 2는 현재 생성형 검색에서 한국어와 영어의 주요 문헌이 검색과 최종 출처 선택에서 어떻게 다르게 나타나는지를 직접 관찰한다. 분석설계와 시간적 범위는 다르지만 두 연구의 공통 질문은</w:t>
+      </w:r>
+      <w:r>
+        <w:t xml:space="preserve"> </w:t>
+      </w:r>
+      <w:r>
+        <w:rPr>
+          <w:bCs/>
+          <w:b/>
+        </w:rPr>
+        <w:t xml:space="preserve">한국어권에서 존재하고 실제 사용되는 연구 가운데 어떤 문헌이 국제적으로 이용되는 검색환경에서 검토 가능한 연구로 나타나는가</w:t>
+      </w:r>
+      <w:r>
+        <w:t xml:space="preserve">이다.</w:t>
+      </w:r>
+    </w:p>
+    <w:p>
+      <w:pPr>
+        <w:pStyle w:val="BodyText"/>
+      </w:pPr>
+      <w:r>
+        <w:t xml:space="preserve">본 논문은 문헌이 내용에 대한 실질적 평가를 받기 전에 검색 및 최종 출처 선택 과정에서 가시성을 잃는 현상을</w:t>
+      </w:r>
+      <w:r>
+        <w:t xml:space="preserve"> </w:t>
+      </w:r>
+      <w:r>
+        <w:rPr>
+          <w:bCs/>
+          <w:b/>
+        </w:rPr>
+        <w:t xml:space="preserve">discovery bottleneck</w:t>
+      </w:r>
+      <w:r>
+        <w:t xml:space="preserve">이라고 부른다. 이는 검색기술이 국제적 인용격차를 발생시키는 단일한 원인이라는 주장이 아니다. 특정 검색환경에서 문헌이 후보로 나타나지 않거나 검색과정에 등장했더라도 최종적으로 제시되는 출처에서 제외되는</w:t>
+      </w:r>
+      <w:r>
+        <w:t xml:space="preserve"> </w:t>
+      </w:r>
+      <w:r>
+        <w:rPr>
+          <w:bCs/>
+          <w:b/>
+        </w:rPr>
+        <w:t xml:space="preserve">관찰 가능한 누락</w:t>
+      </w:r>
+      <w:r>
+        <w:t xml:space="preserve">을 지칭하기 위한 조작적 개념이다.</w:t>
+      </w:r>
+    </w:p>
+    <w:p>
+      <w:pPr>
+        <w:pStyle w:val="BodyText"/>
+      </w:pPr>
+      <w:r>
+        <w:t xml:space="preserve">본 연구의 기여는 세 가지이다. 첫째, 한국 정치 연구의 국제적 가시성을 출판과 인용에 한정하지 않고</w:t>
+      </w:r>
+      <w:r>
+        <w:t xml:space="preserve"> </w:t>
+      </w:r>
+      <w:r>
+        <w:rPr>
+          <w:bCs/>
+          <w:b/>
+        </w:rPr>
+        <w:t xml:space="preserve">개별 논문이 실제 학술검색에서 확인되는가</w:t>
+      </w:r>
+      <w:r>
+        <w:t xml:space="preserve">라는 수준까지 확장한다. 둘째, 생성형 검색에서는 검색과정에서의 등장과 최종 출처 선택을 구분하여 한국어권의 주요 문헌이 어느 지점에서 가시성을 잃는지를 분석한다. 셋째, 문헌의 검색·선택과 제공된 링크를 통한 원문 접근을 구분함으로써 국제적 가시성을 하나의 단일한 결과로 환원하지 않는다.</w:t>
       </w:r>
     </w:p>
     <w:bookmarkEnd w:id="22"/>
@@ -285,13 +622,13 @@
         <w:t xml:space="preserve">2. 선행연구</w:t>
       </w:r>
     </w:p>
-    <w:bookmarkStart w:id="23" w:name="한국-정치학의-국제적-가시성과-학술검색"/>
+    <w:bookmarkStart w:id="23" w:name="국제-정치학의-가시성과-언어적-학술공간"/>
     <w:p>
       <w:pPr>
         <w:pStyle w:val="Heading2"/>
       </w:pPr>
       <w:r>
-        <w:t xml:space="preserve">2.1 한국 정치학의 국제적 가시성과 학술검색</w:t>
+        <w:t xml:space="preserve">2.1 국제 정치학의 가시성과 언어적 학술공간</w:t>
       </w:r>
     </w:p>
     <w:p>
@@ -299,57 +636,140 @@
         <w:pStyle w:val="FirstParagraph"/>
       </w:pPr>
       <w:r>
-        <w:t xml:space="preserve">정치학에서 국제적으로 가시적인 지식은 지역과 언어에 균등하게 분포하지 않는다. 한편으로는 어떤 국가와 지역이 연구대상으로 선택되는가에 편중이 존재한다. 주요 정치학 학술지의 연구대상은 역사적으로 북미와 서유럽에 집중되어 왔으며, 이러한 지리적 편중은 정치학의 기술적·인과적 주장과 이론의 적용범위와 관련된다(Wilson and Knutsen 2022). 국제 정치학의 출판 과정에서도 Global South 연구자의 대표성이 낮고 특정 연구기관 소속 연구자가 과대표되는 패턴이 보고되어 왔다(Breuning et al. 2018).</w:t>
-      </w:r>
-    </w:p>
-    <w:p>
-      <w:pPr>
-        <w:pStyle w:val="BodyText"/>
-      </w:pPr>
-      <w:r>
-        <w:t xml:space="preserve">다른 한편으로는 동일한 국가나 정치현상을 다루더라도 연구가 어느 언어권과 학술공간에서 생산·유통되는가에 따라 국제적 가시성과 인용 범위가 달라질 수 있다. 주요 국제 학술 데이터베이스는 영어권 학술지를 상대적으로 많이 포괄하며(Mongeon and Paul-Hus 2016; Vera-Baceta, Thelwall, and Kousha 2019), 다언어 학술지에서는 다른 출판특성을 고려한 뒤에도 비영어 논문의 인용이 영어 논문보다 낮게 나타난다(Di Bitetti and Ferreras 2017). 따라서 정치학의 국제적 지식구조에는 어떤 지역이 연구되는가뿐 아니라 그 연구가 어느 언어권의 학술공간을 통해 유통되는가라는 차원도 존재한다.</w:t>
-      </w:r>
-    </w:p>
-    <w:p>
-      <w:pPr>
-        <w:pStyle w:val="BodyText"/>
-      </w:pPr>
-      <w:r>
-        <w:t xml:space="preserve">한국 정치학에서도 한국어권과 영어권의 구분된 학술공간이 관찰된다. KCI와 SSCI에 출판된 한국 정치학 연구는 주제와 방법론적 패턴에서 차이를 보이며(Rhee 2026), 영어로 출판되어 국제 학술공간에서 유통되는 한국 정치 연구는 한국어권 연구보다 더 넓은 인용 범위와 국제적 인지도를 확보하는 경향을 보인다(Kim et al. 2025).</w:t>
-      </w:r>
-    </w:p>
-    <w:p>
-      <w:pPr>
-        <w:pStyle w:val="BodyText"/>
-      </w:pPr>
-      <w:r>
-        <w:t xml:space="preserve">본 연구는 이러한 차이를 학술검색에서 어떤 문헌이 가시화되는가라는 차원에서 확장한다. 데이터베이스가 어떤 문헌을 수록하는지는 coverage의 문제인 반면, 개별 문헌이 특정 검색에서 반환되는지는 retrievability의 문제이다(Azzopardi and Vinay 2008). 따라서 학술적 기록에 존재하는 문헌 전체와 특정 검색환경이 실제로 반환하는 문헌은 구분할 필요가 있다.</w:t>
-      </w:r>
-    </w:p>
-    <w:p>
-      <w:pPr>
-        <w:pStyle w:val="BodyText"/>
-      </w:pPr>
-      <w:r>
-        <w:t xml:space="preserve">원문 접근도 검색가능성과 동일하지 않다. 학술문헌의 무료 이용가능성은 주로 OA의 관점에서 분석되어 왔지만, 특정 검색환경이 이용 가능한 원문 version을 식별하여 접근경로로 제시하는지는 별도의 문제이다. Google Scholar는 publisher page뿐 아니라 대학·기관 repository와 연구자 웹사이트 등 다양한 출처의 scholarly content와 여러 version을 색인하고, 이용 가능한 경우 해당 version으로 연결되는 링크를 제공한다(Jamali and Nabavi 2015). 따라서 웹상에 무료 version이 존재하는 것과 검색환경이 그것을 실제 접근경로로 제공하는 것은 구분된다.</w:t>
-      </w:r>
-    </w:p>
-    <w:p>
-      <w:pPr>
-        <w:pStyle w:val="BodyText"/>
-      </w:pPr>
-      <w:r>
-        <w:t xml:space="preserve">이러한 개념적 구분에 따라 Study 1은 Google Scholar의 현재 논문 검색가능성과 영어권 인용의 시기별 관계를 분석하고, Study 2는 생성형 검색에서 benchmark의 검색 회수와 최종 출처 선택을 비교한다. 원문 접근은 두 연구 모두에서 가시성과 구분되는 별도 결과로 분석한다.</w:t>
+        <w:t xml:space="preserve">정치학에서 국제적으로 가시적인 지식은 연구대상, 연구자의 위치, 출판언어에 따라 불균등하게 구성되어 왔다. 주요 정치학 학술지의 연구대상은 역사적으로 북미와 서유럽에 집중되어 있으며, 이러한 지리적 편중은 특정 지역에서 형성된 기술적·인과적 주장이 정치학 전체로 일반화되는 범위와도 관련된다(Wilson and Knutsen 2022). 지식의 생산자 측면에서도 국제 정치학의 핵심 학술지에는 Global South 연구자의 대표성이 낮고 특정 연구기관 소속 연구자가 과대표되는 경향이 확인된다(Breuning et al. 2018). 정치학의 국제적 지식구조는 따라서 무엇을 연구하는가뿐 아니라</w:t>
+      </w:r>
+      <w:r>
+        <w:t xml:space="preserve"> </w:t>
+      </w:r>
+      <w:r>
+        <w:rPr>
+          <w:bCs/>
+          <w:b/>
+        </w:rPr>
+        <w:t xml:space="preserve">어떤 연구가 중심적인 학술공간에 진입하고 유통되는가</w:t>
+      </w:r>
+      <w:r>
+        <w:t xml:space="preserve">와 연결되어 있다.</w:t>
+      </w:r>
+    </w:p>
+    <w:p>
+      <w:pPr>
+        <w:pStyle w:val="BodyText"/>
+      </w:pPr>
+      <w:r>
+        <w:t xml:space="preserve">출판언어와 bibliographic infrastructure는 이러한 불균형의 또 다른 축이다. Web of Science와 Scopus는 전체 학술지 모집단에 비해 영어권 학술지를 상대적으로 많이 포괄하며(Mongeon and Paul-Hus 2016; Vera-Baceta, Thelwall, and Kousha 2019), 다언어 출판환경에서도 비영어 논문은 다른 출판특성을 고려한 뒤 영어 논문보다 낮은 citation rate를 보인다(Di Bitetti and Ferreras 2017). 즉 국제적으로 관찰되는 scholarly record는 여러 언어권에서 생산되는 연구 전체와 동일하지 않으며, 데이터베이스 coverage와 citation visibility 자체가 언어에 따라 선택적으로 구성될 수 있다.</w:t>
+      </w:r>
+    </w:p>
+    <w:p>
+      <w:pPr>
+        <w:pStyle w:val="BodyText"/>
+      </w:pPr>
+      <w:r>
+        <w:t xml:space="preserve">한국 정치 연구에서도 이러한 분화가 나타난다. KCI와 SSCI에 출판되는 한국 정치학 연구는 주제와 방법론적 구성에서 차이를 보이며(Rhee 2026), 한국어권과 영어권에서 생산·유통되는 한국 정치 연구는 국제적 인지도와 인용 범위에서도 서로 다른 패턴을 보인다(Kim et al. 2025). 따라서 한국 정치 연구의 국제적 가시성은 동일한 논문의 언어별 citation difference만으로 환원되지 않는다.</w:t>
+      </w:r>
+      <w:r>
+        <w:t xml:space="preserve"> </w:t>
+      </w:r>
+      <w:r>
+        <w:rPr>
+          <w:bCs/>
+          <w:b/>
+        </w:rPr>
+        <w:t xml:space="preserve">동일한 정치현상에 대해 한국어권에서 축적된 연구가 국제적인 학술정보 환경에 어느 정도 나타나는가</w:t>
+      </w:r>
+      <w:r>
+        <w:t xml:space="preserve">라는 문제도 포함한다.</w:t>
+      </w:r>
+    </w:p>
+    <w:p>
+      <w:pPr>
+        <w:pStyle w:val="BodyText"/>
+      </w:pPr>
+      <w:r>
+        <w:t xml:space="preserve">기존 연구는 publication, database coverage, citation에서 발생하는 이러한 불균형을 보여주지만, 연구자가 실제로 문헌을 발견하는 과정은 별도의 분석 수준이다. 연구자는 선행연구를 검토하기 위해 검색을 통해 후보 문헌을 구성하므로, 특정 연구가 학술적으로 존재하거나 데이터베이스가 해당 분야를 전반적으로 포괄하는 것과</w:t>
+      </w:r>
+      <w:r>
+        <w:t xml:space="preserve"> </w:t>
+      </w:r>
+      <w:r>
+        <w:rPr>
+          <w:bCs/>
+          <w:b/>
+        </w:rPr>
+        <w:t xml:space="preserve">개별 문헌이 실제 검색과정에서 검토대상으로 나타나는 것</w:t>
+      </w:r>
+      <w:r>
+        <w:t xml:space="preserve">은 구분될 수 있다.</w:t>
+      </w:r>
+    </w:p>
+    <w:p>
+      <w:pPr>
+        <w:pStyle w:val="BodyText"/>
+      </w:pPr>
+      <w:r>
+        <w:t xml:space="preserve">정보검색 연구에서는 이러한 차이를 데이터베이스 수준의</w:t>
+      </w:r>
+      <w:r>
+        <w:t xml:space="preserve"> </w:t>
+      </w:r>
+      <w:r>
+        <w:rPr>
+          <w:bCs/>
+          <w:b/>
+        </w:rPr>
+        <w:t xml:space="preserve">coverage</w:t>
+      </w:r>
+      <w:r>
+        <w:t xml:space="preserve">와 개별 문헌 수준의</w:t>
+      </w:r>
+      <w:r>
+        <w:t xml:space="preserve"> </w:t>
+      </w:r>
+      <w:r>
+        <w:rPr>
+          <w:bCs/>
+          <w:b/>
+        </w:rPr>
+        <w:t xml:space="preserve">retrievability</w:t>
+      </w:r>
+      <w:r>
+        <w:t xml:space="preserve">로 개념화해 왔다(Azzopardi and Vinay 2008). 본 연구에서 이 개념은 retrievability 자체를 주요 결과변수로 사용하는 근거라기보다,</w:t>
+      </w:r>
+      <w:r>
+        <w:t xml:space="preserve"> </w:t>
+      </w:r>
+      <w:r>
+        <w:rPr>
+          <w:bCs/>
+          <w:b/>
+        </w:rPr>
+        <w:t xml:space="preserve">aggregate coverage만으로 개별 논문의 검색 가시성을 판단할 수 없다는 개념적 근거</w:t>
+      </w:r>
+      <w:r>
+        <w:t xml:space="preserve">를 제공한다. Study 1에서는 이를 Google Scholar에서 해당 논문의 bibliographic record가 현재 확인되는지, 즉</w:t>
+      </w:r>
+      <w:r>
+        <w:t xml:space="preserve"> </w:t>
+      </w:r>
+      <w:r>
+        <w:rPr>
+          <w:bCs/>
+          <w:b/>
+        </w:rPr>
+        <w:t xml:space="preserve">Google Scholar index presence</w:t>
+      </w:r>
+      <w:r>
+        <w:t xml:space="preserve">의 문제로 분석한다.</w:t>
       </w:r>
     </w:p>
     <w:bookmarkEnd w:id="23"/>
-    <w:bookmarkStart w:id="24" w:name="study-1-google-scholar-검색가능성과-원문-접근"/>
+    <w:bookmarkStart w:id="24" w:name="X1329894a3f8476c786e1c1e3026abbea01aa50c"/>
     <w:p>
       <w:pPr>
         <w:pStyle w:val="Heading2"/>
       </w:pPr>
       <w:r>
-        <w:t xml:space="preserve">2.2 Study 1: Google Scholar 검색가능성과 원문 접근</w:t>
+        <w:t xml:space="preserve">2.2 Google Scholar의 coverage, index presence, 그리고 원문 접근</w:t>
       </w:r>
     </w:p>
     <w:p>
@@ -357,65 +777,72 @@
         <w:pStyle w:val="FirstParagraph"/>
       </w:pPr>
       <w:r>
-        <w:t xml:space="preserve">Google Scholar는 한국어를 포함한 비영어권 연구의 국제적 검색 가시성을 분석하기에 적절한 학술검색 환경이다. Web of Science와 Scopus보다 더 넓은 문헌과 인용을 포착하며, 추가적으로 확인되는 자료에는 비영어 문헌과 비학술지 자료가 상당수 포함된다(Chen 2010; Martín-Martín et al. 2018b, 2021). 또한 연구자와 대학원생의 scholarly information seeking에서 지속적으로 사용되어 왔으며, 사회과학에서도 주요 검색도구로 기능한다(Jamali and Asadi 2010; Cothran 2011; Blankstein 2022).</w:t>
-      </w:r>
-    </w:p>
-    <w:p>
-      <w:pPr>
-        <w:pStyle w:val="BodyText"/>
-      </w:pPr>
-      <w:r>
-        <w:t xml:space="preserve">그러나 넓은 database coverage가 모든 개별 논문의 검색가능성을 의미하지는 않는다. 외부 bibliographic record와 비교한 연구에서도 Google Scholar에서 반환되지 않는 문헌이 확인되었으며, 이는 aggregate coverage와 paper-level retrievability가 서로 다른 분석 수준임을 보여준다(Azzopardi and Vinay 2008; Delgado-Quirós et al. 2024).</w:t>
-      </w:r>
-    </w:p>
-    <w:p>
-      <w:pPr>
-        <w:pStyle w:val="BodyText"/>
-      </w:pPr>
-      <w:r>
-        <w:t xml:space="preserve">Study 1은 이 구분을 한국어권 정치학에서 이미 사용된 한국 정치 관련 문헌에 적용한다. 분석대상에는 한국어권에서만 인용된 논문과 영어권에서도 인용된 논문이 함께 포함되므로, 한국어권에서의 학술적 사용이라는 공통 출발점을 가진 문헌 안에서 현재 Google Scholar retrievability와 영어권 인용이 어떤 관계를 보이는지를 비교할 수 있다. 검색 인프라에서의 가시성이 국제적 학술 유통과 관련된다면, 현재 retrievable한 논문과 그렇지 않은 논문의 영어권 인용확률에서도 차이가 나타날 수 있다. 그러나 이는 현재의 Google Scholar 상태가 과거 인용을 발생시켰다는 인과가정이 아니라 현재 검색가능성에 따라 역사적 영어권 인용패턴이 어떻게 구분되는지를 보는 분석적 기대이다.</w:t>
-      </w:r>
-    </w:p>
-    <w:p>
-      <w:pPr>
-        <w:pStyle w:val="BodyText"/>
-      </w:pPr>
-      <w:r>
-        <w:t xml:space="preserve">Google Scholar가 제공하는 full-text route도 별도의 조건이다. Publisher version이 paywall 뒤에 있더라도 repository copy나 author-deposited manuscript가 연결될 수 있고, 반대로 무료 version이 웹에 존재하더라도 Google Scholar가 이를 제시하지 않을 수 있다(Jamali and Nabavi 2015). 기존 연구는 Google Scholar의 database 및 citation coverage와 Google Scholar를 통해 이용할 수 있는 full text의 범위를 주로 분석해 왔다(Chen 2010; Jamali and Nabavi 2015; Martín-Martín et al. 2018a, 2018b, 2021; Delgado-Quirós et al. 2024). 본 연구에서는 이러한 접근경로를 일반적 OA와 구분하여 Google Scholar-mediated full-text access로 측정한다.</w:t>
-      </w:r>
-    </w:p>
-    <w:p>
-      <w:pPr>
-        <w:pStyle w:val="BodyText"/>
-      </w:pPr>
-      <w:r>
-        <w:t xml:space="preserve">영어권 인용을 시기별 cohort로 나누는 이유는 누적 인용만으로는 현재 retrievable한 논문과 그렇지 않은 논문의 격차가 어느 기간에 확대되거나 축소되었는지를 알 수 없기 때문이다. 반면 연도별 citation incidence는 희소하여 지나치게 세분하면 추정이 불안정해질 수 있다. 이에 2010년 이후를 동일한 5년 단위로 나누고 그 이전을 기준기간으로 통합하여 visible–nonvisible gap의 시간적 이질성을 비교한다.</w:t>
-      </w:r>
-    </w:p>
-    <w:p>
-      <w:pPr>
-        <w:pStyle w:val="BodyText"/>
-      </w:pPr>
-      <w:r>
-        <w:t xml:space="preserve">이 cohort는 Google Scholar의 역사적 indexing 상태나 adoption stage를 대리하지 않는다. 각 target paper가 어느 시점부터 Google Scholar에서 검색 가능했는지는 관찰되지 않기 때문이다. 따라서 cohort의 역할은 현재의 retrievability로 구분되는 두 집단 사이의 영어권 인용격차가 서로 다른 citation period에서 어떻게 나타났는지를 비교하는 것에 한정된다.</w:t>
-      </w:r>
-    </w:p>
-    <w:p>
-      <w:pPr>
-        <w:pStyle w:val="BodyText"/>
-      </w:pPr>
-      <w:r>
-        <w:t xml:space="preserve">또한 늦게 출판된 target은 초기 cohort에 기여할 수 없어 cohort별 eligible-target composition이 달라질 수 있다. 이를 점검하기 위해 Google Scholar가 출시된 2004년까지 출판된 target만을 대상으로 동일한 분석을 반복한다. 이 restriction은 과거 Google Scholar 상태를 복원하기 위한 것이 아니라, 네 cohort 모두에 기여할 시간적 기회를 가진 보다 일정한 target set에서 결과가 유지되는지를 확인하기 위한 robustness check이다.</w:t>
+        <w:t xml:space="preserve">Google Scholar는 비영어권 연구의 국제적 가시성을 검토하기에 중요한 학술검색 환경이다. Web of Science와 Scopus와의 비교에서 Google Scholar는 더 넓은 범위의 문헌과 인용을 포착하며, 추가적으로 확인되는 자료에는 비영어 문헌과 비학술지 자료도 상당수 포함된다(Chen 2010; Martín-Martín et al. 2018b, 2021). 선택적 국제 citation index에서 충분히 포착되지 않는 연구가 Google Scholar에서는 확인될 수 있다는 점에서, 이러한 broad coverage는 비영어권 학술문헌의 가시성과 관련된다.</w:t>
+      </w:r>
+    </w:p>
+    <w:p>
+      <w:pPr>
+        <w:pStyle w:val="BodyText"/>
+      </w:pPr>
+      <w:r>
+        <w:t xml:space="preserve">그러나 Google Scholar가 특정 언어나 분야를 전반적으로 폭넓게 포괄한다는 사실이 모든 개별 논문의 bibliographic record가 실제로 확인됨을 보장하지는 않는다. 외부 bibliographic record와 비교한 연구에서도 Google Scholar에서 반환되지 않는 publication이 보고되어 왔다(Delgado-Quirós et al. 2024). 따라서</w:t>
+      </w:r>
+      <w:r>
+        <w:t xml:space="preserve"> </w:t>
+      </w:r>
+      <w:r>
+        <w:rPr>
+          <w:bCs/>
+          <w:b/>
+        </w:rPr>
+        <w:t xml:space="preserve">Google Scholar의 aggregate coverage와 개별 논문의 index presence는 분석적으로 구분될 필요가 있다.</w:t>
+      </w:r>
+    </w:p>
+    <w:p>
+      <w:pPr>
+        <w:pStyle w:val="BodyText"/>
+      </w:pPr>
+      <w:r>
+        <w:t xml:space="preserve">이 구분은 Google Scholar가 실제 scholarly discovery에서 널리 사용되는 검색환경이라는 점에서 의미를 갖는다. 연구자와 대학원생의 정보탐색에서 Google과 Google Scholar의 이용이 반복적으로 확인되어 왔으며(Jamali and Asadi 2010; Cothran 2011), 최근 faculty survey에서도 Google Scholar는 사회과학 연구자가 새로운 학술문헌을 찾는 주요 시작점 가운데 하나로 나타난다(Blankstein 2022). 이러한 이용 자체가 이후의 citation을 발생시킨다는 뜻은 아니지만, 개별 논문의 index presence가 실제 문헌탐색이 이루어지는 환경에서 관찰되는 속성이라는 점은 분명하다.</w:t>
+      </w:r>
+    </w:p>
+    <w:p>
+      <w:pPr>
+        <w:pStyle w:val="BodyText"/>
+      </w:pPr>
+      <w:r>
+        <w:t xml:space="preserve">Google Scholar의 원문 제공에 관한 연구는 별도의 차원을 보여준다. Google Scholar는 publisher site 외에도 repository와 기타 웹 출처에서 확인되는 version으로 연결할 수 있으며, 상당수 문헌에서 무료 full text로 이어지는 링크를 제공한다(Jamali and Nabavi 2015; Martín-Martín et al. 2018a). 그러나 논문의 bibliographic record가 Google Scholar에서 확인되는 것과 Google Scholar가 이용 가능한 원문 링크를 제공하는 것은 동일하지 않다. 인덱스된 논문도 paywall이나 abstract page로만 연결될 수 있으며, 웹에 무료 version이 존재해도 Google Scholar가 해당 version을 제시하지 않을 수 있다.</w:t>
+      </w:r>
+    </w:p>
+    <w:p>
+      <w:pPr>
+        <w:pStyle w:val="BodyText"/>
+      </w:pPr>
+      <w:r>
+        <w:t xml:space="preserve">이러한 선행연구는</w:t>
+      </w:r>
+      <w:r>
+        <w:t xml:space="preserve"> </w:t>
+      </w:r>
+      <w:r>
+        <w:rPr>
+          <w:bCs/>
+          <w:b/>
+        </w:rPr>
+        <w:t xml:space="preserve">database coverage, paper-level index presence, 그리고 제공 링크를 통한 원문 접근</w:t>
+      </w:r>
+      <w:r>
+        <w:t xml:space="preserve">이 서로 다른 속성임을 보여준다. Study 1은 이 구분을 한국어권 정치학에서 실제로 사용된 한국 정치 관련 문헌에 적용한다. Google Scholar 전체의 coverage를 다시 추정하는 것이 아니라, 동일하게 한국어권 citation record를 가진 문헌 가운데 현재 Google Scholar index presence에 따라 영어권 인용의 역사적 패턴이 어떻게 다른지를 분석한다.</w:t>
       </w:r>
     </w:p>
     <w:bookmarkEnd w:id="24"/>
-    <w:bookmarkStart w:id="25" w:name="study-2-생성형-검색에서의-검색-추천-원문-접근"/>
+    <w:bookmarkStart w:id="25" w:name="생성형-학술검색과-문헌-선택"/>
     <w:p>
       <w:pPr>
         <w:pStyle w:val="Heading2"/>
       </w:pPr>
       <w:r>
-        <w:t xml:space="preserve">2.3 Study 2: 생성형 검색에서의 검색, 추천, 원문 접근</w:t>
+        <w:t xml:space="preserve">2.3 생성형 학술검색과 문헌 선택</w:t>
       </w:r>
     </w:p>
     <w:p>
@@ -423,50 +850,136 @@
         <w:pStyle w:val="FirstParagraph"/>
       </w:pPr>
       <w:r>
-        <w:t xml:space="preserve">Generative search는 retrieval 이후의 source selection까지 검색환경이 수행한다는 점에서 기존 학술검색과 구분된다. Web-enabled LLM은 외부 자료를 검색한 뒤 검색된 문헌 전체를 그대로 제시하지 않고 그중 일부를 citation이나 recommendation으로 선택하여 답변을 구성한다(Liu, Zhang, and Liang 2023). 따라서 생성형 검색에서의 문헌 가시성은 검색단계에 나타나는 것과 최종 출처로 선택되는 것을 구분하여 분석할 필요가 있다.</w:t>
-      </w:r>
-    </w:p>
-    <w:p>
-      <w:pPr>
-        <w:pStyle w:val="BodyText"/>
-      </w:pPr>
-      <w:r>
-        <w:t xml:space="preserve">Scholarly retrieval을 평가하려면 생성된 결과 자체와 독립적인 비교기준이 필요하다. 정보검색에서는 사전에 정의된 relevant set을 이용하여 retrieval 성능을 평가하며(Manning, Raghavan, and Schütze 2008), 최근의 scholarly-search benchmark도 실행 이전에 target paper를 정한 뒤 해당 문헌의 회수를 측정한다(Ajith et al. 2024; He et al. 2025). 이 구분은 multilingual search에서 특히 중요하다. 한국어 논문이 결과에 많이 포함되는 것과 한국어권에서 사전에 주요 문헌으로 선정된 특정 논문이 실제로 회수되는 것은 동일하지 않다. Study 2는 전자를 language representation, 후자를 benchmark recovery로 구분한다.</w:t>
-      </w:r>
-    </w:p>
-    <w:p>
-      <w:pPr>
-        <w:pStyle w:val="BodyText"/>
-      </w:pPr>
-      <w:r>
-        <w:t xml:space="preserve">질의 언어와 출처 지시는 생성형 검색에서 어떤 학술공간의 문헌이 후보로 들어오는지와 관련된 조건이다. Query와 source instruction은 retrieval과 source selection의 입력이 되며, 탐색되는 출처의 범위와 최종적으로 선택되는 자료를 변화시킬 수 있다(Liu, Zhang, and Liang 2023; He et al. 2025). 한국 정치학처럼 한국어권과 영어권이 서로 다른 학술정보원을 통해 문헌을 유통하는 경우에는 영어 general-web query와 한국어 질의 또는 한국 학술 데이터베이스를 명시한 검색이 서로 다른 scholarly source space를 불러올 수 있다. 따라서 한국어 문헌의 상대적 가시성은 고정된 값이 아니라 검색조건에 따라 달라질 수 있는 결과로 분석할 필요가 있다.</w:t>
-      </w:r>
-    </w:p>
-    <w:p>
-      <w:pPr>
-        <w:pStyle w:val="BodyText"/>
-      </w:pPr>
-      <w:r>
-        <w:t xml:space="preserve">Study 2의 주제는 이 언어권 비교가 가능한 영역으로 제한한다. 한국어권과 영어권 한국 정치학의 연구지형을 비교한 Kim et al. (2025)을 바탕으로, 두 학술공간에서 모두 지속적으로 연구되어 온 한국 정치 주제 가운데 한국 현대정치의 전개를 대체로 시간적 순서로 포괄하도록 한국전쟁, 한국 경제발전, 한국 민주화, 북한 핵문제, 한류의 다섯 주제를 선정하였다. 이는 특정 주제 자체가 한 언어권에 거의 존재하지 않기 때문에 발생하는 차이를 줄이고, 동일한 substantive topic 안에서 양 언어권의 주요 문헌이 어떻게 검색·선택되는지를 비교하기 위한 것이다.</w:t>
-      </w:r>
-    </w:p>
-    <w:p>
-      <w:pPr>
-        <w:pStyle w:val="BodyText"/>
-      </w:pPr>
-      <w:r>
-        <w:t xml:space="preserve">생성형 검색에서 추천 이후의 원문 접근도 별개의 결과이다. 실제 논문이 정확하게 추천되더라도 제공된 URL이 paywall, abstract page 또는 broken link로 연결될 수 있다. 따라서 Study 2는 검색 결과에서의 benchmark recovery, final recommendation recovery, 제공 링크를 통한 full-text access를 분리하여 측정한다. 이 구분을 통해 한국어–영어 격차가 검색에서 발생하는지, 최종 source selection에서 나타나는지, 또는 원문 접근에서도 이어지는지를 살펴본다.</w:t>
+        <w:t xml:space="preserve">생성형 검색에서는 검색된 자료 전체가 사용자에게 그대로 제시되지 않는다. Web-enabled LLM은 외부 자료를 검색한 뒤 그중 일부를 citation이나 recommendation으로 선택하고 이를 바탕으로 답변을 생성한다. 따라서 생성형 검색에 관한 연구는 단순한 검색 여부뿐 아니라 어떤 source가 최종 답변에 포함되는지, citation이 실제 주장을 뒷받침하는지, 제시된 출처를 검증할 수 있는지 등을 별도의 문제로 분석해 왔다(Liu, Zhang, and Liang 2023).</w:t>
+      </w:r>
+    </w:p>
+    <w:p>
+      <w:pPr>
+        <w:pStyle w:val="BodyText"/>
+      </w:pPr>
+      <w:r>
+        <w:t xml:space="preserve">학술문헌 검색에 LLM을 적용하는 최근 연구는 시스템이 생성한 목록의 표면적 타당성보다</w:t>
+      </w:r>
+      <w:r>
+        <w:t xml:space="preserve"> </w:t>
+      </w:r>
+      <w:r>
+        <w:rPr>
+          <w:bCs/>
+          <w:b/>
+        </w:rPr>
+        <w:t xml:space="preserve">사전에 정한 문헌이 실제로 검색되는가</w:t>
+      </w:r>
+      <w:r>
+        <w:t xml:space="preserve">를 평가하는 방향으로 발전하고 있다. LitSearch는 시스템 실행과 독립적으로 target paper를 정의한 뒤 검색성능을 평가하고(Ajith et al. 2024), PaSa와 같은 academic-search agent도 query–paper benchmark를 이용해 학술문헌 회수를 평가한다(He et al. 2025). 이는 정보검색에서 사전에 정의된 relevant set을 기준으로 검색성능을 평가하는 전통과 연결된다(Manning, Raghavan, and Schütze 2008). 최근 LLM 기반 scholar recommendation audit 역시 외부 benchmark를 이용하여 사전에 지정된 연구자나 문헌이 실제 추천되는지를 측정한다(Espín-Noboa and Méndez 2026). 동시에 LLM을 이용한 literature search 연구가 빠르게 늘고 있지만, 체계적 문헌고찰과 같은 엄격한 검색과정에서의 적용은 아직 충분히 확립되지 않았다는 지적도 제기된다(Lieberum et al. 2025; Asai et al. 2026).</w:t>
+      </w:r>
+    </w:p>
+    <w:p>
+      <w:pPr>
+        <w:pStyle w:val="BodyText"/>
+      </w:pPr>
+      <w:r>
+        <w:t xml:space="preserve">이러한 접근은 비영어권 학술문헌을 분석할 때 특히 중요하다. 생성된 목록에 한국어 논문이 많다는 것은</w:t>
+      </w:r>
+      <w:r>
+        <w:t xml:space="preserve"> </w:t>
+      </w:r>
+      <w:r>
+        <w:rPr>
+          <w:bCs/>
+          <w:b/>
+        </w:rPr>
+        <w:t xml:space="preserve">한국어 자료가 많이 제시되었다는 사실</w:t>
+      </w:r>
+      <w:r>
+        <w:t xml:space="preserve">을 보여주지만, 그것만으로 한국어권에서 축적된 주요 연구가 충분히 반영되었다고 판단할 수는 없다. 검색조건에 따라 한국어 논문이 다수 추천되더라도, 한국어권 정치학에서 주요하게 다뤄져 온 특정 연구가 거의 포함되지 않을 수 있기 때문이다. 따라서 생성형 검색에서 한국어 학술문헌의 가시성을 분석하려면 최종 추천의 언어적 구성과</w:t>
+      </w:r>
+      <w:r>
+        <w:t xml:space="preserve"> </w:t>
+      </w:r>
+      <w:r>
+        <w:rPr>
+          <w:bCs/>
+          <w:b/>
+        </w:rPr>
+        <w:t xml:space="preserve">사전에 확인한 주요 한국어 문헌이 실제로 검색·선택되는지</w:t>
+      </w:r>
+      <w:r>
+        <w:t xml:space="preserve">를 구분할 필요가 있다.</w:t>
+      </w:r>
+    </w:p>
+    <w:p>
+      <w:pPr>
+        <w:pStyle w:val="BodyText"/>
+      </w:pPr>
+      <w:r>
+        <w:t xml:space="preserve">생성형 검색에서 최종적으로 선택되는 source 역시 고정되어 있지 않다. 기존 연구에서는 생성형 검색결과가 source authority, 지리적 위치, 기관 또는 상업적 출처에 따라 차이를 보일 수 있음이 보고되어 왔다(Liu, Zhang, and Liang 2023; Li and Sinnamon 2024). 한국 정치 연구처럼 한국어권과 영어권 문헌이 서로 다른 데이터베이스와 출판경로를 통해 유통되는 경우에는</w:t>
+      </w:r>
+      <w:r>
+        <w:t xml:space="preserve"> </w:t>
+      </w:r>
+      <w:r>
+        <w:rPr>
+          <w:bCs/>
+          <w:b/>
+        </w:rPr>
+        <w:t xml:space="preserve">질의 언어와 어떤 학술정보원을 검색하도록 지시하는가</w:t>
+      </w:r>
+      <w:r>
+        <w:t xml:space="preserve">가 검색되는 문헌과 최종적으로 제시되는 출처를 변화시킬 가능성이 있다.</w:t>
+      </w:r>
+    </w:p>
+    <w:p>
+      <w:pPr>
+        <w:pStyle w:val="BodyText"/>
+      </w:pPr>
+      <w:r>
+        <w:t xml:space="preserve">이러한 선행연구를 바탕으로 Study 2는 두 지점을 구분한다. 먼저 benchmark paper가 provider가 외부에 공개하는 search trace에서 확인되는지를 본다. 다음으로 해당 논문이 최종 recommendation에 포함되는지를 별도로 본다. Provider가 내부 검색과정을 모두 공개하지 않으므로 search trace를 전체 retrieval process와 동일시할 수는 없지만, 두 결과를 분리하면 특정 문헌이 최종 추천에 없을 때 적어도</w:t>
+      </w:r>
+      <w:r>
+        <w:t xml:space="preserve"> </w:t>
+      </w:r>
+      <w:r>
+        <w:rPr>
+          <w:bCs/>
+          <w:b/>
+        </w:rPr>
+        <w:t xml:space="preserve">관찰 가능한 검색흔적에서부터 나타나지 않았는지, 아니면 검색흔적에는 나타났지만 최종 출처로 제시되지 않았는지</w:t>
+      </w:r>
+      <w:r>
+        <w:t xml:space="preserve">를 구분할 수 있다.</w:t>
+      </w:r>
+    </w:p>
+    <w:p>
+      <w:pPr>
+        <w:pStyle w:val="BodyText"/>
+      </w:pPr>
+      <w:r>
+        <w:t xml:space="preserve">Study 2는 이를 한국어권과 영어권에서 모두 연구되어 온 동일한 한국 정치 주제에 적용한다. Query language와 한국 학술 데이터베이스에 대한 명시적 검색 지시를 변화시켜,</w:t>
+      </w:r>
+      <w:r>
+        <w:t xml:space="preserve"> </w:t>
+      </w:r>
+      <w:r>
+        <w:rPr>
+          <w:bCs/>
+          <w:b/>
+        </w:rPr>
+        <w:t xml:space="preserve">한국어권에서 사전에 주요 문헌으로 확인한 연구가 어떤 조건에서 실제 검색흔적과 최종 추천에 나타나는지</w:t>
+      </w:r>
+      <w:r>
+        <w:t xml:space="preserve">를 분석한다. 제공된 링크를 통한 원문 접근은 검색 및 출처 선택과 구분되는 별도의 결과로 측정한다.</w:t>
       </w:r>
     </w:p>
     <w:bookmarkEnd w:id="25"/>
     <w:bookmarkEnd w:id="26"/>
-    <w:bookmarkStart w:id="31" w:name="study-1-google-scholar-가시성과-영어권-인용"/>
+    <w:bookmarkStart w:id="31" w:name="X69d73f8838c4c8be11c13c91d2c43ad1f3a370a"/>
     <w:p>
       <w:pPr>
         <w:pStyle w:val="Heading1"/>
       </w:pPr>
       <w:r>
-        <w:t xml:space="preserve">3. Study 1: Google Scholar 가시성과 영어권 인용</w:t>
+        <w:t xml:space="preserve">3. Study 1: Google Scholar Index Presence와 영어권 인용</w:t>
       </w:r>
     </w:p>
     <w:bookmarkStart w:id="27" w:name="데이터와-변수"/>
@@ -483,23 +996,36 @@
         <w:pStyle w:val="FirstParagraph"/>
       </w:pPr>
       <w:r>
-        <w:t xml:space="preserve">Study 1의 핵심 비교는 한국어권 정치학에서 이미 사용된 한국 정치 관련 문헌 가운데 현재 Google Scholar에서 검색 가능한 논문과 그렇지 않은 논문의 영어권 인용확률이 시기에 따라 어떻게 다른가이다.</w:t>
-      </w:r>
-    </w:p>
-    <w:p>
-      <w:pPr>
-        <w:pStyle w:val="BodyText"/>
-      </w:pPr>
-      <w:r>
-        <w:t xml:space="preserve">분석대상은 2000–2025년에 생산된 한국어권 정치학 논문들이 인용한 한국 정치 관련 논문 54,789편이다. 표본 포함 기준은 해당 기간의 한국어권 정치학 문헌에서 최소 한 번 인용되었다는 것이므로, 한국어권에서만 인용된 논문과 한국어권 및 영어권 양쪽에서 인용된 논문이 함께 포함된다. 따라서 분석은 국내 학술적 사용 여부가 전혀 다른 문헌을 비교하는 것이 아니라, 한국어권에서 사용된 기록을 공유하는 문헌 안에서 영어권 인용 여부와 검색가능성의 관계를 살펴본다.</w:t>
-      </w:r>
-    </w:p>
-    <w:p>
-      <w:pPr>
-        <w:pStyle w:val="BodyText"/>
-      </w:pPr>
-      <w:r>
-        <w:t xml:space="preserve">영어권 인용은 누적 citation count로 합치지 않고 citation cohort별 incidence로 구성한다. 누적 인용만 사용하면 visible–nonvisible gap의 시간적 변화를 확인할 수 없고, 연도별 outcome은 citation event가 희소하여 추정이 불안정할 수 있다. 이에 영어권 citing paper를 다음 네 기간으로 구분한다.</w:t>
+        <w:t xml:space="preserve">Study 1은</w:t>
+      </w:r>
+      <w:r>
+        <w:t xml:space="preserve"> </w:t>
+      </w:r>
+      <w:r>
+        <w:rPr>
+          <w:bCs/>
+          <w:b/>
+        </w:rPr>
+        <w:t xml:space="preserve">한국어권 정치학에서 이미 사용된 한국 정치 관련 문헌 가운데 현재 Google Scholar index presence가 확인되는 논문과 그렇지 않은 논문의 영어권 인용확률이 시기에 따라 어떻게 다른가</w:t>
+      </w:r>
+      <w:r>
+        <w:t xml:space="preserve">를 분석한다.</w:t>
+      </w:r>
+    </w:p>
+    <w:p>
+      <w:pPr>
+        <w:pStyle w:val="BodyText"/>
+      </w:pPr>
+      <w:r>
+        <w:t xml:space="preserve">분석대상은 2000–2025년에 생산된 한국어권 정치학 논문들이 인용한 한국 정치 관련 논문 54,789편이다. 표본에 포함되려면 이 기간의 한국어권 정치학 문헌에서 적어도 한 번 인용되어야 한다. 따라서 한국어권에서만 인용된 논문과 한국어권 및 영어권 양쪽에서 인용된 논문이 함께 포함된다.</w:t>
+      </w:r>
+    </w:p>
+    <w:p>
+      <w:pPr>
+        <w:pStyle w:val="BodyText"/>
+      </w:pPr>
+      <w:r>
+        <w:t xml:space="preserve">영어권 인용은 누적 citation count 하나로 합치지 않고 citation cohort별 incidence로 구성한다.</w:t>
       </w:r>
     </w:p>
     <w:p>
@@ -511,7 +1037,17 @@
         <w:pStyle w:val="Compact"/>
       </w:pPr>
       <w:r>
-        <w:t xml:space="preserve">C1: 2009년 이하</w:t>
+        <w:rPr>
+          <w:bCs/>
+          <w:b/>
+        </w:rPr>
+        <w:t xml:space="preserve">C1:</w:t>
+      </w:r>
+      <w:r>
+        <w:t xml:space="preserve"> </w:t>
+      </w:r>
+      <w:r>
+        <w:t xml:space="preserve">2009년까지</w:t>
       </w:r>
     </w:p>
     <w:p>
@@ -523,7 +1059,17 @@
         <w:pStyle w:val="Compact"/>
       </w:pPr>
       <w:r>
-        <w:t xml:space="preserve">C2: 2010–2014</w:t>
+        <w:rPr>
+          <w:bCs/>
+          <w:b/>
+        </w:rPr>
+        <w:t xml:space="preserve">C2:</w:t>
+      </w:r>
+      <w:r>
+        <w:t xml:space="preserve"> </w:t>
+      </w:r>
+      <w:r>
+        <w:t xml:space="preserve">2010–2014</w:t>
       </w:r>
     </w:p>
     <w:p>
@@ -535,7 +1081,17 @@
         <w:pStyle w:val="Compact"/>
       </w:pPr>
       <w:r>
-        <w:t xml:space="preserve">C3: 2015–2019</w:t>
+        <w:rPr>
+          <w:bCs/>
+          <w:b/>
+        </w:rPr>
+        <w:t xml:space="preserve">C3:</w:t>
+      </w:r>
+      <w:r>
+        <w:t xml:space="preserve"> </w:t>
+      </w:r>
+      <w:r>
+        <w:t xml:space="preserve">2015–2019</w:t>
       </w:r>
     </w:p>
     <w:p>
@@ -547,7 +1103,17 @@
         <w:pStyle w:val="Compact"/>
       </w:pPr>
       <w:r>
-        <w:t xml:space="preserve">C4: 2020–2024</w:t>
+        <w:rPr>
+          <w:bCs/>
+          <w:b/>
+        </w:rPr>
+        <w:t xml:space="preserve">C4:</w:t>
+      </w:r>
+      <w:r>
+        <w:t xml:space="preserve"> </w:t>
+      </w:r>
+      <w:r>
+        <w:t xml:space="preserve">2020–2024</w:t>
       </w:r>
     </w:p>
     <w:p>
@@ -555,7 +1121,7 @@
         <w:pStyle w:val="FirstParagraph"/>
       </w:pPr>
       <w:r>
-        <w:t xml:space="preserve">C1은 이후 cohort와의 비교를 위한 기준기간이며 Google Scholar 도입 이전의 검색환경을 의미하지 않는다. 2010년 이후에는 동일한 5년 구간을 사용하여 기간 길이에 따른 차이를 줄인다.</w:t>
+        <w:t xml:space="preserve">C1은 이후 cohort와 비교하기 위한 기준기간이며 Google Scholar 도입 이전의 검색환경을 의미하지 않는다. 2010년 이후에는 동일한 5년 구간을 사용한다.</w:t>
       </w:r>
     </w:p>
     <w:p>
@@ -607,31 +1173,86 @@
         <w:pStyle w:val="FirstParagraph"/>
       </w:pPr>
       <w:r>
-        <w:t xml:space="preserve">은 해당 기간의 영어권 source paper가 target을 적어도 한 번 인용한 경우이며, 그렇지 않으면 0이다. 최종 panel은 179,230개의 target-paper × cohort observation으로 구성된다.</w:t>
-      </w:r>
-    </w:p>
-    <w:p>
-      <w:pPr>
-        <w:pStyle w:val="BodyText"/>
-      </w:pPr>
-      <w:r>
-        <w:t xml:space="preserve">주요 exposure (D_j)는 2026년 현재 Google Scholar retrievability이다. 가능한 한국어 제목, 영어 제목, reference-title variant를 이용하여 검색하고 사전에 정한 bibliographic matching 기준을 충족하는 record가 확인되면 (D_j=1), 검색을 완료했지만 match가 없으면 (D_j=0)으로 코딩한다. 표본에는 19,436편의 retrievable paper와 35,353편의 nonretrievable paper가 있다.</w:t>
-      </w:r>
-    </w:p>
-    <w:p>
-      <w:pPr>
-        <w:pStyle w:val="BodyText"/>
-      </w:pPr>
-      <w:r>
-        <w:t xml:space="preserve">여기서 retrievability의 범위는 의도적으로 좁다. Exact-title 기반 lookup은 known-item search이므로 broad topic query에서 처음 해당 논문이 발견될 가능성이나 ranking을 측정하지 않는다. 이미 논문을 식별할 수 있는 제목정보가 주어졌을 때 현재 Google Scholar가 해당 bibliographic record를 반환하는지를 측정한다.</w:t>
-      </w:r>
-    </w:p>
-    <w:p>
-      <w:pPr>
-        <w:pStyle w:val="BodyText"/>
-      </w:pPr>
-      <w:r>
-        <w:t xml:space="preserve">보조 변수는 현재 retrievable한 논문에 대한 Google Scholar-mediated full-text access이다. Google Scholar가 제공한 링크가 로그인이나 결제 없이 full text를 여는 경우 accessible로 코딩한다. 이는 인터넷 전체에서의 OA status가 아니라 현재 Google Scholar가 제공하는 접근경로에 조건부인 변수이다.</w:t>
+        <w:t xml:space="preserve">은 해당 기간의 영어권 source paper가 target을 적어도 한 번 인용한 경우이며, 그렇지 않으면 0이다. 최종 panel은</w:t>
+      </w:r>
+      <w:r>
+        <w:t xml:space="preserve"> </w:t>
+      </w:r>
+      <w:r>
+        <w:rPr>
+          <w:bCs/>
+          <w:b/>
+        </w:rPr>
+        <w:t xml:space="preserve">179,230개의 target-paper × cohort observation</w:t>
+      </w:r>
+      <w:r>
+        <w:t xml:space="preserve">으로 구성된다.</w:t>
+      </w:r>
+    </w:p>
+    <w:p>
+      <w:pPr>
+        <w:pStyle w:val="BodyText"/>
+      </w:pPr>
+      <w:r>
+        <w:t xml:space="preserve">주요 변수 (D_j)는</w:t>
+      </w:r>
+      <w:r>
+        <w:t xml:space="preserve"> </w:t>
+      </w:r>
+      <w:r>
+        <w:rPr>
+          <w:bCs/>
+          <w:b/>
+        </w:rPr>
+        <w:t xml:space="preserve">2026년 현재 Google Scholar index presence</w:t>
+      </w:r>
+      <w:r>
+        <w:t xml:space="preserve">이다. 가능한 한국어 제목, 영어 제목, reference-title variant를 사용해 검색하고 사전에 정한 bibliographic matching 기준을 충족하는 Google Scholar record가 확인되면 (D_j=1)로 코딩한다. 검색을 완료했지만 확인 가능한 matching record를 찾지 못하면 (D_j=0)으로 코딩한다. 표본에는 (D_j=1)인 논문 19,436편과 (D_j=0)인 논문 35,353편이 있다.</w:t>
+      </w:r>
+    </w:p>
+    <w:p>
+      <w:pPr>
+        <w:pStyle w:val="BodyText"/>
+      </w:pPr>
+      <w:r>
+        <w:t xml:space="preserve">Google Scholar는 전체 index의 공개 목록을 제공하지 않으므로, 여기서</w:t>
+      </w:r>
+      <w:r>
+        <w:t xml:space="preserve"> </w:t>
+      </w:r>
+      <w:r>
+        <w:rPr>
+          <w:bCs/>
+          <w:b/>
+        </w:rPr>
+        <w:t xml:space="preserve">index presence는 본 연구의 title-based search와 matching 절차를 통해 bibliographic record의 존재가 확인되었는지로 조작화한다.</w:t>
+      </w:r>
+      <w:r>
+        <w:t xml:space="preserve"> </w:t>
+      </w:r>
+      <w:r>
+        <w:t xml:space="preserve">따라서 (D_j=0)은 Google Scholar의 모든 가능한 검색에서 해당 논문이 절대 존재하지 않는다는 뜻이 아니라, 본 연구의 검색절차에서 현재 index presence를 확인하지 못했다는 의미이다.</w:t>
+      </w:r>
+    </w:p>
+    <w:p>
+      <w:pPr>
+        <w:pStyle w:val="BodyText"/>
+      </w:pPr>
+      <w:r>
+        <w:t xml:space="preserve">보조 변수는 현재 Google Scholar record가 확인된 논문에 대해</w:t>
+      </w:r>
+      <w:r>
+        <w:t xml:space="preserve"> </w:t>
+      </w:r>
+      <w:r>
+        <w:rPr>
+          <w:bCs/>
+          <w:b/>
+        </w:rPr>
+        <w:t xml:space="preserve">Google Scholar가 제공한 링크가 로그인이나 결제 없이 full text로 연결되는지</w:t>
+      </w:r>
+      <w:r>
+        <w:t xml:space="preserve">이다. 이는 논문의 일반적인 OA 여부를 측정하지 않는다.</w:t>
       </w:r>
     </w:p>
     <w:bookmarkEnd w:id="27"/>
@@ -649,7 +1270,7 @@
         <w:pStyle w:val="FirstParagraph"/>
       </w:pPr>
       <w:r>
-        <w:t xml:space="preserve">주요 분석은 현재 Google Scholar retrievability에 따른 영어권 인용확률 격차가 citation cohort별로 달라지는지를 검정한다. Target-paper fixed-effects linear probability model은 다음과 같다.</w:t>
+        <w:t xml:space="preserve">주요 분석은 현재 Google Scholar index presence에 따른 영어권 인용확률 격차가 citation cohort별로 달라지는지를 검정한다. Target-paper fixed-effects linear probability model은 다음과 같다.</w:t>
       </w:r>
     </w:p>
     <w:p>
@@ -886,40 +1507,57 @@
         <w:pStyle w:val="FirstParagraph"/>
       </w:pPr>
       <w:r>
-        <w:t xml:space="preserve">Target fixed effect (</w:t>
-      </w:r>
-      <w:r>
-        <w:t xml:space="preserve">_j)는 시간에 따라 변하지 않는 target-paper attribute를 흡수하고, cohort fixed effect (</w:t>
-      </w:r>
-      <w:r>
-        <w:t xml:space="preserve">_c)는 각 기간에 모든 target에 공통적으로 나타나는 citation incidence의 변화를 흡수한다. (D_j)는 paper 내에서 변하지 않기 때문에 그 main effect는 target fixed effect에 흡수된다.</w:t>
-      </w:r>
-    </w:p>
-    <w:p>
-      <w:pPr>
-        <w:pStyle w:val="BodyText"/>
-      </w:pPr>
-      <w:r>
-        <w:t xml:space="preserve">따라서 핵심 계수 (</w:t>
-      </w:r>
-      <w:r>
-        <w:t xml:space="preserve">_k)는 각 후속 cohort의 visible–nonvisible 영어권 인용확률 격차가 C1의 격차와 얼마나 다른지를 나타낸다. 이 계수는 Google Scholar visibility의 causal effect가 아니라 두 집단 사이 gap의 시기별 차이를 의미한다. Standard error는 target paper 수준에서 cluster한다.</w:t>
-      </w:r>
-    </w:p>
-    <w:p>
-      <w:pPr>
-        <w:pStyle w:val="BodyText"/>
-      </w:pPr>
-      <w:r>
-        <w:t xml:space="preserve">Cohort별 eligible-target composition의 변화를 점검하기 위해 2004년까지 출판된 target paper만을 대상으로 같은 분석을 반복한다. 이 논문들은 네 cohort 모두에 기여할 시간적 기회를 가지므로, 후기에 출판된 논문의 추가로 인해 cohort 구성 자체가 바뀌는 문제를 줄일 수 있다.</w:t>
-      </w:r>
-    </w:p>
-    <w:p>
-      <w:pPr>
-        <w:pStyle w:val="BodyText"/>
-      </w:pPr>
-      <w:r>
-        <w:t xml:space="preserve">추가 robustness에서는 Poisson pseudo-maximum likelihood, citation-count outcome, journal·topic·publication-year와 cohort의 추가 control을 사용한다. 이들 분석은 주모형의 결과가 다른 functional form과 통제에서도 어느 정도 유지되는지를 확인하기 위한 것이다.</w:t>
+        <w:t xml:space="preserve">Target fixed effect α_j는 시간에 따라 변하지 않는 target-paper attribute를 흡수하고, cohort fixed effect λ_c는 각 기간에 모든 target에 공통적으로 나타나는 citation incidence의 변화를 흡수한다. (D_j)는 paper 내에서 변하지 않으므로 main effect는 target fixed effect에 흡수된다.</w:t>
+      </w:r>
+    </w:p>
+    <w:p>
+      <w:pPr>
+        <w:pStyle w:val="BodyText"/>
+      </w:pPr>
+      <w:r>
+        <w:t xml:space="preserve">핵심 계수 β_k는</w:t>
+      </w:r>
+      <w:r>
+        <w:t xml:space="preserve"> </w:t>
+      </w:r>
+      <w:r>
+        <w:rPr>
+          <w:bCs/>
+          <w:b/>
+        </w:rPr>
+        <w:t xml:space="preserve">각 후속 cohort에서 (D=1)과 (D=0) 논문의 영어권 인용확률 격차가 C1의 격차와 얼마나 다른지</w:t>
+      </w:r>
+      <w:r>
+        <w:t xml:space="preserve">를 나타낸다. 이는 Google Scholar indexing의 causal effect가 아니라 현재 index presence에 따라 구분되는 두 집단 사이 gap의 시기별 차이를 나타낸다. Standard error는 target paper 수준에서 cluster한다.</w:t>
+      </w:r>
+    </w:p>
+    <w:p>
+      <w:pPr>
+        <w:pStyle w:val="BodyText"/>
+      </w:pPr>
+      <w:r>
+        <w:t xml:space="preserve">Cohort별 eligible-target composition의 변화를 점검하기 위해</w:t>
+      </w:r>
+      <w:r>
+        <w:t xml:space="preserve"> </w:t>
+      </w:r>
+      <w:r>
+        <w:rPr>
+          <w:bCs/>
+          <w:b/>
+        </w:rPr>
+        <w:t xml:space="preserve">2004년까지 출판된 target paper만을 대상으로 동일한 분석을 반복</w:t>
+      </w:r>
+      <w:r>
+        <w:t xml:space="preserve">한다. 이 논문들은 네 cohort 모두에 기여할 시간적 기회를 가지므로 후기에 출판된 논문의 추가로 인해 cohort 구성이 바뀌는 문제를 줄일 수 있다. 이 restriction은 과거 Google Scholar indexing 상태를 복원하기 위한 것이 아니다.</w:t>
+      </w:r>
+    </w:p>
+    <w:p>
+      <w:pPr>
+        <w:pStyle w:val="BodyText"/>
+      </w:pPr>
+      <w:r>
+        <w:t xml:space="preserve">추가 robustness에서는 Poisson pseudo-maximum likelihood, citation-count outcome, journal·topic·publication-year와 cohort의 추가 control을 사용한다.</w:t>
       </w:r>
     </w:p>
     <w:bookmarkEnd w:id="28"/>
@@ -937,7 +1575,7 @@
         <w:pStyle w:val="FirstParagraph"/>
       </w:pPr>
       <w:r>
-        <w:t xml:space="preserve">현재 Google Scholar에서 retrievable한 논문은 모든 cohort에서 nonretrievable paper보다 높은 raw English-language citation incidence를 보인다.</w:t>
+        <w:t xml:space="preserve">현재 Google Scholar index presence가 확인된 논문은 모든 cohort에서 그렇지 않은 논문보다 높은 raw English-language citation incidence를 보인다.</w:t>
       </w:r>
     </w:p>
     <w:tbl>
@@ -1212,23 +1850,62 @@
         <w:pStyle w:val="BodyText"/>
       </w:pPr>
       <w:r>
-        <w:t xml:space="preserve">Fixed-effects 분석에서는 C1 대비 visible–nonvisible gap이 C2에서 0.405pp 증가한다(95% CI [0.040, 0.770], (p=.030)). C3에서는 0.696pp 증가한다(95% CI [0.329, 1.063], (p&lt;.001)). C2와 C3 계수의 joint test 역시 (p&lt;.001)이다.</w:t>
-      </w:r>
-    </w:p>
-    <w:p>
-      <w:pPr>
-        <w:pStyle w:val="BodyText"/>
-      </w:pPr>
-      <w:r>
-        <w:t xml:space="preserve">반면 C4의 변화는 0.008pp(95% CI [−0.337, 0.353], (p=.965))로, 2020–2024년에 C1 대비 격차가 추가적으로 확대되었다는 근거는 확인되지 않는다.</w:t>
-      </w:r>
-    </w:p>
-    <w:p>
-      <w:pPr>
-        <w:pStyle w:val="BodyText"/>
-      </w:pPr>
-      <w:r>
-        <w:t xml:space="preserve">2004년까지 출판된 target만을 분석해도 C2와 C3의 양의 gap 변화가 나타난다.</w:t>
+        <w:t xml:space="preserve">Fixed-effects 분석에서 C1 대비 두 집단의 격차는</w:t>
+      </w:r>
+      <w:r>
+        <w:t xml:space="preserve"> </w:t>
+      </w:r>
+      <w:r>
+        <w:rPr>
+          <w:bCs/>
+          <w:b/>
+        </w:rPr>
+        <w:t xml:space="preserve">C2에서 0.405pp 증가</w:t>
+      </w:r>
+      <w:r>
+        <w:t xml:space="preserve">한다(95% CI [0.040, 0.770], (p=.030)).</w:t>
+      </w:r>
+      <w:r>
+        <w:t xml:space="preserve"> </w:t>
+      </w:r>
+      <w:r>
+        <w:rPr>
+          <w:bCs/>
+          <w:b/>
+        </w:rPr>
+        <w:t xml:space="preserve">C3에서는 0.696pp 증가</w:t>
+      </w:r>
+      <w:r>
+        <w:t xml:space="preserve">한다(95% CI [0.329, 1.063], (p&lt;.001)). C2와 C3 계수의 joint test 역시 (p&lt;.001)이다.</w:t>
+      </w:r>
+    </w:p>
+    <w:p>
+      <w:pPr>
+        <w:pStyle w:val="BodyText"/>
+      </w:pPr>
+      <w:r>
+        <w:t xml:space="preserve">반면 C4의 변화는</w:t>
+      </w:r>
+      <w:r>
+        <w:t xml:space="preserve"> </w:t>
+      </w:r>
+      <w:r>
+        <w:rPr>
+          <w:bCs/>
+          <w:b/>
+        </w:rPr>
+        <w:t xml:space="preserve">0.008pp</w:t>
+      </w:r>
+      <w:r>
+        <w:t xml:space="preserve">(95% CI [−0.337, 0.353], (p=.965))로, 2020–2024년에 C1 대비 격차가 추가적으로 확대되었다는 근거는 확인되지 않는다.</w:t>
+      </w:r>
+    </w:p>
+    <w:p>
+      <w:pPr>
+        <w:pStyle w:val="BodyText"/>
+      </w:pPr>
+      <w:r>
+        <w:t xml:space="preserve">2004년까지 출판된 target만을 분석해도 C2와 C3에서 양의 gap 변화가 나타난다.</w:t>
       </w:r>
     </w:p>
     <w:tbl>
@@ -1413,15 +2090,38 @@
         <w:pStyle w:val="BodyText"/>
       </w:pPr>
       <w:r>
-        <w:t xml:space="preserve">Robustness 결과는 모든 specification에서 동일하지 않다. Target-fixed-effects Poisson에서는 C2와 C3 변화가 양수이지만 영어권 인용이 전혀 없는 target은 conditional model을 식별하지 못하므로 제외된다. 다른 Poisson specification은 더 불정확하며, journal-by-cohort 및 publication-year-by-cohort model에서는 C2의 양의 추정치는 유지되지만 C3와 C4가 통계적으로 유의하게 재현되지는 않는다. 따라서 결과는 main incidence model과 pre-2005 restriction에서 확인된 C2–C3 패턴의 범위에서 해석한다.</w:t>
-      </w:r>
-    </w:p>
-    <w:p>
-      <w:pPr>
-        <w:pStyle w:val="BodyText"/>
-      </w:pPr>
-      <w:r>
-        <w:t xml:space="preserve">현재 Google Scholar에서 visible한 논문들 사이에서는 Google Scholar-mediated full-text access가 cohort별 영어권 citation incidence와 통계적으로 유의한 관계를 보이지 않았다. 이 null result는 access가 일반적으로 중요하지 않다는 의미가 아니라 현재 retrievability에 조건부인 현재 시점의 접근경로가 이 표본의 historical citation pattern을 별도로 구분하지 못했다는 의미이다.</w:t>
+        <w:t xml:space="preserve">Robustness 결과는 모든 specification에서 동일하지 않다. Target-fixed-effects Poisson에서는 C2와 C3의 변화가 양수이지만 영어권 인용이 전혀 없는 target은 conditional model을 식별하지 못하므로 제외된다. 다른 Poisson specification은 더 불정확하며, journal-by-cohort 및 publication-year-by-cohort model에서는 C2의 양의 추정치는 유지되지만 C3와 C4가 통계적으로 유의하게 재현되지는 않는다. 따라서 결과는</w:t>
+      </w:r>
+      <w:r>
+        <w:t xml:space="preserve"> </w:t>
+      </w:r>
+      <w:r>
+        <w:rPr>
+          <w:bCs/>
+          <w:b/>
+        </w:rPr>
+        <w:t xml:space="preserve">main incidence model과 pre-2005 restriction에서 확인된 C2–C3 패턴의 범위</w:t>
+      </w:r>
+      <w:r>
+        <w:t xml:space="preserve">에서 해석한다.</w:t>
+      </w:r>
+    </w:p>
+    <w:p>
+      <w:pPr>
+        <w:pStyle w:val="BodyText"/>
+      </w:pPr>
+      <w:r>
+        <w:t xml:space="preserve">현재 Google Scholar record가 확인된 논문들 사이에서는</w:t>
+      </w:r>
+      <w:r>
+        <w:t xml:space="preserve"> </w:t>
+      </w:r>
+      <w:r>
+        <w:rPr>
+          <w:bCs/>
+          <w:b/>
+        </w:rPr>
+        <w:t xml:space="preserve">Google Scholar가 제공한 링크를 통한 full-text access가 cohort별 영어권 citation incidence와 통계적으로 유의한 관계를 보이지 않았다.</w:t>
       </w:r>
     </w:p>
     <w:bookmarkEnd w:id="29"/>
@@ -1439,23 +2139,49 @@
         <w:pStyle w:val="FirstParagraph"/>
       </w:pPr>
       <w:r>
-        <w:t xml:space="preserve">Study 1의 결과는 현재 Google Scholar에서 known-item search로 확인 가능한 논문과 그렇지 않은 논문의 과거 영어권 인용패턴이 동일하지 않음을 보여준다. C1에 비해 visible–nonvisible gap은 C2와 C3에서 확대되며, 네 cohort에 모두 기여할 수 있는 pre-2005 target으로 제한해도 같은 방향의 결과가 나타난다. 그러나 C4에서는 추가적인 확대가 확인되지 않고 일부 대안 specification에서는 결과가 덜 정밀하다.</w:t>
-      </w:r>
-    </w:p>
-    <w:p>
-      <w:pPr>
-        <w:pStyle w:val="BodyText"/>
-      </w:pPr>
-      <w:r>
-        <w:t xml:space="preserve">여기서 0.405pp와 0.696pp는 각 기간의 인용확률 수준 자체가 아니라 C1 대비 visible–nonvisible gap의 추가 변화량이다. 따라서 핵심 결과는 검색 가능한 논문의 인용확률이 모든 시기에 일관되게 더 빠르게 증가했다는 것이 아니라, 격차 확대가 C2와 C3에 집중되고 C4에서는 재현되지 않았다는 것이다.</w:t>
-      </w:r>
-    </w:p>
-    <w:p>
-      <w:pPr>
-        <w:pStyle w:val="BodyText"/>
-      </w:pPr>
-      <w:r>
-        <w:t xml:space="preserve">따라서 이 결과를 Google Scholar가 영어권 인용을 증가시켰다는 증거로 해석할 수 없다. 현재 retrievability는 과거의 circulation, 이후의 web availability, indexing 또는 이들과 함께 변화한 다른 특성과 관련될 수 있다. Study 1이 보여주는 것은 보다 제한적으로 현재 paper-level retrievability가 서로 다른 historical English-language citation trajectory를 가진 논문을 구분한다는 것이다.</w:t>
+        <w:t xml:space="preserve">Study 1은 현재 Google Scholar index presence에 따라 구분되는 논문들의 과거 영어권 인용패턴이 동일하지 않음을 보여준다. C1에 비해 두 집단의 인용확률 격차는 C2와 C3에서 확대되며, 네 cohort에 모두 기여할 수 있는 pre-2005 target으로 제한해도 같은 방향의 결과가 나타난다. 그러나 C4에서는 추가 확대가 확인되지 않고 일부 대안 specification에서는 결과가 덜 정밀하다.</w:t>
+      </w:r>
+    </w:p>
+    <w:p>
+      <w:pPr>
+        <w:pStyle w:val="BodyText"/>
+      </w:pPr>
+      <w:r>
+        <w:t xml:space="preserve">여기서 0.405pp와 0.696pp는 각 기간의 인용확률 자체가 아니라</w:t>
+      </w:r>
+      <w:r>
+        <w:t xml:space="preserve"> </w:t>
+      </w:r>
+      <w:r>
+        <w:rPr>
+          <w:bCs/>
+          <w:b/>
+        </w:rPr>
+        <w:t xml:space="preserve">C1 대비 두 집단의 인용확률 격차가 추가로 얼마나 커졌는지</w:t>
+      </w:r>
+      <w:r>
+        <w:t xml:space="preserve">를 나타낸다. 따라서 결과를 모든 시기에 걸쳐 지속적으로 확대되는 advantage로 해석해서는 안 된다.</w:t>
+      </w:r>
+    </w:p>
+    <w:p>
+      <w:pPr>
+        <w:pStyle w:val="BodyText"/>
+      </w:pPr>
+      <w:r>
+        <w:t xml:space="preserve">또한 현재의 index presence가 과거 영어권 인용을 발생시켰다고 결론내릴 수 없다. 현재 Google Scholar record의 존재는 이후의 indexing, web availability, 이전 scholarly circulation 또는 이들과 함께 변화한 다른 특성과 관련될 수 있다. 가장 제한적인 해석은</w:t>
+      </w:r>
+      <w:r>
+        <w:t xml:space="preserve"> </w:t>
+      </w:r>
+      <w:r>
+        <w:rPr>
+          <w:bCs/>
+          <w:b/>
+        </w:rPr>
+        <w:t xml:space="preserve">현재 Google Scholar index presence에 따라 historical English-language citation trajectory가 다르게 나타난다</w:t>
+      </w:r>
+      <w:r>
+        <w:t xml:space="preserve">는 것이다.</w:t>
       </w:r>
     </w:p>
     <w:bookmarkEnd w:id="30"/>
@@ -1483,23 +2209,36 @@
         <w:pStyle w:val="FirstParagraph"/>
       </w:pPr>
       <w:r>
-        <w:t xml:space="preserve">Study 2는 동일한 한국 정치 주제를 다루는 한국어권과 영어권의 주요 문헌이 생성형 검색에서 어느 정도 검색되고 최종 출처로 선택되는지, 그리고 그 격차가 검색조건에 따라 달라지는지를 분석한다.</w:t>
-      </w:r>
-    </w:p>
-    <w:p>
-      <w:pPr>
-        <w:pStyle w:val="BodyText"/>
-      </w:pPr>
-      <w:r>
-        <w:t xml:space="preserve">비교대상은 audit 결과를 본 뒤 사후적으로 정의하지 않고 시스템 실행 전에 benchmark로 고정한다. 이를 통해 결과목록에 특정 언어의 논문이 많이 등장하는지와, 각 언어권에서 사전에 주요 문헌으로 선정된 논문이 실제로 회수되는지를 구분할 수 있다.</w:t>
-      </w:r>
-    </w:p>
-    <w:p>
-      <w:pPr>
-        <w:pStyle w:val="BodyText"/>
-      </w:pPr>
-      <w:r>
-        <w:t xml:space="preserve">Benchmark topic은 한국어권과 영어권 한국 정치학의 연구지형을 비교한 Kim et al. (2025)을 바탕으로 선정한다. 두 학술공간에서 모두 지속적으로 연구되어 온 한국 정치 주제 중 한국 현대정치의 전개를 대체로 시간적 순서에 따라 포괄하도록 다음 다섯 주제를 구성하였다.</w:t>
+        <w:t xml:space="preserve">Study 2는</w:t>
+      </w:r>
+      <w:r>
+        <w:t xml:space="preserve"> </w:t>
+      </w:r>
+      <w:r>
+        <w:rPr>
+          <w:bCs/>
+          <w:b/>
+        </w:rPr>
+        <w:t xml:space="preserve">동일한 한국 정치 주제를 다루는 한국어권과 영어권의 주요 문헌이 생성형 검색에서 어느 정도 검색되고 최종 출처로 제시되는지, 그리고 그 차이가 검색조건에 따라 달라지는지</w:t>
+      </w:r>
+      <w:r>
+        <w:t xml:space="preserve">를 분석한다.</w:t>
+      </w:r>
+    </w:p>
+    <w:p>
+      <w:pPr>
+        <w:pStyle w:val="BodyText"/>
+      </w:pPr>
+      <w:r>
+        <w:t xml:space="preserve">비교대상은 audit 결과를 본 뒤 사후적으로 정하지 않고 시스템 실행 전에 benchmark로 고정한다. 이를 통해 특정 언어의 논문이 결과에 많이 등장하는 것과, 각 언어권에서 사전에 주요 문헌으로 선정한 연구가 실제로 검색·추천되는 것을 구분한다.</w:t>
+      </w:r>
+    </w:p>
+    <w:p>
+      <w:pPr>
+        <w:pStyle w:val="BodyText"/>
+      </w:pPr>
+      <w:r>
+        <w:t xml:space="preserve">Benchmark topic은 한국어권과 영어권 한국 정치학의 연구지형을 비교한 Kim et al. (2025)을 바탕으로 선정하였다. 두 학술공간에서 모두 연구되어 온 한국 정치 주제 가운데 한국 현대정치의 주요 전개를 대체로 시간적 순서로 포괄하도록 다음 다섯 주제를 구성하였다.</w:t>
       </w:r>
     </w:p>
     <w:p>
@@ -1567,15 +2306,7 @@
         <w:pStyle w:val="FirstParagraph"/>
       </w:pPr>
       <w:r>
-        <w:t xml:space="preserve">주제를 양 언어권에서 공통적으로 연구된 영역으로 제한한 이유는 특정 주제 자체의 연구축적이 한쪽에 거의 없기 때문에 발생하는 차이를 언어별 검색가시성의 차이와 혼동하지 않기 위해서이다. 따라서 비교의 초점은 동일한 substantive topic 안에서 각 언어권의 주요 문헌이 생성형 검색에 얼마나 진입하고 선택되는가에 있다.</w:t>
-      </w:r>
-    </w:p>
-    <w:p>
-      <w:pPr>
-        <w:pStyle w:val="BodyText"/>
-      </w:pPr>
-      <w:r>
-        <w:t xml:space="preserve">각 주제는 의미가 대응하는 한국어·영어 주제어 세 개로 조작화하였다. 실행 시 해당 주제의 세 주제어를 질의 언어에 맞추어 prompt에 모두 제공했으며, 두 언어 조건에서 개념적 범위가 달라지지 않도록 번역대응어를 사용하였다.</w:t>
+        <w:t xml:space="preserve">각 주제는 의미가 대응하는 한국어·영어 주제어 세 개로 조작화하였다.</w:t>
       </w:r>
     </w:p>
     <w:tbl>
@@ -1587,9 +2318,9 @@
         <w:tblLayout w:type="fixed"/>
       </w:tblPr>
       <w:tblGrid>
-        <w:gridCol w:w="2640"/>
-        <w:gridCol w:w="2640"/>
-        <w:gridCol w:w="2640"/>
+        <w:gridCol w:w="396"/>
+        <w:gridCol w:w="1640"/>
+        <w:gridCol w:w="5883"/>
       </w:tblGrid>
       <w:tr>
         <w:trPr>
@@ -1828,7 +2559,20 @@
         <w:pStyle w:val="BodyText"/>
       </w:pPr>
       <w:r>
-        <w:t xml:space="preserve">각 주제에는 한국어 논문 10편과 영어 논문 10편을 포함한다. 한국어 benchmark는 DBpia와 KISS, 영어 benchmark는 Web of Science와 Google Scholar를 이용해 구성한다. Candidate pool을 citation count에 따라 정렬한 뒤 두 source에서 공통적으로 상위에 위치하는 논문을 기준으로 주제별 10편을 선정하였다. 최종 benchmark는 한국어 50편과 영어 50편, 총 100편이며 LLM audit 전에 고정하였다. 이는 각 주제의 전체 relevant literature를 포괄하는 gold standard가 아니라 조건 간 상대적 recovery를 비교하기 위한 evaluation set이다.</w:t>
+        <w:t xml:space="preserve">각 주제에는 한국어 논문 10편과 영어 논문 10편을 포함한다. 한국어 benchmark는 DBpia와 KISS, 영어 benchmark는 Web of Science와 Google Scholar를 이용해 구성한다. Candidate pool을 citation count에 따라 정렬한 뒤 두 source에서 공통적으로 상위에 위치하는 논문을 기준으로 주제별 10편을 선정하였다. 최종 benchmark는</w:t>
+      </w:r>
+      <w:r>
+        <w:t xml:space="preserve"> </w:t>
+      </w:r>
+      <w:r>
+        <w:rPr>
+          <w:bCs/>
+          <w:b/>
+        </w:rPr>
+        <w:t xml:space="preserve">한국어 50편과 영어 50편, 총 100편</w:t>
+      </w:r>
+      <w:r>
+        <w:t xml:space="preserve">이며 LLM audit 전에 고정하였다. 이는 각 주제의 모든 relevant literature를 포괄하는 gold standard가 아니라 조건 간 비교를 위한 evaluation set이다.</w:t>
       </w:r>
     </w:p>
     <w:p>
@@ -1848,7 +2592,17 @@
         <w:pStyle w:val="Compact"/>
       </w:pPr>
       <w:r>
-        <w:t xml:space="preserve">Query language: 영어 / 한국어</w:t>
+        <w:rPr>
+          <w:bCs/>
+          <w:b/>
+        </w:rPr>
+        <w:t xml:space="preserve">Query language:</w:t>
+      </w:r>
+      <w:r>
+        <w:t xml:space="preserve"> </w:t>
+      </w:r>
+      <w:r>
+        <w:t xml:space="preserve">영어 / 한국어</w:t>
       </w:r>
     </w:p>
     <w:p>
@@ -1860,7 +2614,17 @@
         <w:pStyle w:val="Compact"/>
       </w:pPr>
       <w:r>
-        <w:t xml:space="preserve">Source instruction: general web / KCI·DBpia·KISS 명시</w:t>
+        <w:rPr>
+          <w:bCs/>
+          <w:b/>
+        </w:rPr>
+        <w:t xml:space="preserve">Source instruction:</w:t>
+      </w:r>
+      <w:r>
+        <w:t xml:space="preserve"> </w:t>
+      </w:r>
+      <w:r>
+        <w:t xml:space="preserve">general web / KCI·DBpia·KISS 명시</w:t>
       </w:r>
     </w:p>
     <w:p>
@@ -1872,7 +2636,17 @@
         <w:pStyle w:val="Compact"/>
       </w:pPr>
       <w:r>
-        <w:t xml:space="preserve">System: OpenAI</w:t>
+        <w:rPr>
+          <w:bCs/>
+          <w:b/>
+        </w:rPr>
+        <w:t xml:space="preserve">System:</w:t>
+      </w:r>
+      <w:r>
+        <w:t xml:space="preserve"> </w:t>
+      </w:r>
+      <w:r>
+        <w:t xml:space="preserve">OpenAI</w:t>
       </w:r>
       <w:r>
         <w:t xml:space="preserve"> </w:t>
@@ -1904,15 +2678,33 @@
         <w:pStyle w:val="FirstParagraph"/>
       </w:pPr>
       <w:r>
-        <w:t xml:space="preserve">Query language와 source instruction은 단순한 문구상의 차이가 아니라 retrieval에 입력되는 검색조건으로 사용한다. 한국어 질의나 한국 학술 데이터베이스의 명시가 한국어 benchmark의 상대적 recovery를 변화시킨다면, 해당 문헌의 가시성이 단일한 고정값이라기보다 검색이 구성되는 조건에 따라 달라질 수 있음을 의미한다.</w:t>
-      </w:r>
-    </w:p>
-    <w:p>
-      <w:pPr>
-        <w:pStyle w:val="BodyText"/>
-      </w:pPr>
-      <w:r>
-        <w:t xml:space="preserve">모든 prompt는 해당 주제의 세 주제어를 포함하고 관련 학술문헌 10편을 고정된 JSON 형식으로 요청하였다. 검색횟수는 주제어당 최대 2회, execution당 최대 6회로 제한하였다. 5개 주제 × 4개 prompt condition × 2개 system × 5회 독립 repetition으로 200개의 stateless execution을 수행하며, 최종적으로 1,932개의 valid recommendation occurrence가 생성되었다.</w:t>
+        <w:t xml:space="preserve">모든 prompt는 해당 주제의 세 주제어를 포함하고 관련 학술문헌 10편을 고정된 JSON 형식으로 요청하였다. 검색횟수는 주제어당 최대 2회, execution당 최대 6회로 제한하였다. 5개 주제 × 4개 prompt condition × 2개 system × 5회 독립 repetition으로</w:t>
+      </w:r>
+      <w:r>
+        <w:t xml:space="preserve"> </w:t>
+      </w:r>
+      <w:r>
+        <w:rPr>
+          <w:bCs/>
+          <w:b/>
+        </w:rPr>
+        <w:t xml:space="preserve">200개의 stateless execution</w:t>
+      </w:r>
+      <w:r>
+        <w:t xml:space="preserve">을 수행하였으며, 최종적으로</w:t>
+      </w:r>
+      <w:r>
+        <w:t xml:space="preserve"> </w:t>
+      </w:r>
+      <w:r>
+        <w:rPr>
+          <w:bCs/>
+          <w:b/>
+        </w:rPr>
+        <w:t xml:space="preserve">1,932개의 valid recommendation occurrence</w:t>
+      </w:r>
+      <w:r>
+        <w:t xml:space="preserve">가 생성되었다.</w:t>
       </w:r>
     </w:p>
     <w:bookmarkEnd w:id="32"/>
@@ -1942,7 +2734,17 @@
         <w:pStyle w:val="Compact"/>
       </w:pPr>
       <w:r>
-        <w:t xml:space="preserve">TraceRecovery는 provider가 외부에 노출하는 observable search trace에 benchmark paper가 나타나는지를 측정한다.</w:t>
+        <w:rPr>
+          <w:bCs/>
+          <w:b/>
+        </w:rPr>
+        <w:t xml:space="preserve">TraceRecovery:</w:t>
+      </w:r>
+      <w:r>
+        <w:t xml:space="preserve"> </w:t>
+      </w:r>
+      <w:r>
+        <w:t xml:space="preserve">provider가 외부에 노출하는 search trace에서 benchmark paper가 확인되는지</w:t>
       </w:r>
     </w:p>
     <w:p>
@@ -1954,7 +2756,17 @@
         <w:pStyle w:val="Compact"/>
       </w:pPr>
       <w:r>
-        <w:t xml:space="preserve">Recommendation은 benchmark paper가 final recommendation에 포함되는지를 측정한다.</w:t>
+        <w:rPr>
+          <w:bCs/>
+          <w:b/>
+        </w:rPr>
+        <w:t xml:space="preserve">Recommendation:</w:t>
+      </w:r>
+      <w:r>
+        <w:t xml:space="preserve"> </w:t>
+      </w:r>
+      <w:r>
+        <w:t xml:space="preserve">benchmark paper가 최종 recommendation에 포함되는지</w:t>
       </w:r>
     </w:p>
     <w:p>
@@ -1966,7 +2778,17 @@
         <w:pStyle w:val="Compact"/>
       </w:pPr>
       <w:r>
-        <w:t xml:space="preserve">SuppliedLinkAccess는 benchmark가 추천되고 제공된 URL이 로그인이나 결제 없이 full text를 제공하는지를 측정한다.</w:t>
+        <w:rPr>
+          <w:bCs/>
+          <w:b/>
+        </w:rPr>
+        <w:t xml:space="preserve">SuppliedLinkAccess:</w:t>
+      </w:r>
+      <w:r>
+        <w:t xml:space="preserve"> </w:t>
+      </w:r>
+      <w:r>
+        <w:t xml:space="preserve">benchmark paper가 추천되고 제공된 URL이 로그인이나 결제 없이 full text로 연결되는지</w:t>
       </w:r>
     </w:p>
     <w:p>
@@ -1974,15 +2796,7 @@
         <w:pStyle w:val="FirstParagraph"/>
       </w:pPr>
       <w:r>
-        <w:t xml:space="preserve">앞의 두 지표가 Study 2에서의 검색 가시성을 구성한다. TraceRecovery는 관찰 가능한 검색단계에 진입했는지를, Recommendation은 그 문헌이 최종 source selection을 통과했는지를 측정한다. SuppliedLinkAccess는 이와 구분되는 후속 접근결과이다.</w:t>
-      </w:r>
-    </w:p>
-    <w:p>
-      <w:pPr>
-        <w:pStyle w:val="BodyText"/>
-      </w:pPr>
-      <w:r>
-        <w:t xml:space="preserve">Benchmark panel은 4,000개의 paper × execution observation으로 구성된다. 200개의 execution 각각에 해당 topic의 한국어 benchmark 10편과 영어 benchmark 10편을 대응시킨다.</w:t>
+        <w:t xml:space="preserve">앞의 두 변수는 서로 다른 질문에 답한다.</w:t>
       </w:r>
       <w:r>
         <w:t xml:space="preserve"> </w:t>
@@ -1991,34 +2805,131 @@
         <w:rPr>
           <w:rStyle w:val="VerbatimChar"/>
         </w:rPr>
+        <w:t xml:space="preserve">TraceRecovery</w:t>
+      </w:r>
+      <w:r>
+        <w:t xml:space="preserve">는 benchmark가</w:t>
+      </w:r>
+      <w:r>
+        <w:t xml:space="preserve"> </w:t>
+      </w:r>
+      <w:r>
+        <w:rPr>
+          <w:bCs/>
+          <w:b/>
+        </w:rPr>
+        <w:t xml:space="preserve">관찰 가능한 검색흔적에 나타나는지</w:t>
+      </w:r>
+      <w:r>
+        <w:t xml:space="preserve">를 측정하고,</w:t>
+      </w:r>
+      <w:r>
+        <w:t xml:space="preserve"> </w:t>
+      </w:r>
+      <w:r>
+        <w:rPr>
+          <w:rStyle w:val="VerbatimChar"/>
+        </w:rPr>
+        <w:t xml:space="preserve">Recommendation</w:t>
+      </w:r>
+      <w:r>
+        <w:t xml:space="preserve">은 그 문헌이</w:t>
+      </w:r>
+      <w:r>
+        <w:t xml:space="preserve"> </w:t>
+      </w:r>
+      <w:r>
+        <w:rPr>
+          <w:bCs/>
+          <w:b/>
+        </w:rPr>
+        <w:t xml:space="preserve">최종적으로 사용자에게 제시되는 출처에 포함되는지</w:t>
+      </w:r>
+      <w:r>
+        <w:t xml:space="preserve">를 측정한다. Search trace는 provider가 공개한 범위만 관찰하므로 시스템 내부의 전체 retrieval process를 의미하지 않는다.</w:t>
+      </w:r>
+    </w:p>
+    <w:p>
+      <w:pPr>
+        <w:pStyle w:val="BodyText"/>
+      </w:pPr>
+      <w:r>
+        <w:t xml:space="preserve">Benchmark panel은</w:t>
+      </w:r>
+      <w:r>
+        <w:t xml:space="preserve"> </w:t>
+      </w:r>
+      <w:r>
+        <w:rPr>
+          <w:bCs/>
+          <w:b/>
+        </w:rPr>
+        <w:t xml:space="preserve">4,000개의 paper × execution observation</w:t>
+      </w:r>
+      <w:r>
+        <w:t xml:space="preserve">으로 구성된다. 200개의 execution 각각에 해당 topic의 한국어 benchmark 10편과 영어 benchmark 10편을 대응시킨다.</w:t>
+      </w:r>
+      <w:r>
+        <w:t xml:space="preserve"> </w:t>
+      </w:r>
+      <w:r>
+        <w:rPr>
+          <w:rStyle w:val="VerbatimChar"/>
+        </w:rPr>
         <w:t xml:space="preserve">SuppliedLinkAccess</w:t>
       </w:r>
       <w:r>
-        <w:t xml:space="preserve">의 denominator는 모든 benchmark-paper × execution pair이므로 이는 추천된 논문에 조건부인 access rate가 아니라 검색, 추천, 접근을 함께 통과했는지를 나타내는 joint pipeline-survival outcome이다.</w:t>
-      </w:r>
-    </w:p>
-    <w:p>
-      <w:pPr>
-        <w:pStyle w:val="BodyText"/>
-      </w:pPr>
-      <w:r>
-        <w:t xml:space="preserve">영어 general-web condition을 baseline으로 한국어와 영어 benchmark의 recovery gap을 추정하고, query language와 source instruction이 이 격차를 어떻게 변화시키는지를 분석한다. 두 intervention을 동시에 적용한 combined condition과 baseline의 전체 contrast도 별도로 산출한다.</w:t>
-      </w:r>
-    </w:p>
-    <w:p>
-      <w:pPr>
-        <w:pStyle w:val="BodyText"/>
-      </w:pPr>
-      <w:r>
-        <w:t xml:space="preserve">이와 별도로 전체 recommendation 가운데 한국어 논문이 차지하는 비율을 Korean-language representation으로 측정한다. 이는 benchmark recovery가 아니다. Benchmark에 포함되지 않은 한국어 논문도 representation에는 포함되기 때문에, 결과목록의 언어구성과 사전에 정한 주요 문헌의 회수는 서로 다른 결과이다.</w:t>
-      </w:r>
-    </w:p>
-    <w:p>
-      <w:pPr>
-        <w:pStyle w:val="BodyText"/>
-      </w:pPr>
-      <w:r>
-        <w:t xml:space="preserve">마지막으로 927개의 distinct supplied URL 또는 no-URL item key를 검토하여 accessible full text, abstract only, paywalled, broken link, hallucinated/unverifiable publication으로 분류한다. 여기서 access는 웹 전체에서 해당 논문의 다른 무료 copy를 찾는 것이 아니라 실제 제공된 URL의 상태를 측정한다.</w:t>
+        <w:t xml:space="preserve">의 denominator는 모든 benchmark-paper × execution pair이므로 추천된 논문에 조건부인 access rate가 아니라 검색, 추천, 접근까지 모두 성공한 경우를 나타낸다.</w:t>
+      </w:r>
+    </w:p>
+    <w:p>
+      <w:pPr>
+        <w:pStyle w:val="BodyText"/>
+      </w:pPr>
+      <w:r>
+        <w:t xml:space="preserve">영어 general-web condition을 baseline으로 한국어와 영어 benchmark의 차이를 추정하고, query language와 source instruction이 그 차이를 어떻게 변화시키는지를 분석한다. 두 조건을 동시에 적용한 combined condition과 baseline의 contrast도 별도로 계산한다.</w:t>
+      </w:r>
+    </w:p>
+    <w:p>
+      <w:pPr>
+        <w:pStyle w:val="BodyText"/>
+      </w:pPr>
+      <w:r>
+        <w:t xml:space="preserve">이와 별도로 전체 recommendation에서</w:t>
+      </w:r>
+      <w:r>
+        <w:t xml:space="preserve"> </w:t>
+      </w:r>
+      <w:r>
+        <w:rPr>
+          <w:bCs/>
+          <w:b/>
+        </w:rPr>
+        <w:t xml:space="preserve">한국어 논문이 차지하는 비율</w:t>
+      </w:r>
+      <w:r>
+        <w:t xml:space="preserve">을 측정한다. 이 값은 benchmark 회수율과 다르다. Benchmark에 포함되지 않은 한국어 논문도 한국어 논문 비율에는 포함되기 때문이다.</w:t>
+      </w:r>
+    </w:p>
+    <w:p>
+      <w:pPr>
+        <w:pStyle w:val="BodyText"/>
+      </w:pPr>
+      <w:r>
+        <w:t xml:space="preserve">마지막으로</w:t>
+      </w:r>
+      <w:r>
+        <w:t xml:space="preserve"> </w:t>
+      </w:r>
+      <w:r>
+        <w:rPr>
+          <w:bCs/>
+          <w:b/>
+        </w:rPr>
+        <w:t xml:space="preserve">927개의 distinct supplied URL 또는 no-URL item key</w:t>
+      </w:r>
+      <w:r>
+        <w:t xml:space="preserve">를 검토하여 accessible full text, abstract only, paywalled, broken link, hallucinated/unverifiable publication으로 분류한다. 이 평가는 시스템이 제공한 URL의 상태만을 대상으로 하며, 다른 웹 위치에 무료 copy가 존재하는지는 조사하지 않는다.</w:t>
       </w:r>
     </w:p>
     <w:bookmarkEnd w:id="33"/>
@@ -2036,7 +2947,7 @@
         <w:pStyle w:val="FirstParagraph"/>
       </w:pPr>
       <w:r>
-        <w:t xml:space="preserve">영어 질의와 일반 웹검색을 사용한 baseline에서는 두 benchmark 모두 recovery가 낮았으며 한국어 benchmark가 추가적인 deficit을 보였다.</w:t>
+        <w:t xml:space="preserve">영어 질의와 일반 웹검색을 사용한 baseline에서는 두 benchmark 모두 회수율이 낮았으며, 한국어 benchmark에서 추가적인 deficit이 나타났다.</w:t>
       </w:r>
     </w:p>
     <w:tbl>
@@ -2360,31 +3271,134 @@
         <w:pStyle w:val="BodyText"/>
       </w:pPr>
       <w:r>
-        <w:t xml:space="preserve">Observable search trace와 final recommendation에서는 통계적으로 유의한 한국어–영어 gap이 확인된다. Accessible supplied link의 차이는 유의하지 않지만, benchmark가 마지막 단계까지 도달하는 경우 자체가 매우 적기 때문에 floor와 함께 해석해야 한다.</w:t>
-      </w:r>
-    </w:p>
-    <w:p>
-      <w:pPr>
-        <w:pStyle w:val="BodyText"/>
-      </w:pPr>
-      <w:r>
-        <w:t xml:space="preserve">한국어 query는 observable search 단계의 Korean–English gap을 +3.8pp 변화시키고(95% CI [0.72, 6.88], (p=.016)), Korean-database instruction은 +4.0pp 변화시킨다(95% CI [0.73, 7.27], (p=.017)). Final recommendation에서는 database instruction이 gap을 +3.2pp 변화시킨다(95% CI [0.71, 5.69], (p=.012)). Korean-query estimate는 +2.6pp로 같은 방향이지만 (p=.068)로 더 불확실하다.</w:t>
-      </w:r>
-    </w:p>
-    <w:p>
-      <w:pPr>
-        <w:pStyle w:val="BodyText"/>
-      </w:pPr>
-      <w:r>
-        <w:t xml:space="preserve">두 조건을 함께 적용한 combined condition과 baseline을 직접 비교하면 Korean–English gap은 observable search에서 +5.6pp, recommendation에서 +6.4pp 변화한다. Combined condition에서 한국어 benchmark의 observable-trace recovery는 2.2%, recommendation recovery는 3.2%이다. 이는 relative gap의 reversal이지만 높은 절대 recovery를 의미하지 않는다. 한국어 benchmark-paper opportunity의 96% 이상이 여전히 최종 추천에 포함되지 않는다.</w:t>
-      </w:r>
-    </w:p>
-    <w:p>
-      <w:pPr>
-        <w:pStyle w:val="BodyText"/>
-      </w:pPr>
-      <w:r>
-        <w:t xml:space="preserve">검색조건은 benchmark recovery보다 recommendation의 언어적 구성을 훨씬 크게 바꾼다.</w:t>
+        <w:t xml:space="preserve">검색흔적과 최종 추천에서의 한국어–영어 차이는 통계적으로 유의하다. 제공된 링크를 통한 원문 접근의 차이는 유의하지 않지만, benchmark가 마지막 단계까지 도달하는 경우 자체가 매우 적다는 점을 함께 고려해야 한다.</w:t>
+      </w:r>
+    </w:p>
+    <w:p>
+      <w:pPr>
+        <w:pStyle w:val="BodyText"/>
+      </w:pPr>
+      <w:r>
+        <w:t xml:space="preserve">한국어 query는 검색흔적 단계의 Korean–English gap을</w:t>
+      </w:r>
+      <w:r>
+        <w:t xml:space="preserve"> </w:t>
+      </w:r>
+      <w:r>
+        <w:rPr>
+          <w:bCs/>
+          <w:b/>
+        </w:rPr>
+        <w:t xml:space="preserve">+3.8pp</w:t>
+      </w:r>
+      <w:r>
+        <w:t xml:space="preserve"> </w:t>
+      </w:r>
+      <w:r>
+        <w:t xml:space="preserve">변화시키고(95% CI [0.72, 6.88], (p=.016)), Korean-database instruction은</w:t>
+      </w:r>
+      <w:r>
+        <w:t xml:space="preserve"> </w:t>
+      </w:r>
+      <w:r>
+        <w:rPr>
+          <w:bCs/>
+          <w:b/>
+        </w:rPr>
+        <w:t xml:space="preserve">+4.0pp</w:t>
+      </w:r>
+      <w:r>
+        <w:t xml:space="preserve"> </w:t>
+      </w:r>
+      <w:r>
+        <w:t xml:space="preserve">변화시킨다(95% CI [0.73, 7.27], (p=.017)). 최종 recommendation에서는 database instruction이 gap을</w:t>
+      </w:r>
+      <w:r>
+        <w:t xml:space="preserve"> </w:t>
+      </w:r>
+      <w:r>
+        <w:rPr>
+          <w:bCs/>
+          <w:b/>
+        </w:rPr>
+        <w:t xml:space="preserve">+3.2pp</w:t>
+      </w:r>
+      <w:r>
+        <w:t xml:space="preserve"> </w:t>
+      </w:r>
+      <w:r>
+        <w:t xml:space="preserve">변화시킨다(95% CI [0.71, 5.69], (p=.012)). Korean-query estimate는 +2.6pp로 같은 방향이지만 (p=.068)이다.</w:t>
+      </w:r>
+    </w:p>
+    <w:p>
+      <w:pPr>
+        <w:pStyle w:val="BodyText"/>
+      </w:pPr>
+      <w:r>
+        <w:t xml:space="preserve">두 조건을 함께 적용한 combined condition과 baseline을 직접 비교하면 Korean–English gap은 검색흔적에서</w:t>
+      </w:r>
+      <w:r>
+        <w:t xml:space="preserve"> </w:t>
+      </w:r>
+      <w:r>
+        <w:rPr>
+          <w:bCs/>
+          <w:b/>
+        </w:rPr>
+        <w:t xml:space="preserve">+5.6pp</w:t>
+      </w:r>
+      <w:r>
+        <w:t xml:space="preserve">, 최종 추천에서</w:t>
+      </w:r>
+      <w:r>
+        <w:t xml:space="preserve"> </w:t>
+      </w:r>
+      <w:r>
+        <w:rPr>
+          <w:bCs/>
+          <w:b/>
+        </w:rPr>
+        <w:t xml:space="preserve">+6.4pp</w:t>
+      </w:r>
+      <w:r>
+        <w:t xml:space="preserve"> </w:t>
+      </w:r>
+      <w:r>
+        <w:t xml:space="preserve">변화한다. Combined condition에서 한국어 benchmark의 검색흔적 회수율은</w:t>
+      </w:r>
+      <w:r>
+        <w:t xml:space="preserve"> </w:t>
+      </w:r>
+      <w:r>
+        <w:rPr>
+          <w:bCs/>
+          <w:b/>
+        </w:rPr>
+        <w:t xml:space="preserve">2.2%</w:t>
+      </w:r>
+      <w:r>
+        <w:t xml:space="preserve">, 최종 추천 회수율은</w:t>
+      </w:r>
+      <w:r>
+        <w:t xml:space="preserve"> </w:t>
+      </w:r>
+      <w:r>
+        <w:rPr>
+          <w:bCs/>
+          <w:b/>
+        </w:rPr>
+        <w:t xml:space="preserve">3.2%</w:t>
+      </w:r>
+      <w:r>
+        <w:t xml:space="preserve">이다. 상대적인 격차의 방향은 바뀌지만 절대적인 회수율은 낮다.</w:t>
+      </w:r>
+    </w:p>
+    <w:p>
+      <w:pPr>
+        <w:pStyle w:val="BodyText"/>
+      </w:pPr>
+      <w:r>
+        <w:t xml:space="preserve">검색조건은 benchmark 회수율보다 최종 추천의 언어구성을 훨씬 크게 변화시킨다.</w:t>
       </w:r>
     </w:p>
     <w:tbl>
@@ -2526,6 +3540,10 @@
               <w:jc w:val="right"/>
             </w:pPr>
             <w:r>
+              <w:rPr>
+                <w:bCs/>
+                <w:b/>
+              </w:rPr>
               <w:t xml:space="preserve">91.2%</w:t>
             </w:r>
           </w:p>
@@ -2537,23 +3555,100 @@
         <w:pStyle w:val="BodyText"/>
       </w:pPr>
       <w:r>
-        <w:t xml:space="preserve">한국어 query는 recommendation의 Korean-language share를 55.7pp 증가시키고((p&lt;.001)), Korean-database instruction은 35.4pp 증가시킨다((p&lt;.001)). 그러나 combined condition에서도 사전에 선정한 한국어 benchmark의 recommendation recovery는 3.2%에 그친다.</w:t>
-      </w:r>
-    </w:p>
-    <w:p>
-      <w:pPr>
-        <w:pStyle w:val="BodyText"/>
-      </w:pPr>
-      <w:r>
-        <w:t xml:space="preserve">따라서 추천결과가 한국어 중심으로 구성된다는 것과 한국어권의 사전 지정 주요 문헌이 높은 비율로 회수된다는 것은 동일하지 않다. 이는 benchmark 밖의 한국어 논문이 부적절하다는 뜻이 아니라 language representation과 benchmark recovery가 서로 다른 속성을 측정한다는 의미이다.</w:t>
-      </w:r>
-    </w:p>
-    <w:p>
-      <w:pPr>
-        <w:pStyle w:val="BodyText"/>
-      </w:pPr>
-      <w:r>
-        <w:t xml:space="preserve">전체 1,932개의 recommendation occurrence 가운데 제공된 링크의 결과는 다음과 같다.</w:t>
+        <w:t xml:space="preserve">한국어 query는 recommendation의 한국어 논문 비율을</w:t>
+      </w:r>
+      <w:r>
+        <w:t xml:space="preserve"> </w:t>
+      </w:r>
+      <w:r>
+        <w:rPr>
+          <w:bCs/>
+          <w:b/>
+        </w:rPr>
+        <w:t xml:space="preserve">55.7pp</w:t>
+      </w:r>
+      <w:r>
+        <w:t xml:space="preserve"> </w:t>
+      </w:r>
+      <w:r>
+        <w:t xml:space="preserve">증가시키고((p&lt;.001)), Korean-database instruction은</w:t>
+      </w:r>
+      <w:r>
+        <w:t xml:space="preserve"> </w:t>
+      </w:r>
+      <w:r>
+        <w:rPr>
+          <w:bCs/>
+          <w:b/>
+        </w:rPr>
+        <w:t xml:space="preserve">35.4pp</w:t>
+      </w:r>
+      <w:r>
+        <w:t xml:space="preserve"> </w:t>
+      </w:r>
+      <w:r>
+        <w:t xml:space="preserve">증가시킨다((p&lt;.001)). 그러나 combined condition에서도 사전에 선정한 한국어 benchmark의 recommendation recovery는</w:t>
+      </w:r>
+      <w:r>
+        <w:t xml:space="preserve"> </w:t>
+      </w:r>
+      <w:r>
+        <w:rPr>
+          <w:bCs/>
+          <w:b/>
+        </w:rPr>
+        <w:t xml:space="preserve">3.2%</w:t>
+      </w:r>
+      <w:r>
+        <w:t xml:space="preserve">에 그친다.</w:t>
+      </w:r>
+    </w:p>
+    <w:p>
+      <w:pPr>
+        <w:pStyle w:val="BodyText"/>
+      </w:pPr>
+      <w:r>
+        <w:t xml:space="preserve">따라서</w:t>
+      </w:r>
+      <w:r>
+        <w:t xml:space="preserve"> </w:t>
+      </w:r>
+      <w:r>
+        <w:rPr>
+          <w:bCs/>
+          <w:b/>
+        </w:rPr>
+        <w:t xml:space="preserve">한국어 논문이 많이 추천되는 것과 한국어권에서 주요하게 축적된 특정 연구가 실제로 높은 비율로 포함되는 것은 동일하지 않다.</w:t>
+      </w:r>
+      <w:r>
+        <w:t xml:space="preserve"> </w:t>
+      </w:r>
+      <w:r>
+        <w:t xml:space="preserve">Benchmark 밖의 한국어 추천이 부적절하다는 의미가 아니라, 두 지표가 다른 질문에 답한다는 의미이다.</w:t>
+      </w:r>
+    </w:p>
+    <w:p>
+      <w:pPr>
+        <w:pStyle w:val="BodyText"/>
+      </w:pPr>
+      <w:r>
+        <w:t xml:space="preserve">전체</w:t>
+      </w:r>
+      <w:r>
+        <w:t xml:space="preserve"> </w:t>
+      </w:r>
+      <w:r>
+        <w:rPr>
+          <w:bCs/>
+          <w:b/>
+        </w:rPr>
+        <w:t xml:space="preserve">1,932개의 recommendation occurrence</w:t>
+      </w:r>
+      <w:r>
+        <w:t xml:space="preserve"> </w:t>
+      </w:r>
+      <w:r>
+        <w:t xml:space="preserve">가운데 제공된 링크의 결과는 다음과 같다.</w:t>
       </w:r>
     </w:p>
     <w:p>
@@ -2564,7 +3659,14 @@
         </w:numPr>
       </w:pPr>
       <w:r>
-        <w:t xml:space="preserve">854개(44.2%)는 full text 접근 가능</w:t>
+        <w:rPr>
+          <w:bCs/>
+          <w:b/>
+        </w:rPr>
+        <w:t xml:space="preserve">854개(44.2%)</w:t>
+      </w:r>
+      <w:r>
+        <w:t xml:space="preserve">: full text 접근 가능</w:t>
       </w:r>
     </w:p>
     <w:p>
@@ -2575,7 +3677,14 @@
         </w:numPr>
       </w:pPr>
       <w:r>
-        <w:t xml:space="preserve">859개(44.5%)는 접근 제한</w:t>
+        <w:rPr>
+          <w:bCs/>
+          <w:b/>
+        </w:rPr>
+        <w:t xml:space="preserve">859개(44.5%)</w:t>
+      </w:r>
+      <w:r>
+        <w:t xml:space="preserve">: 접근 제한</w:t>
       </w:r>
     </w:p>
     <w:p>
@@ -2610,7 +3719,14 @@
         </w:numPr>
       </w:pPr>
       <w:r>
-        <w:t xml:space="preserve">219개(11.3%)는 invalid 또는 unverifiable</w:t>
+        <w:rPr>
+          <w:bCs/>
+          <w:b/>
+        </w:rPr>
+        <w:t xml:space="preserve">219개(11.3%)</w:t>
+      </w:r>
+      <w:r>
+        <w:t xml:space="preserve">: invalid 또는 unverifiable</w:t>
       </w:r>
     </w:p>
     <w:p>
@@ -2959,7 +4075,7 @@
         <w:pStyle w:val="BodyText"/>
       </w:pPr>
       <w:r>
-        <w:t xml:space="preserve">Prompt condition과 system을 통제하면 recommended-item language는 full access, access restriction 또는 invalid/unverifiable outcome과 독립적으로 유의한 관계를 보이지 않는다. 따라서 raw language difference를 publication language 자체의 효과로 해석하지 않는다.</w:t>
+        <w:t xml:space="preserve">Prompt condition과 system을 통제하면 recommended-item language는 full access, access restriction 또는 invalid/unverifiable outcome과 독립적으로 유의한 관계를 보이지 않는다. 따라서 표의 raw difference를 publication language 자체의 효과로 해석하지 않는다.</w:t>
       </w:r>
     </w:p>
     <w:bookmarkEnd w:id="34"/>
@@ -2977,36 +4093,52 @@
         <w:pStyle w:val="FirstParagraph"/>
       </w:pPr>
       <w:r>
-        <w:t xml:space="preserve">Study 2에서 한국어–영어 가시성 격차는 검색과 최종 source selection에서 직접 관찰된다. 영어 general-web baseline에서는 한국어 benchmark가 observable search trace와 recommendation에서 모두 회수되지 않았으며, 한국어 질의와 한국 학술 데이터베이스 지시는 상대적 gap을 줄였다. 그러나 이러한 조건 변화가 높은 절대 recovery로 이어지지는 않았다.</w:t>
-      </w:r>
-    </w:p>
-    <w:p>
-      <w:pPr>
-        <w:pStyle w:val="BodyText"/>
-      </w:pPr>
-      <w:r>
-        <w:t xml:space="preserve">두 조건을 함께 적용한 경우에는 gap의 방향이 반전되지만, 이는 한국어 benchmark가 충분히 회수되었다는 의미가 아니다. 검색 회수율 2.2%와 추천 회수율 3.2%는 상대적 격차의 개선과 절대적 discovery bottleneck이 동시에 존재할 수 있음을 보여준다. 또한 search trace는 provider가 공개한 범위만 관찰하므로 내부 retrieval 전체로 해석하지 않는다.</w:t>
-      </w:r>
-    </w:p>
-    <w:p>
-      <w:pPr>
-        <w:pStyle w:val="BodyText"/>
-      </w:pPr>
-      <w:r>
-        <w:t xml:space="preserve">또한 한국어 representation의 큰 변화와 benchmark recovery의 낮은 수준이 동시에 나타났다. 따라서 생성형 검색에서 한국어 문헌이 많이 제시되는 것만으로 한국어권의 주요 학술기록이 충분히 가시화되었다고 볼 수 없다.</w:t>
-      </w:r>
-    </w:p>
-    <w:p>
-      <w:pPr>
-        <w:pStyle w:val="BodyText"/>
-      </w:pPr>
-      <w:r>
-        <w:t xml:space="preserve">추천 이후의 full-text access는 별도의 제약을 보여준다. 전체 recommendation 가운데 절반 미만만 제공된 URL을 통해 바로 원문으로 연결되었으나, 이 단계에서는 검색과 추천에서 나타난 것과 같은 유의한 한국어–영어 격차가 확인되지 않았다.</w:t>
+        <w:t xml:space="preserve">Study 2에서 영어 general-web baseline의 한국어 benchmark deficit은</w:t>
+      </w:r>
+      <w:r>
+        <w:t xml:space="preserve"> </w:t>
+      </w:r>
+      <w:r>
+        <w:rPr>
+          <w:bCs/>
+          <w:b/>
+        </w:rPr>
+        <w:t xml:space="preserve">검색흔적과 최종 추천 모두에서</w:t>
+      </w:r>
+      <w:r>
+        <w:t xml:space="preserve"> </w:t>
+      </w:r>
+      <w:r>
+        <w:t xml:space="preserve">관찰된다. 한국어 query와 한국 학술 데이터베이스 지시는 이 상대적 차이를 줄이거나 반전시키지만, 절대적인 한국어 benchmark 회수율은 여전히 낮다.</w:t>
+      </w:r>
+    </w:p>
+    <w:p>
+      <w:pPr>
+        <w:pStyle w:val="BodyText"/>
+      </w:pPr>
+      <w:r>
+        <w:t xml:space="preserve">Combined condition에서는 최종 추천의 91.2%가 한국어 논문으로 구성되지만 사전에 정한 한국어 benchmark의 recommendation recovery는 3.2%에 머문다. 따라서 검색결과가 언어적으로 한국어 중심으로 보이는 것만으로 한국어권의 주요 연구가 충분히 포함되었다고 결론내릴 수 없다.</w:t>
+      </w:r>
+    </w:p>
+    <w:p>
+      <w:pPr>
+        <w:pStyle w:val="BodyText"/>
+      </w:pPr>
+      <w:r>
+        <w:t xml:space="preserve">또한 검색흔적과 최종 추천을 구분하면 문헌이 최종 결과에 없는 경우를 일부 구분할 수 있다. Benchmark가 공개된 search trace에도 나타나지 않는 경우와 search trace에는 나타났지만 최종 recommendation에 포함되지 않는 경우는 관찰 가능한 결과가 다르다. 다만 provider가 내부 검색과정을 모두 공개하지 않으므로 이를 내부적인 retrieval mechanism의 완전한 관찰로 해석하지 않는다.</w:t>
+      </w:r>
+    </w:p>
+    <w:p>
+      <w:pPr>
+        <w:pStyle w:val="BodyText"/>
+      </w:pPr>
+      <w:r>
+        <w:t xml:space="preserve">제공된 링크를 통한 원문 접근은 또 다른 문제이다. 전체 recommendation 가운데 절반 미만만 바로 full text로 연결되었지만, 이 결과에서는 검색과 추천에서와 같은 유의한 한국어–영어 차이가 확인되지 않았다.</w:t>
       </w:r>
     </w:p>
     <w:bookmarkEnd w:id="35"/>
     <w:bookmarkEnd w:id="36"/>
-    <w:bookmarkStart w:id="42" w:name="논의"/>
+    <w:bookmarkStart w:id="39" w:name="논의"/>
     <w:p>
       <w:pPr>
         <w:pStyle w:val="Heading1"/>
@@ -3015,7 +4147,7 @@
         <w:t xml:space="preserve">5. 논의</w:t>
       </w:r>
     </w:p>
-    <w:bookmarkStart w:id="40" w:name="주요-발견의-종합"/>
+    <w:bookmarkStart w:id="37" w:name="주요-발견의-종합"/>
     <w:p>
       <w:pPr>
         <w:pStyle w:val="Heading2"/>
@@ -3029,140 +4161,301 @@
         <w:pStyle w:val="FirstParagraph"/>
       </w:pPr>
       <w:r>
-        <w:t xml:space="preserve">두 Study가 공통으로 보여주는 것은 한국어권에서 학술적으로 사용되거나 주요하게 다뤄진 문헌이 다른 검색환경에서 자동적으로 동일한 가시성을 갖는 것은 아니라는 점이다. 다만 두 연구에서 가시성이 의미하는 바와 증거의 성격은 구분해야 한다.</w:t>
-      </w:r>
-    </w:p>
-    <w:p>
-      <w:pPr>
-        <w:pStyle w:val="BodyText"/>
-      </w:pPr>
-      <w:r>
-        <w:t xml:space="preserve">Study 1의 분석대상은 2000–2025년에 생산된 한국어권 정치학 논문들이 인용한 한국 정치 관련 문헌이다. 이 문헌들 가운데 현재 Google Scholar의 known-item search에서 확인되는 논문과 그렇지 않은 논문의 영어권 인용확률 격차는 시기에 따라 다르게 나타났다. 특히 기준기간보다 2010–2014년과 2015–2019년에 격차가 확대되었지만, 2020–2024년에는 추가 확대가 확인되지 않았다. 여기서 가시성은 broad discovery가 아니라 현재 bibliographic retrievability를 의미하며, 영어권 citation은 그와 비교되는 별도의 historical outcome이다.</w:t>
-      </w:r>
-    </w:p>
-    <w:p>
-      <w:pPr>
-        <w:pStyle w:val="BodyText"/>
-      </w:pPr>
-      <w:r>
-        <w:t xml:space="preserve">Study 2에서는 가시성을 현재의 생성형 검색과정에서 직접 관찰한다. 영어 general-web baseline에서 한국어 benchmark의 observable search-trace recovery와 final recommendation recovery가 영어 benchmark보다 낮았고, 그 격차는 한국어 질의와 한국 학술 데이터베이스 지시에 따라 변화하였다. 따라서 Study 2의 가시성은 사전에 정의한 문헌이 검색과 최종 source selection을 통과하는가를 의미한다.</w:t>
-      </w:r>
-    </w:p>
-    <w:p>
-      <w:pPr>
-        <w:pStyle w:val="BodyText"/>
-      </w:pPr>
-      <w:r>
-        <w:t xml:space="preserve">Figure 1에서 보듯이, Study 1의 격차 확대는 C2와 C3에 집중되고 C4에서는 확인되지 않는다. Study 2에서는 baseline의 한국어 deficit이 검색조건에 따라 반전되지만 절대 recovery는 낮으며, combined condition에서 한국어 추천 비율은 91.2%까지 증가해도 한국어 benchmark recommendation recovery는 3.2%에 머문다.</w:t>
-      </w:r>
-    </w:p>
-    <w:p>
-      <w:pPr>
-        <w:pStyle w:val="CaptionedFigure"/>
-      </w:pPr>
-      <w:r>
-        <w:drawing>
-          <wp:inline>
-            <wp:extent cx="5334000" cy="1886100"/>
-            <wp:effectExtent b="0" l="0" r="0" t="0"/>
-            <wp:docPr descr="Study 1의 Google Scholar 가시성과 Study 2의 생성형 검색 결과" title="" id="38" name="Picture"/>
-            <a:graphic>
-              <a:graphicData uri="http://schemas.openxmlformats.org/drawingml/2006/picture">
-                <pic:pic>
-                  <pic:nvPicPr>
-                    <pic:cNvPr descr="combined_analysis/figures/discovery_bottleneck_combined_simple.png" id="39" name="Picture"/>
-                    <pic:cNvPicPr>
-                      <a:picLocks noChangeArrowheads="1" noChangeAspect="1"/>
-                    </pic:cNvPicPr>
-                  </pic:nvPicPr>
-                  <pic:blipFill>
-                    <a:blip r:embed="rId37"/>
-                    <a:stretch>
-                      <a:fillRect/>
-                    </a:stretch>
-                  </pic:blipFill>
-                  <pic:spPr bwMode="auto">
-                    <a:xfrm>
-                      <a:off x="0" y="0"/>
-                      <a:ext cx="5334000" cy="1886100"/>
-                    </a:xfrm>
-                    <a:prstGeom prst="rect">
-                      <a:avLst/>
-                    </a:prstGeom>
-                    <a:noFill/>
-                    <a:ln w="9525">
-                      <a:noFill/>
-                      <a:headEnd/>
-                      <a:tailEnd/>
-                    </a:ln>
-                  </pic:spPr>
-                </pic:pic>
-              </a:graphicData>
-            </a:graphic>
-          </wp:inline>
-        </w:drawing>
-      </w:r>
-    </w:p>
-    <w:p>
-      <w:pPr>
-        <w:pStyle w:val="ImageCaption"/>
-      </w:pPr>
-      <w:r>
-        <w:t xml:space="preserve">Study 1의 Google Scholar 가시성과 Study 2의 생성형 검색 결과</w:t>
-      </w:r>
-    </w:p>
-    <w:p>
-      <w:pPr>
-        <w:pStyle w:val="BodyText"/>
-      </w:pPr>
-      <w:r>
-        <w:t xml:space="preserve">이 차이 때문에 두 결과를 하나의 인과 메커니즘으로 결합해서는 안 된다. Study 1은 현재의 paper-level retrievability와 historical English-language citation pattern 사이의 association을 보여주며, Study 2는 현재 조건에서 나타나는 retrieval 및 recommendation difference를 실험적으로 비교한다. 두 연구가 공유하는 것은 검색환경이 문헌을 후보로 포함하고 선택하는 과정 자체가 관찰 가능한 차이를 만든다는 것이다.</w:t>
-      </w:r>
-    </w:p>
-    <w:p>
-      <w:pPr>
-        <w:pStyle w:val="BodyText"/>
-      </w:pPr>
-      <w:r>
-        <w:t xml:space="preserve">Study 2의 결과는 특히 language representation과 scholarly recovery의 차이를 명확하게 보여준다. Combined condition에서는 추천의 91.2%가 한국어 논문이지만 사전에 선정한 한국어 benchmark의 recommendation recovery는 3.2%이다. 따라서 결과목록이 언어적으로 local해 보이는 것과 특정 local scholarly record가 실제로 가시화되는 것은 다른 문제이다.</w:t>
-      </w:r>
-    </w:p>
-    <w:p>
-      <w:pPr>
-        <w:pStyle w:val="BodyText"/>
-      </w:pPr>
-      <w:r>
-        <w:t xml:space="preserve">원문 접근 역시 가시성과 동일하지 않다. Study 1에서는 현재 Google Scholar-mediated access가 영어권 인용과 별도의 유의한 관계를 보이지 않았으며, Study 2에서도 추천된 문헌의 절반 미만만 제공된 링크로 직접 원문에 접근할 수 있었지만 한국어와 영어 사이의 유의한 access gap은 나타나지 않았다. 본 연구의 결과는 따라서</w:t>
-      </w:r>
-      <w:r>
-        <w:t xml:space="preserve"> </w:t>
-      </w:r>
-      <w:r>
-        <w:rPr>
-          <w:rStyle w:val="VerbatimChar"/>
-        </w:rPr>
-        <w:t xml:space="preserve">retrieval → access → citation</w:t>
-      </w:r>
-      <w:r>
-        <w:t xml:space="preserve">이라는 단일한 연쇄효과를 지지하지 않는다. 검색가능성, source selection, access through provided links는 서로 구분되는 결과이다.</w:t>
-      </w:r>
-    </w:p>
-    <w:p>
-      <w:pPr>
-        <w:pStyle w:val="BodyText"/>
-      </w:pPr>
-      <w:r>
-        <w:t xml:space="preserve">두 Study의 시간적 범위도 다르다. Google Scholar는 오랫동안 학술검색에 사용되어 온 환경인 반면(Jamali and Asadi 2010; Cothran 2011; Blankstein 2022), web-enabled generative search는 훨씬 최근의 환경이다. Study 1의 citation cohort를 생성형 검색의 등장과 연결해서는 안 되며, 현재 생성형 검색에서의 직접적인 근거는 Study 2에서 나온다.</w:t>
+        <w:t xml:space="preserve">두 Study가 공통으로 보여주는 것은</w:t>
+      </w:r>
+      <w:r>
+        <w:t xml:space="preserve"> </w:t>
+      </w:r>
+      <w:r>
+        <w:rPr>
+          <w:bCs/>
+          <w:b/>
+        </w:rPr>
+        <w:t xml:space="preserve">한국어권에서 존재하고 실제 사용되는 연구가 다른 검색환경에서도 자동적으로 같은 정도로 가시화되는 것은 아니라는 점</w:t>
+      </w:r>
+      <w:r>
+        <w:t xml:space="preserve">이다. 다만 두 연구에서 가시성을 관찰하는 방식과 증거의 시간적 성격은 다르다.</w:t>
+      </w:r>
+    </w:p>
+    <w:p>
+      <w:pPr>
+        <w:pStyle w:val="BodyText"/>
+      </w:pPr>
+      <w:r>
+        <w:t xml:space="preserve">Study 1에서는 한국어권 정치학에서 이미 인용된 문헌을 출발점으로 삼았다. 이 문헌들 가운데 2026년 현재 Google Scholar index presence가 확인되는 논문과 확인되지 않는 논문의 영어권 인용확률 격차는 시기에 따라 동일하지 않았다. 특히 기준기간보다 2010–2014년과 2015–2019년에 격차가 더 크게 나타났지만 2020–2024년에는 추가 확대되지 않았다. 이는 현재 Google Scholar index presence와 historical citation trajectory 사이의 association이며 과거의 실제 검색환경을 직접 보여주는 결과는 아니다.</w:t>
+      </w:r>
+    </w:p>
+    <w:p>
+      <w:pPr>
+        <w:pStyle w:val="BodyText"/>
+      </w:pPr>
+      <w:r>
+        <w:t xml:space="preserve">Study 2에서는 현재의 생성형 검색과정을 직접 관찰한다. 영어 general-web baseline에서 한국어 benchmark는 공개된 search trace와 최종 recommendation 모두에서 영어 benchmark보다 낮게 나타났고, 그 차이는 한국어 query와 한국 학술 데이터베이스 검색 지시에 따라 달라졌다. 즉 한국어권의 주요 문헌이 생성형 검색에서 나타나는 정도는 검색조건에 따라 변화할 수 있다.</w:t>
+      </w:r>
+    </w:p>
+    <w:p>
+      <w:pPr>
+        <w:pStyle w:val="BodyText"/>
+      </w:pPr>
+      <w:r>
+        <w:t xml:space="preserve">두 연구를 하나의 인과 메커니즘으로 결합할 수는 없다. Study 1은 현재의 Google Scholar index presence와 과거 영어권 인용패턴 사이의 관계를 보여주고, Study 2는 현재 생성형 검색에서 문헌이 검색되고 최종 출처로 제시되는 결과를 직접 비교한다. 두 연구가 함께 보여주는 보다 제한적인 점은</w:t>
+      </w:r>
+      <w:r>
+        <w:t xml:space="preserve"> </w:t>
+      </w:r>
+      <w:r>
+        <w:rPr>
+          <w:bCs/>
+          <w:b/>
+        </w:rPr>
+        <w:t xml:space="preserve">학술문헌이 검색환경에서 검토 가능한 연구로 나타나는 과정 자체가 국제적 가시성의 별도 분석대상이라는 것</w:t>
+      </w:r>
+      <w:r>
+        <w:t xml:space="preserve">이다.</w:t>
+      </w:r>
+    </w:p>
+    <w:p>
+      <w:pPr>
+        <w:pStyle w:val="BodyText"/>
+      </w:pPr>
+      <w:r>
+        <w:t xml:space="preserve">Study 2의 결과는 특히 최종 목록의 언어적 구성과 한국어권 주요 연구의 실제 반영 정도가 다를 수 있음을 보여준다. Combined condition에서는 recommendation의 91.2%가 한국어 논문이지만 사전 지정 한국어 benchmark의 recommendation recovery는 3.2%이다. 따라서</w:t>
+      </w:r>
+      <w:r>
+        <w:t xml:space="preserve"> </w:t>
+      </w:r>
+      <w:r>
+        <w:rPr>
+          <w:bCs/>
+          <w:b/>
+        </w:rPr>
+        <w:t xml:space="preserve">한국어 자료가 많이 보인다는 것과 한국어권에서 축적된 주요 연구가 실제 검색결과에 충분히 포함된다는 것은 다른 주장</w:t>
+      </w:r>
+      <w:r>
+        <w:t xml:space="preserve">이다.</w:t>
+      </w:r>
+    </w:p>
+    <w:p>
+      <w:pPr>
+        <w:pStyle w:val="BodyText"/>
+      </w:pPr>
+      <w:r>
+        <w:t xml:space="preserve">원문 접근 역시 검색 및 추천과 같은 결과가 아니었다. Study 1에서는 현재 Google Scholar가 제공한 full-text link가 영어권 citation incidence와 유의한 별도 관계를 보이지 않았고, Study 2에서는 전체 추천의 절반 미만이 제공된 링크를 통해 full text로 연결되었지만 한국어와 영어 사이의 유의한 차이는 확인되지 않았다. 따라서 문헌이 검색에서 확인되는지, 최종 출처로 제시되는지, 제공된 링크를 통해 읽을 수 있는지, 이후 인용되는지는 서로 구분하여 해석할 필요가 있다.</w:t>
+      </w:r>
+    </w:p>
+    <w:bookmarkEnd w:id="37"/>
+    <w:bookmarkStart w:id="38" w:name="정치학적-함의와-후속연구"/>
+    <w:p>
+      <w:pPr>
+        <w:pStyle w:val="Heading2"/>
+      </w:pPr>
+      <w:r>
+        <w:t xml:space="preserve">5.2 정치학적 함의와 후속연구</w:t>
+      </w:r>
+    </w:p>
+    <w:p>
+      <w:pPr>
+        <w:pStyle w:val="FirstParagraph"/>
+      </w:pPr>
+      <w:r>
+        <w:t xml:space="preserve">본 연구의 정치학적 함의는 검색기술이 국제적 지식 불평등을 단독으로 결정한다는 데 있지 않다. 기존 연구는 정치학의 연구대상, 출판, 데이터베이스 coverage, 국제 인용이 지역과 언어에 따라 불균등하게 구성되어 있음을 이미 보여왔다(Breuning et al. 2018; Wilson and Knutsen 2022; Mongeon and Paul-Hus 2016). 한국 정치 연구에서도 한국어권과 영어권은 연구 주제와 방법론, 국제적 인지도에서 구분되는 학술공간을 형성한다(Rhee 2026; Kim et al. 2025).</w:t>
+      </w:r>
+    </w:p>
+    <w:p>
+      <w:pPr>
+        <w:pStyle w:val="BodyText"/>
+      </w:pPr>
+      <w:r>
+        <w:t xml:space="preserve">본 연구가 추가하는 것은</w:t>
+      </w:r>
+      <w:r>
+        <w:t xml:space="preserve"> </w:t>
+      </w:r>
+      <w:r>
+        <w:rPr>
+          <w:bCs/>
+          <w:b/>
+        </w:rPr>
+        <w:t xml:space="preserve">연구자가 선행연구를 찾는 검색과정에서도 이러한 가시성의 차이를 관찰할 수 있다는 점</w:t>
+      </w:r>
+      <w:r>
+        <w:t xml:space="preserve">이다. 한국어권에서 실제로 인용된 논문이라도 현재 Google Scholar에서 모두 확인되는 것은 아니며, 생성형 검색이 다수의 한국어 논문을 제시하더라도 한국어권에서 주요하게 다뤄져 온 특정 연구가 같은 정도로 포함되는 것도 아니다.</w:t>
+      </w:r>
+    </w:p>
+    <w:p>
+      <w:pPr>
+        <w:pStyle w:val="BodyText"/>
+      </w:pPr>
+      <w:r>
+        <w:t xml:space="preserve">검색환경은 문헌의 학술적 가치 자체를 결정하지 않지만, 연구자가 어떤 문헌을 검토할 가능성이 있는지를 구성하는 과정에 개입한다. 관련 문헌이 검색결과에 나타나지 않는다면 연구자는 그 문헌의 내용과 가치를 평가하기 이전에 해당 연구를 고려하지 못할 수 있다. 이 점에서 discovery bottleneck은</w:t>
+      </w:r>
+      <w:r>
+        <w:t xml:space="preserve"> </w:t>
+      </w:r>
+      <w:r>
+        <w:rPr>
+          <w:bCs/>
+          <w:b/>
+        </w:rPr>
+        <w:t xml:space="preserve">문헌의 질에 대한 평가 이전에 발생하는 가시성의 문제</w:t>
+      </w:r>
+      <w:r>
+        <w:t xml:space="preserve">를 가리킨다.</w:t>
+      </w:r>
+    </w:p>
+    <w:p>
+      <w:pPr>
+        <w:pStyle w:val="BodyText"/>
+      </w:pPr>
+      <w:r>
+        <w:t xml:space="preserve">이 문제는 동일한 정치현상에 대해 현지어와 영어로 상당한 연구가 병존하는 경우 특히 중요하다. 한국 정치에 관한 국제적 지식을 영어권 학술지나 국제 citation index, 또는 생성형 검색이 제시하는 reading list만으로 파악하면 한국어권에 축적된 scholarly record와 특정 검색환경에서 실제로 나타나는 문헌집합 사이의 차이를 놓칠 수 있다.</w:t>
+      </w:r>
+    </w:p>
+    <w:p>
+      <w:pPr>
+        <w:pStyle w:val="BodyText"/>
+      </w:pPr>
+      <w:r>
+        <w:t xml:space="preserve">Study 1과 Study 2는 이 차이를 서로 다른 방식으로 제한하여 관찰한다. Study 1은 한국어권에서 실제 인용된 문헌이라는 공통 출발점을 두고 현재 Google Scholar index presence와 영어권 citation pattern을 비교한다. Study 2는 양 언어권에서 모두 연구되어 온 substantive topic을 고정한 뒤 각 언어권에서 사전에 선정한 주요 문헌이 검색흔적과 최종 recommendation에 나타나는 정도를 비교한다.</w:t>
+      </w:r>
+    </w:p>
+    <w:p>
+      <w:pPr>
+        <w:pStyle w:val="BodyText"/>
+      </w:pPr>
+      <w:r>
+        <w:t xml:space="preserve">본 논문의</w:t>
+      </w:r>
+      <w:r>
+        <w:t xml:space="preserve"> </w:t>
+      </w:r>
+      <w:r>
+        <w:rPr>
+          <w:bCs/>
+          <w:b/>
+        </w:rPr>
+        <w:t xml:space="preserve">discovery bottleneck</w:t>
+      </w:r>
+      <w:r>
+        <w:t xml:space="preserve">은 하나의 내부 알고리즘적 원인을 지칭하지 않는다. Study 1에서는 본 연구의 search protocol에서 Google Scholar bibliographic record를 확인하지 못하는 경우를, Study 2에서는 benchmark paper가 관찰 가능한 search trace에서 확인되지 않거나 최종 recommendation에 포함되지 않는 경우를 가리킨다. 즉 문헌이 실질적 평가에 도달하기 전에 관찰 가능한 검색·선택 과정에서 가시성을 잃는 상태를 지칭한다.</w:t>
+      </w:r>
+    </w:p>
+    <w:p>
+      <w:pPr>
+        <w:pStyle w:val="BodyText"/>
+      </w:pPr>
+      <w:r>
+        <w:t xml:space="preserve">후속연구에서는 이러한 상태를 시간에 따라 직접 관찰할 필요가 있다. Google Scholar에서 동일한 문헌의 index presence와 제공 링크를 반복 측정하면 현재 Study 1에서 관찰할 수 없는 indexing 변화를 기록할 수 있다. 생성형 검색에서도 동일한 benchmark와 검색조건을 반복 적용하면 특정 한국어 연구가 검색과 추천에 나타나는 정도가 모델과 검색환경의 변화에 따라 어떻게 달라지는지 확인할 수 있다.</w:t>
+      </w:r>
+    </w:p>
+    <w:bookmarkEnd w:id="38"/>
+    <w:bookmarkEnd w:id="39"/>
+    <w:bookmarkStart w:id="40" w:name="결론"/>
+    <w:p>
+      <w:pPr>
+        <w:pStyle w:val="Heading1"/>
+      </w:pPr>
+      <w:r>
+        <w:t xml:space="preserve">6. 결론</w:t>
+      </w:r>
+    </w:p>
+    <w:p>
+      <w:pPr>
+        <w:pStyle w:val="FirstParagraph"/>
+      </w:pPr>
+      <w:r>
+        <w:t xml:space="preserve">한국 정치 연구의 국제적 가시성은 어떤 연구가 출판되고 최종적으로 인용되는가만으로 완전히 포착되지 않는다. 연구자가 실제 선행연구를 찾는 과정에서는</w:t>
+      </w:r>
+      <w:r>
+        <w:t xml:space="preserve"> </w:t>
+      </w:r>
+      <w:r>
+        <w:rPr>
+          <w:bCs/>
+          <w:b/>
+        </w:rPr>
+        <w:t xml:space="preserve">어떤 문헌이 검색환경에 존재하고, 검색결과에서 확인되며, 최종적으로 검토할 출처로 제시되는가</w:t>
+      </w:r>
+      <w:r>
+        <w:t xml:space="preserve">라는 문제가 추가된다.</w:t>
+      </w:r>
+    </w:p>
+    <w:p>
+      <w:pPr>
+        <w:pStyle w:val="BodyText"/>
+      </w:pPr>
+      <w:r>
+        <w:t xml:space="preserve">Study 1은 2000–2025년에 생산된 한국어권 정치학 논문들이 인용한 한국 정치 관련 논문 54,789편을 대상으로 현재 Google Scholar index presence와 과거 영어권 인용패턴을 비교하였다. 현재 Google Scholar record가 확인되는 논문과 그렇지 않은 논문의 영어권 인용확률 격차는 기준기간보다 2010–2014년과 2015–2019년에 유의하게 더 컸으나 2020–2024년에는 추가적인 확대가 확인되지 않았다. 현재 Google Scholar가 제공하는 full-text link는 영어권 citation incidence와 별도의 유의한 관계를 보이지 않았다. 이 결과는 Google Scholar의 역사적 인과효과가 아니라 현재 index presence와 historical citation trajectory 사이의 제한적인 association이다.</w:t>
+      </w:r>
+    </w:p>
+    <w:p>
+      <w:pPr>
+        <w:pStyle w:val="BodyText"/>
+      </w:pPr>
+      <w:r>
+        <w:t xml:space="preserve">Study 2에서는 양 언어권에서 모두 연구되어 온 동일한 한국 정치 주제를 기준으로 한국어와 영어 benchmark를 사전에 구성하여 현재의 생성형 검색을 감사하였다. 영어 general-web baseline에서는 한국어 benchmark가 search trace와 final recommendation에서 영어 benchmark보다 유의하게 덜 회수되었다. 한국어 질의와 한국 학술 데이터베이스 검색 지시는 이 상대적 격차를 줄였지만 절대적인 한국어 benchmark recovery는 낮게 유지되었다. 특히 combined condition에서 recommendation의 91.2%가 한국어 논문이어도 사전 지정 한국어 benchmark의 recommendation recovery는 3.2%였다. 따라서</w:t>
+      </w:r>
+      <w:r>
+        <w:t xml:space="preserve"> </w:t>
+      </w:r>
+      <w:r>
+        <w:rPr>
+          <w:bCs/>
+          <w:b/>
+        </w:rPr>
+        <w:t xml:space="preserve">한국어 논문이 많이 제시되는 것과 한국어권의 주요 연구가 실제 검색결과에 충분히 반영되는 것은 동일하지 않았다.</w:t>
+      </w:r>
+    </w:p>
+    <w:p>
+      <w:pPr>
+        <w:pStyle w:val="BodyText"/>
+      </w:pPr>
+      <w:r>
+        <w:t xml:space="preserve">두 Study 모두 제공된 링크를 통한 원문 접근에서는 검색 및 추천에서 관찰된 차이에 상응하는 유의한 언어격차를 확인하지 못했다. 이는 문헌의 검색 여부, 최종 출처 선택, 원문 접근, 이후의 학술적 이용을 하나의 결과로 간주해서는 안 된다는 점을 보여준다.</w:t>
+      </w:r>
+    </w:p>
+    <w:p>
+      <w:pPr>
+        <w:pStyle w:val="BodyText"/>
+      </w:pPr>
+      <w:r>
+        <w:t xml:space="preserve">본 논문에서</w:t>
+      </w:r>
+      <w:r>
+        <w:t xml:space="preserve"> </w:t>
+      </w:r>
+      <w:r>
+        <w:rPr>
+          <w:bCs/>
+          <w:b/>
+        </w:rPr>
+        <w:t xml:space="preserve">discovery bottleneck</w:t>
+      </w:r>
+      <w:r>
+        <w:t xml:space="preserve">은 문헌이 학술적으로 존재하고 한 학술공간에서 이미 사용되고 있더라도, 내용에 대한 실질적 평가에 도달하기 전에 특정 검색환경에서 가시성을 잃는 현상을 의미한다. 이는 검색기술이 국제적 지식 불평등을 단독으로 발생시킨다는 주장이 아니다. 한국 정치 연구처럼 한국어권과 영어권에 병렬적인 학술적 축적이 존재하는 경우,</w:t>
+      </w:r>
+      <w:r>
+        <w:t xml:space="preserve"> </w:t>
+      </w:r>
+      <w:r>
+        <w:rPr>
+          <w:bCs/>
+          <w:b/>
+        </w:rPr>
+        <w:t xml:space="preserve">어떤 연구가 생산되고 인용되는가와 함께 어떤 구체적인 연구가 실제 검색과정에서 검토 가능한 문헌으로 나타나는가를 별도로 분석할 필요가 있다</w:t>
+      </w:r>
+      <w:r>
+        <w:t xml:space="preserve">는 주장이다.</w:t>
       </w:r>
     </w:p>
     <w:bookmarkEnd w:id="40"/>
-    <w:bookmarkStart w:id="41" w:name="정치학적-함의와-후속연구"/>
-    <w:p>
-      <w:pPr>
-        <w:pStyle w:val="Heading2"/>
-      </w:pPr>
-      <w:r>
-        <w:t xml:space="preserve">5.2 정치학적 함의와 후속연구</w:t>
+    <w:bookmarkStart w:id="41" w:name="한계"/>
+    <w:p>
+      <w:pPr>
+        <w:pStyle w:val="Heading1"/>
+      </w:pPr>
+      <w:r>
+        <w:t xml:space="preserve">7. 한계</w:t>
       </w:r>
     </w:p>
     <w:p>
@@ -3170,231 +4463,117 @@
         <w:pStyle w:val="FirstParagraph"/>
       </w:pPr>
       <w:r>
-        <w:t xml:space="preserve">본 연구의 정치학적 함의는 검색기술이 국제적 지식 불평등을 단독으로 결정한다는 데 있지 않다. 기존 연구는 정치학의 연구대상, 출판, 데이터베이스 coverage, 국제 인용이 지역과 언어에 따라 불균등하게 구성되어 있음을 이미 보여왔다(Breuning et al. 2018; Wilson and Knutsen 2022; Mongeon and Paul-Hus 2016). 한국 정치학에서도 KCI와 SSCI를 중심으로 연구 주제와 방법론이 다른 학술공간이 병존한다(Rhee 2026).</w:t>
-      </w:r>
-    </w:p>
-    <w:p>
-      <w:pPr>
-        <w:pStyle w:val="BodyText"/>
-      </w:pPr>
-      <w:r>
-        <w:t xml:space="preserve">본 연구가 추가하는 것은 문헌이 검색 가능한 후보가 되고 최종 출처로 선택되는 과정도 국제적 가시성의 한 차원으로 측정할 수 있다는 점이다. 한국어권에서 이미 인용된 문헌이라도 현재 국제적으로 이용되는 학술검색 환경에서 모두 동일하게 검색되는 것은 아니며, 생성형 검색이 다수의 한국어 논문을 제시하더라도 한국어권의 사전 지정 주요 문헌이 같은 정도로 회수되는 것도 아니다.</w:t>
-      </w:r>
-    </w:p>
-    <w:p>
-      <w:pPr>
-        <w:pStyle w:val="BodyText"/>
-      </w:pPr>
-      <w:r>
-        <w:t xml:space="preserve">이 관점에서 검색환경은 문헌의 학술적 가치를 직접 결정한다기보다 어떤 문헌이 평가받을 후보집합에 들어오는가를 구조화한다. Discovery bottleneck의 정치학적 의미는 검색결과의 언어적 외형보다, 현지 학술공간에서 축적된 구체적 문헌이 실제 평가대상으로 제시되는지를 묻는 데 있다.</w:t>
-      </w:r>
-    </w:p>
-    <w:p>
-      <w:pPr>
-        <w:pStyle w:val="BodyText"/>
-      </w:pPr>
-      <w:r>
-        <w:t xml:space="preserve">이 문제는 동일한 정치현상에 대해 현지어와 영어의 학술문헌이 병존하는 경우에 특히 중요하다. 한국 정치에 관한 국제적 지식을 영어권 학술지나 국제 citation index 또는 생성된 reading list만으로 파악하면, 한국어권에 축적된 문헌과 실제로 외부 검색환경에서 가시화되는 subset 사이의 차이를 놓칠 수 있다.</w:t>
-      </w:r>
-    </w:p>
-    <w:p>
-      <w:pPr>
-        <w:pStyle w:val="BodyText"/>
-      </w:pPr>
-      <w:r>
-        <w:t xml:space="preserve">Study 1과 Study 2는 이 차이를 서로 다른 방식으로 통제한다. Study 1은 한국어권에서 실제로 인용된 문헌이라는 공통 출발점을 두고 그 내부에서 현재 retrievability와 영어권 citation pattern을 비교한다. Study 2는 양 언어권에서 모두 연구되어 온 substantive topic을 고정한 뒤, 각 언어권에서 사전에 선정한 주요 문헌의 recovery를 비교한다. 따라서 두 연구 모두 단순히</w:t>
-      </w:r>
-      <w:r>
-        <w:t xml:space="preserve"> </w:t>
-      </w:r>
-      <w:r>
-        <w:t xml:space="preserve">“</w:t>
-      </w:r>
-      <w:r>
-        <w:t xml:space="preserve">한국어 논문이 적다</w:t>
-      </w:r>
-      <w:r>
-        <w:t xml:space="preserve">”</w:t>
-      </w:r>
-      <w:r>
-        <w:t xml:space="preserve">는 진술보다 동일한 비교범위 안에서 어떤 구체적인 문헌이 검색과 선택을 통과하는가에 초점을 둔다.</w:t>
-      </w:r>
-    </w:p>
-    <w:p>
-      <w:pPr>
-        <w:pStyle w:val="BodyText"/>
-      </w:pPr>
-      <w:r>
-        <w:t xml:space="preserve">이러한 관점에서 본 논문의 discovery bottleneck은 문헌이 관련성이나 학술적 가치에 대한 실질적 평가를 받기 전에 검색과 선택의 관찰 가능한 단계에서 후보집합에 들어오지 못하거나 최종 출처로 남지 못하는 현상을 가리킨다. Study 1에서는 현재 known-item lookup에서도 bibliographic record가 반환되지 않는 상태가 가장 좁은 형태의 bottleneck이고, Study 2에서는 benchmark가 observable search trace 또는 final recommendation에 진입하지 못하는 상태가 이에 해당한다. 두 경우 모두 다른 경로를 통한 발견 가능성을 부정하는 개념은 아니다.</w:t>
-      </w:r>
-    </w:p>
-    <w:p>
-      <w:pPr>
-        <w:pStyle w:val="BodyText"/>
-      </w:pPr>
-      <w:r>
-        <w:t xml:space="preserve">후속연구에서는 이러한 검색상태를 longitudinal하게 관찰할 필요가 있다. Google Scholar에서 동일한 문헌의 retrievability와 status of provided links를 반복 측정하면 현재 Study 1에서 관찰할 수 없는 indexing 및 접근경로의 변화를 직접 기록할 수 있다. 생성형 검색에서도 동일 benchmark와 조건을 반복 적용하면 현재 관찰된 recovery pattern이 시간이 지나면서 어떻게 변화하는지를 확인할 수 있다. 이러한 자료는 현재 검색상태와 과거 scholarly circulation 사이의 시간적 간극을 줄이고 discovery bottleneck의 형성과 변화를 보다 직접적으로 분석할 수 있게 한다.</w:t>
+        <w:t xml:space="preserve">Study 1의 가장 중요한 한계는 Google Scholar index presence가 2026년에만 관찰된다는 점이다. 각 target이 언제 Google Scholar에 처음 포함되었는지, 과거 어느 시점부터 검색되었는지, 당시 어떤 full-text link가 제공되었는지는 알 수 없다. 따라서 현재 Google Scholar 상태를 과거의 실제 search environment와 동일시할 수 없다.</w:t>
+      </w:r>
+    </w:p>
+    <w:p>
+      <w:pPr>
+        <w:pStyle w:val="BodyText"/>
+      </w:pPr>
+      <w:r>
+        <w:t xml:space="preserve">현재 index presence 자체가 이전 scholarly circulation의 결과일 가능성도 있다. 널리 인용되거나 웹에 더 많이 노출된 논문이 이후 Google Scholar에서 확인될 가능성이 높아졌을 수 있다. Target fixed effects는 시간불변의 paper characteristic을 통제하지만 이러한 temporal ordering이나 time-varying process를 제거하지 못한다.</w:t>
+      </w:r>
+    </w:p>
+    <w:p>
+      <w:pPr>
+        <w:pStyle w:val="BodyText"/>
+      </w:pPr>
+      <w:r>
+        <w:t xml:space="preserve">Google Scholar index presence의 측정에는 bibliographic matching error도 존재할 수 있다. 한국어·영어 제목과 reference-title variant를 사용했지만 metadata 오류, 제목 변형, 중복 record 또는 불완전한 indexing 때문에 실제 존재하는 record를 놓치거나 잘못 연결했을 가능성이 있다. 특히 Google Scholar가 전체 index 목록을 공개하지 않으므로 (D=0)은 Google Scholar 전체에서의 절대적인 부재가 아니라</w:t>
+      </w:r>
+      <w:r>
+        <w:t xml:space="preserve"> </w:t>
+      </w:r>
+      <w:r>
+        <w:rPr>
+          <w:bCs/>
+          <w:b/>
+        </w:rPr>
+        <w:t xml:space="preserve">본 연구의 search and matching protocol에서 index presence가 확인되지 않았음</w:t>
+      </w:r>
+      <w:r>
+        <w:t xml:space="preserve">을 뜻한다.</w:t>
+      </w:r>
+    </w:p>
+    <w:p>
+      <w:pPr>
+        <w:pStyle w:val="BodyText"/>
+      </w:pPr>
+      <w:r>
+        <w:t xml:space="preserve">Study 1 결과의 강도는 specification에 따라서도 달라진다. Main incidence model과 pre-2005 restriction에서는 C2와 C3의 gap 확대가 나타나지만 일부 Poisson 및 추가-control specification에서는 결과가 더 불확실하다. 따라서 모든 outcome과 functional form에서 동일한 패턴이 확인되었다고 일반화할 수 없다.</w:t>
+      </w:r>
+    </w:p>
+    <w:p>
+      <w:pPr>
+        <w:pStyle w:val="BodyText"/>
+      </w:pPr>
+      <w:r>
+        <w:t xml:space="preserve">Study 2는 두 개의 시스템, 다섯 개의 한국 정치 주제, 한 번의 collection period, 100편의 사전 지정 benchmark에 한정된다. 다섯 주제는 양 언어권에서 모두 연구되어 온 영역을 비교하기 위해 선정되었지만 한국 정치 연구 전체를 대표하는 확률표본은 아니다. Benchmark 역시 각 주제의 모든 relevant literature를 포괄하지 않는다.</w:t>
+      </w:r>
+    </w:p>
+    <w:p>
+      <w:pPr>
+        <w:pStyle w:val="BodyText"/>
+      </w:pPr>
+      <w:r>
+        <w:t xml:space="preserve">Benchmark 선정이 citation count와 두 출처의 공통 상위문헌에 의존한다는 점도 범위를 제한한다. 이 절차는 각 언어권에서 비교적 확립된 문헌으로 안정적인 evaluation set을 구성하지만 최근 연구, 저인용 연구, 전문적인 하위주제의 문헌을 충분히 대표하지 못할 수 있다.</w:t>
+      </w:r>
+    </w:p>
+    <w:p>
+      <w:pPr>
+        <w:pStyle w:val="BodyText"/>
+      </w:pPr>
+      <w:r>
+        <w:t xml:space="preserve">생성형 검색환경은 지속적으로 변한다. 동일한 model name 아래에서도 underlying model, search index, ranking procedure 또는 provider interface가 달라질 수 있으므로 Study 2는 수집시점의 behavior를 측정한다.</w:t>
+      </w:r>
+    </w:p>
+    <w:p>
+      <w:pPr>
+        <w:pStyle w:val="BodyText"/>
+      </w:pPr>
+      <w:r>
+        <w:t xml:space="preserve">또한 provider가 외부에 공개하는 search trace는 내부 retrieval 전체를 보여주지 않는다. 따라서 benchmark가 trace에서 발견되지 않았다고 해서 내부적으로 한 번도 고려되지 않았다고 단정할 수 없다. Provider별 trace observability도 다르므로 search trace의 언어적 구성을 시스템 간 대칭적으로 비교하지 않는다.</w:t>
+      </w:r>
+    </w:p>
+    <w:p>
+      <w:pPr>
+        <w:pStyle w:val="BodyText"/>
+      </w:pPr>
+      <w:r>
+        <w:t xml:space="preserve">제공 링크를 통한 원문 접근은 특히 benchmark 수준에서 희소하다. 검색과 recommendation 자체가 낮기 때문에 access 단계에는 floor가 존재한다. 따라서 한국어와 영어 사이에 유의한 access gap이 나타나지 않았다는 결과를 두 언어 문헌의 접근성이 동일하다는 적극적 증거로 해석해서는 안 된다.</w:t>
+      </w:r>
+    </w:p>
+    <w:p>
+      <w:pPr>
+        <w:pStyle w:val="BodyText"/>
+      </w:pPr>
+      <w:r>
+        <w:t xml:space="preserve">Link audit은 시스템이 실제 제공한 URL만 평가한다. Paywall, abstract-only page 또는 broken link로 분류된 논문이 인터넷의 다른 위치에서도 이용 불가능하다는 의미는 아니다. Hallucination event 역시 적고 특정 experimental cell에 집중되어 있어 system-level 특성으로 일반화하기 어렵다.</w:t>
+      </w:r>
+    </w:p>
+    <w:p>
+      <w:pPr>
+        <w:pStyle w:val="BodyText"/>
+      </w:pPr>
+      <w:r>
+        <w:t xml:space="preserve">마지막으로 두 Study 모두 문헌이 검색되거나 추천된 이후 연구자가 실제로 무엇을 하는지는 관찰하지 않는다. 검색결과의 클릭, 원문의 열람, substantive relevance 평가, 언어능력, perceived quality, citation norm, collaboration network 및 publication venue 등은 후속 이용과 인용에 영향을 줄 수 있다. 따라서 본 논문의 증거는 전체 지식순환 과정이 아니라</w:t>
+      </w:r>
+      <w:r>
+        <w:t xml:space="preserve"> </w:t>
+      </w:r>
+      <w:r>
+        <w:rPr>
+          <w:bCs/>
+          <w:b/>
+        </w:rPr>
+        <w:t xml:space="preserve">검색환경에서 어떤 문헌이 가시화되고 제시되는가, 그리고 제공된 링크를 통해 원문에 접근할 수 있는가</w:t>
+      </w:r>
+      <w:r>
+        <w:t xml:space="preserve">에 한정된다.</w:t>
       </w:r>
     </w:p>
     <w:bookmarkEnd w:id="41"/>
-    <w:bookmarkEnd w:id="42"/>
-    <w:bookmarkStart w:id="43" w:name="결론"/>
-    <w:p>
-      <w:pPr>
-        <w:pStyle w:val="Heading1"/>
-      </w:pPr>
-      <w:r>
-        <w:t xml:space="preserve">6. 결론</w:t>
-      </w:r>
-    </w:p>
-    <w:p>
-      <w:pPr>
-        <w:pStyle w:val="FirstParagraph"/>
-      </w:pPr>
-      <w:r>
-        <w:t xml:space="preserve">한국 정치학의 국제적 가시성은 어떤 연구가 출판되고 최종적으로 인용되는가만으로 완전히 포착되지 않는다. 그 사이에는 문헌이 특정 검색환경에서 검색 가능한 후보로 나타나는지, 최종 출처로 선택되는지, 그리고 원문으로 연결되는지라는 서로 구분되는 단계가 존재한다.</w:t>
-      </w:r>
-    </w:p>
-    <w:p>
-      <w:pPr>
-        <w:pStyle w:val="BodyText"/>
-      </w:pPr>
-      <w:r>
-        <w:t xml:space="preserve">Study 1은 2000–2025년에 생산된 한국어권 정치학 논문들이 인용한 한국 정치 관련 논문 54,789편을 대상으로 현재 Google Scholar의 paper-level retrievability와 과거 영어권 인용패턴을 비교하였다. 현재 검색 가능한 논문과 그렇지 않은 논문의 영어권 인용확률 격차는 기준기간보다 2010–2014년과 2015–2019년에 유의하게 더 컸으나 2020–2024년에는 추가적인 확대가 확인되지 않았다. 현재 Google Scholar가 제공하는 full-text route는 영어권 citation incidence와 별도의 유의한 관계를 보이지 않았다. 이는 Google Scholar의 역사적 인과효과가 아니라 현재 known-item retrievability에 따라 historical citation trajectory가 다르게 나타난다는 제한적인 association이다.</w:t>
-      </w:r>
-    </w:p>
-    <w:p>
-      <w:pPr>
-        <w:pStyle w:val="BodyText"/>
-      </w:pPr>
-      <w:r>
-        <w:t xml:space="preserve">Study 2에서는 양 언어권에서 모두 연구되어 온 동일한 한국 정치 주제를 기준으로 한국어와 영어 benchmark를 사전에 구성하여 현재의 생성형 검색을 감사하였다. 영어 general-web baseline에서는 한국어 benchmark가 검색과 final recommendation에서 영어 benchmark보다 유의하게 덜 회수되었다. 한국어 질의와 한국 학술 데이터베이스 지시는 이 상대적 격차를 줄였지만 절대적인 한국어 benchmark recovery는 낮게 유지되었다. 특히 combined condition에서 recommendation의 91.2%가 한국어 논문이어도 사전 지정 한국어 benchmark의 recommendation recovery는 3.2%였다. 따라서 한국어 문헌이 많이 보이는 것과 한국어권의 주요 문헌이 실제로 회수되는 것은 동일하지 않았다.</w:t>
-      </w:r>
-    </w:p>
-    <w:p>
-      <w:pPr>
-        <w:pStyle w:val="BodyText"/>
-      </w:pPr>
-      <w:r>
-        <w:t xml:space="preserve">두 Study 모두 원문 접근에서는 검색 및 추천에서 나타난 차이에 상응하는 유의한 언어격차를 확인하지 못했다. 따라서 본 연구는 retrieval, source selection, access를 하나의 연속적인 효과로 간주하지 않는다. 각 단계는 별도로 측정해야 하는 결과이다.</w:t>
-      </w:r>
-    </w:p>
-    <w:p>
-      <w:pPr>
-        <w:pStyle w:val="BodyText"/>
-      </w:pPr>
-      <w:r>
-        <w:t xml:space="preserve">이 논문에서 discovery bottleneck은 바로 이러한 구분을 포착하기 위한 조작적 개념이다. 문헌은 학술적으로 존재하고 한 학술공간에서 이미 이용되고 있어도 특정 검색환경에서 후보로 나타나지 않을 수 있으며, 검색단계에 진입하더라도 최종 출처로 선택되지 않을 수 있다. 이 개념은 검색기술이 국제적 지식 불평등을 단독으로 발생시킨다는 주장이 아니다. 한국 정치학처럼 한국어권과 영어권에 병렬적인 연구축적이 존재하는 경우, 어떤 문헌이 생산되고 인용되는가와 함께 어떤 문헌이 실제 검색환경에서 가시화되는가를 별도의 국제적 가시성의 차원으로 분석할 필요가 있다는 주장이다.</w:t>
-      </w:r>
-    </w:p>
-    <w:p>
-      <w:pPr>
-        <w:pStyle w:val="BodyText"/>
-      </w:pPr>
-      <w:r>
-        <w:t xml:space="preserve">이 점에서 본 연구는 국제적 가시성을 최종 인용의 결과만으로 보지 않고, 문헌이 평가대상이 되기 전의 검색단계까지 분석범위를 확장한다. 한국어권에서 축적된 지식과 특정 검색환경이 실제로 보여주는 지식 사이의 차이를 측정하는 것은, 국제 정치학에서 어떤 연구가 실질적으로 발견 가능한 scholarly record가 되는지를 이해하기 위한 추가적인 분석축을 제공한다.</w:t>
-      </w:r>
-    </w:p>
-    <w:bookmarkEnd w:id="43"/>
-    <w:bookmarkStart w:id="44" w:name="한계"/>
-    <w:p>
-      <w:pPr>
-        <w:pStyle w:val="Heading1"/>
-      </w:pPr>
-      <w:r>
-        <w:t xml:space="preserve">7. 한계</w:t>
-      </w:r>
-    </w:p>
-    <w:p>
-      <w:pPr>
-        <w:pStyle w:val="FirstParagraph"/>
-      </w:pPr>
-      <w:r>
-        <w:t xml:space="preserve">Study 1의 가장 중요한 한계는 2026년에 관찰한 Google Scholar 환경과 과거 영어권 인용이 발생할 당시의 검색환경이 동일하지 않다는 점이다. 각 target이 언제 Google Scholar에 처음 포함되었는지, 어느 시점부터 현재와 같은 제목으로 검색 가능했는지, 또는 당시 어떤 full-text link가 제공되었는지는 알 수 없다. 과거 연구자들이 실제로 Google Scholar를 통해 해당 문헌을 발견했는지도 관찰하지 않는다. 연구자들은 Web of Science, 도서관 데이터베이스, 참고문헌 추적, 학술지 browsing, 동료 추천 등 다양한 경로를 사용할 수 있었으므로 현재 retrievability를 과거의 실제 discovery opportunity와 동일시할 수 없다.</w:t>
-      </w:r>
-    </w:p>
-    <w:p>
-      <w:pPr>
-        <w:pStyle w:val="BodyText"/>
-      </w:pPr>
-      <w:r>
-        <w:t xml:space="preserve">Citation cohort는 이 문제를 해결하기 위한 historical indexing proxy가 아니다. 그 목적은 현재 retrievability에 따른 영어권 인용격차가 서로 다른 기간에 어떻게 나타났는지를 비교하는 데 있다. Pre-2005 restriction 역시 historical search environment를 복원하지 않는다. 이 분석은 늦게 출판된 target이 초기 cohort에 기여하지 못해 발생하는 eligible-target composition의 변화를 줄이고, 네 기간 모두에서 비교 가능한 보다 일정한 target set에서도 결과가 나타나는지를 점검하기 위한 것이다.</w:t>
-      </w:r>
-    </w:p>
-    <w:p>
-      <w:pPr>
-        <w:pStyle w:val="BodyText"/>
-      </w:pPr>
-      <w:r>
-        <w:t xml:space="preserve">현재 Google Scholar retrievability 자체가 이전 scholarly circulation과 관련되어 있을 가능성도 남는다. 널리 인용되거나 웹에 더 많이 노출된 논문이 이후 Google Scholar에서 검색되기 쉬워졌을 수 있다. Target fixed effects는 시간불변의 paper characteristic을 흡수하지만 이러한 temporal ordering이나 time-varying process를 제거하지 못한다. 따라서 Study 1의 결과는 현재 retrievability와 historical citation trajectory의 association으로 제한하여 해석한다.</w:t>
-      </w:r>
-    </w:p>
-    <w:p>
-      <w:pPr>
-        <w:pStyle w:val="BodyText"/>
-      </w:pPr>
-      <w:r>
-        <w:t xml:space="preserve">Study 1의 검색가능성에는 bibliographic matching error의 가능성도 있다. 한국어·영어 제목과 reference-title variant를 사용했지만 metadata의 오기, 제목 변형, 중복 record 또는 불완전한 indexing 때문에 실제 존재하는 record를 놓치거나 잘못 연결했을 수 있다. 따라서 (D_j)는 Google Scholar 전체 coverage의 완전한 측정이 아니라 본 연구의 검색·매칭 절차에서 확인된 현재 상태이다.</w:t>
-      </w:r>
-    </w:p>
-    <w:p>
-      <w:pPr>
-        <w:pStyle w:val="BodyText"/>
-      </w:pPr>
-      <w:r>
-        <w:t xml:space="preserve">Study 1의 결과는 specification에 따라서도 강도가 달라진다. Main incidence model과 pre-2005 restriction에서는 C2와 C3의 gap 확대가 나타나지만 일부 Poisson 및 추가-control specification에서는 결과가 더 불확실하다. 따라서 모든 outcome과 functional form에서 동일한 패턴이 확인되었다고 일반화할 수 없다. 현재 full-text access 분석 역시 Google Scholar visibility에 조건부이며 영어권 citation incidence와 유의한 관계를 보이지 않았다.</w:t>
-      </w:r>
-    </w:p>
-    <w:p>
-      <w:pPr>
-        <w:pStyle w:val="BodyText"/>
-      </w:pPr>
-      <w:r>
-        <w:t xml:space="preserve">Study 2는 두 개의 시스템, 다섯 개의 한국 정치 주제, 한 번의 collection period, 100편의 사전 지정 benchmark에 한정된다. 다섯 주제는 양 언어권에서 모두 연구되어 온 영역을 비교하기 위해 선정되었지만 한국 정치학 전체를 대표하는 확률표본은 아니다. Benchmark 역시 각 주제의 모든 relevant literature를 포괄하지 않으므로 낮은 benchmark recovery가 benchmark 밖의 recommendation이 관련성 없음을 의미하지 않는다.</w:t>
-      </w:r>
-    </w:p>
-    <w:p>
-      <w:pPr>
-        <w:pStyle w:val="BodyText"/>
-      </w:pPr>
-      <w:r>
-        <w:t xml:space="preserve">Benchmark 선정이 citation count와 두 출처의 공통 상위문헌에 의존한다는 점도 범위를 제한한다. 이 절차는 각 언어권에서 이미 비교적 가시적인 문헌을 중심으로 안정적인 evaluation set을 만들지만, 최근 연구·저인용 연구·전문 주제의 문헌을 충분히 대표하지 못할 수 있다. 따라서 recovery는 한국 정치학 전체에 대한 recall이 아니라 사전에 정한 benchmark에 대한 회수율이다.</w:t>
-      </w:r>
-    </w:p>
-    <w:p>
-      <w:pPr>
-        <w:pStyle w:val="BodyText"/>
-      </w:pPr>
-      <w:r>
-        <w:t xml:space="preserve">생성형 검색환경은 지속적으로 변한다. 동일한 model name 아래에서도 underlying model, search index, ranking procedure 또는 provider interface가 달라질 수 있으므로 Study 2는 수집시점의 behavior를 측정한다. 또한 provider가 외부에 노출하는 trace의 범위가 다르기 때문에 observable search trace를 시스템 내부의 전체 retrieval process와 동일시할 수 없다.</w:t>
-      </w:r>
-    </w:p>
-    <w:p>
-      <w:pPr>
-        <w:pStyle w:val="BodyText"/>
-      </w:pPr>
-      <w:r>
-        <w:t xml:space="preserve">Accessible-link outcome은 특히 baseline에서 희소하다. Retrieval과 recommendation 자체가 낮기 때문에 access 단계에는 강한 floor가 존재한다. 따라서 한국어와 영어 사이에 유의한 access gap이 발견되지 않았다는 결과를 두 언어 문헌의 접근성이 동일하다는 증거로 해석해서는 안 된다.</w:t>
-      </w:r>
-    </w:p>
-    <w:p>
-      <w:pPr>
-        <w:pStyle w:val="BodyText"/>
-      </w:pPr>
-      <w:r>
-        <w:t xml:space="preserve">Link audit은 시스템이 실제 제공한 URL만 평가한다. Paywall, abstract-only page 또는 broken link로 분류된 논문이 인터넷의 다른 위치에서도 이용 불가능하다는 의미는 아니다. Hallucination event 역시 적고 특정 experimental cell에 집중되어 있어 system-level 특성으로 일반화하기 어렵다.</w:t>
-      </w:r>
-    </w:p>
-    <w:p>
-      <w:pPr>
-        <w:pStyle w:val="BodyText"/>
-      </w:pPr>
-      <w:r>
-        <w:t xml:space="preserve">마지막으로 두 Study 모두 문헌이 가시화된 이후 연구자가 실제로 무엇을 하는지는 관찰하지 않는다. 검색결과의 클릭, 원문의 열람, substantive relevance 평가, 언어능력, perceived quality, citation norm, collaboration network 및 publication venue 등은 후속 이용과 인용에 영향을 줄 수 있다. 따라서 본 논문의 증거는 전체적인 지식순환 과정이 아니라 검색환경에서의 paper-level visibility, source selection, 그리고 access through provided links에 한정된다.</w:t>
-      </w:r>
-    </w:p>
-    <w:bookmarkEnd w:id="44"/>
-    <w:bookmarkStart w:id="45" w:name="references"/>
+    <w:bookmarkStart w:id="42" w:name="references"/>
     <w:p>
       <w:pPr>
         <w:pStyle w:val="Heading1"/>
@@ -4291,7 +5470,7 @@
         <w:t xml:space="preserve">20(3): 1024–1039. https://doi.org/10.1017/S1537592720002509.</w:t>
       </w:r>
     </w:p>
-    <w:bookmarkEnd w:id="45"/>
+    <w:bookmarkEnd w:id="42"/>
     <w:sectPr/>
   </w:body>
 </w:document>
@@ -5131,7 +6310,7 @@
       <w:color w:themeColor="accent1" w:themeShade="BF" w:val="365F91"/>
     </w:rPr>
   </w:style>
-  <w:style w:type="paragraph" w:customStyle="1" w:styleId="SourceCode">
+  <w:style w:customStyle="1" w:styleId="SourceCode" w:type="paragraph">
     <w:name w:val="Source Code"/>
     <w:basedOn w:val="Normal"/>
     <w:link w:val="VerbatimChar"/>
@@ -5139,7 +6318,7 @@
       <w:wordWrap w:val="off"/>
     </w:pPr>
   </w:style>
-  <w:style w:type="character" w:customStyle="1" w:styleId="KeywordTok">
+  <w:style w:customStyle="1" w:styleId="KeywordTok" w:type="character">
     <w:name w:val="KeywordTok"/>
     <w:basedOn w:val="VerbatimChar"/>
     <w:rPr>
@@ -5147,77 +6326,77 @@
       <w:b/>
     </w:rPr>
   </w:style>
-  <w:style w:type="character" w:customStyle="1" w:styleId="DataTypeTok">
+  <w:style w:customStyle="1" w:styleId="DataTypeTok" w:type="character">
     <w:name w:val="DataTypeTok"/>
     <w:basedOn w:val="VerbatimChar"/>
     <w:rPr>
       <w:color w:val="902000"/>
     </w:rPr>
   </w:style>
-  <w:style w:type="character" w:customStyle="1" w:styleId="DecValTok">
+  <w:style w:customStyle="1" w:styleId="DecValTok" w:type="character">
     <w:name w:val="DecValTok"/>
     <w:basedOn w:val="VerbatimChar"/>
     <w:rPr>
       <w:color w:val="40a070"/>
     </w:rPr>
   </w:style>
-  <w:style w:type="character" w:customStyle="1" w:styleId="BaseNTok">
+  <w:style w:customStyle="1" w:styleId="BaseNTok" w:type="character">
     <w:name w:val="BaseNTok"/>
     <w:basedOn w:val="VerbatimChar"/>
     <w:rPr>
       <w:color w:val="40a070"/>
     </w:rPr>
   </w:style>
-  <w:style w:type="character" w:customStyle="1" w:styleId="FloatTok">
+  <w:style w:customStyle="1" w:styleId="FloatTok" w:type="character">
     <w:name w:val="FloatTok"/>
     <w:basedOn w:val="VerbatimChar"/>
     <w:rPr>
       <w:color w:val="40a070"/>
     </w:rPr>
   </w:style>
-  <w:style w:type="character" w:customStyle="1" w:styleId="ConstantTok">
+  <w:style w:customStyle="1" w:styleId="ConstantTok" w:type="character">
     <w:name w:val="ConstantTok"/>
     <w:basedOn w:val="VerbatimChar"/>
     <w:rPr>
       <w:color w:val="880000"/>
     </w:rPr>
   </w:style>
-  <w:style w:type="character" w:customStyle="1" w:styleId="CharTok">
+  <w:style w:customStyle="1" w:styleId="CharTok" w:type="character">
     <w:name w:val="CharTok"/>
     <w:basedOn w:val="VerbatimChar"/>
     <w:rPr>
       <w:color w:val="4070a0"/>
     </w:rPr>
   </w:style>
-  <w:style w:type="character" w:customStyle="1" w:styleId="SpecialCharTok">
+  <w:style w:customStyle="1" w:styleId="SpecialCharTok" w:type="character">
     <w:name w:val="SpecialCharTok"/>
     <w:basedOn w:val="VerbatimChar"/>
     <w:rPr>
       <w:color w:val="4070a0"/>
     </w:rPr>
   </w:style>
-  <w:style w:type="character" w:customStyle="1" w:styleId="StringTok">
+  <w:style w:customStyle="1" w:styleId="StringTok" w:type="character">
     <w:name w:val="StringTok"/>
     <w:basedOn w:val="VerbatimChar"/>
     <w:rPr>
       <w:color w:val="4070a0"/>
     </w:rPr>
   </w:style>
-  <w:style w:type="character" w:customStyle="1" w:styleId="VerbatimStringTok">
+  <w:style w:customStyle="1" w:styleId="VerbatimStringTok" w:type="character">
     <w:name w:val="VerbatimStringTok"/>
     <w:basedOn w:val="VerbatimChar"/>
     <w:rPr>
       <w:color w:val="4070a0"/>
     </w:rPr>
   </w:style>
-  <w:style w:type="character" w:customStyle="1" w:styleId="SpecialStringTok">
+  <w:style w:customStyle="1" w:styleId="SpecialStringTok" w:type="character">
     <w:name w:val="SpecialStringTok"/>
     <w:basedOn w:val="VerbatimChar"/>
     <w:rPr>
       <w:color w:val="bb6688"/>
     </w:rPr>
   </w:style>
-  <w:style w:type="character" w:customStyle="1" w:styleId="ImportTok">
+  <w:style w:customStyle="1" w:styleId="ImportTok" w:type="character">
     <w:name w:val="ImportTok"/>
     <w:basedOn w:val="VerbatimChar"/>
     <w:rPr>
@@ -5225,7 +6404,7 @@
       <w:b/>
     </w:rPr>
   </w:style>
-  <w:style w:type="character" w:customStyle="1" w:styleId="CommentTok">
+  <w:style w:customStyle="1" w:styleId="CommentTok" w:type="character">
     <w:name w:val="CommentTok"/>
     <w:basedOn w:val="VerbatimChar"/>
     <w:rPr>
@@ -5233,7 +6412,7 @@
       <w:i/>
     </w:rPr>
   </w:style>
-  <w:style w:type="character" w:customStyle="1" w:styleId="DocumentationTok">
+  <w:style w:customStyle="1" w:styleId="DocumentationTok" w:type="character">
     <w:name w:val="DocumentationTok"/>
     <w:basedOn w:val="VerbatimChar"/>
     <w:rPr>
@@ -5241,7 +6420,7 @@
       <w:i/>
     </w:rPr>
   </w:style>
-  <w:style w:type="character" w:customStyle="1" w:styleId="AnnotationTok">
+  <w:style w:customStyle="1" w:styleId="AnnotationTok" w:type="character">
     <w:name w:val="AnnotationTok"/>
     <w:basedOn w:val="VerbatimChar"/>
     <w:rPr>
@@ -5250,7 +6429,7 @@
       <w:i/>
     </w:rPr>
   </w:style>
-  <w:style w:type="character" w:customStyle="1" w:styleId="CommentVarTok">
+  <w:style w:customStyle="1" w:styleId="CommentVarTok" w:type="character">
     <w:name w:val="CommentVarTok"/>
     <w:basedOn w:val="VerbatimChar"/>
     <w:rPr>
@@ -5259,28 +6438,28 @@
       <w:i/>
     </w:rPr>
   </w:style>
-  <w:style w:type="character" w:customStyle="1" w:styleId="OtherTok">
+  <w:style w:customStyle="1" w:styleId="OtherTok" w:type="character">
     <w:name w:val="OtherTok"/>
     <w:basedOn w:val="VerbatimChar"/>
     <w:rPr>
       <w:color w:val="007020"/>
     </w:rPr>
   </w:style>
-  <w:style w:type="character" w:customStyle="1" w:styleId="FunctionTok">
+  <w:style w:customStyle="1" w:styleId="FunctionTok" w:type="character">
     <w:name w:val="FunctionTok"/>
     <w:basedOn w:val="VerbatimChar"/>
     <w:rPr>
       <w:color w:val="06287e"/>
     </w:rPr>
   </w:style>
-  <w:style w:type="character" w:customStyle="1" w:styleId="VariableTok">
+  <w:style w:customStyle="1" w:styleId="VariableTok" w:type="character">
     <w:name w:val="VariableTok"/>
     <w:basedOn w:val="VerbatimChar"/>
     <w:rPr>
       <w:color w:val="19177c"/>
     </w:rPr>
   </w:style>
-  <w:style w:type="character" w:customStyle="1" w:styleId="ControlFlowTok">
+  <w:style w:customStyle="1" w:styleId="ControlFlowTok" w:type="character">
     <w:name w:val="ControlFlowTok"/>
     <w:basedOn w:val="VerbatimChar"/>
     <w:rPr>
@@ -5288,45 +6467,45 @@
       <w:b/>
     </w:rPr>
   </w:style>
-  <w:style w:type="character" w:customStyle="1" w:styleId="OperatorTok">
+  <w:style w:customStyle="1" w:styleId="OperatorTok" w:type="character">
     <w:name w:val="OperatorTok"/>
     <w:basedOn w:val="VerbatimChar"/>
     <w:rPr>
       <w:color w:val="666666"/>
     </w:rPr>
   </w:style>
-  <w:style w:type="character" w:customStyle="1" w:styleId="BuiltInTok">
+  <w:style w:customStyle="1" w:styleId="BuiltInTok" w:type="character">
     <w:name w:val="BuiltInTok"/>
     <w:basedOn w:val="VerbatimChar"/>
     <w:rPr>
       <w:color w:val="008000"/>
     </w:rPr>
   </w:style>
-  <w:style w:type="character" w:customStyle="1" w:styleId="ExtensionTok">
+  <w:style w:customStyle="1" w:styleId="ExtensionTok" w:type="character">
     <w:name w:val="ExtensionTok"/>
     <w:basedOn w:val="VerbatimChar"/>
     <w:rPr/>
   </w:style>
-  <w:style w:type="character" w:customStyle="1" w:styleId="PreprocessorTok">
+  <w:style w:customStyle="1" w:styleId="PreprocessorTok" w:type="character">
     <w:name w:val="PreprocessorTok"/>
     <w:basedOn w:val="VerbatimChar"/>
     <w:rPr>
       <w:color w:val="bc7a00"/>
     </w:rPr>
   </w:style>
-  <w:style w:type="character" w:customStyle="1" w:styleId="AttributeTok">
+  <w:style w:customStyle="1" w:styleId="AttributeTok" w:type="character">
     <w:name w:val="AttributeTok"/>
     <w:basedOn w:val="VerbatimChar"/>
     <w:rPr>
       <w:color w:val="7d9029"/>
     </w:rPr>
   </w:style>
-  <w:style w:type="character" w:customStyle="1" w:styleId="RegionMarkerTok">
+  <w:style w:customStyle="1" w:styleId="RegionMarkerTok" w:type="character">
     <w:name w:val="RegionMarkerTok"/>
     <w:basedOn w:val="VerbatimChar"/>
     <w:rPr/>
   </w:style>
-  <w:style w:type="character" w:customStyle="1" w:styleId="InformationTok">
+  <w:style w:customStyle="1" w:styleId="InformationTok" w:type="character">
     <w:name w:val="InformationTok"/>
     <w:basedOn w:val="VerbatimChar"/>
     <w:rPr>
@@ -5335,7 +6514,7 @@
       <w:i/>
     </w:rPr>
   </w:style>
-  <w:style w:type="character" w:customStyle="1" w:styleId="WarningTok">
+  <w:style w:customStyle="1" w:styleId="WarningTok" w:type="character">
     <w:name w:val="WarningTok"/>
     <w:basedOn w:val="VerbatimChar"/>
     <w:rPr>
@@ -5344,7 +6523,7 @@
       <w:i/>
     </w:rPr>
   </w:style>
-  <w:style w:type="character" w:customStyle="1" w:styleId="AlertTok">
+  <w:style w:customStyle="1" w:styleId="AlertTok" w:type="character">
     <w:name w:val="AlertTok"/>
     <w:basedOn w:val="VerbatimChar"/>
     <w:rPr>
@@ -5352,7 +6531,7 @@
       <w:b/>
     </w:rPr>
   </w:style>
-  <w:style w:type="character" w:customStyle="1" w:styleId="ErrorTok">
+  <w:style w:customStyle="1" w:styleId="ErrorTok" w:type="character">
     <w:name w:val="ErrorTok"/>
     <w:basedOn w:val="VerbatimChar"/>
     <w:rPr>
@@ -5360,7 +6539,7 @@
       <w:b/>
     </w:rPr>
   </w:style>
-  <w:style w:type="character" w:customStyle="1" w:styleId="NormalTok">
+  <w:style w:customStyle="1" w:styleId="NormalTok" w:type="character">
     <w:name w:val="NormalTok"/>
     <w:basedOn w:val="VerbatimChar"/>
     <w:rPr/>

</xml_diff>

<commit_message>
Remove body bold formatting from manuscripts
</commit_message>
<xml_diff>
--- a/manuscript/discovery_bottleneck_combined.docx
+++ b/manuscript/discovery_bottleneck_combined.docx
@@ -160,215 +160,39 @@
         <w:pStyle w:val="FirstParagraph"/>
       </w:pPr>
       <w:r>
-        <w:t xml:space="preserve">한국 정치에 관한 연구는 한국어권과 영어권의 구분된 학술공간에서 생산·유통되며, 두 공간에서 축적된 연구가 국제적으로 가시화되고 인용되는 범위도 동일하지 않다(Rhee 2026; Kim et al. 2025). 본 논문은 이러한 차이의 한 측면을</w:t>
-      </w:r>
-      <w:r>
-        <w:t xml:space="preserve"> </w:t>
-      </w:r>
-      <w:r>
-        <w:rPr>
-          <w:bCs/>
-          <w:b/>
-        </w:rPr>
-        <w:t xml:space="preserve">학술검색 환경에서의 문헌 가시성</w:t>
-      </w:r>
-      <w:r>
-        <w:t xml:space="preserve">에서 분석한다. 연구자가 선행연구를 탐색할 때 검색환경을 이용해 검토할 문헌을 구성한다는 점에서, 어떤 연구가 학술적으로 존재하는가와 실제 검색과정에서 어떤 연구가 후보 문헌으로 나타나는가는 구분될 수 있다. 본 연구는 한국어권에서 이미 사용되거나 주요 문헌으로 확인된 한국 정치 연구가 Google Scholar와 생성형 검색에서 어떻게 가시화되는지를 분석하고, 검색환경이 제공하는 링크를 통한 원문 접근을 별도의 결과로 살펴본다.</w:t>
-      </w:r>
-    </w:p>
-    <w:p>
-      <w:pPr>
-        <w:pStyle w:val="BodyText"/>
-      </w:pPr>
-      <w:r>
-        <w:rPr>
-          <w:bCs/>
-          <w:b/>
-        </w:rPr>
-        <w:t xml:space="preserve">Study 1</w:t>
-      </w:r>
-      <w:r>
-        <w:t xml:space="preserve">은 2000–2025년에 생산된 한국어권 정치학 논문들이 인용한 한국 정치 관련 논문 54,789편을 대상으로,</w:t>
-      </w:r>
-      <w:r>
-        <w:t xml:space="preserve"> </w:t>
-      </w:r>
-      <w:r>
-        <w:rPr>
-          <w:bCs/>
-          <w:b/>
-        </w:rPr>
-        <w:t xml:space="preserve">2026년 현재 Google Scholar index presence</w:t>
-      </w:r>
-      <w:r>
-        <w:t xml:space="preserve">와 영어권 인용확률의 시기별 관계를 분석한다. 현재 Google Scholar에서 bibliographic record가 확인된 논문과 확인되지 않은 논문 사이의 영어권 인용확률 격차는 2009년까지의 기준기간에 비해 2010–2014년에</w:t>
-      </w:r>
-      <w:r>
-        <w:t xml:space="preserve"> </w:t>
-      </w:r>
-      <w:r>
-        <w:rPr>
-          <w:bCs/>
-          <w:b/>
-        </w:rPr>
-        <w:t xml:space="preserve">0.405퍼센트포인트(pp)</w:t>
-      </w:r>
-      <w:r>
-        <w:t xml:space="preserve">, 2015–2019년에</w:t>
-      </w:r>
-      <w:r>
-        <w:t xml:space="preserve"> </w:t>
-      </w:r>
-      <w:r>
-        <w:rPr>
-          <w:bCs/>
-          <w:b/>
-        </w:rPr>
-        <w:t xml:space="preserve">0.696pp</w:t>
-      </w:r>
-      <w:r>
-        <w:t xml:space="preserve"> </w:t>
-      </w:r>
-      <w:r>
-        <w:t xml:space="preserve">유의하게 더 컸으나 2020–2024년에는 추가 확대되지 않았다. 현재 Google Scholar가 제공하는 링크를 통한 원문 접근은 index presence가 확인된 논문들 사이에서 영어권 인용확률과 유의한 관계를 보이지 않았다. 이 결과는 현재 Google Scholar index presence와 과거 영어권 인용궤적 사이의 연관성이며 Google Scholar의 인과효과를 의미하지 않는다.</w:t>
-      </w:r>
-    </w:p>
-    <w:p>
-      <w:pPr>
-        <w:pStyle w:val="BodyText"/>
-      </w:pPr>
-      <w:r>
-        <w:rPr>
-          <w:bCs/>
-          <w:b/>
-        </w:rPr>
-        <w:t xml:space="preserve">Study 2</w:t>
-      </w:r>
-      <w:r>
-        <w:t xml:space="preserve">는 한국어권과 영어권에서 모두 연구되어 온 다섯 개의 한국 정치 주제에서 사전에 선정한 한국어 논문 50편과 영어 논문 50편을 기준으로 두 개의 web-enabled generative search system을 감사한다. 영어 질의와 일반 웹검색을 사용한 baseline에서는 한국어 benchmark가 관찰 가능한 검색흔적과 최종 추천에서 모두 회수되지 않은 반면 영어 benchmark는 각각</w:t>
-      </w:r>
-      <w:r>
-        <w:t xml:space="preserve"> </w:t>
-      </w:r>
-      <w:r>
-        <w:rPr>
-          <w:bCs/>
-          <w:b/>
-        </w:rPr>
-        <w:t xml:space="preserve">3.4%와 3.2%</w:t>
-      </w:r>
-      <w:r>
-        <w:t xml:space="preserve"> </w:t>
-      </w:r>
-      <w:r>
-        <w:t xml:space="preserve">회수되었다. 한국어 질의와 한국 학술 데이터베이스 검색 지시를 함께 적용하면 한국어–영어 격차는 검색에서</w:t>
-      </w:r>
-      <w:r>
-        <w:t xml:space="preserve"> </w:t>
-      </w:r>
-      <w:r>
-        <w:rPr>
-          <w:bCs/>
-          <w:b/>
-        </w:rPr>
-        <w:t xml:space="preserve">5.6pp</w:t>
-      </w:r>
-      <w:r>
-        <w:t xml:space="preserve">, 추천에서</w:t>
-      </w:r>
-      <w:r>
-        <w:t xml:space="preserve"> </w:t>
-      </w:r>
-      <w:r>
-        <w:rPr>
-          <w:bCs/>
-          <w:b/>
-        </w:rPr>
-        <w:t xml:space="preserve">6.4pp</w:t>
-      </w:r>
-      <w:r>
-        <w:t xml:space="preserve"> </w:t>
-      </w:r>
-      <w:r>
-        <w:t xml:space="preserve">축소되었지만, 한국어 benchmark의 최종 추천 회수율은</w:t>
-      </w:r>
-      <w:r>
-        <w:t xml:space="preserve"> </w:t>
-      </w:r>
-      <w:r>
-        <w:rPr>
-          <w:bCs/>
-          <w:b/>
-        </w:rPr>
-        <w:t xml:space="preserve">3.2%</w:t>
-      </w:r>
-      <w:r>
-        <w:t xml:space="preserve">에 머물렀다. 전체 추천의</w:t>
-      </w:r>
-      <w:r>
-        <w:t xml:space="preserve"> </w:t>
-      </w:r>
-      <w:r>
-        <w:rPr>
-          <w:bCs/>
-          <w:b/>
-        </w:rPr>
-        <w:t xml:space="preserve">44.2%</w:t>
-      </w:r>
-      <w:r>
-        <w:t xml:space="preserve">만 제공된 링크를 통해 원문에 직접 접근할 수 있었으며, 원문 접근에서는 유의한 언어격차가 확인되지 않았다.</w:t>
-      </w:r>
-    </w:p>
-    <w:p>
-      <w:pPr>
-        <w:pStyle w:val="BodyText"/>
-      </w:pPr>
-      <w:r>
-        <w:t xml:space="preserve">두 연구는 한국 정치 연구의 국제적 가시성을 출판과 인용만으로 파악하기보다</w:t>
-      </w:r>
-      <w:r>
-        <w:t xml:space="preserve"> </w:t>
-      </w:r>
-      <w:r>
-        <w:rPr>
-          <w:bCs/>
-          <w:b/>
-        </w:rPr>
-        <w:t xml:space="preserve">어떤 문헌이 학술검색에서 실제 검토 가능한 후보로 나타나고 최종 출처로 선택되는가</w:t>
-      </w:r>
-      <w:r>
-        <w:t xml:space="preserve">를 함께 분석할 필요가 있음을 보여준다. 특히 생성형 검색에서 한국어 논문이 많이 제시된다고 해서 한국어권에서 축적된 주요 연구가 그만큼 충실하게 반영되었다고 볼 수는 없다. 본 논문은 문헌이 내용에 대한 실질적 평가를 받기 전에 검색 또는 최종 출처 선택의 관찰 가능한 단계에서 가시성을 잃는 현상을</w:t>
-      </w:r>
-      <w:r>
-        <w:t xml:space="preserve"> </w:t>
-      </w:r>
-      <w:r>
-        <w:rPr>
-          <w:bCs/>
-          <w:b/>
-        </w:rPr>
-        <w:t xml:space="preserve">discovery bottleneck</w:t>
-      </w:r>
-      <w:r>
-        <w:t xml:space="preserve">이라는 조작적 개념으로 제시한다.</w:t>
-      </w:r>
-    </w:p>
-    <w:p>
-      <w:pPr>
-        <w:pStyle w:val="BodyText"/>
-      </w:pPr>
-      <w:r>
-        <w:rPr>
-          <w:bCs/>
-          <w:b/>
-        </w:rPr>
-        <w:t xml:space="preserve">Keywords:</w:t>
-      </w:r>
-      <w:r>
-        <w:t xml:space="preserve"> </w:t>
-      </w:r>
-      <w:r>
-        <w:t xml:space="preserve">한국 정치학; 한국 정치 연구; 학술검색; Google Scholar; 생성형 검색; 비영어권 학술문헌; 국제적 가시성; 원문 접근; discovery bottleneck</w:t>
+        <w:t xml:space="preserve">한국 정치에 관한 연구는 한국어권과 영어권의 구분된 학술공간에서 생산·유통되며, 두 공간에서 축적된 연구가 국제적으로 가시화되고 인용되는 범위도 동일하지 않다(Rhee 2026; Kim et al. 2025). 본 논문은 이러한 차이의 한 측면을 학술검색 환경에서의 문헌 가시성에서 분석한다. 연구자가 선행연구를 탐색할 때 검색환경을 이용해 검토할 문헌을 구성한다는 점에서, 어떤 연구가 학술적으로 존재하는가와 실제 검색과정에서 어떤 연구가 후보 문헌으로 나타나는가는 구분될 수 있다. 본 연구는 한국어권에서 이미 사용되거나 주요 문헌으로 확인된 한국 정치 연구가 Google Scholar와 생성형 검색에서 어떻게 가시화되는지를 분석하고, 검색환경이 제공하는 링크를 통한 원문 접근을 별도의 결과로 살펴본다.</w:t>
+      </w:r>
+    </w:p>
+    <w:p>
+      <w:pPr>
+        <w:pStyle w:val="BodyText"/>
+      </w:pPr>
+      <w:r>
+        <w:t xml:space="preserve">Study 1은 2000–2025년에 생산된 한국어권 정치학 논문들이 인용한 한국 정치 관련 논문 54,789편을 대상으로, 2026년 현재 Google Scholar index presence와 영어권 인용확률의 시기별 관계를 분석한다. 현재 Google Scholar에서 bibliographic record가 확인된 논문과 확인되지 않은 논문 사이의 영어권 인용확률 격차는 2009년까지의 기준기간에 비해 2010–2014년에 0.405퍼센트포인트(pp), 2015–2019년에 0.696pp 유의하게 더 컸으나 2020–2024년에는 추가 확대되지 않았다. 현재 Google Scholar가 제공하는 링크를 통한 원문 접근은 index presence가 확인된 논문들 사이에서 영어권 인용확률과 유의한 관계를 보이지 않았다. 이 결과는 현재 Google Scholar index presence와 과거 영어권 인용궤적 사이의 연관성이며 Google Scholar의 인과효과를 의미하지 않는다.</w:t>
+      </w:r>
+    </w:p>
+    <w:p>
+      <w:pPr>
+        <w:pStyle w:val="BodyText"/>
+      </w:pPr>
+      <w:r>
+        <w:t xml:space="preserve">Study 2는 한국어권과 영어권에서 모두 연구되어 온 다섯 개의 한국 정치 주제에서 사전에 선정한 한국어 논문 50편과 영어 논문 50편을 기준으로 두 개의 web-enabled generative search system을 감사한다. 영어 질의와 일반 웹검색을 사용한 baseline에서는 한국어 benchmark가 관찰 가능한 검색흔적과 최종 추천에서 모두 회수되지 않은 반면 영어 benchmark는 각각 3.4%와 3.2% 회수되었다. 한국어 질의와 한국 학술 데이터베이스 검색 지시를 함께 적용하면 한국어–영어 격차는 검색에서 5.6pp, 추천에서 6.4pp 축소되었지만, 한국어 benchmark의 최종 추천 회수율은 3.2%에 머물렀다. 전체 추천의 44.2%만 제공된 링크를 통해 원문에 직접 접근할 수 있었으며, 원문 접근에서는 유의한 언어격차가 확인되지 않았다.</w:t>
+      </w:r>
+    </w:p>
+    <w:p>
+      <w:pPr>
+        <w:pStyle w:val="BodyText"/>
+      </w:pPr>
+      <w:r>
+        <w:t xml:space="preserve">두 연구는 한국 정치 연구의 국제적 가시성을 출판과 인용만으로 파악하기보다 어떤 문헌이 학술검색에서 실제 검토 가능한 후보로 나타나고 최종 출처로 선택되는가를 함께 분석할 필요가 있음을 보여준다. 특히 생성형 검색에서 한국어 논문이 많이 제시된다고 해서 한국어권에서 축적된 주요 연구가 그만큼 충실하게 반영되었다고 볼 수는 없다. 본 논문은 문헌이 내용에 대한 실질적 평가를 받기 전에 검색 또는 최종 출처 선택의 관찰 가능한 단계에서 가시성을 잃는 현상을 discovery bottleneck이라는 조작적 개념으로 제시한다.</w:t>
+      </w:r>
+    </w:p>
+    <w:p>
+      <w:pPr>
+        <w:pStyle w:val="BodyText"/>
+      </w:pPr>
+      <w:r>
+        <w:t xml:space="preserve">Keywords: 한국 정치학; 한국 정치 연구; 학술검색; Google Scholar; 생성형 검색; 비영어권 학술문헌; 국제적 가시성; 원문 접근; discovery bottleneck</w:t>
       </w:r>
     </w:p>
     <w:bookmarkEnd w:id="20"/>
@@ -414,111 +238,39 @@
         <w:pStyle w:val="BodyText"/>
       </w:pPr>
       <w:r>
-        <w:t xml:space="preserve">본 논문은 이 차이를</w:t>
-      </w:r>
-      <w:r>
-        <w:t xml:space="preserve"> </w:t>
-      </w:r>
-      <w:r>
-        <w:rPr>
-          <w:bCs/>
-          <w:b/>
-        </w:rPr>
-        <w:t xml:space="preserve">학술검색 환경에서의 문헌 가시성</w:t>
-      </w:r>
-      <w:r>
-        <w:t xml:space="preserve">이라는 차원에서 분석한다. 연구자는 선행연구를 파악하고 연구질문을 위치시키기 위해 검색과정을 거쳐 검토할 문헌을 구성한다. 따라서 어떤 논문이 출판되어 존재하거나 특정 데이터베이스의 전체 coverage 안에 포함되는 것과, 특정 검색환경에서 개별 문헌이 실제로 연구자의 검토대상으로 나타나는 것은 동일하지 않다. 정보검색 연구가 데이터베이스 수준의 coverage와 개별 문헌의 retrievability를 구분해 온 것도 이러한 차이와 관련된다(Azzopardi and Vinay 2008). 본 연구는 이 구분을 한국 정치 연구의 국제적 가시성에 적용한다.</w:t>
-      </w:r>
-    </w:p>
-    <w:p>
-      <w:pPr>
-        <w:pStyle w:val="BodyText"/>
-      </w:pPr>
-      <w:r>
-        <w:rPr>
-          <w:bCs/>
-          <w:b/>
-        </w:rPr>
-        <w:t xml:space="preserve">Study 1은 현재 Google Scholar에 개별 논문의 bibliographic record가 인덱스되어 검색되는지와 영어권 인용의 시기별 관계를 분석한다.</w:t>
-      </w:r>
-      <w:r>
-        <w:t xml:space="preserve"> </w:t>
-      </w:r>
-      <w:r>
-        <w:t xml:space="preserve">분석대상은 2000–2025년에 생산된 한국어권 정치학 논문에서 적어도 한 번 인용된 한국 정치 관련 문헌 54,789편이다. 따라서 모든 target paper는 한국어권에서 실제 학술적으로 사용된 기록을 갖는다. 이 공통된 문헌집합 안에서 현재 Google Scholar index presence가 확인되는 논문과 확인되지 않는 논문의 영어권 인용확률 격차가 시기에 따라 어떻게 나타나는지를 비교한다. Google Scholar 상태는 2026년에만 관찰되므로, 이 분석은 과거 Google Scholar indexing이 영어권 인용을 발생시켰는지를 추정하지 않는다.</w:t>
-      </w:r>
-    </w:p>
-    <w:p>
-      <w:pPr>
-        <w:pStyle w:val="BodyText"/>
-      </w:pPr>
-      <w:r>
-        <w:rPr>
-          <w:bCs/>
-          <w:b/>
-        </w:rPr>
-        <w:t xml:space="preserve">Study 2는 생성형 검색에서 개별 논문이 검색과정에 나타나는지와 그중 어떤 논문이 최종 출처로 제시되는지를 분석한다.</w:t>
-      </w:r>
-      <w:r>
-        <w:t xml:space="preserve"> </w:t>
-      </w:r>
-      <w:r>
-        <w:t xml:space="preserve">Web-enabled generative search는 외부 자료를 검색한 뒤 검색된 자료 전체를 그대로 사용자에게 반환하지 않고, 일부를 citation이나 recommendation으로 선택해 답변을 구성한다(Liu, Zhang, and Liang 2023; He et al. 2025). 따라서 사전에 정한 benchmark paper가 provider가 공개하는 search trace에서 확인되는 것과 최종 recommendation에 포함되는 것은 서로 다른 결과이다. Study 2는 한국어권과 영어권 모두에서 연구되어 온 동일한 한국 정치 주제를 대상으로 query language와 한국 학술 데이터베이스 검색 지시를 변화시키고, 한국어와 영어의 주요 문헌이 두 지점에서 어떻게 나타나는지를 비교한다.</w:t>
-      </w:r>
-    </w:p>
-    <w:p>
-      <w:pPr>
-        <w:pStyle w:val="BodyText"/>
-      </w:pPr>
-      <w:r>
-        <w:t xml:space="preserve">이 분석에서 중요한 것은 단순히 한국어 논문이 몇 편 제시되는가가 아니다.</w:t>
-      </w:r>
-      <w:r>
-        <w:t xml:space="preserve"> </w:t>
-      </w:r>
-      <w:r>
-        <w:rPr>
-          <w:bCs/>
-          <w:b/>
-        </w:rPr>
-        <w:t xml:space="preserve">한국어 논문이 많이 제시되는 것과 한국어권 정치학에서 축적된 주요 연구가 실제 검색결과에 반영되는 것은 다른 문제이다.</w:t>
-      </w:r>
-      <w:r>
-        <w:t xml:space="preserve"> </w:t>
-      </w:r>
-      <w:r>
-        <w:t xml:space="preserve">생성형 검색이 한국어 논문을 다수 추천하더라도, 검색 이전에 주요 문헌으로 정한 한국어 연구가 거의 포함되지 않을 수 있다. 따라서 Study 2는 최종 추천에서 한국어 논문이 차지하는 비율과 사전에 정한 한국어 benchmark가 실제로 검색·추천되는 정도를 구분한다.</w:t>
-      </w:r>
-    </w:p>
-    <w:p>
-      <w:pPr>
-        <w:pStyle w:val="BodyText"/>
-      </w:pPr>
-      <w:r>
-        <w:rPr>
-          <w:bCs/>
-          <w:b/>
-        </w:rPr>
-        <w:t xml:space="preserve">원문 접근 역시 문헌의 검색 가시성과 별도로 분석한다.</w:t>
-      </w:r>
-      <w:r>
-        <w:t xml:space="preserve"> </w:t>
-      </w:r>
-      <w:r>
-        <w:t xml:space="preserve">논문이 Google Scholar에 인덱스되어 있거나 생성형 검색에서 추천되더라도 제공된 URL이 paywall, abstract page 또는 broken link로 이어질 수 있다. 반대로 출판사 version은 유료이지만 repository나 저자 공개본을 통해 원문을 볼 수 있는 경우도 있다(Jamali and Nabavi 2015). 따라서 본 연구는 논문의 일반적인</w:t>
-      </w:r>
-      <w:r>
-        <w:t xml:space="preserve"> </w:t>
-      </w:r>
-      <w:r>
-        <w:rPr>
-          <w:bCs/>
-          <w:b/>
-        </w:rPr>
-        <w:t xml:space="preserve">오픈 액세스(open access, OA) 여부</w:t>
-      </w:r>
-      <w:r>
-        <w:t xml:space="preserve">를 측정하는 것이 아니라, 각 검색환경이 실제 제공한 링크가 로그인이나 결제 없이 full text로 연결되는지를 측정한다.</w:t>
+        <w:t xml:space="preserve">본 논문은 이 차이를 학술검색 환경에서의 문헌 가시성이라는 차원에서 분석한다. 연구자는 선행연구를 파악하고 연구질문을 위치시키기 위해 검색과정을 거쳐 검토할 문헌을 구성한다. 따라서 어떤 논문이 출판되어 존재하거나 특정 데이터베이스의 전체 coverage 안에 포함되는 것과, 특정 검색환경에서 개별 문헌이 실제로 연구자의 검토대상으로 나타나는 것은 동일하지 않다. 정보검색 연구가 데이터베이스 수준의 coverage와 개별 문헌의 retrievability를 구분해 온 것도 이러한 차이와 관련된다(Azzopardi and Vinay 2008). 본 연구는 이 구분을 한국 정치 연구의 국제적 가시성에 적용한다.</w:t>
+      </w:r>
+    </w:p>
+    <w:p>
+      <w:pPr>
+        <w:pStyle w:val="BodyText"/>
+      </w:pPr>
+      <w:r>
+        <w:t xml:space="preserve">Study 1은 현재 Google Scholar에 개별 논문의 bibliographic record가 인덱스되어 검색되는지와 영어권 인용의 시기별 관계를 분석한다. 분석대상은 2000–2025년에 생산된 한국어권 정치학 논문에서 적어도 한 번 인용된 한국 정치 관련 문헌 54,789편이다. 따라서 모든 target paper는 한국어권에서 실제 학술적으로 사용된 기록을 갖는다. 이 공통된 문헌집합 안에서 현재 Google Scholar index presence가 확인되는 논문과 확인되지 않는 논문의 영어권 인용확률 격차가 시기에 따라 어떻게 나타나는지를 비교한다. Google Scholar 상태는 2026년에만 관찰되므로, 이 분석은 과거 Google Scholar indexing이 영어권 인용을 발생시켰는지를 추정하지 않는다.</w:t>
+      </w:r>
+    </w:p>
+    <w:p>
+      <w:pPr>
+        <w:pStyle w:val="BodyText"/>
+      </w:pPr>
+      <w:r>
+        <w:t xml:space="preserve">Study 2는 생성형 검색에서 개별 논문이 검색과정에 나타나는지와 그중 어떤 논문이 최종 출처로 제시되는지를 분석한다. Web-enabled generative search는 외부 자료를 검색한 뒤 검색된 자료 전체를 그대로 사용자에게 반환하지 않고, 일부를 citation이나 recommendation으로 선택해 답변을 구성한다(Liu, Zhang, and Liang 2023; He et al. 2025). 따라서 사전에 정한 benchmark paper가 provider가 공개하는 search trace에서 확인되는 것과 최종 recommendation에 포함되는 것은 서로 다른 결과이다. Study 2는 한국어권과 영어권 모두에서 연구되어 온 동일한 한국 정치 주제를 대상으로 query language와 한국 학술 데이터베이스 검색 지시를 변화시키고, 한국어와 영어의 주요 문헌이 두 지점에서 어떻게 나타나는지를 비교한다.</w:t>
+      </w:r>
+    </w:p>
+    <w:p>
+      <w:pPr>
+        <w:pStyle w:val="BodyText"/>
+      </w:pPr>
+      <w:r>
+        <w:t xml:space="preserve">이 분석에서 중요한 것은 단순히 한국어 논문이 몇 편 제시되는가가 아니다. 한국어 논문이 많이 제시되는 것과 한국어권 정치학에서 축적된 주요 연구가 실제 검색결과에 반영되는 것은 다른 문제이다. 생성형 검색이 한국어 논문을 다수 추천하더라도, 검색 이전에 주요 문헌으로 정한 한국어 연구가 거의 포함되지 않을 수 있다. 따라서 Study 2는 최종 추천에서 한국어 논문이 차지하는 비율과 사전에 정한 한국어 benchmark가 실제로 검색·추천되는 정도를 구분한다.</w:t>
+      </w:r>
+    </w:p>
+    <w:p>
+      <w:pPr>
+        <w:pStyle w:val="BodyText"/>
+      </w:pPr>
+      <w:r>
+        <w:t xml:space="preserve">원문 접근 역시 문헌의 검색 가시성과 별도로 분석한다. 논문이 Google Scholar에 인덱스되어 있거나 생성형 검색에서 추천되더라도 제공된 URL이 paywall, abstract page 또는 broken link로 이어질 수 있다. 반대로 출판사 version은 유료이지만 repository나 저자 공개본을 통해 원문을 볼 수 있는 경우도 있다(Jamali and Nabavi 2015). 따라서 본 연구는 논문의 일반적인 오픈 액세스(open access, OA) 여부를 측정하는 것이 아니라, 각 검색환경이 실제 제공한 링크가 로그인이나 결제 없이 full text로 연결되는지를 측정한다.</w:t>
       </w:r>
     </w:p>
     <w:p>
@@ -541,75 +293,23 @@
         <w:t xml:space="preserve"> </w:t>
       </w:r>
       <w:r>
-        <w:t xml:space="preserve">인과과정을 구성하지 않는다. Study 1은 현재 Google Scholar index presence와 과거 영어권 인용궤적의 관계를 분석하고, Study 2는 현재 생성형 검색에서 한국어와 영어의 주요 문헌이 검색과 최종 출처 선택에서 어떻게 다르게 나타나는지를 직접 관찰한다. 분석설계와 시간적 범위는 다르지만 두 연구의 공통 질문은</w:t>
-      </w:r>
-      <w:r>
-        <w:t xml:space="preserve"> </w:t>
-      </w:r>
-      <w:r>
-        <w:rPr>
-          <w:bCs/>
-          <w:b/>
-        </w:rPr>
-        <w:t xml:space="preserve">한국어권에서 존재하고 실제 사용되는 연구 가운데 어떤 문헌이 국제적으로 이용되는 검색환경에서 검토 가능한 연구로 나타나는가</w:t>
-      </w:r>
-      <w:r>
-        <w:t xml:space="preserve">이다.</w:t>
-      </w:r>
-    </w:p>
-    <w:p>
-      <w:pPr>
-        <w:pStyle w:val="BodyText"/>
-      </w:pPr>
-      <w:r>
-        <w:t xml:space="preserve">본 논문은 문헌이 내용에 대한 실질적 평가를 받기 전에 검색 및 최종 출처 선택 과정에서 가시성을 잃는 현상을</w:t>
-      </w:r>
-      <w:r>
-        <w:t xml:space="preserve"> </w:t>
-      </w:r>
-      <w:r>
-        <w:rPr>
-          <w:bCs/>
-          <w:b/>
-        </w:rPr>
-        <w:t xml:space="preserve">discovery bottleneck</w:t>
-      </w:r>
-      <w:r>
-        <w:t xml:space="preserve">이라고 부른다. 이는 검색기술이 국제적 인용격차를 발생시키는 단일한 원인이라는 주장이 아니다. 특정 검색환경에서 문헌이 후보로 나타나지 않거나 검색과정에 등장했더라도 최종적으로 제시되는 출처에서 제외되는</w:t>
-      </w:r>
-      <w:r>
-        <w:t xml:space="preserve"> </w:t>
-      </w:r>
-      <w:r>
-        <w:rPr>
-          <w:bCs/>
-          <w:b/>
-        </w:rPr>
-        <w:t xml:space="preserve">관찰 가능한 누락</w:t>
-      </w:r>
-      <w:r>
-        <w:t xml:space="preserve">을 지칭하기 위한 조작적 개념이다.</w:t>
-      </w:r>
-    </w:p>
-    <w:p>
-      <w:pPr>
-        <w:pStyle w:val="BodyText"/>
-      </w:pPr>
-      <w:r>
-        <w:t xml:space="preserve">본 연구의 기여는 세 가지이다. 첫째, 한국 정치 연구의 국제적 가시성을 출판과 인용에 한정하지 않고</w:t>
-      </w:r>
-      <w:r>
-        <w:t xml:space="preserve"> </w:t>
-      </w:r>
-      <w:r>
-        <w:rPr>
-          <w:bCs/>
-          <w:b/>
-        </w:rPr>
-        <w:t xml:space="preserve">개별 논문이 실제 학술검색에서 확인되는가</w:t>
-      </w:r>
-      <w:r>
-        <w:t xml:space="preserve">라는 수준까지 확장한다. 둘째, 생성형 검색에서는 검색과정에서의 등장과 최종 출처 선택을 구분하여 한국어권의 주요 문헌이 어느 지점에서 가시성을 잃는지를 분석한다. 셋째, 문헌의 검색·선택과 제공된 링크를 통한 원문 접근을 구분함으로써 국제적 가시성을 하나의 단일한 결과로 환원하지 않는다.</w:t>
+        <w:t xml:space="preserve">인과과정을 구성하지 않는다. Study 1은 현재 Google Scholar index presence와 과거 영어권 인용궤적의 관계를 분석하고, Study 2는 현재 생성형 검색에서 한국어와 영어의 주요 문헌이 검색과 최종 출처 선택에서 어떻게 다르게 나타나는지를 직접 관찰한다. 분석설계와 시간적 범위는 다르지만 두 연구의 공통 질문은 한국어권에서 존재하고 실제 사용되는 연구 가운데 어떤 문헌이 국제적으로 이용되는 검색환경에서 검토 가능한 연구로 나타나는가이다.</w:t>
+      </w:r>
+    </w:p>
+    <w:p>
+      <w:pPr>
+        <w:pStyle w:val="BodyText"/>
+      </w:pPr>
+      <w:r>
+        <w:t xml:space="preserve">본 논문은 문헌이 내용에 대한 실질적 평가를 받기 전에 검색 및 최종 출처 선택 과정에서 가시성을 잃는 현상을 discovery bottleneck이라고 부른다. 이는 검색기술이 국제적 인용격차를 발생시키는 단일한 원인이라는 주장이 아니다. 특정 검색환경에서 문헌이 후보로 나타나지 않거나 검색과정에 등장했더라도 최종적으로 제시되는 출처에서 제외되는 관찰 가능한 누락을 지칭하기 위한 조작적 개념이다.</w:t>
+      </w:r>
+    </w:p>
+    <w:p>
+      <w:pPr>
+        <w:pStyle w:val="BodyText"/>
+      </w:pPr>
+      <w:r>
+        <w:t xml:space="preserve">본 연구의 기여는 세 가지이다. 첫째, 한국 정치 연구의 국제적 가시성을 출판과 인용에 한정하지 않고 개별 논문이 실제 학술검색에서 확인되는가라는 수준까지 확장한다. 둘째, 생성형 검색에서는 검색과정에서의 등장과 최종 출처 선택을 구분하여 한국어권의 주요 문헌이 어느 지점에서 가시성을 잃는지를 분석한다. 셋째, 문헌의 검색·선택과 제공된 링크를 통한 원문 접근을 구분함으로써 국제적 가시성을 하나의 단일한 결과로 환원하지 않는다.</w:t>
       </w:r>
     </w:p>
     <w:bookmarkEnd w:id="22"/>
@@ -636,20 +336,7 @@
         <w:pStyle w:val="FirstParagraph"/>
       </w:pPr>
       <w:r>
-        <w:t xml:space="preserve">정치학에서 국제적으로 가시적인 지식은 연구대상, 연구자의 위치, 출판언어에 따라 불균등하게 구성되어 왔다. 주요 정치학 학술지의 연구대상은 역사적으로 북미와 서유럽에 집중되어 있으며, 이러한 지리적 편중은 특정 지역에서 형성된 기술적·인과적 주장이 정치학 전체로 일반화되는 범위와도 관련된다(Wilson and Knutsen 2022). 지식의 생산자 측면에서도 국제 정치학의 핵심 학술지에는 Global South 연구자의 대표성이 낮고 특정 연구기관 소속 연구자가 과대표되는 경향이 확인된다(Breuning et al. 2018). 정치학의 국제적 지식구조는 따라서 무엇을 연구하는가뿐 아니라</w:t>
-      </w:r>
-      <w:r>
-        <w:t xml:space="preserve"> </w:t>
-      </w:r>
-      <w:r>
-        <w:rPr>
-          <w:bCs/>
-          <w:b/>
-        </w:rPr>
-        <w:t xml:space="preserve">어떤 연구가 중심적인 학술공간에 진입하고 유통되는가</w:t>
-      </w:r>
-      <w:r>
-        <w:t xml:space="preserve">와 연결되어 있다.</w:t>
+        <w:t xml:space="preserve">정치학에서 국제적으로 가시적인 지식은 연구대상, 연구자의 위치, 출판언어에 따라 불균등하게 구성되어 왔다. 주요 정치학 학술지의 연구대상은 역사적으로 북미와 서유럽에 집중되어 있으며, 이러한 지리적 편중은 특정 지역에서 형성된 기술적·인과적 주장이 정치학 전체로 일반화되는 범위와도 관련된다(Wilson and Knutsen 2022). 지식의 생산자 측면에서도 국제 정치학의 핵심 학술지에는 Global South 연구자의 대표성이 낮고 특정 연구기관 소속 연구자가 과대표되는 경향이 확인된다(Breuning et al. 2018). 정치학의 국제적 지식구조는 따라서 무엇을 연구하는가뿐 아니라 어떤 연구가 중심적인 학술공간에 진입하고 유통되는가와 연결되어 있다.</w:t>
       </w:r>
     </w:p>
     <w:p>
@@ -665,101 +352,23 @@
         <w:pStyle w:val="BodyText"/>
       </w:pPr>
       <w:r>
-        <w:t xml:space="preserve">한국 정치 연구에서도 이러한 분화가 나타난다. KCI와 SSCI에 출판되는 한국 정치학 연구는 주제와 방법론적 구성에서 차이를 보이며(Rhee 2026), 한국어권과 영어권에서 생산·유통되는 한국 정치 연구는 국제적 인지도와 인용 범위에서도 서로 다른 패턴을 보인다(Kim et al. 2025). 따라서 한국 정치 연구의 국제적 가시성은 동일한 논문의 언어별 citation difference만으로 환원되지 않는다.</w:t>
-      </w:r>
-      <w:r>
-        <w:t xml:space="preserve"> </w:t>
-      </w:r>
-      <w:r>
-        <w:rPr>
-          <w:bCs/>
-          <w:b/>
-        </w:rPr>
-        <w:t xml:space="preserve">동일한 정치현상에 대해 한국어권에서 축적된 연구가 국제적인 학술정보 환경에 어느 정도 나타나는가</w:t>
-      </w:r>
-      <w:r>
-        <w:t xml:space="preserve">라는 문제도 포함한다.</w:t>
-      </w:r>
-    </w:p>
-    <w:p>
-      <w:pPr>
-        <w:pStyle w:val="BodyText"/>
-      </w:pPr>
-      <w:r>
-        <w:t xml:space="preserve">기존 연구는 publication, database coverage, citation에서 발생하는 이러한 불균형을 보여주지만, 연구자가 실제로 문헌을 발견하는 과정은 별도의 분석 수준이다. 연구자는 선행연구를 검토하기 위해 검색을 통해 후보 문헌을 구성하므로, 특정 연구가 학술적으로 존재하거나 데이터베이스가 해당 분야를 전반적으로 포괄하는 것과</w:t>
-      </w:r>
-      <w:r>
-        <w:t xml:space="preserve"> </w:t>
-      </w:r>
-      <w:r>
-        <w:rPr>
-          <w:bCs/>
-          <w:b/>
-        </w:rPr>
-        <w:t xml:space="preserve">개별 문헌이 실제 검색과정에서 검토대상으로 나타나는 것</w:t>
-      </w:r>
-      <w:r>
-        <w:t xml:space="preserve">은 구분될 수 있다.</w:t>
-      </w:r>
-    </w:p>
-    <w:p>
-      <w:pPr>
-        <w:pStyle w:val="BodyText"/>
-      </w:pPr>
-      <w:r>
-        <w:t xml:space="preserve">정보검색 연구에서는 이러한 차이를 데이터베이스 수준의</w:t>
-      </w:r>
-      <w:r>
-        <w:t xml:space="preserve"> </w:t>
-      </w:r>
-      <w:r>
-        <w:rPr>
-          <w:bCs/>
-          <w:b/>
-        </w:rPr>
-        <w:t xml:space="preserve">coverage</w:t>
-      </w:r>
-      <w:r>
-        <w:t xml:space="preserve">와 개별 문헌 수준의</w:t>
-      </w:r>
-      <w:r>
-        <w:t xml:space="preserve"> </w:t>
-      </w:r>
-      <w:r>
-        <w:rPr>
-          <w:bCs/>
-          <w:b/>
-        </w:rPr>
-        <w:t xml:space="preserve">retrievability</w:t>
-      </w:r>
-      <w:r>
-        <w:t xml:space="preserve">로 개념화해 왔다(Azzopardi and Vinay 2008). 본 연구에서 이 개념은 retrievability 자체를 주요 결과변수로 사용하는 근거라기보다,</w:t>
-      </w:r>
-      <w:r>
-        <w:t xml:space="preserve"> </w:t>
-      </w:r>
-      <w:r>
-        <w:rPr>
-          <w:bCs/>
-          <w:b/>
-        </w:rPr>
-        <w:t xml:space="preserve">aggregate coverage만으로 개별 논문의 검색 가시성을 판단할 수 없다는 개념적 근거</w:t>
-      </w:r>
-      <w:r>
-        <w:t xml:space="preserve">를 제공한다. Study 1에서는 이를 Google Scholar에서 해당 논문의 bibliographic record가 현재 확인되는지, 즉</w:t>
-      </w:r>
-      <w:r>
-        <w:t xml:space="preserve"> </w:t>
-      </w:r>
-      <w:r>
-        <w:rPr>
-          <w:bCs/>
-          <w:b/>
-        </w:rPr>
-        <w:t xml:space="preserve">Google Scholar index presence</w:t>
-      </w:r>
-      <w:r>
-        <w:t xml:space="preserve">의 문제로 분석한다.</w:t>
+        <w:t xml:space="preserve">한국 정치 연구에서도 이러한 분화가 나타난다. KCI와 SSCI에 출판되는 한국 정치학 연구는 주제와 방법론적 구성에서 차이를 보이며(Rhee 2026), 한국어권과 영어권에서 생산·유통되는 한국 정치 연구는 국제적 인지도와 인용 범위에서도 서로 다른 패턴을 보인다(Kim et al. 2025). 따라서 한국 정치 연구의 국제적 가시성은 동일한 논문의 언어별 citation difference만으로 환원되지 않는다. 동일한 정치현상에 대해 한국어권에서 축적된 연구가 국제적인 학술정보 환경에 어느 정도 나타나는가라는 문제도 포함한다.</w:t>
+      </w:r>
+    </w:p>
+    <w:p>
+      <w:pPr>
+        <w:pStyle w:val="BodyText"/>
+      </w:pPr>
+      <w:r>
+        <w:t xml:space="preserve">기존 연구는 publication, database coverage, citation에서 발생하는 이러한 불균형을 보여주지만, 연구자가 실제로 문헌을 발견하는 과정은 별도의 분석 수준이다. 연구자는 선행연구를 검토하기 위해 검색을 통해 후보 문헌을 구성하므로, 특정 연구가 학술적으로 존재하거나 데이터베이스가 해당 분야를 전반적으로 포괄하는 것과 개별 문헌이 실제 검색과정에서 검토대상으로 나타나는 것은 구분될 수 있다.</w:t>
+      </w:r>
+    </w:p>
+    <w:p>
+      <w:pPr>
+        <w:pStyle w:val="BodyText"/>
+      </w:pPr>
+      <w:r>
+        <w:t xml:space="preserve">정보검색 연구에서는 이러한 차이를 데이터베이스 수준의 coverage와 개별 문헌 수준의 retrievability로 개념화해 왔다(Azzopardi and Vinay 2008). 본 연구에서 이 개념은 retrievability 자체를 주요 결과변수로 사용하는 근거라기보다, aggregate coverage만으로 개별 논문의 검색 가시성을 판단할 수 없다는 개념적 근거를 제공한다. Study 1에서는 이를 Google Scholar에서 해당 논문의 bibliographic record가 현재 확인되는지, 즉 Google Scholar index presence의 문제로 분석한다.</w:t>
       </w:r>
     </w:p>
     <w:bookmarkEnd w:id="23"/>
@@ -785,17 +394,7 @@
         <w:pStyle w:val="BodyText"/>
       </w:pPr>
       <w:r>
-        <w:t xml:space="preserve">그러나 Google Scholar가 특정 언어나 분야를 전반적으로 폭넓게 포괄한다는 사실이 모든 개별 논문의 bibliographic record가 실제로 확인됨을 보장하지는 않는다. 외부 bibliographic record와 비교한 연구에서도 Google Scholar에서 반환되지 않는 publication이 보고되어 왔다(Delgado-Quirós et al. 2024). 따라서</w:t>
-      </w:r>
-      <w:r>
-        <w:t xml:space="preserve"> </w:t>
-      </w:r>
-      <w:r>
-        <w:rPr>
-          <w:bCs/>
-          <w:b/>
-        </w:rPr>
-        <w:t xml:space="preserve">Google Scholar의 aggregate coverage와 개별 논문의 index presence는 분석적으로 구분될 필요가 있다.</w:t>
+        <w:t xml:space="preserve">그러나 Google Scholar가 특정 언어나 분야를 전반적으로 폭넓게 포괄한다는 사실이 모든 개별 논문의 bibliographic record가 실제로 확인됨을 보장하지는 않는다. 외부 bibliographic record와 비교한 연구에서도 Google Scholar에서 반환되지 않는 publication이 보고되어 왔다(Delgado-Quirós et al. 2024). 따라서 Google Scholar의 aggregate coverage와 개별 논문의 index presence는 분석적으로 구분될 필요가 있다.</w:t>
       </w:r>
     </w:p>
     <w:p>
@@ -819,20 +418,7 @@
         <w:pStyle w:val="BodyText"/>
       </w:pPr>
       <w:r>
-        <w:t xml:space="preserve">이러한 선행연구는</w:t>
-      </w:r>
-      <w:r>
-        <w:t xml:space="preserve"> </w:t>
-      </w:r>
-      <w:r>
-        <w:rPr>
-          <w:bCs/>
-          <w:b/>
-        </w:rPr>
-        <w:t xml:space="preserve">database coverage, paper-level index presence, 그리고 제공 링크를 통한 원문 접근</w:t>
-      </w:r>
-      <w:r>
-        <w:t xml:space="preserve">이 서로 다른 속성임을 보여준다. Study 1은 이 구분을 한국어권 정치학에서 실제로 사용된 한국 정치 관련 문헌에 적용한다. Google Scholar 전체의 coverage를 다시 추정하는 것이 아니라, 동일하게 한국어권 citation record를 가진 문헌 가운데 현재 Google Scholar index presence에 따라 영어권 인용의 역사적 패턴이 어떻게 다른지를 분석한다.</w:t>
+        <w:t xml:space="preserve">이러한 선행연구는 database coverage, paper-level index presence, 그리고 제공 링크를 통한 원문 접근이 서로 다른 속성임을 보여준다. Study 1은 이 구분을 한국어권 정치학에서 실제로 사용된 한국 정치 관련 문헌에 적용한다. Google Scholar 전체의 coverage를 다시 추정하는 것이 아니라, 동일하게 한국어권 citation record를 가진 문헌 가운데 현재 Google Scholar index presence에 따라 영어권 인용의 역사적 패턴이 어떻게 다른지를 분석한다.</w:t>
       </w:r>
     </w:p>
     <w:bookmarkEnd w:id="24"/>
@@ -858,117 +444,39 @@
         <w:pStyle w:val="BodyText"/>
       </w:pPr>
       <w:r>
-        <w:t xml:space="preserve">학술문헌 검색에 LLM을 적용하는 최근 연구는 시스템이 생성한 목록의 표면적 타당성보다</w:t>
-      </w:r>
-      <w:r>
-        <w:t xml:space="preserve"> </w:t>
-      </w:r>
-      <w:r>
-        <w:rPr>
-          <w:bCs/>
-          <w:b/>
-        </w:rPr>
-        <w:t xml:space="preserve">사전에 정한 문헌이 실제로 검색되는가</w:t>
-      </w:r>
-      <w:r>
-        <w:t xml:space="preserve">를 평가하는 방향으로 발전하고 있다. LitSearch는 시스템 실행과 독립적으로 target paper를 정의한 뒤 검색성능을 평가하고(Ajith et al. 2024), PaSa와 같은 academic-search agent도 query–paper benchmark를 이용해 학술문헌 회수를 평가한다(He et al. 2025). 이는 정보검색에서 사전에 정의된 relevant set을 기준으로 검색성능을 평가하는 전통과 연결된다(Manning, Raghavan, and Schütze 2008). 최근 LLM 기반 scholar recommendation audit 역시 외부 benchmark를 이용하여 사전에 지정된 연구자나 문헌이 실제 추천되는지를 측정한다(Espín-Noboa and Méndez 2026). 동시에 LLM을 이용한 literature search 연구가 빠르게 늘고 있지만, 체계적 문헌고찰과 같은 엄격한 검색과정에서의 적용은 아직 충분히 확립되지 않았다는 지적도 제기된다(Lieberum et al. 2025; Asai et al. 2026).</w:t>
-      </w:r>
-    </w:p>
-    <w:p>
-      <w:pPr>
-        <w:pStyle w:val="BodyText"/>
-      </w:pPr>
-      <w:r>
-        <w:t xml:space="preserve">이러한 접근은 비영어권 학술문헌을 분석할 때 특히 중요하다. 생성된 목록에 한국어 논문이 많다는 것은</w:t>
-      </w:r>
-      <w:r>
-        <w:t xml:space="preserve"> </w:t>
-      </w:r>
-      <w:r>
-        <w:rPr>
-          <w:bCs/>
-          <w:b/>
-        </w:rPr>
-        <w:t xml:space="preserve">한국어 자료가 많이 제시되었다는 사실</w:t>
-      </w:r>
-      <w:r>
-        <w:t xml:space="preserve">을 보여주지만, 그것만으로 한국어권에서 축적된 주요 연구가 충분히 반영되었다고 판단할 수는 없다. 검색조건에 따라 한국어 논문이 다수 추천되더라도, 한국어권 정치학에서 주요하게 다뤄져 온 특정 연구가 거의 포함되지 않을 수 있기 때문이다. 따라서 생성형 검색에서 한국어 학술문헌의 가시성을 분석하려면 최종 추천의 언어적 구성과</w:t>
-      </w:r>
-      <w:r>
-        <w:t xml:space="preserve"> </w:t>
-      </w:r>
-      <w:r>
-        <w:rPr>
-          <w:bCs/>
-          <w:b/>
-        </w:rPr>
-        <w:t xml:space="preserve">사전에 확인한 주요 한국어 문헌이 실제로 검색·선택되는지</w:t>
-      </w:r>
-      <w:r>
-        <w:t xml:space="preserve">를 구분할 필요가 있다.</w:t>
-      </w:r>
-    </w:p>
-    <w:p>
-      <w:pPr>
-        <w:pStyle w:val="BodyText"/>
-      </w:pPr>
-      <w:r>
-        <w:t xml:space="preserve">생성형 검색에서 최종적으로 선택되는 source 역시 고정되어 있지 않다. 기존 연구에서는 생성형 검색결과가 source authority, 지리적 위치, 기관 또는 상업적 출처에 따라 차이를 보일 수 있음이 보고되어 왔다(Liu, Zhang, and Liang 2023; Li and Sinnamon 2024). 한국 정치 연구처럼 한국어권과 영어권 문헌이 서로 다른 데이터베이스와 출판경로를 통해 유통되는 경우에는</w:t>
-      </w:r>
-      <w:r>
-        <w:t xml:space="preserve"> </w:t>
-      </w:r>
-      <w:r>
-        <w:rPr>
-          <w:bCs/>
-          <w:b/>
-        </w:rPr>
-        <w:t xml:space="preserve">질의 언어와 어떤 학술정보원을 검색하도록 지시하는가</w:t>
-      </w:r>
-      <w:r>
-        <w:t xml:space="preserve">가 검색되는 문헌과 최종적으로 제시되는 출처를 변화시킬 가능성이 있다.</w:t>
-      </w:r>
-    </w:p>
-    <w:p>
-      <w:pPr>
-        <w:pStyle w:val="BodyText"/>
-      </w:pPr>
-      <w:r>
-        <w:t xml:space="preserve">이러한 선행연구를 바탕으로 Study 2는 두 지점을 구분한다. 먼저 benchmark paper가 provider가 외부에 공개하는 search trace에서 확인되는지를 본다. 다음으로 해당 논문이 최종 recommendation에 포함되는지를 별도로 본다. Provider가 내부 검색과정을 모두 공개하지 않으므로 search trace를 전체 retrieval process와 동일시할 수는 없지만, 두 결과를 분리하면 특정 문헌이 최종 추천에 없을 때 적어도</w:t>
-      </w:r>
-      <w:r>
-        <w:t xml:space="preserve"> </w:t>
-      </w:r>
-      <w:r>
-        <w:rPr>
-          <w:bCs/>
-          <w:b/>
-        </w:rPr>
-        <w:t xml:space="preserve">관찰 가능한 검색흔적에서부터 나타나지 않았는지, 아니면 검색흔적에는 나타났지만 최종 출처로 제시되지 않았는지</w:t>
-      </w:r>
-      <w:r>
-        <w:t xml:space="preserve">를 구분할 수 있다.</w:t>
-      </w:r>
-    </w:p>
-    <w:p>
-      <w:pPr>
-        <w:pStyle w:val="BodyText"/>
-      </w:pPr>
-      <w:r>
-        <w:t xml:space="preserve">Study 2는 이를 한국어권과 영어권에서 모두 연구되어 온 동일한 한국 정치 주제에 적용한다. Query language와 한국 학술 데이터베이스에 대한 명시적 검색 지시를 변화시켜,</w:t>
-      </w:r>
-      <w:r>
-        <w:t xml:space="preserve"> </w:t>
-      </w:r>
-      <w:r>
-        <w:rPr>
-          <w:bCs/>
-          <w:b/>
-        </w:rPr>
-        <w:t xml:space="preserve">한국어권에서 사전에 주요 문헌으로 확인한 연구가 어떤 조건에서 실제 검색흔적과 최종 추천에 나타나는지</w:t>
-      </w:r>
-      <w:r>
-        <w:t xml:space="preserve">를 분석한다. 제공된 링크를 통한 원문 접근은 검색 및 출처 선택과 구분되는 별도의 결과로 측정한다.</w:t>
+        <w:t xml:space="preserve">학술문헌 검색에 LLM을 적용하는 최근 연구는 시스템이 생성한 목록의 표면적 타당성보다 사전에 정한 문헌이 실제로 검색되는가를 평가하는 방향으로 발전하고 있다. LitSearch는 시스템 실행과 독립적으로 target paper를 정의한 뒤 검색성능을 평가하고(Ajith et al. 2024), PaSa와 같은 academic-search agent도 query–paper benchmark를 이용해 학술문헌 회수를 평가한다(He et al. 2025). 이는 정보검색에서 사전에 정의된 relevant set을 기준으로 검색성능을 평가하는 전통과 연결된다(Manning, Raghavan, and Schütze 2008). 최근 LLM 기반 scholar recommendation audit 역시 외부 benchmark를 이용하여 사전에 지정된 연구자나 문헌이 실제 추천되는지를 측정한다(Espín-Noboa and Méndez 2026). 동시에 LLM을 이용한 literature search 연구가 빠르게 늘고 있지만, 체계적 문헌고찰과 같은 엄격한 검색과정에서의 적용은 아직 충분히 확립되지 않았다는 지적도 제기된다(Lieberum et al. 2025; Asai et al. 2026).</w:t>
+      </w:r>
+    </w:p>
+    <w:p>
+      <w:pPr>
+        <w:pStyle w:val="BodyText"/>
+      </w:pPr>
+      <w:r>
+        <w:t xml:space="preserve">이러한 접근은 비영어권 학술문헌을 분석할 때 특히 중요하다. 생성된 목록에 한국어 논문이 많다는 것은 한국어 자료가 많이 제시되었다는 사실을 보여주지만, 그것만으로 한국어권에서 축적된 주요 연구가 충분히 반영되었다고 판단할 수는 없다. 검색조건에 따라 한국어 논문이 다수 추천되더라도, 한국어권 정치학에서 주요하게 다뤄져 온 특정 연구가 거의 포함되지 않을 수 있기 때문이다. 따라서 생성형 검색에서 한국어 학술문헌의 가시성을 분석하려면 최종 추천의 언어적 구성과 사전에 확인한 주요 한국어 문헌이 실제로 검색·선택되는지를 구분할 필요가 있다.</w:t>
+      </w:r>
+    </w:p>
+    <w:p>
+      <w:pPr>
+        <w:pStyle w:val="BodyText"/>
+      </w:pPr>
+      <w:r>
+        <w:t xml:space="preserve">생성형 검색에서 최종적으로 선택되는 source 역시 고정되어 있지 않다. 기존 연구에서는 생성형 검색결과가 source authority, 지리적 위치, 기관 또는 상업적 출처에 따라 차이를 보일 수 있음이 보고되어 왔다(Liu, Zhang, and Liang 2023; Li and Sinnamon 2024). 한국 정치 연구처럼 한국어권과 영어권 문헌이 서로 다른 데이터베이스와 출판경로를 통해 유통되는 경우에는 질의 언어와 어떤 학술정보원을 검색하도록 지시하는가가 검색되는 문헌과 최종적으로 제시되는 출처를 변화시킬 가능성이 있다.</w:t>
+      </w:r>
+    </w:p>
+    <w:p>
+      <w:pPr>
+        <w:pStyle w:val="BodyText"/>
+      </w:pPr>
+      <w:r>
+        <w:t xml:space="preserve">이러한 선행연구를 바탕으로 Study 2는 두 지점을 구분한다. 먼저 benchmark paper가 provider가 외부에 공개하는 search trace에서 확인되는지를 본다. 다음으로 해당 논문이 최종 recommendation에 포함되는지를 별도로 본다. Provider가 내부 검색과정을 모두 공개하지 않으므로 search trace를 전체 retrieval process와 동일시할 수는 없지만, 두 결과를 분리하면 특정 문헌이 최종 추천에 없을 때 적어도 관찰 가능한 검색흔적에서부터 나타나지 않았는지, 아니면 검색흔적에는 나타났지만 최종 출처로 제시되지 않았는지를 구분할 수 있다.</w:t>
+      </w:r>
+    </w:p>
+    <w:p>
+      <w:pPr>
+        <w:pStyle w:val="BodyText"/>
+      </w:pPr>
+      <w:r>
+        <w:t xml:space="preserve">Study 2는 이를 한국어권과 영어권에서 모두 연구되어 온 동일한 한국 정치 주제에 적용한다. Query language와 한국 학술 데이터베이스에 대한 명시적 검색 지시를 변화시켜, 한국어권에서 사전에 주요 문헌으로 확인한 연구가 어떤 조건에서 실제 검색흔적과 최종 추천에 나타나는지를 분석한다. 제공된 링크를 통한 원문 접근은 검색 및 출처 선택과 구분되는 별도의 결과로 측정한다.</w:t>
       </w:r>
     </w:p>
     <w:bookmarkEnd w:id="25"/>
@@ -996,20 +504,7 @@
         <w:pStyle w:val="FirstParagraph"/>
       </w:pPr>
       <w:r>
-        <w:t xml:space="preserve">Study 1은</w:t>
-      </w:r>
-      <w:r>
-        <w:t xml:space="preserve"> </w:t>
-      </w:r>
-      <w:r>
-        <w:rPr>
-          <w:bCs/>
-          <w:b/>
-        </w:rPr>
-        <w:t xml:space="preserve">한국어권 정치학에서 이미 사용된 한국 정치 관련 문헌 가운데 현재 Google Scholar index presence가 확인되는 논문과 그렇지 않은 논문의 영어권 인용확률이 시기에 따라 어떻게 다른가</w:t>
-      </w:r>
-      <w:r>
-        <w:t xml:space="preserve">를 분석한다.</w:t>
+        <w:t xml:space="preserve">Study 1은 한국어권 정치학에서 이미 사용된 한국 정치 관련 문헌 가운데 현재 Google Scholar index presence가 확인되는 논문과 그렇지 않은 논문의 영어권 인용확률이 시기에 따라 어떻게 다른가를 분석한다.</w:t>
       </w:r>
     </w:p>
     <w:p>
@@ -1037,17 +532,7 @@
         <w:pStyle w:val="Compact"/>
       </w:pPr>
       <w:r>
-        <w:rPr>
-          <w:bCs/>
-          <w:b/>
-        </w:rPr>
-        <w:t xml:space="preserve">C1:</w:t>
-      </w:r>
-      <w:r>
-        <w:t xml:space="preserve"> </w:t>
-      </w:r>
-      <w:r>
-        <w:t xml:space="preserve">2009년까지</w:t>
+        <w:t xml:space="preserve">C1: 2009년까지</w:t>
       </w:r>
     </w:p>
     <w:p>
@@ -1059,17 +544,7 @@
         <w:pStyle w:val="Compact"/>
       </w:pPr>
       <w:r>
-        <w:rPr>
-          <w:bCs/>
-          <w:b/>
-        </w:rPr>
-        <w:t xml:space="preserve">C2:</w:t>
-      </w:r>
-      <w:r>
-        <w:t xml:space="preserve"> </w:t>
-      </w:r>
-      <w:r>
-        <w:t xml:space="preserve">2010–2014</w:t>
+        <w:t xml:space="preserve">C2: 2010–2014</w:t>
       </w:r>
     </w:p>
     <w:p>
@@ -1081,17 +556,7 @@
         <w:pStyle w:val="Compact"/>
       </w:pPr>
       <w:r>
-        <w:rPr>
-          <w:bCs/>
-          <w:b/>
-        </w:rPr>
-        <w:t xml:space="preserve">C3:</w:t>
-      </w:r>
-      <w:r>
-        <w:t xml:space="preserve"> </w:t>
-      </w:r>
-      <w:r>
-        <w:t xml:space="preserve">2015–2019</w:t>
+        <w:t xml:space="preserve">C3: 2015–2019</w:t>
       </w:r>
     </w:p>
     <w:p>
@@ -1103,17 +568,7 @@
         <w:pStyle w:val="Compact"/>
       </w:pPr>
       <w:r>
-        <w:rPr>
-          <w:bCs/>
-          <w:b/>
-        </w:rPr>
-        <w:t xml:space="preserve">C4:</w:t>
-      </w:r>
-      <w:r>
-        <w:t xml:space="preserve"> </w:t>
-      </w:r>
-      <w:r>
-        <w:t xml:space="preserve">2020–2024</w:t>
+        <w:t xml:space="preserve">C4: 2020–2024</w:t>
       </w:r>
     </w:p>
     <w:p>
@@ -1173,86 +628,31 @@
         <w:pStyle w:val="FirstParagraph"/>
       </w:pPr>
       <w:r>
-        <w:t xml:space="preserve">은 해당 기간의 영어권 source paper가 target을 적어도 한 번 인용한 경우이며, 그렇지 않으면 0이다. 최종 panel은</w:t>
-      </w:r>
-      <w:r>
-        <w:t xml:space="preserve"> </w:t>
-      </w:r>
-      <w:r>
-        <w:rPr>
-          <w:bCs/>
-          <w:b/>
-        </w:rPr>
-        <w:t xml:space="preserve">179,230개의 target-paper × cohort observation</w:t>
-      </w:r>
-      <w:r>
-        <w:t xml:space="preserve">으로 구성된다.</w:t>
-      </w:r>
-    </w:p>
-    <w:p>
-      <w:pPr>
-        <w:pStyle w:val="BodyText"/>
-      </w:pPr>
-      <w:r>
-        <w:t xml:space="preserve">주요 변수 (D_j)는</w:t>
-      </w:r>
-      <w:r>
-        <w:t xml:space="preserve"> </w:t>
-      </w:r>
-      <w:r>
-        <w:rPr>
-          <w:bCs/>
-          <w:b/>
-        </w:rPr>
-        <w:t xml:space="preserve">2026년 현재 Google Scholar index presence</w:t>
-      </w:r>
-      <w:r>
-        <w:t xml:space="preserve">이다. 가능한 한국어 제목, 영어 제목, reference-title variant를 사용해 검색하고 사전에 정한 bibliographic matching 기준을 충족하는 Google Scholar record가 확인되면 (D_j=1)로 코딩한다. 검색을 완료했지만 확인 가능한 matching record를 찾지 못하면 (D_j=0)으로 코딩한다. 표본에는 (D_j=1)인 논문 19,436편과 (D_j=0)인 논문 35,353편이 있다.</w:t>
-      </w:r>
-    </w:p>
-    <w:p>
-      <w:pPr>
-        <w:pStyle w:val="BodyText"/>
-      </w:pPr>
-      <w:r>
-        <w:t xml:space="preserve">Google Scholar는 전체 index의 공개 목록을 제공하지 않으므로, 여기서</w:t>
-      </w:r>
-      <w:r>
-        <w:t xml:space="preserve"> </w:t>
-      </w:r>
-      <w:r>
-        <w:rPr>
-          <w:bCs/>
-          <w:b/>
-        </w:rPr>
-        <w:t xml:space="preserve">index presence는 본 연구의 title-based search와 matching 절차를 통해 bibliographic record의 존재가 확인되었는지로 조작화한다.</w:t>
-      </w:r>
-      <w:r>
-        <w:t xml:space="preserve"> </w:t>
-      </w:r>
-      <w:r>
-        <w:t xml:space="preserve">따라서 (D_j=0)은 Google Scholar의 모든 가능한 검색에서 해당 논문이 절대 존재하지 않는다는 뜻이 아니라, 본 연구의 검색절차에서 현재 index presence를 확인하지 못했다는 의미이다.</w:t>
-      </w:r>
-    </w:p>
-    <w:p>
-      <w:pPr>
-        <w:pStyle w:val="BodyText"/>
-      </w:pPr>
-      <w:r>
-        <w:t xml:space="preserve">보조 변수는 현재 Google Scholar record가 확인된 논문에 대해</w:t>
-      </w:r>
-      <w:r>
-        <w:t xml:space="preserve"> </w:t>
-      </w:r>
-      <w:r>
-        <w:rPr>
-          <w:bCs/>
-          <w:b/>
-        </w:rPr>
-        <w:t xml:space="preserve">Google Scholar가 제공한 링크가 로그인이나 결제 없이 full text로 연결되는지</w:t>
-      </w:r>
-      <w:r>
-        <w:t xml:space="preserve">이다. 이는 논문의 일반적인 OA 여부를 측정하지 않는다.</w:t>
+        <w:t xml:space="preserve">은 해당 기간의 영어권 source paper가 target을 적어도 한 번 인용한 경우이며, 그렇지 않으면 0이다. 최종 panel은 179,230개의 target-paper × cohort observation으로 구성된다.</w:t>
+      </w:r>
+    </w:p>
+    <w:p>
+      <w:pPr>
+        <w:pStyle w:val="BodyText"/>
+      </w:pPr>
+      <w:r>
+        <w:t xml:space="preserve">주요 변수 (D_j)는 2026년 현재 Google Scholar index presence이다. 가능한 한국어 제목, 영어 제목, reference-title variant를 사용해 검색하고 사전에 정한 bibliographic matching 기준을 충족하는 Google Scholar record가 확인되면 (D_j=1)로 코딩한다. 검색을 완료했지만 확인 가능한 matching record를 찾지 못하면 (D_j=0)으로 코딩한다. 표본에는 (D_j=1)인 논문 19,436편과 (D_j=0)인 논문 35,353편이 있다.</w:t>
+      </w:r>
+    </w:p>
+    <w:p>
+      <w:pPr>
+        <w:pStyle w:val="BodyText"/>
+      </w:pPr>
+      <w:r>
+        <w:t xml:space="preserve">Google Scholar는 전체 index의 공개 목록을 제공하지 않으므로, 여기서 index presence는 본 연구의 title-based search와 matching 절차를 통해 bibliographic record의 존재가 확인되었는지로 조작화한다. 따라서 (D_j=0)은 Google Scholar의 모든 가능한 검색에서 해당 논문이 절대 존재하지 않는다는 뜻이 아니라, 본 연구의 검색절차에서 현재 index presence를 확인하지 못했다는 의미이다.</w:t>
+      </w:r>
+    </w:p>
+    <w:p>
+      <w:pPr>
+        <w:pStyle w:val="BodyText"/>
+      </w:pPr>
+      <w:r>
+        <w:t xml:space="preserve">보조 변수는 현재 Google Scholar record가 확인된 논문에 대해 Google Scholar가 제공한 링크가 로그인이나 결제 없이 full text로 연결되는지이다. 이는 논문의 일반적인 OA 여부를 측정하지 않는다.</w:t>
       </w:r>
     </w:p>
     <w:bookmarkEnd w:id="27"/>
@@ -1515,41 +915,15 @@
         <w:pStyle w:val="BodyText"/>
       </w:pPr>
       <w:r>
-        <w:t xml:space="preserve">핵심 계수 β_k는</w:t>
-      </w:r>
-      <w:r>
-        <w:t xml:space="preserve"> </w:t>
-      </w:r>
-      <w:r>
-        <w:rPr>
-          <w:bCs/>
-          <w:b/>
-        </w:rPr>
-        <w:t xml:space="preserve">각 후속 cohort에서 (D=1)과 (D=0) 논문의 영어권 인용확률 격차가 C1의 격차와 얼마나 다른지</w:t>
-      </w:r>
-      <w:r>
-        <w:t xml:space="preserve">를 나타낸다. 이는 Google Scholar indexing의 causal effect가 아니라 현재 index presence에 따라 구분되는 두 집단 사이 gap의 시기별 차이를 나타낸다. Standard error는 target paper 수준에서 cluster한다.</w:t>
-      </w:r>
-    </w:p>
-    <w:p>
-      <w:pPr>
-        <w:pStyle w:val="BodyText"/>
-      </w:pPr>
-      <w:r>
-        <w:t xml:space="preserve">Cohort별 eligible-target composition의 변화를 점검하기 위해</w:t>
-      </w:r>
-      <w:r>
-        <w:t xml:space="preserve"> </w:t>
-      </w:r>
-      <w:r>
-        <w:rPr>
-          <w:bCs/>
-          <w:b/>
-        </w:rPr>
-        <w:t xml:space="preserve">2004년까지 출판된 target paper만을 대상으로 동일한 분석을 반복</w:t>
-      </w:r>
-      <w:r>
-        <w:t xml:space="preserve">한다. 이 논문들은 네 cohort 모두에 기여할 시간적 기회를 가지므로 후기에 출판된 논문의 추가로 인해 cohort 구성이 바뀌는 문제를 줄일 수 있다. 이 restriction은 과거 Google Scholar indexing 상태를 복원하기 위한 것이 아니다.</w:t>
+        <w:t xml:space="preserve">핵심 계수 β_k는 각 후속 cohort에서 (D=1)과 (D=0) 논문의 영어권 인용확률 격차가 C1의 격차와 얼마나 다른지를 나타낸다. 이는 Google Scholar indexing의 causal effect가 아니라 현재 index presence에 따라 구분되는 두 집단 사이 gap의 시기별 차이를 나타낸다. Standard error는 target paper 수준에서 cluster한다.</w:t>
+      </w:r>
+    </w:p>
+    <w:p>
+      <w:pPr>
+        <w:pStyle w:val="BodyText"/>
+      </w:pPr>
+      <w:r>
+        <w:t xml:space="preserve">Cohort별 eligible-target composition의 변화를 점검하기 위해 2004년까지 출판된 target paper만을 대상으로 동일한 분석을 반복한다. 이 논문들은 네 cohort 모두에 기여할 시간적 기회를 가지므로 후기에 출판된 논문의 추가로 인해 cohort 구성이 바뀌는 문제를 줄일 수 있다. 이 restriction은 과거 Google Scholar indexing 상태를 복원하기 위한 것이 아니다.</w:t>
       </w:r>
     </w:p>
     <w:p>
@@ -1850,54 +1224,15 @@
         <w:pStyle w:val="BodyText"/>
       </w:pPr>
       <w:r>
-        <w:t xml:space="preserve">Fixed-effects 분석에서 C1 대비 두 집단의 격차는</w:t>
-      </w:r>
-      <w:r>
-        <w:t xml:space="preserve"> </w:t>
-      </w:r>
-      <w:r>
-        <w:rPr>
-          <w:bCs/>
-          <w:b/>
-        </w:rPr>
-        <w:t xml:space="preserve">C2에서 0.405pp 증가</w:t>
-      </w:r>
-      <w:r>
-        <w:t xml:space="preserve">한다(95% CI [0.040, 0.770], (p=.030)).</w:t>
-      </w:r>
-      <w:r>
-        <w:t xml:space="preserve"> </w:t>
-      </w:r>
-      <w:r>
-        <w:rPr>
-          <w:bCs/>
-          <w:b/>
-        </w:rPr>
-        <w:t xml:space="preserve">C3에서는 0.696pp 증가</w:t>
-      </w:r>
-      <w:r>
-        <w:t xml:space="preserve">한다(95% CI [0.329, 1.063], (p&lt;.001)). C2와 C3 계수의 joint test 역시 (p&lt;.001)이다.</w:t>
-      </w:r>
-    </w:p>
-    <w:p>
-      <w:pPr>
-        <w:pStyle w:val="BodyText"/>
-      </w:pPr>
-      <w:r>
-        <w:t xml:space="preserve">반면 C4의 변화는</w:t>
-      </w:r>
-      <w:r>
-        <w:t xml:space="preserve"> </w:t>
-      </w:r>
-      <w:r>
-        <w:rPr>
-          <w:bCs/>
-          <w:b/>
-        </w:rPr>
-        <w:t xml:space="preserve">0.008pp</w:t>
-      </w:r>
-      <w:r>
-        <w:t xml:space="preserve">(95% CI [−0.337, 0.353], (p=.965))로, 2020–2024년에 C1 대비 격차가 추가적으로 확대되었다는 근거는 확인되지 않는다.</w:t>
+        <w:t xml:space="preserve">Fixed-effects 분석에서 C1 대비 두 집단의 격차는 C2에서 0.405pp 증가한다(95% CI [0.040, 0.770], (p=.030)). C3에서는 0.696pp 증가한다(95% CI [0.329, 1.063], (p&lt;.001)). C2와 C3 계수의 joint test 역시 (p&lt;.001)이다.</w:t>
+      </w:r>
+    </w:p>
+    <w:p>
+      <w:pPr>
+        <w:pStyle w:val="BodyText"/>
+      </w:pPr>
+      <w:r>
+        <w:t xml:space="preserve">반면 C4의 변화는 0.008pp(95% CI [−0.337, 0.353], (p=.965))로, 2020–2024년에 C1 대비 격차가 추가적으로 확대되었다는 근거는 확인되지 않는다.</w:t>
       </w:r>
     </w:p>
     <w:p>
@@ -2090,38 +1425,15 @@
         <w:pStyle w:val="BodyText"/>
       </w:pPr>
       <w:r>
-        <w:t xml:space="preserve">Robustness 결과는 모든 specification에서 동일하지 않다. Target-fixed-effects Poisson에서는 C2와 C3의 변화가 양수이지만 영어권 인용이 전혀 없는 target은 conditional model을 식별하지 못하므로 제외된다. 다른 Poisson specification은 더 불정확하며, journal-by-cohort 및 publication-year-by-cohort model에서는 C2의 양의 추정치는 유지되지만 C3와 C4가 통계적으로 유의하게 재현되지는 않는다. 따라서 결과는</w:t>
-      </w:r>
-      <w:r>
-        <w:t xml:space="preserve"> </w:t>
-      </w:r>
-      <w:r>
-        <w:rPr>
-          <w:bCs/>
-          <w:b/>
-        </w:rPr>
-        <w:t xml:space="preserve">main incidence model과 pre-2005 restriction에서 확인된 C2–C3 패턴의 범위</w:t>
-      </w:r>
-      <w:r>
-        <w:t xml:space="preserve">에서 해석한다.</w:t>
-      </w:r>
-    </w:p>
-    <w:p>
-      <w:pPr>
-        <w:pStyle w:val="BodyText"/>
-      </w:pPr>
-      <w:r>
-        <w:t xml:space="preserve">현재 Google Scholar record가 확인된 논문들 사이에서는</w:t>
-      </w:r>
-      <w:r>
-        <w:t xml:space="preserve"> </w:t>
-      </w:r>
-      <w:r>
-        <w:rPr>
-          <w:bCs/>
-          <w:b/>
-        </w:rPr>
-        <w:t xml:space="preserve">Google Scholar가 제공한 링크를 통한 full-text access가 cohort별 영어권 citation incidence와 통계적으로 유의한 관계를 보이지 않았다.</w:t>
+        <w:t xml:space="preserve">Robustness 결과는 모든 specification에서 동일하지 않다. Target-fixed-effects Poisson에서는 C2와 C3의 변화가 양수이지만 영어권 인용이 전혀 없는 target은 conditional model을 식별하지 못하므로 제외된다. 다른 Poisson specification은 더 불정확하며, journal-by-cohort 및 publication-year-by-cohort model에서는 C2의 양의 추정치는 유지되지만 C3와 C4가 통계적으로 유의하게 재현되지는 않는다. 따라서 결과는 main incidence model과 pre-2005 restriction에서 확인된 C2–C3 패턴의 범위에서 해석한다.</w:t>
+      </w:r>
+    </w:p>
+    <w:p>
+      <w:pPr>
+        <w:pStyle w:val="BodyText"/>
+      </w:pPr>
+      <w:r>
+        <w:t xml:space="preserve">현재 Google Scholar record가 확인된 논문들 사이에서는 Google Scholar가 제공한 링크를 통한 full-text access가 cohort별 영어권 citation incidence와 통계적으로 유의한 관계를 보이지 않았다.</w:t>
       </w:r>
     </w:p>
     <w:bookmarkEnd w:id="29"/>
@@ -2147,41 +1459,15 @@
         <w:pStyle w:val="BodyText"/>
       </w:pPr>
       <w:r>
-        <w:t xml:space="preserve">여기서 0.405pp와 0.696pp는 각 기간의 인용확률 자체가 아니라</w:t>
-      </w:r>
-      <w:r>
-        <w:t xml:space="preserve"> </w:t>
-      </w:r>
-      <w:r>
-        <w:rPr>
-          <w:bCs/>
-          <w:b/>
-        </w:rPr>
-        <w:t xml:space="preserve">C1 대비 두 집단의 인용확률 격차가 추가로 얼마나 커졌는지</w:t>
-      </w:r>
-      <w:r>
-        <w:t xml:space="preserve">를 나타낸다. 따라서 결과를 모든 시기에 걸쳐 지속적으로 확대되는 advantage로 해석해서는 안 된다.</w:t>
-      </w:r>
-    </w:p>
-    <w:p>
-      <w:pPr>
-        <w:pStyle w:val="BodyText"/>
-      </w:pPr>
-      <w:r>
-        <w:t xml:space="preserve">또한 현재의 index presence가 과거 영어권 인용을 발생시켰다고 결론내릴 수 없다. 현재 Google Scholar record의 존재는 이후의 indexing, web availability, 이전 scholarly circulation 또는 이들과 함께 변화한 다른 특성과 관련될 수 있다. 가장 제한적인 해석은</w:t>
-      </w:r>
-      <w:r>
-        <w:t xml:space="preserve"> </w:t>
-      </w:r>
-      <w:r>
-        <w:rPr>
-          <w:bCs/>
-          <w:b/>
-        </w:rPr>
-        <w:t xml:space="preserve">현재 Google Scholar index presence에 따라 historical English-language citation trajectory가 다르게 나타난다</w:t>
-      </w:r>
-      <w:r>
-        <w:t xml:space="preserve">는 것이다.</w:t>
+        <w:t xml:space="preserve">여기서 0.405pp와 0.696pp는 각 기간의 인용확률 자체가 아니라 C1 대비 두 집단의 인용확률 격차가 추가로 얼마나 커졌는지를 나타낸다. 따라서 결과를 모든 시기에 걸쳐 지속적으로 확대되는 advantage로 해석해서는 안 된다.</w:t>
+      </w:r>
+    </w:p>
+    <w:p>
+      <w:pPr>
+        <w:pStyle w:val="BodyText"/>
+      </w:pPr>
+      <w:r>
+        <w:t xml:space="preserve">또한 현재의 index presence가 과거 영어권 인용을 발생시켰다고 결론내릴 수 없다. 현재 Google Scholar record의 존재는 이후의 indexing, web availability, 이전 scholarly circulation 또는 이들과 함께 변화한 다른 특성과 관련될 수 있다. 가장 제한적인 해석은 현재 Google Scholar index presence에 따라 historical English-language citation trajectory가 다르게 나타난다는 것이다.</w:t>
       </w:r>
     </w:p>
     <w:bookmarkEnd w:id="30"/>
@@ -2209,20 +1495,7 @@
         <w:pStyle w:val="FirstParagraph"/>
       </w:pPr>
       <w:r>
-        <w:t xml:space="preserve">Study 2는</w:t>
-      </w:r>
-      <w:r>
-        <w:t xml:space="preserve"> </w:t>
-      </w:r>
-      <w:r>
-        <w:rPr>
-          <w:bCs/>
-          <w:b/>
-        </w:rPr>
-        <w:t xml:space="preserve">동일한 한국 정치 주제를 다루는 한국어권과 영어권의 주요 문헌이 생성형 검색에서 어느 정도 검색되고 최종 출처로 제시되는지, 그리고 그 차이가 검색조건에 따라 달라지는지</w:t>
-      </w:r>
-      <w:r>
-        <w:t xml:space="preserve">를 분석한다.</w:t>
+        <w:t xml:space="preserve">Study 2는 동일한 한국 정치 주제를 다루는 한국어권과 영어권의 주요 문헌이 생성형 검색에서 어느 정도 검색되고 최종 출처로 제시되는지, 그리고 그 차이가 검색조건에 따라 달라지는지를 분석한다.</w:t>
       </w:r>
     </w:p>
     <w:p>
@@ -2559,20 +1832,7 @@
         <w:pStyle w:val="BodyText"/>
       </w:pPr>
       <w:r>
-        <w:t xml:space="preserve">각 주제에는 한국어 논문 10편과 영어 논문 10편을 포함한다. 한국어 benchmark는 DBpia와 KISS, 영어 benchmark는 Web of Science와 Google Scholar를 이용해 구성한다. Candidate pool을 citation count에 따라 정렬한 뒤 두 source에서 공통적으로 상위에 위치하는 논문을 기준으로 주제별 10편을 선정하였다. 최종 benchmark는</w:t>
-      </w:r>
-      <w:r>
-        <w:t xml:space="preserve"> </w:t>
-      </w:r>
-      <w:r>
-        <w:rPr>
-          <w:bCs/>
-          <w:b/>
-        </w:rPr>
-        <w:t xml:space="preserve">한국어 50편과 영어 50편, 총 100편</w:t>
-      </w:r>
-      <w:r>
-        <w:t xml:space="preserve">이며 LLM audit 전에 고정하였다. 이는 각 주제의 모든 relevant literature를 포괄하는 gold standard가 아니라 조건 간 비교를 위한 evaluation set이다.</w:t>
+        <w:t xml:space="preserve">각 주제에는 한국어 논문 10편과 영어 논문 10편을 포함한다. 한국어 benchmark는 DBpia와 KISS, 영어 benchmark는 Web of Science와 Google Scholar를 이용해 구성한다. Candidate pool을 citation count에 따라 정렬한 뒤 두 source에서 공통적으로 상위에 위치하는 논문을 기준으로 주제별 10편을 선정하였다. 최종 benchmark는 한국어 50편과 영어 50편, 총 100편이며 LLM audit 전에 고정하였다. 이는 각 주제의 모든 relevant literature를 포괄하는 gold standard가 아니라 조건 간 비교를 위한 evaluation set이다.</w:t>
       </w:r>
     </w:p>
     <w:p>
@@ -2592,17 +1852,7 @@
         <w:pStyle w:val="Compact"/>
       </w:pPr>
       <w:r>
-        <w:rPr>
-          <w:bCs/>
-          <w:b/>
-        </w:rPr>
-        <w:t xml:space="preserve">Query language:</w:t>
-      </w:r>
-      <w:r>
-        <w:t xml:space="preserve"> </w:t>
-      </w:r>
-      <w:r>
-        <w:t xml:space="preserve">영어 / 한국어</w:t>
+        <w:t xml:space="preserve">Query language: 영어 / 한국어</w:t>
       </w:r>
     </w:p>
     <w:p>
@@ -2614,17 +1864,7 @@
         <w:pStyle w:val="Compact"/>
       </w:pPr>
       <w:r>
-        <w:rPr>
-          <w:bCs/>
-          <w:b/>
-        </w:rPr>
-        <w:t xml:space="preserve">Source instruction:</w:t>
-      </w:r>
-      <w:r>
-        <w:t xml:space="preserve"> </w:t>
-      </w:r>
-      <w:r>
-        <w:t xml:space="preserve">general web / KCI·DBpia·KISS 명시</w:t>
+        <w:t xml:space="preserve">Source instruction: general web / KCI·DBpia·KISS 명시</w:t>
       </w:r>
     </w:p>
     <w:p>
@@ -2636,17 +1876,7 @@
         <w:pStyle w:val="Compact"/>
       </w:pPr>
       <w:r>
-        <w:rPr>
-          <w:bCs/>
-          <w:b/>
-        </w:rPr>
-        <w:t xml:space="preserve">System:</w:t>
-      </w:r>
-      <w:r>
-        <w:t xml:space="preserve"> </w:t>
-      </w:r>
-      <w:r>
-        <w:t xml:space="preserve">OpenAI</w:t>
+        <w:t xml:space="preserve">System: OpenAI</w:t>
       </w:r>
       <w:r>
         <w:t xml:space="preserve"> </w:t>
@@ -2678,33 +1908,7 @@
         <w:pStyle w:val="FirstParagraph"/>
       </w:pPr>
       <w:r>
-        <w:t xml:space="preserve">모든 prompt는 해당 주제의 세 주제어를 포함하고 관련 학술문헌 10편을 고정된 JSON 형식으로 요청하였다. 검색횟수는 주제어당 최대 2회, execution당 최대 6회로 제한하였다. 5개 주제 × 4개 prompt condition × 2개 system × 5회 독립 repetition으로</w:t>
-      </w:r>
-      <w:r>
-        <w:t xml:space="preserve"> </w:t>
-      </w:r>
-      <w:r>
-        <w:rPr>
-          <w:bCs/>
-          <w:b/>
-        </w:rPr>
-        <w:t xml:space="preserve">200개의 stateless execution</w:t>
-      </w:r>
-      <w:r>
-        <w:t xml:space="preserve">을 수행하였으며, 최종적으로</w:t>
-      </w:r>
-      <w:r>
-        <w:t xml:space="preserve"> </w:t>
-      </w:r>
-      <w:r>
-        <w:rPr>
-          <w:bCs/>
-          <w:b/>
-        </w:rPr>
-        <w:t xml:space="preserve">1,932개의 valid recommendation occurrence</w:t>
-      </w:r>
-      <w:r>
-        <w:t xml:space="preserve">가 생성되었다.</w:t>
+        <w:t xml:space="preserve">모든 prompt는 해당 주제의 세 주제어를 포함하고 관련 학술문헌 10편을 고정된 JSON 형식으로 요청하였다. 검색횟수는 주제어당 최대 2회, execution당 최대 6회로 제한하였다. 5개 주제 × 4개 prompt condition × 2개 system × 5회 독립 repetition으로 200개의 stateless execution을 수행하였으며, 최종적으로 1,932개의 valid recommendation occurrence가 생성되었다.</w:t>
       </w:r>
     </w:p>
     <w:bookmarkEnd w:id="32"/>
@@ -2734,17 +1938,7 @@
         <w:pStyle w:val="Compact"/>
       </w:pPr>
       <w:r>
-        <w:rPr>
-          <w:bCs/>
-          <w:b/>
-        </w:rPr>
-        <w:t xml:space="preserve">TraceRecovery:</w:t>
-      </w:r>
-      <w:r>
-        <w:t xml:space="preserve"> </w:t>
-      </w:r>
-      <w:r>
-        <w:t xml:space="preserve">provider가 외부에 노출하는 search trace에서 benchmark paper가 확인되는지</w:t>
+        <w:t xml:space="preserve">TraceRecovery: provider가 외부에 노출하는 search trace에서 benchmark paper가 확인되는지</w:t>
       </w:r>
     </w:p>
     <w:p>
@@ -2756,17 +1950,7 @@
         <w:pStyle w:val="Compact"/>
       </w:pPr>
       <w:r>
-        <w:rPr>
-          <w:bCs/>
-          <w:b/>
-        </w:rPr>
-        <w:t xml:space="preserve">Recommendation:</w:t>
-      </w:r>
-      <w:r>
-        <w:t xml:space="preserve"> </w:t>
-      </w:r>
-      <w:r>
-        <w:t xml:space="preserve">benchmark paper가 최종 recommendation에 포함되는지</w:t>
+        <w:t xml:space="preserve">Recommendation: benchmark paper가 최종 recommendation에 포함되는지</w:t>
       </w:r>
     </w:p>
     <w:p>
@@ -2778,17 +1962,7 @@
         <w:pStyle w:val="Compact"/>
       </w:pPr>
       <w:r>
-        <w:rPr>
-          <w:bCs/>
-          <w:b/>
-        </w:rPr>
-        <w:t xml:space="preserve">SuppliedLinkAccess:</w:t>
-      </w:r>
-      <w:r>
-        <w:t xml:space="preserve"> </w:t>
-      </w:r>
-      <w:r>
-        <w:t xml:space="preserve">benchmark paper가 추천되고 제공된 URL이 로그인이나 결제 없이 full text로 연결되는지</w:t>
+        <w:t xml:space="preserve">SuppliedLinkAccess: benchmark paper가 추천되고 제공된 URL이 로그인이나 결제 없이 full text로 연결되는지</w:t>
       </w:r>
     </w:p>
     <w:p>
@@ -2808,20 +1982,7 @@
         <w:t xml:space="preserve">TraceRecovery</w:t>
       </w:r>
       <w:r>
-        <w:t xml:space="preserve">는 benchmark가</w:t>
-      </w:r>
-      <w:r>
-        <w:t xml:space="preserve"> </w:t>
-      </w:r>
-      <w:r>
-        <w:rPr>
-          <w:bCs/>
-          <w:b/>
-        </w:rPr>
-        <w:t xml:space="preserve">관찰 가능한 검색흔적에 나타나는지</w:t>
-      </w:r>
-      <w:r>
-        <w:t xml:space="preserve">를 측정하고,</w:t>
+        <w:t xml:space="preserve">는 benchmark가 관찰 가능한 검색흔적에 나타나는지를 측정하고,</w:t>
       </w:r>
       <w:r>
         <w:t xml:space="preserve"> </w:t>
@@ -2833,41 +1994,15 @@
         <w:t xml:space="preserve">Recommendation</w:t>
       </w:r>
       <w:r>
-        <w:t xml:space="preserve">은 그 문헌이</w:t>
-      </w:r>
-      <w:r>
-        <w:t xml:space="preserve"> </w:t>
-      </w:r>
-      <w:r>
-        <w:rPr>
-          <w:bCs/>
-          <w:b/>
-        </w:rPr>
-        <w:t xml:space="preserve">최종적으로 사용자에게 제시되는 출처에 포함되는지</w:t>
-      </w:r>
-      <w:r>
-        <w:t xml:space="preserve">를 측정한다. Search trace는 provider가 공개한 범위만 관찰하므로 시스템 내부의 전체 retrieval process를 의미하지 않는다.</w:t>
-      </w:r>
-    </w:p>
-    <w:p>
-      <w:pPr>
-        <w:pStyle w:val="BodyText"/>
-      </w:pPr>
-      <w:r>
-        <w:t xml:space="preserve">Benchmark panel은</w:t>
-      </w:r>
-      <w:r>
-        <w:t xml:space="preserve"> </w:t>
-      </w:r>
-      <w:r>
-        <w:rPr>
-          <w:bCs/>
-          <w:b/>
-        </w:rPr>
-        <w:t xml:space="preserve">4,000개의 paper × execution observation</w:t>
-      </w:r>
-      <w:r>
-        <w:t xml:space="preserve">으로 구성된다. 200개의 execution 각각에 해당 topic의 한국어 benchmark 10편과 영어 benchmark 10편을 대응시킨다.</w:t>
+        <w:t xml:space="preserve">은 그 문헌이 최종적으로 사용자에게 제시되는 출처에 포함되는지를 측정한다. Search trace는 provider가 공개한 범위만 관찰하므로 시스템 내부의 전체 retrieval process를 의미하지 않는다.</w:t>
+      </w:r>
+    </w:p>
+    <w:p>
+      <w:pPr>
+        <w:pStyle w:val="BodyText"/>
+      </w:pPr>
+      <w:r>
+        <w:t xml:space="preserve">Benchmark panel은 4,000개의 paper × execution observation으로 구성된다. 200개의 execution 각각에 해당 topic의 한국어 benchmark 10편과 영어 benchmark 10편을 대응시킨다.</w:t>
       </w:r>
       <w:r>
         <w:t xml:space="preserve"> </w:t>
@@ -2895,41 +2030,15 @@
         <w:pStyle w:val="BodyText"/>
       </w:pPr>
       <w:r>
-        <w:t xml:space="preserve">이와 별도로 전체 recommendation에서</w:t>
-      </w:r>
-      <w:r>
-        <w:t xml:space="preserve"> </w:t>
-      </w:r>
-      <w:r>
-        <w:rPr>
-          <w:bCs/>
-          <w:b/>
-        </w:rPr>
-        <w:t xml:space="preserve">한국어 논문이 차지하는 비율</w:t>
-      </w:r>
-      <w:r>
-        <w:t xml:space="preserve">을 측정한다. 이 값은 benchmark 회수율과 다르다. Benchmark에 포함되지 않은 한국어 논문도 한국어 논문 비율에는 포함되기 때문이다.</w:t>
-      </w:r>
-    </w:p>
-    <w:p>
-      <w:pPr>
-        <w:pStyle w:val="BodyText"/>
-      </w:pPr>
-      <w:r>
-        <w:t xml:space="preserve">마지막으로</w:t>
-      </w:r>
-      <w:r>
-        <w:t xml:space="preserve"> </w:t>
-      </w:r>
-      <w:r>
-        <w:rPr>
-          <w:bCs/>
-          <w:b/>
-        </w:rPr>
-        <w:t xml:space="preserve">927개의 distinct supplied URL 또는 no-URL item key</w:t>
-      </w:r>
-      <w:r>
-        <w:t xml:space="preserve">를 검토하여 accessible full text, abstract only, paywalled, broken link, hallucinated/unverifiable publication으로 분류한다. 이 평가는 시스템이 제공한 URL의 상태만을 대상으로 하며, 다른 웹 위치에 무료 copy가 존재하는지는 조사하지 않는다.</w:t>
+        <w:t xml:space="preserve">이와 별도로 전체 recommendation에서 한국어 논문이 차지하는 비율을 측정한다. 이 값은 benchmark 회수율과 다르다. Benchmark에 포함되지 않은 한국어 논문도 한국어 논문 비율에는 포함되기 때문이다.</w:t>
+      </w:r>
+    </w:p>
+    <w:p>
+      <w:pPr>
+        <w:pStyle w:val="BodyText"/>
+      </w:pPr>
+      <w:r>
+        <w:t xml:space="preserve">마지막으로 927개의 distinct supplied URL 또는 no-URL item key를 검토하여 accessible full text, abstract only, paywalled, broken link, hallucinated/unverifiable publication으로 분류한다. 이 평가는 시스템이 제공한 URL의 상태만을 대상으로 하며, 다른 웹 위치에 무료 copy가 존재하는지는 조사하지 않는다.</w:t>
       </w:r>
     </w:p>
     <w:bookmarkEnd w:id="33"/>
@@ -3279,118 +2388,15 @@
         <w:pStyle w:val="BodyText"/>
       </w:pPr>
       <w:r>
-        <w:t xml:space="preserve">한국어 query는 검색흔적 단계의 Korean–English gap을</w:t>
-      </w:r>
-      <w:r>
-        <w:t xml:space="preserve"> </w:t>
-      </w:r>
-      <w:r>
-        <w:rPr>
-          <w:bCs/>
-          <w:b/>
-        </w:rPr>
-        <w:t xml:space="preserve">+3.8pp</w:t>
-      </w:r>
-      <w:r>
-        <w:t xml:space="preserve"> </w:t>
-      </w:r>
-      <w:r>
-        <w:t xml:space="preserve">변화시키고(95% CI [0.72, 6.88], (p=.016)), Korean-database instruction은</w:t>
-      </w:r>
-      <w:r>
-        <w:t xml:space="preserve"> </w:t>
-      </w:r>
-      <w:r>
-        <w:rPr>
-          <w:bCs/>
-          <w:b/>
-        </w:rPr>
-        <w:t xml:space="preserve">+4.0pp</w:t>
-      </w:r>
-      <w:r>
-        <w:t xml:space="preserve"> </w:t>
-      </w:r>
-      <w:r>
-        <w:t xml:space="preserve">변화시킨다(95% CI [0.73, 7.27], (p=.017)). 최종 recommendation에서는 database instruction이 gap을</w:t>
-      </w:r>
-      <w:r>
-        <w:t xml:space="preserve"> </w:t>
-      </w:r>
-      <w:r>
-        <w:rPr>
-          <w:bCs/>
-          <w:b/>
-        </w:rPr>
-        <w:t xml:space="preserve">+3.2pp</w:t>
-      </w:r>
-      <w:r>
-        <w:t xml:space="preserve"> </w:t>
-      </w:r>
-      <w:r>
-        <w:t xml:space="preserve">변화시킨다(95% CI [0.71, 5.69], (p=.012)). Korean-query estimate는 +2.6pp로 같은 방향이지만 (p=.068)이다.</w:t>
-      </w:r>
-    </w:p>
-    <w:p>
-      <w:pPr>
-        <w:pStyle w:val="BodyText"/>
-      </w:pPr>
-      <w:r>
-        <w:t xml:space="preserve">두 조건을 함께 적용한 combined condition과 baseline을 직접 비교하면 Korean–English gap은 검색흔적에서</w:t>
-      </w:r>
-      <w:r>
-        <w:t xml:space="preserve"> </w:t>
-      </w:r>
-      <w:r>
-        <w:rPr>
-          <w:bCs/>
-          <w:b/>
-        </w:rPr>
-        <w:t xml:space="preserve">+5.6pp</w:t>
-      </w:r>
-      <w:r>
-        <w:t xml:space="preserve">, 최종 추천에서</w:t>
-      </w:r>
-      <w:r>
-        <w:t xml:space="preserve"> </w:t>
-      </w:r>
-      <w:r>
-        <w:rPr>
-          <w:bCs/>
-          <w:b/>
-        </w:rPr>
-        <w:t xml:space="preserve">+6.4pp</w:t>
-      </w:r>
-      <w:r>
-        <w:t xml:space="preserve"> </w:t>
-      </w:r>
-      <w:r>
-        <w:t xml:space="preserve">변화한다. Combined condition에서 한국어 benchmark의 검색흔적 회수율은</w:t>
-      </w:r>
-      <w:r>
-        <w:t xml:space="preserve"> </w:t>
-      </w:r>
-      <w:r>
-        <w:rPr>
-          <w:bCs/>
-          <w:b/>
-        </w:rPr>
-        <w:t xml:space="preserve">2.2%</w:t>
-      </w:r>
-      <w:r>
-        <w:t xml:space="preserve">, 최종 추천 회수율은</w:t>
-      </w:r>
-      <w:r>
-        <w:t xml:space="preserve"> </w:t>
-      </w:r>
-      <w:r>
-        <w:rPr>
-          <w:bCs/>
-          <w:b/>
-        </w:rPr>
-        <w:t xml:space="preserve">3.2%</w:t>
-      </w:r>
-      <w:r>
-        <w:t xml:space="preserve">이다. 상대적인 격차의 방향은 바뀌지만 절대적인 회수율은 낮다.</w:t>
+        <w:t xml:space="preserve">한국어 query는 검색흔적 단계의 Korean–English gap을 +3.8pp 변화시키고(95% CI [0.72, 6.88], (p=.016)), Korean-database instruction은 +4.0pp 변화시킨다(95% CI [0.73, 7.27], (p=.017)). 최종 recommendation에서는 database instruction이 gap을 +3.2pp 변화시킨다(95% CI [0.71, 5.69], (p=.012)). Korean-query estimate는 +2.6pp로 같은 방향이지만 (p=.068)이다.</w:t>
+      </w:r>
+    </w:p>
+    <w:p>
+      <w:pPr>
+        <w:pStyle w:val="BodyText"/>
+      </w:pPr>
+      <w:r>
+        <w:t xml:space="preserve">두 조건을 함께 적용한 combined condition과 baseline을 직접 비교하면 Korean–English gap은 검색흔적에서 +5.6pp, 최종 추천에서 +6.4pp 변화한다. Combined condition에서 한국어 benchmark의 검색흔적 회수율은 2.2%, 최종 추천 회수율은 3.2%이다. 상대적인 격차의 방향은 바뀌지만 절대적인 회수율은 낮다.</w:t>
       </w:r>
     </w:p>
     <w:p>
@@ -3540,10 +2546,6 @@
               <w:jc w:val="right"/>
             </w:pPr>
             <w:r>
-              <w:rPr>
-                <w:bCs/>
-                <w:b/>
-              </w:rPr>
               <w:t xml:space="preserve">91.2%</w:t>
             </w:r>
           </w:p>
@@ -3555,100 +2557,23 @@
         <w:pStyle w:val="BodyText"/>
       </w:pPr>
       <w:r>
-        <w:t xml:space="preserve">한국어 query는 recommendation의 한국어 논문 비율을</w:t>
-      </w:r>
-      <w:r>
-        <w:t xml:space="preserve"> </w:t>
-      </w:r>
-      <w:r>
-        <w:rPr>
-          <w:bCs/>
-          <w:b/>
-        </w:rPr>
-        <w:t xml:space="preserve">55.7pp</w:t>
-      </w:r>
-      <w:r>
-        <w:t xml:space="preserve"> </w:t>
-      </w:r>
-      <w:r>
-        <w:t xml:space="preserve">증가시키고((p&lt;.001)), Korean-database instruction은</w:t>
-      </w:r>
-      <w:r>
-        <w:t xml:space="preserve"> </w:t>
-      </w:r>
-      <w:r>
-        <w:rPr>
-          <w:bCs/>
-          <w:b/>
-        </w:rPr>
-        <w:t xml:space="preserve">35.4pp</w:t>
-      </w:r>
-      <w:r>
-        <w:t xml:space="preserve"> </w:t>
-      </w:r>
-      <w:r>
-        <w:t xml:space="preserve">증가시킨다((p&lt;.001)). 그러나 combined condition에서도 사전에 선정한 한국어 benchmark의 recommendation recovery는</w:t>
-      </w:r>
-      <w:r>
-        <w:t xml:space="preserve"> </w:t>
-      </w:r>
-      <w:r>
-        <w:rPr>
-          <w:bCs/>
-          <w:b/>
-        </w:rPr>
-        <w:t xml:space="preserve">3.2%</w:t>
-      </w:r>
-      <w:r>
-        <w:t xml:space="preserve">에 그친다.</w:t>
-      </w:r>
-    </w:p>
-    <w:p>
-      <w:pPr>
-        <w:pStyle w:val="BodyText"/>
-      </w:pPr>
-      <w:r>
-        <w:t xml:space="preserve">따라서</w:t>
-      </w:r>
-      <w:r>
-        <w:t xml:space="preserve"> </w:t>
-      </w:r>
-      <w:r>
-        <w:rPr>
-          <w:bCs/>
-          <w:b/>
-        </w:rPr>
-        <w:t xml:space="preserve">한국어 논문이 많이 추천되는 것과 한국어권에서 주요하게 축적된 특정 연구가 실제로 높은 비율로 포함되는 것은 동일하지 않다.</w:t>
-      </w:r>
-      <w:r>
-        <w:t xml:space="preserve"> </w:t>
-      </w:r>
-      <w:r>
-        <w:t xml:space="preserve">Benchmark 밖의 한국어 추천이 부적절하다는 의미가 아니라, 두 지표가 다른 질문에 답한다는 의미이다.</w:t>
-      </w:r>
-    </w:p>
-    <w:p>
-      <w:pPr>
-        <w:pStyle w:val="BodyText"/>
-      </w:pPr>
-      <w:r>
-        <w:t xml:space="preserve">전체</w:t>
-      </w:r>
-      <w:r>
-        <w:t xml:space="preserve"> </w:t>
-      </w:r>
-      <w:r>
-        <w:rPr>
-          <w:bCs/>
-          <w:b/>
-        </w:rPr>
-        <w:t xml:space="preserve">1,932개의 recommendation occurrence</w:t>
-      </w:r>
-      <w:r>
-        <w:t xml:space="preserve"> </w:t>
-      </w:r>
-      <w:r>
-        <w:t xml:space="preserve">가운데 제공된 링크의 결과는 다음과 같다.</w:t>
+        <w:t xml:space="preserve">한국어 query는 recommendation의 한국어 논문 비율을 55.7pp 증가시키고((p&lt;.001)), Korean-database instruction은 35.4pp 증가시킨다((p&lt;.001)). 그러나 combined condition에서도 사전에 선정한 한국어 benchmark의 recommendation recovery는 3.2%에 그친다.</w:t>
+      </w:r>
+    </w:p>
+    <w:p>
+      <w:pPr>
+        <w:pStyle w:val="BodyText"/>
+      </w:pPr>
+      <w:r>
+        <w:t xml:space="preserve">따라서 한국어 논문이 많이 추천되는 것과 한국어권에서 주요하게 축적된 특정 연구가 실제로 높은 비율로 포함되는 것은 동일하지 않다. Benchmark 밖의 한국어 추천이 부적절하다는 의미가 아니라, 두 지표가 다른 질문에 답한다는 의미이다.</w:t>
+      </w:r>
+    </w:p>
+    <w:p>
+      <w:pPr>
+        <w:pStyle w:val="BodyText"/>
+      </w:pPr>
+      <w:r>
+        <w:t xml:space="preserve">전체 1,932개의 recommendation occurrence 가운데 제공된 링크의 결과는 다음과 같다.</w:t>
       </w:r>
     </w:p>
     <w:p>
@@ -3659,14 +2584,7 @@
         </w:numPr>
       </w:pPr>
       <w:r>
-        <w:rPr>
-          <w:bCs/>
-          <w:b/>
-        </w:rPr>
-        <w:t xml:space="preserve">854개(44.2%)</w:t>
-      </w:r>
-      <w:r>
-        <w:t xml:space="preserve">: full text 접근 가능</w:t>
+        <w:t xml:space="preserve">854개(44.2%): full text 접근 가능</w:t>
       </w:r>
     </w:p>
     <w:p>
@@ -3677,14 +2595,7 @@
         </w:numPr>
       </w:pPr>
       <w:r>
-        <w:rPr>
-          <w:bCs/>
-          <w:b/>
-        </w:rPr>
-        <w:t xml:space="preserve">859개(44.5%)</w:t>
-      </w:r>
-      <w:r>
-        <w:t xml:space="preserve">: 접근 제한</w:t>
+        <w:t xml:space="preserve">859개(44.5%): 접근 제한</w:t>
       </w:r>
     </w:p>
     <w:p>
@@ -3719,14 +2630,7 @@
         </w:numPr>
       </w:pPr>
       <w:r>
-        <w:rPr>
-          <w:bCs/>
-          <w:b/>
-        </w:rPr>
-        <w:t xml:space="preserve">219개(11.3%)</w:t>
-      </w:r>
-      <w:r>
-        <w:t xml:space="preserve">: invalid 또는 unverifiable</w:t>
+        <w:t xml:space="preserve">219개(11.3%): invalid 또는 unverifiable</w:t>
       </w:r>
     </w:p>
     <w:p>
@@ -4093,23 +2997,7 @@
         <w:pStyle w:val="FirstParagraph"/>
       </w:pPr>
       <w:r>
-        <w:t xml:space="preserve">Study 2에서 영어 general-web baseline의 한국어 benchmark deficit은</w:t>
-      </w:r>
-      <w:r>
-        <w:t xml:space="preserve"> </w:t>
-      </w:r>
-      <w:r>
-        <w:rPr>
-          <w:bCs/>
-          <w:b/>
-        </w:rPr>
-        <w:t xml:space="preserve">검색흔적과 최종 추천 모두에서</w:t>
-      </w:r>
-      <w:r>
-        <w:t xml:space="preserve"> </w:t>
-      </w:r>
-      <w:r>
-        <w:t xml:space="preserve">관찰된다. 한국어 query와 한국 학술 데이터베이스 지시는 이 상대적 차이를 줄이거나 반전시키지만, 절대적인 한국어 benchmark 회수율은 여전히 낮다.</w:t>
+        <w:t xml:space="preserve">Study 2에서 영어 general-web baseline의 한국어 benchmark deficit은 검색흔적과 최종 추천 모두에서 관찰된다. 한국어 query와 한국 학술 데이터베이스 지시는 이 상대적 차이를 줄이거나 반전시키지만, 절대적인 한국어 benchmark 회수율은 여전히 낮다.</w:t>
       </w:r>
     </w:p>
     <w:p>
@@ -4161,20 +3049,7 @@
         <w:pStyle w:val="FirstParagraph"/>
       </w:pPr>
       <w:r>
-        <w:t xml:space="preserve">두 Study가 공통으로 보여주는 것은</w:t>
-      </w:r>
-      <w:r>
-        <w:t xml:space="preserve"> </w:t>
-      </w:r>
-      <w:r>
-        <w:rPr>
-          <w:bCs/>
-          <w:b/>
-        </w:rPr>
-        <w:t xml:space="preserve">한국어권에서 존재하고 실제 사용되는 연구가 다른 검색환경에서도 자동적으로 같은 정도로 가시화되는 것은 아니라는 점</w:t>
-      </w:r>
-      <w:r>
-        <w:t xml:space="preserve">이다. 다만 두 연구에서 가시성을 관찰하는 방식과 증거의 시간적 성격은 다르다.</w:t>
+        <w:t xml:space="preserve">두 Study가 공통으로 보여주는 것은 한국어권에서 존재하고 실제 사용되는 연구가 다른 검색환경에서도 자동적으로 같은 정도로 가시화되는 것은 아니라는 점이다. 다만 두 연구에서 가시성을 관찰하는 방식과 증거의 시간적 성격은 다르다.</w:t>
       </w:r>
     </w:p>
     <w:p>
@@ -4198,41 +3073,15 @@
         <w:pStyle w:val="BodyText"/>
       </w:pPr>
       <w:r>
-        <w:t xml:space="preserve">두 연구를 하나의 인과 메커니즘으로 결합할 수는 없다. Study 1은 현재의 Google Scholar index presence와 과거 영어권 인용패턴 사이의 관계를 보여주고, Study 2는 현재 생성형 검색에서 문헌이 검색되고 최종 출처로 제시되는 결과를 직접 비교한다. 두 연구가 함께 보여주는 보다 제한적인 점은</w:t>
-      </w:r>
-      <w:r>
-        <w:t xml:space="preserve"> </w:t>
-      </w:r>
-      <w:r>
-        <w:rPr>
-          <w:bCs/>
-          <w:b/>
-        </w:rPr>
-        <w:t xml:space="preserve">학술문헌이 검색환경에서 검토 가능한 연구로 나타나는 과정 자체가 국제적 가시성의 별도 분석대상이라는 것</w:t>
-      </w:r>
-      <w:r>
-        <w:t xml:space="preserve">이다.</w:t>
-      </w:r>
-    </w:p>
-    <w:p>
-      <w:pPr>
-        <w:pStyle w:val="BodyText"/>
-      </w:pPr>
-      <w:r>
-        <w:t xml:space="preserve">Study 2의 결과는 특히 최종 목록의 언어적 구성과 한국어권 주요 연구의 실제 반영 정도가 다를 수 있음을 보여준다. Combined condition에서는 recommendation의 91.2%가 한국어 논문이지만 사전 지정 한국어 benchmark의 recommendation recovery는 3.2%이다. 따라서</w:t>
-      </w:r>
-      <w:r>
-        <w:t xml:space="preserve"> </w:t>
-      </w:r>
-      <w:r>
-        <w:rPr>
-          <w:bCs/>
-          <w:b/>
-        </w:rPr>
-        <w:t xml:space="preserve">한국어 자료가 많이 보인다는 것과 한국어권에서 축적된 주요 연구가 실제 검색결과에 충분히 포함된다는 것은 다른 주장</w:t>
-      </w:r>
-      <w:r>
-        <w:t xml:space="preserve">이다.</w:t>
+        <w:t xml:space="preserve">두 연구를 하나의 인과 메커니즘으로 결합할 수는 없다. Study 1은 현재의 Google Scholar index presence와 과거 영어권 인용패턴 사이의 관계를 보여주고, Study 2는 현재 생성형 검색에서 문헌이 검색되고 최종 출처로 제시되는 결과를 직접 비교한다. 두 연구가 함께 보여주는 보다 제한적인 점은 학술문헌이 검색환경에서 검토 가능한 연구로 나타나는 과정 자체가 국제적 가시성의 별도 분석대상이라는 것이다.</w:t>
+      </w:r>
+    </w:p>
+    <w:p>
+      <w:pPr>
+        <w:pStyle w:val="BodyText"/>
+      </w:pPr>
+      <w:r>
+        <w:t xml:space="preserve">Study 2의 결과는 특히 최종 목록의 언어적 구성과 한국어권 주요 연구의 실제 반영 정도가 다를 수 있음을 보여준다. Combined condition에서는 recommendation의 91.2%가 한국어 논문이지만 사전 지정 한국어 benchmark의 recommendation recovery는 3.2%이다. 따라서 한국어 자료가 많이 보인다는 것과 한국어권에서 축적된 주요 연구가 실제 검색결과에 충분히 포함된다는 것은 다른 주장이다.</w:t>
       </w:r>
     </w:p>
     <w:p>
@@ -4266,41 +3115,15 @@
         <w:pStyle w:val="BodyText"/>
       </w:pPr>
       <w:r>
-        <w:t xml:space="preserve">본 연구가 추가하는 것은</w:t>
-      </w:r>
-      <w:r>
-        <w:t xml:space="preserve"> </w:t>
-      </w:r>
-      <w:r>
-        <w:rPr>
-          <w:bCs/>
-          <w:b/>
-        </w:rPr>
-        <w:t xml:space="preserve">연구자가 선행연구를 찾는 검색과정에서도 이러한 가시성의 차이를 관찰할 수 있다는 점</w:t>
-      </w:r>
-      <w:r>
-        <w:t xml:space="preserve">이다. 한국어권에서 실제로 인용된 논문이라도 현재 Google Scholar에서 모두 확인되는 것은 아니며, 생성형 검색이 다수의 한국어 논문을 제시하더라도 한국어권에서 주요하게 다뤄져 온 특정 연구가 같은 정도로 포함되는 것도 아니다.</w:t>
-      </w:r>
-    </w:p>
-    <w:p>
-      <w:pPr>
-        <w:pStyle w:val="BodyText"/>
-      </w:pPr>
-      <w:r>
-        <w:t xml:space="preserve">검색환경은 문헌의 학술적 가치 자체를 결정하지 않지만, 연구자가 어떤 문헌을 검토할 가능성이 있는지를 구성하는 과정에 개입한다. 관련 문헌이 검색결과에 나타나지 않는다면 연구자는 그 문헌의 내용과 가치를 평가하기 이전에 해당 연구를 고려하지 못할 수 있다. 이 점에서 discovery bottleneck은</w:t>
-      </w:r>
-      <w:r>
-        <w:t xml:space="preserve"> </w:t>
-      </w:r>
-      <w:r>
-        <w:rPr>
-          <w:bCs/>
-          <w:b/>
-        </w:rPr>
-        <w:t xml:space="preserve">문헌의 질에 대한 평가 이전에 발생하는 가시성의 문제</w:t>
-      </w:r>
-      <w:r>
-        <w:t xml:space="preserve">를 가리킨다.</w:t>
+        <w:t xml:space="preserve">본 연구가 추가하는 것은 연구자가 선행연구를 찾는 검색과정에서도 이러한 가시성의 차이를 관찰할 수 있다는 점이다. 한국어권에서 실제로 인용된 논문이라도 현재 Google Scholar에서 모두 확인되는 것은 아니며, 생성형 검색이 다수의 한국어 논문을 제시하더라도 한국어권에서 주요하게 다뤄져 온 특정 연구가 같은 정도로 포함되는 것도 아니다.</w:t>
+      </w:r>
+    </w:p>
+    <w:p>
+      <w:pPr>
+        <w:pStyle w:val="BodyText"/>
+      </w:pPr>
+      <w:r>
+        <w:t xml:space="preserve">검색환경은 문헌의 학술적 가치 자체를 결정하지 않지만, 연구자가 어떤 문헌을 검토할 가능성이 있는지를 구성하는 과정에 개입한다. 관련 문헌이 검색결과에 나타나지 않는다면 연구자는 그 문헌의 내용과 가치를 평가하기 이전에 해당 연구를 고려하지 못할 수 있다. 이 점에서 discovery bottleneck은 문헌의 질에 대한 평가 이전에 발생하는 가시성의 문제를 가리킨다.</w:t>
       </w:r>
     </w:p>
     <w:p>
@@ -4324,20 +3147,7 @@
         <w:pStyle w:val="BodyText"/>
       </w:pPr>
       <w:r>
-        <w:t xml:space="preserve">본 논문의</w:t>
-      </w:r>
-      <w:r>
-        <w:t xml:space="preserve"> </w:t>
-      </w:r>
-      <w:r>
-        <w:rPr>
-          <w:bCs/>
-          <w:b/>
-        </w:rPr>
-        <w:t xml:space="preserve">discovery bottleneck</w:t>
-      </w:r>
-      <w:r>
-        <w:t xml:space="preserve">은 하나의 내부 알고리즘적 원인을 지칭하지 않는다. Study 1에서는 본 연구의 search protocol에서 Google Scholar bibliographic record를 확인하지 못하는 경우를, Study 2에서는 benchmark paper가 관찰 가능한 search trace에서 확인되지 않거나 최종 recommendation에 포함되지 않는 경우를 가리킨다. 즉 문헌이 실질적 평가에 도달하기 전에 관찰 가능한 검색·선택 과정에서 가시성을 잃는 상태를 지칭한다.</w:t>
+        <w:t xml:space="preserve">본 논문의 discovery bottleneck은 하나의 내부 알고리즘적 원인을 지칭하지 않는다. Study 1에서는 본 연구의 search protocol에서 Google Scholar bibliographic record를 확인하지 못하는 경우를, Study 2에서는 benchmark paper가 관찰 가능한 search trace에서 확인되지 않거나 최종 recommendation에 포함되지 않는 경우를 가리킨다. 즉 문헌이 실질적 평가에 도달하기 전에 관찰 가능한 검색·선택 과정에서 가시성을 잃는 상태를 지칭한다.</w:t>
       </w:r>
     </w:p>
     <w:p>
@@ -4364,20 +3174,7 @@
         <w:pStyle w:val="FirstParagraph"/>
       </w:pPr>
       <w:r>
-        <w:t xml:space="preserve">한국 정치 연구의 국제적 가시성은 어떤 연구가 출판되고 최종적으로 인용되는가만으로 완전히 포착되지 않는다. 연구자가 실제 선행연구를 찾는 과정에서는</w:t>
-      </w:r>
-      <w:r>
-        <w:t xml:space="preserve"> </w:t>
-      </w:r>
-      <w:r>
-        <w:rPr>
-          <w:bCs/>
-          <w:b/>
-        </w:rPr>
-        <w:t xml:space="preserve">어떤 문헌이 검색환경에 존재하고, 검색결과에서 확인되며, 최종적으로 검토할 출처로 제시되는가</w:t>
-      </w:r>
-      <w:r>
-        <w:t xml:space="preserve">라는 문제가 추가된다.</w:t>
+        <w:t xml:space="preserve">한국 정치 연구의 국제적 가시성은 어떤 연구가 출판되고 최종적으로 인용되는가만으로 완전히 포착되지 않는다. 연구자가 실제 선행연구를 찾는 과정에서는 어떤 문헌이 검색환경에 존재하고, 검색결과에서 확인되며, 최종적으로 검토할 출처로 제시되는가라는 문제가 추가된다.</w:t>
       </w:r>
     </w:p>
     <w:p>
@@ -4393,17 +3190,7 @@
         <w:pStyle w:val="BodyText"/>
       </w:pPr>
       <w:r>
-        <w:t xml:space="preserve">Study 2에서는 양 언어권에서 모두 연구되어 온 동일한 한국 정치 주제를 기준으로 한국어와 영어 benchmark를 사전에 구성하여 현재의 생성형 검색을 감사하였다. 영어 general-web baseline에서는 한국어 benchmark가 search trace와 final recommendation에서 영어 benchmark보다 유의하게 덜 회수되었다. 한국어 질의와 한국 학술 데이터베이스 검색 지시는 이 상대적 격차를 줄였지만 절대적인 한국어 benchmark recovery는 낮게 유지되었다. 특히 combined condition에서 recommendation의 91.2%가 한국어 논문이어도 사전 지정 한국어 benchmark의 recommendation recovery는 3.2%였다. 따라서</w:t>
-      </w:r>
-      <w:r>
-        <w:t xml:space="preserve"> </w:t>
-      </w:r>
-      <w:r>
-        <w:rPr>
-          <w:bCs/>
-          <w:b/>
-        </w:rPr>
-        <w:t xml:space="preserve">한국어 논문이 많이 제시되는 것과 한국어권의 주요 연구가 실제 검색결과에 충분히 반영되는 것은 동일하지 않았다.</w:t>
+        <w:t xml:space="preserve">Study 2에서는 양 언어권에서 모두 연구되어 온 동일한 한국 정치 주제를 기준으로 한국어와 영어 benchmark를 사전에 구성하여 현재의 생성형 검색을 감사하였다. 영어 general-web baseline에서는 한국어 benchmark가 search trace와 final recommendation에서 영어 benchmark보다 유의하게 덜 회수되었다. 한국어 질의와 한국 학술 데이터베이스 검색 지시는 이 상대적 격차를 줄였지만 절대적인 한국어 benchmark recovery는 낮게 유지되었다. 특히 combined condition에서 recommendation의 91.2%가 한국어 논문이어도 사전 지정 한국어 benchmark의 recommendation recovery는 3.2%였다. 따라서 한국어 논문이 많이 제시되는 것과 한국어권의 주요 연구가 실제 검색결과에 충분히 반영되는 것은 동일하지 않았다.</w:t>
       </w:r>
     </w:p>
     <w:p>
@@ -4419,33 +3206,7 @@
         <w:pStyle w:val="BodyText"/>
       </w:pPr>
       <w:r>
-        <w:t xml:space="preserve">본 논문에서</w:t>
-      </w:r>
-      <w:r>
-        <w:t xml:space="preserve"> </w:t>
-      </w:r>
-      <w:r>
-        <w:rPr>
-          <w:bCs/>
-          <w:b/>
-        </w:rPr>
-        <w:t xml:space="preserve">discovery bottleneck</w:t>
-      </w:r>
-      <w:r>
-        <w:t xml:space="preserve">은 문헌이 학술적으로 존재하고 한 학술공간에서 이미 사용되고 있더라도, 내용에 대한 실질적 평가에 도달하기 전에 특정 검색환경에서 가시성을 잃는 현상을 의미한다. 이는 검색기술이 국제적 지식 불평등을 단독으로 발생시킨다는 주장이 아니다. 한국 정치 연구처럼 한국어권과 영어권에 병렬적인 학술적 축적이 존재하는 경우,</w:t>
-      </w:r>
-      <w:r>
-        <w:t xml:space="preserve"> </w:t>
-      </w:r>
-      <w:r>
-        <w:rPr>
-          <w:bCs/>
-          <w:b/>
-        </w:rPr>
-        <w:t xml:space="preserve">어떤 연구가 생산되고 인용되는가와 함께 어떤 구체적인 연구가 실제 검색과정에서 검토 가능한 문헌으로 나타나는가를 별도로 분석할 필요가 있다</w:t>
-      </w:r>
-      <w:r>
-        <w:t xml:space="preserve">는 주장이다.</w:t>
+        <w:t xml:space="preserve">본 논문에서 discovery bottleneck은 문헌이 학술적으로 존재하고 한 학술공간에서 이미 사용되고 있더라도, 내용에 대한 실질적 평가에 도달하기 전에 특정 검색환경에서 가시성을 잃는 현상을 의미한다. 이는 검색기술이 국제적 지식 불평등을 단독으로 발생시킨다는 주장이 아니다. 한국 정치 연구처럼 한국어권과 영어권에 병렬적인 학술적 축적이 존재하는 경우, 어떤 연구가 생산되고 인용되는가와 함께 어떤 구체적인 연구가 실제 검색과정에서 검토 가능한 문헌으로 나타나는가를 별도로 분석할 필요가 있다는 주장이다.</w:t>
       </w:r>
     </w:p>
     <w:bookmarkEnd w:id="40"/>
@@ -4479,20 +3240,7 @@
         <w:pStyle w:val="BodyText"/>
       </w:pPr>
       <w:r>
-        <w:t xml:space="preserve">Google Scholar index presence의 측정에는 bibliographic matching error도 존재할 수 있다. 한국어·영어 제목과 reference-title variant를 사용했지만 metadata 오류, 제목 변형, 중복 record 또는 불완전한 indexing 때문에 실제 존재하는 record를 놓치거나 잘못 연결했을 가능성이 있다. 특히 Google Scholar가 전체 index 목록을 공개하지 않으므로 (D=0)은 Google Scholar 전체에서의 절대적인 부재가 아니라</w:t>
-      </w:r>
-      <w:r>
-        <w:t xml:space="preserve"> </w:t>
-      </w:r>
-      <w:r>
-        <w:rPr>
-          <w:bCs/>
-          <w:b/>
-        </w:rPr>
-        <w:t xml:space="preserve">본 연구의 search and matching protocol에서 index presence가 확인되지 않았음</w:t>
-      </w:r>
-      <w:r>
-        <w:t xml:space="preserve">을 뜻한다.</w:t>
+        <w:t xml:space="preserve">Google Scholar index presence의 측정에는 bibliographic matching error도 존재할 수 있다. 한국어·영어 제목과 reference-title variant를 사용했지만 metadata 오류, 제목 변형, 중복 record 또는 불완전한 indexing 때문에 실제 존재하는 record를 놓치거나 잘못 연결했을 가능성이 있다. 특히 Google Scholar가 전체 index 목록을 공개하지 않으므로 (D=0)은 Google Scholar 전체에서의 절대적인 부재가 아니라 본 연구의 search and matching protocol에서 index presence가 확인되지 않았음을 뜻한다.</w:t>
       </w:r>
     </w:p>
     <w:p>
@@ -4556,20 +3304,7 @@
         <w:pStyle w:val="BodyText"/>
       </w:pPr>
       <w:r>
-        <w:t xml:space="preserve">마지막으로 두 Study 모두 문헌이 검색되거나 추천된 이후 연구자가 실제로 무엇을 하는지는 관찰하지 않는다. 검색결과의 클릭, 원문의 열람, substantive relevance 평가, 언어능력, perceived quality, citation norm, collaboration network 및 publication venue 등은 후속 이용과 인용에 영향을 줄 수 있다. 따라서 본 논문의 증거는 전체 지식순환 과정이 아니라</w:t>
-      </w:r>
-      <w:r>
-        <w:t xml:space="preserve"> </w:t>
-      </w:r>
-      <w:r>
-        <w:rPr>
-          <w:bCs/>
-          <w:b/>
-        </w:rPr>
-        <w:t xml:space="preserve">검색환경에서 어떤 문헌이 가시화되고 제시되는가, 그리고 제공된 링크를 통해 원문에 접근할 수 있는가</w:t>
-      </w:r>
-      <w:r>
-        <w:t xml:space="preserve">에 한정된다.</w:t>
+        <w:t xml:space="preserve">마지막으로 두 Study 모두 문헌이 검색되거나 추천된 이후 연구자가 실제로 무엇을 하는지는 관찰하지 않는다. 검색결과의 클릭, 원문의 열람, substantive relevance 평가, 언어능력, perceived quality, citation norm, collaboration network 및 publication venue 등은 후속 이용과 인용에 영향을 줄 수 있다. 따라서 본 논문의 증거는 전체 지식순환 과정이 아니라 검색환경에서 어떤 문헌이 가시화되고 제시되는가, 그리고 제공된 링크를 통해 원문에 접근할 수 있는가에 한정된다.</w:t>
       </w:r>
     </w:p>
     <w:bookmarkEnd w:id="41"/>

</xml_diff>